<commit_message>
Synchronize Japanese presentation script
</commit_message>
<xml_diff>
--- a/manuscript/vector_missing_iv_presentation_script_ja.docx
+++ b/manuscript/vector_missing_iv_presentation_script_ja.docx
@@ -11,12 +11,9 @@
       </w:r>
     </w:p>
     <w:p>
-      <w:pPr>
-        <w:jc w:val="left"/>
-      </w:pPr>
       <w:r>
         <w:rPr>
-          <w:rFonts w:ascii="Arial Unicode MS" w:hAnsi="Arial Unicode MS" w:eastAsia="Arial Unicode MS"/>
+          <w:rFonts w:ascii="Arial" w:hAnsi="Arial" w:eastAsia="BIZ UDPGothic"/>
           <w:b/>
           <w:color w:val="000000"/>
           <w:sz w:val="24"/>
@@ -26,7 +23,7 @@
     </w:p>
     <w:p>
       <w:r>
-        <w:t>本原稿は、英語Beamerの各スライドに対応する口頭説明用の日本語原稿である。識別対象、仮定、定理の適用範囲をスライド間で一貫させ、証明は発表時に必要な論理だけを説明する。</w:t>
+        <w:t>本原稿は、英語Beamer全33枚に対応する日本語の口頭説明用原稿である。本文の識別対象、仮定、定理、推定法、simulation設定と整合させ、証明は本編では論理の流れ、Appendixでは8ステップを説明する。</w:t>
       </w:r>
     </w:p>
     <w:p>
@@ -60,7 +57,7 @@
           <w:p>
             <w:r>
               <w:rPr>
-                <w:rFonts w:ascii="Arial Unicode MS" w:hAnsi="Arial Unicode MS" w:eastAsia="Arial Unicode MS"/>
+                <w:rFonts w:ascii="Arial" w:hAnsi="Arial" w:eastAsia="BIZ UDPGothic"/>
                 <w:b/>
                 <w:color w:val="000000"/>
                 <w:sz w:val="20"/>
@@ -77,7 +74,7 @@
           <w:p>
             <w:r>
               <w:rPr>
-                <w:rFonts w:ascii="Arial Unicode MS" w:hAnsi="Arial Unicode MS" w:eastAsia="Arial Unicode MS"/>
+                <w:rFonts w:ascii="Arial" w:hAnsi="Arial" w:eastAsia="BIZ UDPGothic"/>
                 <w:b/>
                 <w:color w:val="000000"/>
                 <w:sz w:val="20"/>
@@ -95,11 +92,11 @@
           <w:p>
             <w:r>
               <w:rPr>
-                <w:rFonts w:ascii="Arial Unicode MS" w:hAnsi="Arial Unicode MS" w:eastAsia="Arial Unicode MS"/>
+                <w:rFonts w:ascii="Arial" w:hAnsi="Arial" w:eastAsia="BIZ UDPGothic"/>
                 <w:color w:val="000000"/>
                 <w:sz w:val="21"/>
               </w:rPr>
-              <w:t>Slides 1–5</w:t>
+              <w:t>Slides 1–7</w:t>
             </w:r>
           </w:p>
         </w:tc>
@@ -110,11 +107,11 @@
           <w:p>
             <w:r>
               <w:rPr>
-                <w:rFonts w:ascii="Arial Unicode MS" w:hAnsi="Arial Unicode MS" w:eastAsia="Arial Unicode MS"/>
+                <w:rFonts w:ascii="Arial" w:hAnsi="Arial" w:eastAsia="BIZ UDPGothic"/>
                 <w:color w:val="000000"/>
                 <w:sz w:val="21"/>
               </w:rPr>
-              <w:t>問題設定、既存研究、潜在分解に残る識別問題</w:t>
+              <w:t>基礎概念、問題設定、既存研究、latent shifterの役割</w:t>
             </w:r>
           </w:p>
         </w:tc>
@@ -127,11 +124,11 @@
           <w:p>
             <w:r>
               <w:rPr>
-                <w:rFonts w:ascii="Arial Unicode MS" w:hAnsi="Arial Unicode MS" w:eastAsia="Arial Unicode MS"/>
+                <w:rFonts w:ascii="Arial" w:hAnsi="Arial" w:eastAsia="BIZ UDPGothic"/>
                 <w:color w:val="000000"/>
                 <w:sz w:val="21"/>
               </w:rPr>
-              <w:t>Slides 6–12</w:t>
+              <w:t>Slides 8–14</w:t>
             </w:r>
           </w:p>
         </w:tc>
@@ -142,7 +139,7 @@
           <w:p>
             <w:r>
               <w:rPr>
-                <w:rFonts w:ascii="Arial Unicode MS" w:hAnsi="Arial Unicode MS" w:eastAsia="Arial Unicode MS"/>
+                <w:rFonts w:ascii="Arial" w:hAnsi="Arial" w:eastAsia="BIZ UDPGothic"/>
                 <w:color w:val="000000"/>
                 <w:sz w:val="21"/>
               </w:rPr>
@@ -159,11 +156,11 @@
           <w:p>
             <w:r>
               <w:rPr>
-                <w:rFonts w:ascii="Arial Unicode MS" w:hAnsi="Arial Unicode MS" w:eastAsia="Arial Unicode MS"/>
+                <w:rFonts w:ascii="Arial" w:hAnsi="Arial" w:eastAsia="BIZ UDPGothic"/>
                 <w:color w:val="000000"/>
                 <w:sz w:val="21"/>
               </w:rPr>
-              <w:t>Slides 13–18</w:t>
+              <w:t>Slides 15–21</w:t>
             </w:r>
           </w:p>
         </w:tc>
@@ -174,7 +171,7 @@
           <w:p>
             <w:r>
               <w:rPr>
-                <w:rFonts w:ascii="Arial Unicode MS" w:hAnsi="Arial Unicode MS" w:eastAsia="Arial Unicode MS"/>
+                <w:rFonts w:ascii="Arial" w:hAnsi="Arial" w:eastAsia="BIZ UDPGothic"/>
                 <w:color w:val="000000"/>
                 <w:sz w:val="21"/>
               </w:rPr>
@@ -191,11 +188,11 @@
           <w:p>
             <w:r>
               <w:rPr>
-                <w:rFonts w:ascii="Arial Unicode MS" w:hAnsi="Arial Unicode MS" w:eastAsia="Arial Unicode MS"/>
+                <w:rFonts w:ascii="Arial" w:hAnsi="Arial" w:eastAsia="BIZ UDPGothic"/>
                 <w:color w:val="000000"/>
                 <w:sz w:val="21"/>
               </w:rPr>
-              <w:t>Slides 19–24</w:t>
+              <w:t>Slides 22–28</w:t>
             </w:r>
           </w:p>
         </w:tc>
@@ -206,11 +203,11 @@
           <w:p>
             <w:r>
               <w:rPr>
-                <w:rFonts w:ascii="Arial Unicode MS" w:hAnsi="Arial Unicode MS" w:eastAsia="Arial Unicode MS"/>
+                <w:rFonts w:ascii="Arial" w:hAnsi="Arial" w:eastAsia="BIZ UDPGothic"/>
                 <w:color w:val="000000"/>
                 <w:sz w:val="21"/>
               </w:rPr>
-              <w:t>推定、計算、simulation、結論</w:t>
+              <w:t>推定、計算、simulation、結論、参考文献</w:t>
             </w:r>
           </w:p>
         </w:tc>
@@ -223,11 +220,11 @@
           <w:p>
             <w:r>
               <w:rPr>
-                <w:rFonts w:ascii="Arial Unicode MS" w:hAnsi="Arial Unicode MS" w:eastAsia="Arial Unicode MS"/>
+                <w:rFonts w:ascii="Arial" w:hAnsi="Arial" w:eastAsia="BIZ UDPGothic"/>
                 <w:color w:val="000000"/>
                 <w:sz w:val="21"/>
               </w:rPr>
-              <w:t>References and Appendix</w:t>
+              <w:t>Appendix 29–33</w:t>
             </w:r>
           </w:p>
         </w:tc>
@@ -238,11 +235,11 @@
           <w:p>
             <w:r>
               <w:rPr>
-                <w:rFonts w:ascii="Arial Unicode MS" w:hAnsi="Arial Unicode MS" w:eastAsia="Arial Unicode MS"/>
+                <w:rFonts w:ascii="Arial" w:hAnsi="Arial" w:eastAsia="BIZ UDPGothic"/>
                 <w:color w:val="000000"/>
                 <w:sz w:val="21"/>
               </w:rPr>
-              <w:t>文献関係と質疑用の補足</w:t>
+              <w:t>定理1の8ステップとempirical diagnostics</w:t>
             </w:r>
           </w:p>
         </w:tc>
@@ -266,7 +263,7 @@
         <w:keepLines/>
       </w:pPr>
       <w:r>
-        <w:t>本報告では、多次元の測定項目がmissing not at random、つまりMNARで欠測する状況において、潜在分布と測定核をどのように識別するかを議論します。</w:t>
+        <w:t>本報告の題目は、欠測IVと潜在変数モデリングによる非無作為欠測の識別です。多次元の測定項目がmissing not at random、すなわちMNARで欠測する状況で、潜在分布と測定核をどのように識別するかを議論します。</w:t>
       </w:r>
     </w:p>
     <w:p>
@@ -274,7 +271,7 @@
         <w:keepLines/>
       </w:pPr>
       <w:r>
-        <w:t>中心となる考え方は二段階です。第一段階でshadow IVとsupported blockを用いて観測変数のblock lawを回復し、第二段階でanchor itemsとlatent shifterを用いて、その法則を有限潜在クラスへ一意に分解します。</w:t>
+        <w:t>中心となる考え方は二段階です。第一段階でMissing IVとsupported blockを用いて観測変数のblock lawを回復し、第二段階でanchor itemsとlatent shifterを用いて、その法則を有限潜在クラスへ一意に分解します。</w:t>
       </w:r>
     </w:p>
     <w:p>
@@ -287,7 +284,7 @@
         <w:pStyle w:val="Heading1"/>
       </w:pPr>
       <w:r>
-        <w:t>Slide 2  Nonignorable item nonresponse in latent structure models</w:t>
+        <w:t>Slide 2  Missing-data mechanisms and standard approaches</w:t>
       </w:r>
     </w:p>
     <w:p>
@@ -295,7 +292,7 @@
         <w:keepLines/>
       </w:pPr>
       <w:r>
-        <w:t>多変量データでは、各測定項目の観測確率が、その項目自身を含む未観測の値に依存することがあります。この場合、欠測はMNARであり、観測された回答だけから母集団の分布を推定するとbiasが生じます。</w:t>
+        <w:t>まず欠測機構を整理します。Dをresponse pattern、Y obsとY misを観測部分と欠測部分とします。MCARではDはYに依存せず、MARでは観測値だけに依存します。MNARではDが欠測値そのものにも依存するため、通常の補完やrespondent-only analysisではsample-selection biasが生じ得ます。</w:t>
       </w:r>
     </w:p>
     <w:p>
@@ -303,7 +300,7 @@
         <w:keepLines/>
       </w:pPr>
       <w:r>
-        <w:t>一方、構造方程式モデルや項目反応理論では、関心は観測項目の分布だけではありません。潜在変数の分布Q Fと、各項目が潜在状態をどのように測定するかを表す測定核Q Yの双方が推定対象です。したがって、観測変数のfull-data lawを回復した後に、それを潜在分布と測定核へ分離する問題が残ります。</w:t>
+        <w:t>本報告では、欠測のためのinstrumental variableを最初にMissing IVまたはshadow variableと呼び、以後はMissing IVに統一します。Missing IVによってfull-data lawを回復した後に、潜在構造を分解することが課題です。</w:t>
       </w:r>
     </w:p>
     <w:p>
@@ -316,7 +313,7 @@
         <w:pStyle w:val="Heading1"/>
       </w:pPr>
       <w:r>
-        <w:t>Slide 3  Related identification results</w:t>
+        <w:t>Slide 3  Usual IV and Missing IV</w:t>
       </w:r>
     </w:p>
     <w:p>
@@ -324,7 +321,7 @@
         <w:keepLines/>
       </w:pPr>
       <w:r>
-        <w:t>関連研究は、大きく二つの流れに分かれます。第一はMNARの識別です。d’Haultfoeuilleは条件付きmoment equationとcompletenessを用いた識別を示し、Zhao and Shaoは共変量を調整したexclusionへ拡張しています。またMiaoらは、completenessを観測可能なcomplete-case law上の条件として定式化しています。</w:t>
+        <w:t>通常のIVとMissing IVは役割が異なります。通常のIVはoutcome equationから除外され、treatmentや内生変数を動かします。これに対してMissing IVのZは、欠測指標Rへの直接効果を持たず、欠測し得るYを予測します。</w:t>
       </w:r>
     </w:p>
     <w:p>
@@ -332,7 +329,7 @@
         <w:keepLines/>
       </w:pPr>
       <w:r>
-        <w:t>第二は潜在構造の識別です。Allman、Matias and Rhodesは、三つの条件付き独立なviewから得られるprobability tensorの分解一意性を用いて、latent class比率とclass-specific measurement kernelsを識別しています。ただし、こちらはMNARによる選択が除去されたjoint distributionから出発します。本研究は、この二つの識別段階を接続します。</w:t>
+        <w:t>本稿の基本条件は、Yと共変量Uを条件づけるとRとZが独立になることです。Zのrelevanceと、このexclusion、さらにcompletenessを組み合わせて、観測確率を一意に回復します。</w:t>
       </w:r>
     </w:p>
     <w:p>
@@ -345,7 +342,7 @@
         <w:pStyle w:val="Heading1"/>
       </w:pPr>
       <w:r>
-        <w:t>Slide 4  The latent mixture and the additional identification problem</w:t>
+        <w:t>Slide 4  A simple multivariate extension</w:t>
       </w:r>
     </w:p>
     <w:p>
@@ -353,7 +350,7 @@
         <w:keepLines/>
       </w:pPr>
       <w:r>
-        <w:t>Fを未観測の潜在変数、Yを欠測前に定義される全測定項目、Xを通常共変量、Wを潜在分布を動かす常時観測のlatent shifterとします。局所独立性の下では、Yの条件付き分布は、各測定核の積をQ Fで積分したmixtureとして表されます。</w:t>
+        <w:t>単純な多変量拡張では、D jを各項目Y jの観測指標とし、全項目が同時に観測されたcomplete-case indicatorをRと置きます。Rが正の確率を持ち、vector Y全体に対するMissing IV条件とcompletenessが成立すれば、full-data lawを識別できます。</w:t>
       </w:r>
     </w:p>
     <w:p>
@@ -361,7 +358,7 @@
         <w:keepLines/>
       </w:pPr>
       <w:r>
-        <w:t>有限潜在クラスの場合、この式はclass比率lambdaと測定行列M jのtensor mixtureになります。missingness IVによって左辺の顕在分布が識別されても、同じ顕在分布を生成する潜在分布と測定核が複数存在し得ます。したがって、潜在構造の識別にはtensor分解の一意性条件が別途必要です。</w:t>
+        <w:t>ただし、この方法は全項目を同時に観測するglobal complete caseを必要とします。項目数が多い場合にはこの確率が極端に小さくなり得るため、本稿では後でsupported blocksへ置き換えます。</w:t>
       </w:r>
     </w:p>
     <w:p>
@@ -374,7 +371,7 @@
         <w:pStyle w:val="Heading1"/>
       </w:pPr>
       <w:r>
-        <w:t>Slide 5  A latent shifter is not a missingness IV</w:t>
+        <w:t>Slide 5  Latent measurement model</w:t>
       </w:r>
     </w:p>
     <w:p>
@@ -382,7 +379,7 @@
         <w:keepLines/>
       </w:pPr>
       <w:r>
-        <w:t>ここで、latent shifter Wとmissingness IV Z Sは区別する必要があります。仮にFまで条件づければDとWが独立であっても、Fを積分すると、Dの条件付き分布にはP of F given Y, W, Xが残ります。WがFを動かすなら、この分布は一般にWへ依存します。</w:t>
+        <w:t>Fを未観測の潜在変数、Y 1からY mをその測定項目、Xを通常共変量、Wを潜在分布を動かすlatent shifterとします。この構造はstructural equation modeling、SEMやitem response theory、IRTの基礎となる測定モデルです。</w:t>
       </w:r>
     </w:p>
     <w:p>
@@ -390,7 +387,7 @@
         <w:keepLines/>
       </w:pPr>
       <w:r>
-        <w:t>したがって、Wは周辺化後のmissingness IVにはなりません。Z Sは各block lawをMNAR selectionから回復する変数であり、Wは回復後のtensorにthird-mode variationを与える変数です。本研究では、この二つを別々の役割として用います。</w:t>
+        <w:t>Q FはFの潜在分布、Q jは項目jの測定核です。局所独立性の下で、観測変数の分布はQ FとQ jの積をFについて周辺化したmixtureになります。したがって左辺のfull-data lawが回復されても、Q FとQ Yを一意に分離できるとは限りません。</w:t>
       </w:r>
     </w:p>
     <w:p>
@@ -403,7 +400,7 @@
         <w:pStyle w:val="Heading1"/>
       </w:pPr>
       <w:r>
-        <w:t>Slide 6  Stage 1</w:t>
+        <w:t>Slide 6  Related identification results</w:t>
       </w:r>
     </w:p>
     <w:p>
@@ -411,28 +408,28 @@
         <w:keepLines/>
       </w:pPr>
       <w:r>
-        <w:t>第一段階では、観測データから各supported-block lawを回復します。必要なのは、blockwise shadow IV、positivity、そしてcomplete-case law上のcompletenessです。この段階では、回復した法則を潜在クラスへ分解しません。</w:t>
+        <w:t>関連研究には二つの流れがあります。MNAR側では、d’Haultfoeuilleが条件付きmoment equationとcompleteness、Zhao and Shaoがcovariate-adjusted exclusionとsemiparametric pseudo-likelihoodを扱っています。Miaoらはcompletenessを観測可能なcomplete-case law上の条件として整理しています。</w:t>
       </w:r>
     </w:p>
     <w:p>
       <w:pPr>
-        <w:spacing w:after="20"/>
-      </w:pPr>
-    </w:p>
-    <w:p>
-      <w:pPr>
-        <w:pStyle w:val="Heading1"/>
+        <w:keepLines/>
       </w:pPr>
       <w:r>
-        <w:t>Slide 7  Observed data and supported blocks</w:t>
+        <w:t>latent structure側では、Allman、Matias and Rhodesが、many observed variablesから構成されるprobability tensorの分解一意性により、latent class比率とmeasurement kernelsを識別しています。本稿は、Missing IVによるlaw recoveryとlatent tensor decompositionを二段階として接続します。</w:t>
       </w:r>
     </w:p>
     <w:p>
       <w:pPr>
-        <w:keepLines/>
+        <w:spacing w:after="20"/>
+      </w:pPr>
+    </w:p>
+    <w:p>
+      <w:pPr>
+        <w:pStyle w:val="Heading1"/>
       </w:pPr>
       <w:r>
-        <w:t>D jを項目Y jの観測指標とし、観測データOは、常時観測されるX、W、Z、Dと、Dによって選択されたYの成分Y Dから構成されます。</w:t>
+        <w:t>Slide 7  A latent shifter is not a Missing IV</w:t>
       </w:r>
     </w:p>
     <w:p>
@@ -440,28 +437,28 @@
         <w:keepLines/>
       </w:pPr>
       <w:r>
-        <w:t>項目集合Sについて、R SをS内の全項目が観測されたことを示すblock indicator、Y Sをblock内の測定値、U SをXとWの組と定義します。R SがゼロならY Sは欠測です。supported blockとは、対象とするsupport上でR Sが1となる条件付き確率pi Sが正であるblockです。必要なのはanchor pairとextension pairsがsupportedであることであり、全項目が同時観測されるglobal complete caseではありません。</w:t>
+        <w:t>latent shifter WとMissing IV Z Sは区別します。仮にFまで条件づければDとWが独立であっても、Fを積分するとDの条件付き分布にはP of F given Y, W, Xが残ります。WがFの分布を動かすなら、この分布は一般にWへ依存します。</w:t>
       </w:r>
     </w:p>
     <w:p>
       <w:pPr>
-        <w:spacing w:after="20"/>
-      </w:pPr>
-    </w:p>
-    <w:p>
-      <w:pPr>
-        <w:pStyle w:val="Heading1"/>
+        <w:keepLines/>
       </w:pPr>
       <w:r>
-        <w:t>Slide 8  Single-block data-generating structure</w:t>
+        <w:t>したがって、Wは周辺化後のMissing IVにはなりません。Z Sはblock lawをMNAR selectionから回復し、Wは回復後のtensorにthird-mode variationを与えます。</w:t>
       </w:r>
     </w:p>
     <w:p>
       <w:pPr>
-        <w:keepLines/>
+        <w:spacing w:after="20"/>
+      </w:pPr>
+    </w:p>
+    <w:p>
+      <w:pPr>
+        <w:pStyle w:val="Heading1"/>
       </w:pPr>
       <w:r>
-        <w:t>図は一つのsupported blockの構造です。U S、つまりXとWはF、Z S、Y Sへ関連します。Z SはFを通じてY Sを予測しますが、Y SとU Sを条件づけた後にはR Sへ直接影響しないと仮定します。このためZ SからR Sへの矢印はありません。</w:t>
+        <w:t>Slide 8  Stage 1</w:t>
       </w:r>
     </w:p>
     <w:p>
@@ -469,7 +466,7 @@
         <w:keepLines/>
       </w:pPr>
       <w:r>
-        <w:t>一方、R Sは未観測となり得るY Sに依存してよく、ここでMNARを許容しています。図の矢印は因果効果を一般に主張するものではなく、本稿で用いる条件付き分布の分解関係を表しています。</w:t>
+        <w:t>第一段階では、Missing IV、positivity、complete-case completenessを用いて、観測データから各supported-block lawを回復します。この段階ではlatent mixtureの分解は行いません。</w:t>
       </w:r>
     </w:p>
     <w:p>
@@ -482,7 +479,7 @@
         <w:pStyle w:val="Heading1"/>
       </w:pPr>
       <w:r>
-        <w:t>Slide 9  Stage-1 assumptions</w:t>
+        <w:t>Slide 9  Observed data and supported blocks</w:t>
       </w:r>
     </w:p>
     <w:p>
@@ -490,7 +487,7 @@
         <w:keepLines/>
       </w:pPr>
       <w:r>
-        <w:t>第一の仮定はblockwise covariate-adjusted missingness IVです。各supported blockについて、Y SとU Sを条件づけると、R SとZ Sが独立であるとします。</w:t>
+        <w:t>D jをY jの観測指標とし、Oを観測変数の集合とします。Oは常時観測されるX、W、Z、Dと、Dによって選択されたYの成分Y Dから構成されます。R Sは集合Sの全項目が観測されたことを示すblock indicatorです。R SがゼロならY Sは欠測であり、観測データには値を持つ変数として現れません。</w:t>
       </w:r>
     </w:p>
     <w:p>
@@ -498,7 +495,7 @@
         <w:keepLines/>
       </w:pPr>
       <w:r>
-        <w:t>第二の仮定はcomplete-case completenessです。R Sが1である標本において、Z SとU Sで条件づけたhの期待値がゼロなら、h自体がほとんど確実にゼロであるとします。これは、観測されたcomplete-case conditional operatorの単射性です。positivityはcomplete-case lawとfull lawの零集合を対応させます。</w:t>
+        <w:t>supported blockとは、対象support上でR Sが1となる条件付き確率pi Sが正のblockです。必要なのはanchor pairとextension pairsがsupportedであることであり、global complete caseではありません。</w:t>
       </w:r>
     </w:p>
     <w:p>
@@ -511,7 +508,7 @@
         <w:pStyle w:val="Heading1"/>
       </w:pPr>
       <w:r>
-        <w:t>Slide 10  Proposition 1</w:t>
+        <w:t>Slide 10  Single-block data-generating structure</w:t>
       </w:r>
     </w:p>
     <w:p>
@@ -519,7 +516,7 @@
         <w:keepLines/>
       </w:pPr>
       <w:r>
-        <w:t>命題1はsupported-block lawの識別です。仮定したexclusion、positivity、complete-case completenessの下で、条件付きmoment equationを満たす正値関数qのうち、pi Sが唯一の解になります。</w:t>
+        <w:t>図は一つのsupported blockの構造です。U SはXとWの組であり、F、Z S、Y Sと関連します。Z SはFを通じてY Sを予測しますが、Y SとU Sを条件づけた後にはR Sへ直接影響しません。そのためZ SからR Sへの直接辺は置きません。</w:t>
       </w:r>
     </w:p>
     <w:p>
@@ -527,7 +524,7 @@
         <w:keepLines/>
       </w:pPr>
       <w:r>
-        <w:t>pi Sが識別されると、R Sをpi Sで割ったinverse probability weightによって、任意のblock関数hのfull-data expectationを再現できます。したがって、P of Y S, Z S, U Sというblock full law全体が識別されます。この段階でparametric selection modelを直接規定する必要はありません。</w:t>
+        <w:t>一方、R Sは欠測し得るY Sに依存してよく、MNARを許容します。ここでのDAGは、本稿が用いる条件付き独立性と分布の関係を整理したものです。</w:t>
       </w:r>
     </w:p>
     <w:p>
@@ -540,7 +537,7 @@
         <w:pStyle w:val="Heading1"/>
       </w:pPr>
       <w:r>
-        <w:t>Slide 11  Proof sketch for Proposition 1</w:t>
+        <w:t>Slide 11  Overlapping supported blocks replace global complete cases</w:t>
       </w:r>
     </w:p>
     <w:p>
@@ -548,7 +545,7 @@
         <w:keepLines/>
       </w:pPr>
       <w:r>
-        <w:t>証明は四段階です。まずexclusionから、Y S、Z S、U Sを条件づけたR Sの期待値はpi Sになります。このため真のpi Sはbridge momentを満たします。</w:t>
+        <w:t>global complete caseの代わりに、重なりを持つsupported pairsを用います。S 0はanchor itemsのY aとY bを含み、各nonanchor item Y jには、Y jと共通anchor Y aからなるextension pairを用意します。</w:t>
       </w:r>
     </w:p>
     <w:p>
@@ -556,7 +553,7 @@
         <w:keepLines/>
       </w:pPr>
       <w:r>
-        <w:t>次に、別の解qがあると仮定すると、complete casesの下でqの逆数とpi Sの逆数の差の条件付き期待値がゼロになります。completenessによって、この差はcomplete-case support上でゼロです。最後にpositivityを用いてfull supportへ拡張し、inverse weighting identityを得ます。</w:t>
+        <w:t>各pairに固有のMissing IV Z Sとbridgeを置き、第一段階でpair lawを回復します。第二段階では共有されたanchorを通じて、block間のmeasurement kernelとclass labelを接続します。</w:t>
       </w:r>
     </w:p>
     <w:p>
@@ -569,7 +566,7 @@
         <w:pStyle w:val="Heading1"/>
       </w:pPr>
       <w:r>
-        <w:t>Slide 12  Overlapping supported blocks</w:t>
+        <w:t>Slide 12  Stage-1 assumptions</w:t>
       </w:r>
     </w:p>
     <w:p>
@@ -577,7 +574,7 @@
         <w:keepLines/>
       </w:pPr>
       <w:r>
-        <w:t>global complete caseの代わりに、重なりを持つsupported pairsを利用します。S 0は二つのanchor items、Y aとY bを含みます。その他の項目Y jについては、Y jと共通anchor Y aからなるextension pairを用意します。</w:t>
+        <w:t>仮定6はblockwise covariate-adjusted Missing IVです。各supported blockについて、Y SとU Sを条件づけるとR SとZ Sが独立であるとします。</w:t>
       </w:r>
     </w:p>
     <w:p>
@@ -585,7 +582,7 @@
         <w:keepLines/>
       </w:pPr>
       <w:r>
-        <w:t>各pairには、それぞれのshadow IV Z Sとbridgeがあります。第一段階でpair lawを個別に回復し、第二段階で共有されたY aを使って測定核のlabelとscaleを接続します。</w:t>
+        <w:t>仮定7はcomplete-case completenessです。R Sが1である標本において、Z SとU Sで条件づけたhの期待値がゼロなら、h自体がほとんど確実にゼロであるとします。これは観測可能なcomplete-case conditional operatorの単射性です。positivityはcomplete-case lawとfull lawの零集合を対応させます。</w:t>
       </w:r>
     </w:p>
     <w:p>
@@ -598,7 +595,7 @@
         <w:pStyle w:val="Heading1"/>
       </w:pPr>
       <w:r>
-        <w:t>Slide 13  Stage 2</w:t>
+        <w:t>Slide 13  New Proposition 1</w:t>
       </w:r>
     </w:p>
     <w:p>
@@ -606,28 +603,28 @@
         <w:keepLines/>
       </w:pPr>
       <w:r>
-        <w:t>第二段階では、第一段階で回復したblock lawsを有限潜在クラスへ分解します。二つのanchor itemsとlatent shifter Wを三つのviewとして用い、Kruskal型の一意性を適用します。</w:t>
+        <w:t>新しい命題1は、本文の命題2.1に対応するsupported-block identificationです。exclusion、positivity、complete-case completenessの下で、observable bridge momentを満たし、逆数がcomplete-case lawの下で二乗可積分となる正値関数のうち、pi Sが唯一の解になります。</w:t>
       </w:r>
     </w:p>
     <w:p>
       <w:pPr>
-        <w:spacing w:after="20"/>
-      </w:pPr>
-    </w:p>
-    <w:p>
-      <w:pPr>
-        <w:pStyle w:val="Heading1"/>
+        <w:keepLines/>
       </w:pPr>
       <w:r>
-        <w:t>Slide 14  Finite latent classes and the anchor tensor</w:t>
+        <w:t>pi Sが識別されると、R S divided by pi Sによるinverse probability weightingで任意のblock関数のfull-data expectationを再現できます。したがって各block lawが、parametric selection modelを指定せずに識別されます。</w:t>
       </w:r>
     </w:p>
     <w:p>
       <w:pPr>
-        <w:keepLines/>
+        <w:spacing w:after="20"/>
+      </w:pPr>
+    </w:p>
+    <w:p>
+      <w:pPr>
+        <w:pStyle w:val="Heading1"/>
       </w:pPr>
       <w:r>
-        <w:t>Xを固定し、Fがr個の有限状態を取るとします。M jはFとXを条件とする項目jの測定確率、p fはXを条件とするclass比率、GはFとXを条件とするWの分布です。</w:t>
+        <w:t>Slide 14  Proof sketch the observable bridge is unique</w:t>
       </w:r>
     </w:p>
     <w:p>
@@ -635,28 +632,28 @@
         <w:keepLines/>
       </w:pPr>
       <w:r>
-        <w:t>回復されたY a、Y b、Wのjoint lawは三方向のtensorになります。局所独立性とmeasurement exclusionの下で、このtensorはp f、M a、M b、Gのrank-one tensorの和として表されます。ここでY a、Y b、Wが三つの条件付き独立なviewになります。</w:t>
+        <w:t>証明では仮定の役割を分けます。観測過程とsupported blockの定義、Missing IV exclusionから真のpi Sがbridge momentを満たします。別の解との差を取ると、complete cases上の条件付き期待値がゼロになります。</w:t>
       </w:r>
     </w:p>
     <w:p>
       <w:pPr>
-        <w:spacing w:after="20"/>
-      </w:pPr>
-    </w:p>
-    <w:p>
-      <w:pPr>
-        <w:pStyle w:val="Heading1"/>
+        <w:keepLines/>
       </w:pPr>
       <w:r>
-        <w:t>Slide 15  Anchor-pair identification conditions</w:t>
+        <w:t>complete-case completenessがその差をゼロにし、positivityが等式を対象support全体へ拡張します。最後にinverse weighting identityからblock lawの識別が従います。</w:t>
       </w:r>
     </w:p>
     <w:p>
       <w:pPr>
-        <w:keepLines/>
+        <w:spacing w:after="20"/>
+      </w:pPr>
+    </w:p>
+    <w:p>
+      <w:pPr>
+        <w:pStyle w:val="Heading1"/>
       </w:pPr>
       <w:r>
-        <w:t>anchor-pair identificationには四種類の条件を置きます。class数rは既知とし、anchor pairと全extension pairsがsupportedであること、class比率とWの各support確率が正であることを仮定します。</w:t>
+        <w:t>Slide 15  Stage 2</w:t>
       </w:r>
     </w:p>
     <w:p>
@@ -664,7 +661,7 @@
         <w:keepLines/>
       </w:pPr>
       <w:r>
-        <w:t>中心となるrank条件は、M a、M b、Gのcolumn Kruskal rankの和が2rプラス2以上という条件です。さらに、既知のanchor scoreのclass別平均に共通の厳密順序を置きます。Kruskal条件がtensor分解を一意にし、anchor orderingがclass labelを固定します。</w:t>
+        <w:t>第二段階では、第一段階で回復したblock lawsを有限潜在クラスへ分解します。anchor itemsとlatent shifterを用いてKruskal型の一意性を得ることが目的です。</w:t>
       </w:r>
     </w:p>
     <w:p>
@@ -677,7 +674,7 @@
         <w:pStyle w:val="Heading1"/>
       </w:pPr>
       <w:r>
-        <w:t>Slide 16  Theorem 1</w:t>
+        <w:t>Slide 16  The remaining decomposition problem</w:t>
       </w:r>
     </w:p>
     <w:p>
@@ -685,7 +682,7 @@
         <w:keepLines/>
       </w:pPr>
       <w:r>
-        <w:t>定理1は二段階を統合した識別結果です。第一段階の仮定とanchor-pair条件の下で、観測データ法則からp、G、Wごとの潜在class分布Q F、そして全項目の測定核Q Yが共通labelの下で識別されます。</w:t>
+        <w:t>第一段階の後には、必要なY S、W、Xのfull pair lawsが識別されています。しかし潜在変数Fは未観測であり、同じpair lawを生成するp f、G、M jが複数存在する可能性があります。</w:t>
       </w:r>
     </w:p>
     <w:p>
@@ -693,7 +690,7 @@
         <w:keepLines/>
       </w:pPr>
       <w:r>
-        <w:t>その結果、一度も全てが同時観測されていない項目集合についても、有限潜在クラスの局所独立モデルを通じてjoint distributionを構成できます。ただし、この結論は有限class測定モデルと局所独立性に依存しています。</w:t>
+        <w:t>ここでp fはclass比率、Gはclass別のWの分布、M jはclass別の測定核です。Lewbelの用語では、同じobserved-data lawを生成する二つの値はobservationally equivalentです。anchor orderingを課さないとclass permutationを除く同値類が識別され、orderingを課すと正規化されたparameter space上でpoint identificationを得ます。</w:t>
       </w:r>
     </w:p>
     <w:p>
@@ -706,7 +703,7 @@
         <w:pStyle w:val="Heading1"/>
       </w:pPr>
       <w:r>
-        <w:t>Slide 17  Proof sketch for Theorem 1</w:t>
+        <w:t>Slide 17  Identification strategy</w:t>
       </w:r>
     </w:p>
     <w:p>
@@ -714,7 +711,7 @@
         <w:keepLines/>
       </w:pPr>
       <w:r>
-        <w:t>まず命題1によりanchor tensorとextension tensorsを回復します。次にAllmanらのKruskal一意性をanchor tensorへ適用し、M a、M b、p、Gをscalingとpermutationを除いて識別します。確率ベクトルとしての列和制約がscalingを固定し、anchor orderingがpermutationを固定します。</w:t>
+        <w:t>識別戦略は四段階です。まずsupported-block lawsを回復し、次にanchor tensorとextension tensorsを構成します。anchor tensorを一意に分解してp、G、M a、M bを得た後、class weightsを回復し、各extension tensorを線形反転して全M jを得ます。</w:t>
       </w:r>
     </w:p>
     <w:p>
@@ -722,7 +719,7 @@
         <w:keepLines/>
       </w:pPr>
       <w:r>
-        <w:t>pとGからBayes則によりWごとのclass比率lambdaを得ます。最後に、GとM aのKhatri–Rao積がfull column rankになるため、各extension tensorを線形反転して全てのM jを回復します。</w:t>
+        <w:t>つまり第二段階は、回復済みblock lawsをanchor decompositionとextension inversionで潜在分布と測定核へ分ける操作です。</w:t>
       </w:r>
     </w:p>
     <w:p>
@@ -735,7 +732,7 @@
         <w:pStyle w:val="Heading1"/>
       </w:pPr>
       <w:r>
-        <w:t>Slide 18  From observed data to latent parameters</w:t>
+        <w:t>Slide 18  Lemma 3.1</w:t>
       </w:r>
     </w:p>
     <w:p>
@@ -743,7 +740,7 @@
         <w:keepLines/>
       </w:pPr>
       <w:r>
-        <w:t>識別の全体像をまとめた図です。出発点はobserved pattern dataです。命題1が各supported blockについて選択確率とfull lawを回復します。その法則を周辺化、条件づけることでanchor tensorとextension tensorsを作ります。</w:t>
+        <w:t>補題3.1はKhatri–Rao積のrank条件です。AとBのcolumn Kruskal rankの和がrプラス1以上なら、B Khatri–Rao Aはfull column rankになります。</w:t>
       </w:r>
     </w:p>
     <w:p>
@@ -751,7 +748,7 @@
         <w:keepLines/>
       </w:pPr>
       <w:r>
-        <w:t>最後に、Wをthird modeとするKruskal分解とextension kernelの線形反転によって、潜在分布Q Fと測定核Q Yを識別します。この順序により、global complete caseを要求しません。</w:t>
+        <w:t>この補題により、anchor tensorのKruskal条件を、各extension itemを線形反転するためのrank条件へ変換できます。</w:t>
       </w:r>
     </w:p>
     <w:p>
@@ -764,7 +761,7 @@
         <w:pStyle w:val="Heading1"/>
       </w:pPr>
       <w:r>
-        <w:t>Slide 19  Bridge-weighted composite estimation</w:t>
+        <w:t>Slide 19  Assumption 3.1</w:t>
       </w:r>
     </w:p>
     <w:p>
@@ -772,7 +769,7 @@
         <w:keepLines/>
       </w:pPr>
       <w:r>
-        <w:t>推定も識別と同じ順序で構成します。まず必要な各pairについてbridge pi Sを推定します。その後、観測されたpairの対数密度への寄与をR S divided by estimated pi Sで重み付けし、全supported pairsについて足し合わせます。</w:t>
+        <w:t>仮定3.1はcovariate-assisted anchor-pair structureです。class数rは既知で、anchor pairと全extension pairsがsupportedであり、class比率p fとWの周辺確率P of W equals w given X equals xは正とします。</w:t>
       </w:r>
     </w:p>
     <w:p>
@@ -780,7 +777,7 @@
         <w:keepLines/>
       </w:pPr>
       <w:r>
-        <w:t>これはfull likelihoodではなく、回復されたoverlapping pair lawsを同時に当てはめるcomposite M-estimatorです。有限次元bridgeが正しく指定され、regularityとseparationが成立すれば、一致性と漸近正規性が得られます。分散にはlatent modelのscoreだけでなく、第一段階のbridge推定誤差も含める必要があります。</w:t>
+        <w:t>さらにM a、M b、Gの三つのcolumn Kruskal rankの和が2rプラス2以上であることを課します。これはAllman、Matias and Rhodesのthree-view Kruskal conditionと同じです。最後に既知のanchor scoreの順序でclass labelを固定します。</w:t>
       </w:r>
     </w:p>
     <w:p>
@@ -793,7 +790,7 @@
         <w:pStyle w:val="Heading1"/>
       </w:pPr>
       <w:r>
-        <w:t>Slide 20  Computation</w:t>
+        <w:t>Slide 20  New Theorem 1</w:t>
       </w:r>
     </w:p>
     <w:p>
@@ -801,7 +798,7 @@
         <w:keepLines/>
       </w:pPr>
       <w:r>
-        <w:t>計算手順も二段階識別に対応させます。各pairのbridgeを推定した後、weighted anchor tensorとextension tensorsを構成します。anchor tensorをnonnegative CP decompositionで初期化し、確率単体制約で正規化してlabelを固定します。</w:t>
+        <w:t>新しい定理1は、本文の定理3.1に対応するanchor-pair identificationです。第一段階の仮定と仮定3.1の下で、観測データ法則からp、G、Wごとの潜在class分布Q F、全項目の測定核Q Yが固定された共通labelの下で識別されます。</w:t>
       </w:r>
     </w:p>
     <w:p>
@@ -809,7 +806,7 @@
         <w:keepLines/>
       </w:pPr>
       <w:r>
-        <w:t>次にextension tensorsを反転して各M jの初期値を得ます。latent mixtureのcriterionは非凸なので、複数初期値から制約付き更新を行い、criterionが最大の解を採用します。併せてrank gap、anchor gap、propensity overlapを確認します。</w:t>
+        <w:t>要するに、pair lawsを回復し、一つのanchor tensorを分解すれば、latent-class distributionと全measurement kernelsが得られます。その結果、同時観測されたことのない項目集合についてもjoint lawを構成できます。</w:t>
       </w:r>
     </w:p>
     <w:p>
@@ -822,7 +819,7 @@
         <w:pStyle w:val="Heading1"/>
       </w:pPr>
       <w:r>
-        <w:t>Slide 21  Simulation design</w:t>
+        <w:t>Slide 21  Proof map for Theorem 1</w:t>
       </w:r>
     </w:p>
     <w:p>
@@ -830,7 +827,7 @@
         <w:keepLines/>
       </w:pPr>
       <w:r>
-        <w:t>simulationは、定理1に直接対応するAllman型の二class product mixtureで行います。標本サイズは500、WとY 1、Y 2、Y 3は二値です。Y 1は常時観測、Y 2とY 3は自身の値に依存して欠測するMNARとし、平均item観測率を80パーセントに設定します。</w:t>
+        <w:t>証明の流れを一枚で示します。observed-data lawから命題1でanchor tensorとextension tensorsを回復し、Allman型の一意性からM a、M b、p、Gを共通labelの下で得ます。</w:t>
       </w:r>
     </w:p>
     <w:p>
@@ -838,7 +835,7 @@
         <w:keepLines/>
       </w:pPr>
       <w:r>
-        <w:t>比較は、complete-data oracle、MAR、正しく指定されたselection likelihood、誤指定されたselection likelihood、提案するsaturated finite-cell bridgeの五手法です。評価対象は、各測定核M jとlatent class比率p fのbiasおよびRMSEです。</w:t>
+        <w:t>次に補題3.1でextension inversionのrankを確保します。pとGにはBayes則を適用してWごとのlatent distributionを得た後、各extension tensorを反転して全M jを回復します。詳細な8ステップはAppendixに置いています。</w:t>
       </w:r>
     </w:p>
     <w:p>
@@ -851,7 +848,7 @@
         <w:pStyle w:val="Heading1"/>
       </w:pPr>
       <w:r>
-        <w:t>Slide 22  Simulation results</w:t>
+        <w:t>Slide 22  Bridge-weighted composite estimation</w:t>
       </w:r>
     </w:p>
     <w:p>
@@ -859,7 +856,7 @@
         <w:keepLines/>
       </w:pPr>
       <w:r>
-        <w:t>測定核M jについて、提案法の平均biasはマイナス0.0064、RMSEは0.0555です。MARのbiasはマイナス0.0496、RMSEは0.0966であり、誤指定selection likelihoodのbiasは0.0409、RMSEは0.0684です。提案法は、この二手法よりbiasの絶対値とRMSEがともに小さくなっています。</w:t>
+        <w:t>推定も識別と同じ順序です。第一段階はd’HaultfoeuilleのSection 3に従い、各blockでconditional moment equationを解いてpair lawをIPWで回復します。第二段階はZhao and Shaoのplug-inの順序に従い、共通のlatent mixtureをoverlapping pair lawsへ当てはめます。</w:t>
       </w:r>
     </w:p>
     <w:p>
@@ -867,7 +864,7 @@
         <w:keepLines/>
       </w:pPr>
       <w:r>
-        <w:t>正しく指定されたselection likelihoodのRMSEは0.0544であり、提案法とほぼ同程度です。一方、oracleの0.0351よりは大きく、bridge推定とpairwise composite criterionに伴う効率性の低下が残ります。</w:t>
+        <w:t>提案量はfull likelihoodではなくbridge-weighted composite M-estimatorです。有限次元bridgeとregularity条件の下では一致性と漸近正規性が得られ、sandwich varianceにはfirst-stage bridgeの推定誤差も含めます。</w:t>
       </w:r>
     </w:p>
     <w:p>
@@ -880,7 +877,7 @@
         <w:pStyle w:val="Heading1"/>
       </w:pPr>
       <w:r>
-        <w:t>Slide 23  Interpretation and limits</w:t>
+        <w:t>Slide 23  Computation</w:t>
       </w:r>
     </w:p>
     <w:p>
@@ -888,7 +885,7 @@
         <w:keepLines/>
       </w:pPr>
       <w:r>
-        <w:t>simulationが示す利点は、特定のparametric selection equationを誤指定した場合のbiasを抑えながら、測定核とclass比率を同時に推定できることです。正しいselection modelを既知として推定できる場合に、それより効率的であると主張するものではありません。</w:t>
+        <w:t>Zhao and Shaoの二段階更新は、nuisance lawと推定対象を分ける先例です。ただし本稿のcriterionは非凸なlatent mixtureを含むため、tensor initialization、複数初期値、制約付き更新を組み合わせます。</w:t>
       </w:r>
     </w:p>
     <w:p>
@@ -896,7 +893,7 @@
         <w:keepLines/>
       </w:pPr>
       <w:r>
-        <w:t>また、頑健性の範囲はselection-link specificationです。shadow-IV exclusion、positivity、complete-case completeness、局所独立性、rank条件、有限latent-class modelの誤指定まで許容するわけではありません。とくにsieve bridgeの漸近推論には、ill-posed inverse problemに対する追加理論が必要です。</w:t>
+        <w:t>具体的にはbridgeを推定してweighted tensorsを作り、anchor tensorを分解してlabelを正規化し、extension kernelsを初期化します。その後、確率単体制約の下で全パラメータを更新し、最大criterionの解を採用します。</w:t>
       </w:r>
     </w:p>
     <w:p>
@@ -909,7 +906,7 @@
         <w:pStyle w:val="Heading1"/>
       </w:pPr>
       <w:r>
-        <w:t>Slide 24  Conclusion</w:t>
+        <w:t>Slide 24  Simulation design</w:t>
       </w:r>
     </w:p>
     <w:p>
@@ -917,7 +914,7 @@
         <w:keepLines/>
       </w:pPr>
       <w:r>
-        <w:t>本研究は、多次元MNARの下で潜在測定モデルを識別する問題を二段階に分けました。第一段階では、shadow IVとcomplete-case completenessにより、parametric selection modelを規定せずにsupported-block lawsを回復します。</w:t>
+        <w:t>simulationはAllman、Matias and RhodesのSections 3から5に従い、本文式35のr-class、p-feature product mixtureから出発します。p fはlatent class比率、G fはclass別のWの分布、M j fはclass別の項目jの測定核です。</w:t>
       </w:r>
     </w:p>
     <w:p>
@@ -925,41 +922,36 @@
         <w:keepLines/>
       </w:pPr>
       <w:r>
-        <w:t>第二段階では、anchor itemsでoverlapping blocksを接続し、latent shifter Wをtensorのthird modeとして用いることで、有限潜在class比率と全測定核を共通labelの下で識別します。推定量もこの順序に沿ったbridge-weighted composite estimatorとして構成できます。</w:t>
+        <w:t>標本サイズは500、Fは2 class、WとY 1、Y 2、Y 3は二値です。Y 1は常時観測とし、Y 2とY 3は自身の値に依存して欠測するMNAR、平均item response rateは80パーセントです。各pairには4カテゴリでfull-rankのMissing IVを置き、100回反復します。</w:t>
       </w:r>
     </w:p>
     <w:p>
       <w:pPr>
-        <w:spacing w:after="20"/>
-      </w:pPr>
-    </w:p>
-    <w:p>
-      <w:pPr>
-        <w:pStyle w:val="Heading1"/>
+        <w:keepLines/>
       </w:pPr>
       <w:r>
-        <w:t>Slide 25  Selected references</w:t>
+        <w:t>比較は五手法です。第一は欠測前のfull product-mixture likelihoodを使うcomplete-data oracle、第二はignorabilityを置くMAR full-information likelihood、第三は真のlogistic selection equationを用いてW、Y obs、Dの周辺尤度を最大化するcorrect selection likelihood、第四はY 1のmain effectとinteractionを除くmisspecified selection likelihoodです。第五の提案法は、各blockでsaturated inverse bridgeを推定し、weighted pairwise latent-class criterionを当てはめます。</w:t>
       </w:r>
     </w:p>
     <w:p>
       <w:pPr>
-        <w:keepLines/>
+        <w:spacing w:after="20"/>
+      </w:pPr>
+    </w:p>
+    <w:p>
+      <w:pPr>
+        <w:pStyle w:val="Heading1"/>
       </w:pPr>
       <w:r>
-        <w:t>主要な識別の依拠関係は、MNAR側のd’Haultfoeuille、Zhao and Shao、Miaoらと、latent decomposition側のAllman、Matias and Rhodesです。Holman and GlasおよびKuhaらは、IRTやlatent response modelにおいてnonignorable item nonresponseを扱う応用上近接した研究です。質疑では、各論文が識別する対象と、本稿の二段階のどこに対応するかを区別して説明します。</w:t>
+        <w:t>Slide 25  Evaluation targets</w:t>
       </w:r>
     </w:p>
     <w:p>
       <w:pPr>
-        <w:spacing w:after="20"/>
-      </w:pPr>
-    </w:p>
-    <w:p>
-      <w:pPr>
-        <w:pStyle w:val="Heading1"/>
+        <w:keepLines/>
       </w:pPr>
       <w:r>
-        <w:t>Appendix Slide 1  Extension-kernel inversion</w:t>
+        <w:t>新しい評価対象の一つ目はmeasurement kernel M jです。二値項目ではM j of 1, fは、latent classがfのときに項目jが1となる確率です。これは項目とlatent classの測定関係を表し、全てのitem-by-class cellsにわたる平均biasと平均RMSEを報告します。</w:t>
       </w:r>
     </w:p>
     <w:p>
@@ -967,7 +959,7 @@
         <w:keepLines/>
       </w:pPr>
       <w:r>
-        <w:t>extension pairのmode-j unfoldingは、M jと、p、G、M aからなる既知行列の積として表されます。anchor Kruskal条件からGとM aのKhatri–Rao積がfull column rankになるため、Moore–Penrose逆行列を用いてM jを一意に回復できます。これを全extension itemsへ繰り返します。</w:t>
+        <w:t>二つ目はlatent class proportion p f、つまり母集団におけるclass fの比率です。本文の結果表に合わせてp 2を評価し、p 1は1 minus p 2で決まります。Biasは系統誤差を、RMSEはbiasとreplication variabilityを合わせた有限標本誤差を表します。</w:t>
       </w:r>
     </w:p>
     <w:p>
@@ -980,7 +972,7 @@
         <w:pStyle w:val="Heading1"/>
       </w:pPr>
       <w:r>
-        <w:t>Appendix Slide 2  Empirical diagnostics</w:t>
+        <w:t>Slide 26  Simulation results</w:t>
       </w:r>
     </w:p>
     <w:p>
@@ -988,7 +980,7 @@
         <w:keepLines/>
       </w:pPr>
       <w:r>
-        <w:t>候補となるIV、latent shifter、anchor itemsの割当てについて、relevance、有限カテゴリcomplete-case operatorのrank、supported-block positivity、third-mode rank、anchor separationはデータから診断できます。冗長なblocksから回復される測定核の一致はoveridentifying restrictionになります。</w:t>
+        <w:t>measurement kernelsについて、提案法はMARと誤指定selection likelihoodよりabsolute biasとRMSEが小さく、測定関係をより正確に回復しています。これは、selection equationを直接指定せず、Missing IVからblock lawsを回復しているためと考えられます。</w:t>
       </w:r>
     </w:p>
     <w:p>
@@ -996,7 +988,170 @@
         <w:keepLines/>
       </w:pPr>
       <w:r>
-        <w:t>ただし、診断に適合することだけでshadow exclusion、measurement exclusion、局所独立性を検証できるわけではありません。不適合は候補設計を反証できますが、適合は全仮定の正しさを保証しません。</w:t>
+        <w:t>latent class proportionsについても提案法のbiasはほぼゼロですが、RMSEが全比較で常に最小になるわけではありません。正しく指定されたparametric selection likelihoodは効率面で競争的であり、提案法の利点は誤指定回避と引き換えの頑健性にあります。</w:t>
+      </w:r>
+    </w:p>
+    <w:p>
+      <w:pPr>
+        <w:spacing w:after="20"/>
+      </w:pPr>
+    </w:p>
+    <w:p>
+      <w:pPr>
+        <w:pStyle w:val="Heading1"/>
+      </w:pPr>
+      <w:r>
+        <w:t>Slide 27  Conclusion and limits</w:t>
+      </w:r>
+    </w:p>
+    <w:p>
+      <w:pPr>
+        <w:keepLines/>
+      </w:pPr>
+      <w:r>
+        <w:t>第一段階ではMissing IVとcomplete-case completenessにより、parametric selection modelを置かずに各supported-block lawを識別します。第二段階ではanchor itemsとWにより、有限latent-class proportionsと全measurement kernelsを共通labelの下で識別します。推定量もこの順序に沿います。</w:t>
+      </w:r>
+    </w:p>
+    <w:p>
+      <w:pPr>
+        <w:keepLines/>
+      </w:pPr>
+      <w:r>
+        <w:t>限界もあります。提案法はselection-link misspecificationには頑健ですが、Missing IV exclusion、completeness、局所独立性、rank条件、既知のclass数、anchor ordering、latent-class modelの誤指定まで許すものではありません。また、class proportionのRMSEは正指定selection likelihoodを上回り得ます。漸近正規性は有限次元bridgeに対する結果であり、sieve inferenceには追加のinverse-problem theoryが必要です。</w:t>
+      </w:r>
+    </w:p>
+    <w:p>
+      <w:pPr>
+        <w:spacing w:after="20"/>
+      </w:pPr>
+    </w:p>
+    <w:p>
+      <w:pPr>
+        <w:pStyle w:val="Heading1"/>
+      </w:pPr>
+      <w:r>
+        <w:t>Slide 28  Selected references</w:t>
+      </w:r>
+    </w:p>
+    <w:p>
+      <w:pPr>
+        <w:keepLines/>
+      </w:pPr>
+      <w:r>
+        <w:t>Stage 1はd’HaultfoeuilleとZhao and Shao、complete-case-law上のcompletenessはMiaoら、Stage 2はAllman、Matias and Rhodesに依拠しています。Lewbelはobservational equivalenceとpoint identificationの用語、Little and Rubinは欠測機構、Heckmanはsample-selection biasの基礎として参照しています。</w:t>
+      </w:r>
+    </w:p>
+    <w:p>
+      <w:pPr>
+        <w:spacing w:after="20"/>
+      </w:pPr>
+    </w:p>
+    <w:p>
+      <w:pPr>
+        <w:pStyle w:val="Heading1"/>
+      </w:pPr>
+      <w:r>
+        <w:t>Appendix Slide 29  Steps 1 and 2</w:t>
+      </w:r>
+    </w:p>
+    <w:p>
+      <w:pPr>
+        <w:keepLines/>
+      </w:pPr>
+      <w:r>
+        <w:t>Step 1では命題1によりanchor pairと全extension pairsのfull lawsを回復します。Step 2ではX equals xを固定し、局所独立性からY a、Y b、WをFとX equals xの下で三つの条件付き独立なviewとするanchor tensorを構成します。</w:t>
+      </w:r>
+    </w:p>
+    <w:p>
+      <w:pPr>
+        <w:spacing w:after="20"/>
+      </w:pPr>
+    </w:p>
+    <w:p>
+      <w:pPr>
+        <w:pStyle w:val="Heading1"/>
+      </w:pPr>
+      <w:r>
+        <w:t>Appendix Slide 30  Steps 3 and 4</w:t>
+      </w:r>
+    </w:p>
+    <w:p>
+      <w:pPr>
+        <w:keepLines/>
+      </w:pPr>
+      <w:r>
+        <w:t>Step 3ではKruskal rank conditionからanchor tensorの分解をcommon permutationとcolumn scalingを除いて一意にします。Step 4では確率ベクトルの列和でscalingを固定し、anchor orderingでclass labelsを固定します。</w:t>
+      </w:r>
+    </w:p>
+    <w:p>
+      <w:pPr>
+        <w:spacing w:after="20"/>
+      </w:pPr>
+    </w:p>
+    <w:p>
+      <w:pPr>
+        <w:pStyle w:val="Heading1"/>
+      </w:pPr>
+      <w:r>
+        <w:t>Appendix Slide 31  Steps 5 and 6</w:t>
+      </w:r>
+    </w:p>
+    <w:p>
+      <w:pPr>
+        <w:keepLines/>
+      </w:pPr>
+      <w:r>
+        <w:t>Step 5では補題3.1によりG Khatri–Rao M aがfull column rankであることを示し、extension inversionを一意にします。Step 6では識別されたpとGへBayes則を適用し、WとXを条件とするlatent class distributionを得ます。</w:t>
+      </w:r>
+    </w:p>
+    <w:p>
+      <w:pPr>
+        <w:spacing w:after="20"/>
+      </w:pPr>
+    </w:p>
+    <w:p>
+      <w:pPr>
+        <w:pStyle w:val="Heading1"/>
+      </w:pPr>
+      <w:r>
+        <w:t>Appendix Slide 32  Steps 7 and 8</w:t>
+      </w:r>
+    </w:p>
+    <w:p>
+      <w:pPr>
+        <w:keepLines/>
+      </w:pPr>
+      <w:r>
+        <w:t>Step 7では各extension tensorを線形反転して全measurement kernels M jを識別します。Step 8では識別されたlatent weightsとmeasurement kernelsを局所独立モデルへ代入し、一度も同時観測されていない項目集合のjoint lawを構成します。</w:t>
+      </w:r>
+    </w:p>
+    <w:p>
+      <w:pPr>
+        <w:spacing w:after="20"/>
+      </w:pPr>
+    </w:p>
+    <w:p>
+      <w:pPr>
+        <w:pStyle w:val="Heading1"/>
+      </w:pPr>
+      <w:r>
+        <w:t>Appendix Slide 33  Empirical diagnostics</w:t>
+      </w:r>
+    </w:p>
+    <w:p>
+      <w:pPr>
+        <w:keepLines/>
+      </w:pPr>
+      <w:r>
+        <w:t>候補となるMissing IV、latent shifter、covariates、anchor itemsの割当てについて、relevance、finite complete-case operatorのrank、supported-block positivity、third-mode rank、anchor separationを診断できます。冗長なblocksから得られるmeasurement kernelsの一致はoveridentifying restrictionになります。</w:t>
+      </w:r>
+    </w:p>
+    <w:p>
+      <w:pPr>
+        <w:keepLines/>
+      </w:pPr>
+      <w:r>
+        <w:t>ただし、診断に適合するだけでMissing IV exclusion、measurement exclusion、局所独立性が検証されたとはいえません。不適合は候補設計を反証できますが、適合は全仮定の正しさを保証しません。</w:t>
       </w:r>
     </w:p>
     <w:sectPr>
@@ -1036,7 +1191,7 @@
     </w:pPr>
     <w:r>
       <w:rPr>
-        <w:rFonts w:ascii="Arial Unicode MS" w:hAnsi="Arial Unicode MS" w:eastAsia="Arial Unicode MS"/>
+        <w:rFonts w:ascii="Arial" w:hAnsi="Arial" w:eastAsia="BIZ UDPGothic"/>
         <w:color w:val="000000"/>
         <w:sz w:val="17"/>
       </w:rPr>
@@ -1413,7 +1568,7 @@
       <w:spacing w:after="120" w:line="276" w:lineRule="auto"/>
     </w:pPr>
     <w:rPr>
-      <w:rFonts w:ascii="Arial Unicode MS" w:hAnsi="Arial Unicode MS" w:eastAsia="Arial Unicode MS"/>
+      <w:rFonts w:ascii="Arial" w:hAnsi="Arial" w:eastAsia="BIZ UDPGothic"/>
       <w:color w:val="000000"/>
       <w:sz w:val="22"/>
     </w:rPr>
@@ -1477,7 +1632,7 @@
       <w:outlineLvl w:val="0"/>
     </w:pPr>
     <w:rPr>
-      <w:rFonts w:asciiTheme="majorHAnsi" w:eastAsiaTheme="majorEastAsia" w:hAnsiTheme="majorHAnsi" w:cstheme="majorBidi" w:ascii="Arial Unicode MS" w:hAnsi="Arial Unicode MS" w:eastAsia="Arial Unicode MS"/>
+      <w:rFonts w:asciiTheme="majorHAnsi" w:eastAsiaTheme="majorEastAsia" w:hAnsiTheme="majorHAnsi" w:cstheme="majorBidi" w:ascii="Arial" w:hAnsi="Arial" w:eastAsia="BIZ UDPGothic"/>
       <w:b/>
       <w:bCs/>
       <w:color w:val="000000"/>
@@ -1501,7 +1656,7 @@
       <w:outlineLvl w:val="1"/>
     </w:pPr>
     <w:rPr>
-      <w:rFonts w:asciiTheme="majorHAnsi" w:eastAsiaTheme="majorEastAsia" w:hAnsiTheme="majorHAnsi" w:cstheme="majorBidi" w:ascii="Arial Unicode MS" w:hAnsi="Arial Unicode MS" w:eastAsia="Arial Unicode MS"/>
+      <w:rFonts w:asciiTheme="majorHAnsi" w:eastAsiaTheme="majorEastAsia" w:hAnsiTheme="majorHAnsi" w:cstheme="majorBidi" w:ascii="Arial" w:hAnsi="Arial" w:eastAsia="BIZ UDPGothic"/>
       <w:b/>
       <w:bCs/>
       <w:color w:val="000000"/>
@@ -1766,7 +1921,7 @@
       <w:contextualSpacing/>
     </w:pPr>
     <w:rPr>
-      <w:rFonts w:asciiTheme="majorHAnsi" w:eastAsiaTheme="majorEastAsia" w:hAnsiTheme="majorHAnsi" w:cstheme="majorBidi" w:ascii="Arial Unicode MS" w:hAnsi="Arial Unicode MS" w:eastAsia="Arial Unicode MS"/>
+      <w:rFonts w:asciiTheme="majorHAnsi" w:eastAsiaTheme="majorEastAsia" w:hAnsiTheme="majorHAnsi" w:cstheme="majorBidi" w:ascii="Arial" w:hAnsi="Arial" w:eastAsia="BIZ UDPGothic"/>
       <w:b/>
       <w:color w:val="000000"/>
       <w:spacing w:val="5"/>
@@ -13107,7 +13262,7 @@
       <w:spacing w:after="60"/>
     </w:pPr>
     <w:rPr>
-      <w:rFonts w:ascii="Arial Unicode MS" w:hAnsi="Arial Unicode MS" w:eastAsia="Arial Unicode MS"/>
+      <w:rFonts w:ascii="Arial" w:hAnsi="Arial" w:eastAsia="BIZ UDPGothic"/>
       <w:color w:val="505050"/>
       <w:sz w:val="18"/>
     </w:rPr>

</xml_diff>

<commit_message>
Clarify novelty and identification scope in slides
</commit_message>
<xml_diff>
--- a/manuscript/vector_missing_iv_presentation_script_ja.docx
+++ b/manuscript/vector_missing_iv_presentation_script_ja.docx
@@ -392,6 +392,14 @@
     </w:p>
     <w:p>
       <w:pPr>
+        <w:keepLines/>
+      </w:pPr>
+      <w:r>
+        <w:t>今回の識別定理が直接扱うのは有限潜在クラスです。連続因子のSEMやIRTへ拡張するには、測定族やcalibrationなどの追加条件が必要です。</w:t>
+      </w:r>
+    </w:p>
+    <w:p>
+      <w:pPr>
         <w:spacing w:after="20"/>
       </w:pPr>
     </w:p>
@@ -416,7 +424,15 @@
         <w:keepLines/>
       </w:pPr>
       <w:r>
-        <w:t>latent structure側では、Allman、Matias and Rhodesが、many observed variablesから構成されるprobability tensorの分解一意性により、latent class比率とmeasurement kernelsを識別しています。本稿は、Missing IVによるlaw recoveryとlatent tensor decompositionを二段階として接続します。</w:t>
+        <w:t>latent structure側では、Allman、Matias and Rhodesが、many observed variablesから構成されるprobability tensorの分解一意性により、latent class比率とmeasurement kernelsを識別しています。latent-MNARのjoint model自体も既に存在します。</w:t>
+      </w:r>
+    </w:p>
+    <w:p>
+      <w:pPr>
+        <w:keepLines/>
+      </w:pPr>
+      <w:r>
+        <w:t>本稿の新規性はlatent-MNAR自体ではありません。parametric selection modelを置かないsupported-block lawの回復と、共通label下でのlatent decompositionを接続し、一つの識別定理として示す点です。</w:t>
       </w:r>
     </w:p>
     <w:p>
@@ -603,7 +619,7 @@
         <w:keepLines/>
       </w:pPr>
       <w:r>
-        <w:t>新しい命題1は、本文の命題2.1に対応するsupported-block identificationです。exclusion、positivity、complete-case completenessの下で、observable bridge momentを満たし、逆数がcomplete-case lawの下で二乗可積分となる正値関数のうち、pi Sが唯一の解になります。</w:t>
+        <w:t>新しい命題1は、本文の命題2.1に対応するsupported-block identificationです。真のpi Sの逆数がcomplete-case lawの下で二乗可積分であると仮定します。その上で、observable bridge momentを満たし、逆数が同じL2空間に属する正値関数のうち、pi Sが唯一の解になります。存在は真のpropensityから与えられ、命題の中心はこのbridge class内の一意性です。</w:t>
       </w:r>
     </w:p>
     <w:p>
@@ -632,7 +648,7 @@
         <w:keepLines/>
       </w:pPr>
       <w:r>
-        <w:t>証明では仮定の役割を分けます。観測過程とsupported blockの定義、Missing IV exclusionから真のpi Sがbridge momentを満たします。別の解との差を取ると、complete cases上の条件付き期待値がゼロになります。</w:t>
+        <w:t>証明では仮定の役割を分けます。観測過程、supported blockの定義、Missing IV exclusionから、真のpi Sがbridge momentを満たすことを示します。別の解との差を取ると、complete cases上の条件付き期待値がゼロになります。</w:t>
       </w:r>
     </w:p>
     <w:p>
@@ -769,7 +785,7 @@
         <w:keepLines/>
       </w:pPr>
       <w:r>
-        <w:t>仮定3.1はcovariate-assisted anchor-pair structureです。class数rは既知で、anchor pairと全extension pairsがsupportedであり、class比率p fとWの周辺確率P of W equals w given X equals xは正とします。</w:t>
+        <w:t>仮定3.1はcovariate-assisted anchor-pair structureです。class数rは既知です。anchor decompositionには、anchor pairのsupportedness、正のclass比率とWの周辺確率、M a、M b、GのKruskal rank条件を用います。これはAllman、Matias and Rhodesのthree-view conditionと同じです。</w:t>
       </w:r>
     </w:p>
     <w:p>
@@ -777,7 +793,7 @@
         <w:keepLines/>
       </w:pPr>
       <w:r>
-        <w:t>さらにM a、M b、Gの三つのcolumn Kruskal rankの和が2rプラス2以上であることを課します。これはAllman、Matias and Rhodesのthree-view Kruskal conditionと同じです。最後に既知のanchor scoreの順序でclass labelを固定します。</w:t>
+        <w:t>既知のanchor scoreの厳密順序で共通labelを固定します。extension propagationでは全extension pairsがsupportedであることと、補題3.1からG Khatri–Rao M aがfull column rankになることを用います。</w:t>
       </w:r>
     </w:p>
     <w:p>
@@ -864,7 +880,7 @@
         <w:keepLines/>
       </w:pPr>
       <w:r>
-        <w:t>提案量はfull likelihoodではなくbridge-weighted composite M-estimatorです。有限次元bridgeとregularity条件の下では一致性と漸近正規性が得られ、sandwich varianceにはfirst-stage bridgeの推定誤差も含めます。</w:t>
+        <w:t>提案量はfull likelihoodではなくbridge-weighted composite M-estimatorです。一致性と漸近正規性の定理は有限次元bridgeを対象とし、sandwich varianceにはfirst-stage bridgeの推定誤差も含めます。dimensionが増えるsieve bridgeには別途inverse-problem theoryが必要です。</w:t>
       </w:r>
     </w:p>
     <w:p>
@@ -885,7 +901,7 @@
         <w:keepLines/>
       </w:pPr>
       <w:r>
-        <w:t>Zhao and Shaoの二段階更新は、nuisance lawと推定対象を分ける先例です。ただし本稿のcriterionは非凸なlatent mixtureを含むため、tensor initialization、複数初期値、制約付き更新を組み合わせます。</w:t>
+        <w:t>Zhao and ShaoのSection 2.3は、nuisance lawを先に推定してtarget modelへplug-inする順序の先例です。本稿の更新アルゴリズムそのものの先例ではありません。本稿のcriterionは非凸なlatent mixtureを含むため、tensor initialization、複数初期値、制約付き更新を組み合わせます。</w:t>
       </w:r>
     </w:p>
     <w:p>
@@ -914,7 +930,7 @@
         <w:keepLines/>
       </w:pPr>
       <w:r>
-        <w:t>simulationはAllman、Matias and RhodesのSections 3から5に従い、本文式35のr-class、p-feature product mixtureから出発します。p fはlatent class比率、G fはclass別のWの分布、M j fはclass別の項目jの測定核です。</w:t>
+        <w:t>simulationはAllman、Matias and RhodesのSections 3から5に従い、本文式35のr-class、p-feature product mixtureから出発します。Allmanらに従うのはmodel classであり、数値parameterは本研究固有です。p fはlatent class比率、G fはclass別のWの分布、M j fはclass別の項目jの測定核です。</w:t>
       </w:r>
     </w:p>
     <w:p>
@@ -930,7 +946,7 @@
         <w:keepLines/>
       </w:pPr>
       <w:r>
-        <w:t>比較は五手法です。第一は欠測前のfull product-mixture likelihoodを使うcomplete-data oracle、第二はignorabilityを置くMAR full-information likelihood、第三は真のlogistic selection equationを用いてW、Y obs、Dの周辺尤度を最大化するcorrect selection likelihood、第四はY 1のmain effectとinteractionを除くmisspecified selection likelihoodです。第五の提案法は、各blockでsaturated inverse bridgeを推定し、weighted pairwise latent-class criterionを当てはめます。</w:t>
+        <w:t>比較は五手法です。第一は欠測前のfull product-mixture likelihoodを使うcomplete-data oracle、第二はignorabilityを置くMAR full-information likelihood、第三は真のlogistic selection equationを用いてW、Y obs、Dの周辺尤度を最大化するcorrect selection likelihood、第四はY 1のmain effectとinteractionを除くmisspecified selection likelihoodです。第五の提案法は、各blockで固定4-cellのfinite-cell saturated inverse bridgeを推定し、weighted pairwise latent-class criterionを当てはめます。</w:t>
       </w:r>
     </w:p>
     <w:p>
@@ -1017,7 +1033,7 @@
         <w:keepLines/>
       </w:pPr>
       <w:r>
-        <w:t>限界もあります。提案法はselection-link misspecificationには頑健ですが、Missing IV exclusion、completeness、局所独立性、rank条件、既知のclass数、anchor ordering、latent-class modelの誤指定まで許すものではありません。また、class proportionのRMSEは正指定selection likelihoodを上回り得ます。漸近正規性は有限次元bridgeに対する結果であり、sieve inferenceには追加のinverse-problem theoryが必要です。</w:t>
+        <w:t>限界もあります。識別には、既知のclass数r、anchor ordering、supported pairs、Missing IV exclusion、completeness、局所独立性、rank条件、有限latent-class modelが必要です。提案法はselection-link misspecificationには頑健ですが、これらの仮定やlatent-class modelの誤指定まで許すものではありません。また、class proportionのRMSEは正指定selection likelihoodを上回り得ます。漸近正規性は有限次元bridgeに対する結果であり、sieve inferenceには追加のinverse-problem theoryが必要です。</w:t>
       </w:r>
     </w:p>
     <w:p>
@@ -1135,7 +1151,7 @@
         <w:pStyle w:val="Heading1"/>
       </w:pPr>
       <w:r>
-        <w:t>Appendix Slide 33  Empirical diagnostics</w:t>
+        <w:t>Appendix Slide 33  Empirical diagnostics and falsification checks</w:t>
       </w:r>
     </w:p>
     <w:p>

</xml_diff>

<commit_message>
Reorganize slides around two-stage identification
</commit_message>
<xml_diff>
--- a/manuscript/vector_missing_iv_presentation_script_ja.docx
+++ b/manuscript/vector_missing_iv_presentation_script_ja.docx
@@ -23,7 +23,7 @@
     </w:p>
     <w:p>
       <w:r>
-        <w:t>本原稿は、英語Beamer全33枚に対応する日本語の口頭説明用原稿である。本文の識別対象、仮定、定理、推定法、simulation設定と整合させ、証明は本編では論理の流れ、Appendixでは8ステップを説明する。</w:t>
+        <w:t>本原稿は、英語Beamer全36枚に対応する日本語の口頭説明用原稿である。本文の識別対象、仮定、定理、推定法、simulation設定と整合させ、証明は本編では論理の流れ、Appendixでは8ステップを説明する。</w:t>
       </w:r>
     </w:p>
     <w:p>
@@ -111,7 +111,7 @@
                 <w:color w:val="000000"/>
                 <w:sz w:val="21"/>
               </w:rPr>
-              <w:t>基礎概念、問題設定、既存研究、latent shifterの役割</w:t>
+              <w:t>基礎概念、既存研究、二段階の識別戦略</w:t>
             </w:r>
           </w:p>
         </w:tc>
@@ -128,7 +128,7 @@
                 <w:color w:val="000000"/>
                 <w:sz w:val="21"/>
               </w:rPr>
-              <w:t>Slides 8–14</w:t>
+              <w:t>Slides 8–15</w:t>
             </w:r>
           </w:p>
         </w:tc>
@@ -143,7 +143,7 @@
                 <w:color w:val="000000"/>
                 <w:sz w:val="21"/>
               </w:rPr>
-              <w:t>Stage 1  supported-block lawの回復</w:t>
+              <w:t>モデルとsupported-block lawの回復</w:t>
             </w:r>
           </w:p>
         </w:tc>
@@ -160,7 +160,7 @@
                 <w:color w:val="000000"/>
                 <w:sz w:val="21"/>
               </w:rPr>
-              <w:t>Slides 15–21</w:t>
+              <w:t>Slides 16–22</w:t>
             </w:r>
           </w:p>
         </w:tc>
@@ -175,7 +175,7 @@
                 <w:color w:val="000000"/>
                 <w:sz w:val="21"/>
               </w:rPr>
-              <w:t>Stage 2  有限潜在クラスのtensor分解</w:t>
+              <w:t>有限潜在クラスのtensor分解</w:t>
             </w:r>
           </w:p>
         </w:tc>
@@ -192,7 +192,7 @@
                 <w:color w:val="000000"/>
                 <w:sz w:val="21"/>
               </w:rPr>
-              <w:t>Slides 22–28</w:t>
+              <w:t>Slides 23–31</w:t>
             </w:r>
           </w:p>
         </w:tc>
@@ -224,7 +224,7 @@
                 <w:color w:val="000000"/>
                 <w:sz w:val="21"/>
               </w:rPr>
-              <w:t>Appendix 29–33</w:t>
+              <w:t>Appendix 32–36</w:t>
             </w:r>
           </w:p>
         </w:tc>
@@ -342,7 +342,160 @@
         <w:pStyle w:val="Heading1"/>
       </w:pPr>
       <w:r>
-        <w:t>Slide 4  A simple multivariate extension</w:t>
+        <w:t>Slide 4  Latent measurement model</w:t>
+      </w:r>
+    </w:p>
+    <w:p>
+      <w:pPr>
+        <w:keepLines/>
+      </w:pPr>
+      <w:r>
+        <w:t>Fを未観測の潜在変数、Y 1からY mをその測定項目、Xを通常共変量、Wを潜在分布を動かすlatent shifterとします。この構造はstructural equation modeling、SEMやitem response theory、IRTの基礎となる測定モデルです。</w:t>
+      </w:r>
+    </w:p>
+    <w:p>
+      <w:pPr>
+        <w:keepLines/>
+      </w:pPr>
+      <w:r>
+        <w:t>Q FはFの潜在分布、Q jは項目jの測定核です。局所独立性の下で、観測変数の分布はQ FとQ jの積をFについて周辺化したmixtureになります。完全データで三つのviewが十分なrankを持つ場合、Allman、Matias and Rhodesの結果により、有限class比率と測定核はlabelを除いて識別されます。</w:t>
+      </w:r>
+    </w:p>
+    <w:p>
+      <w:pPr>
+        <w:keepLines/>
+      </w:pPr>
+      <w:r>
+        <w:t>今回の識別定理が直接扱うのは有限潜在クラスです。連続因子のSEMやIRTへ拡張するには、測定族やcalibrationなどの追加条件が必要です。</w:t>
+      </w:r>
+    </w:p>
+    <w:p>
+      <w:pPr>
+        <w:spacing w:after="20"/>
+      </w:pPr>
+    </w:p>
+    <w:p>
+      <w:pPr>
+        <w:pStyle w:val="Heading1"/>
+      </w:pPr>
+      <w:r>
+        <w:t>Slide 5  Related identification results</w:t>
+      </w:r>
+    </w:p>
+    <w:p>
+      <w:pPr>
+        <w:keepLines/>
+      </w:pPr>
+      <w:r>
+        <w:t>関連研究を三つに整理します。scalar Missing IVではd’Haultfoeuille、Zhao and Shao、Miaoらがcompletenessとconditional moment identificationを扱います。multivariate MNARではTangら、Sadinle and Reiter、Liら、Ni and Shaoがpattern restrictionやitemwise nonresponse modelを扱います。</w:t>
+      </w:r>
+    </w:p>
+    <w:p>
+      <w:pPr>
+        <w:keepLines/>
+      </w:pPr>
+      <w:r>
+        <w:t>latent structure側ではAllman、Matias and Rhodesのtensor uniquenessに加え、Muthénら、Holman and Glas、Lee and Tang、Harel and Schafer、Jungら、Kano and Takai、Kuhaらがlatent variableとnonignorable missingnessを同時に扱い、Xieらはdeep latent MNARを検討しています。latent-MNARのjoint model自体は既知です。</w:t>
+      </w:r>
+    </w:p>
+    <w:p>
+      <w:pPr>
+        <w:keepLines/>
+      </w:pPr>
+      <w:r>
+        <w:t>本稿の新規性はlatent-MNAR自体ではありません。parametric selection modelを置かないsupported-block lawの回復と、共通label下でのlatent decompositionを接続し、一つの識別定理として示す点です。</w:t>
+      </w:r>
+    </w:p>
+    <w:p>
+      <w:pPr>
+        <w:spacing w:after="20"/>
+      </w:pPr>
+    </w:p>
+    <w:p>
+      <w:pPr>
+        <w:pStyle w:val="Heading1"/>
+      </w:pPr>
+      <w:r>
+        <w:t>Slide 6  Proposed two-stage identification</w:t>
+      </w:r>
+    </w:p>
+    <w:p>
+      <w:pPr>
+        <w:keepLines/>
+      </w:pPr>
+      <w:r>
+        <w:t>本稿の方法を先に概観します。第一に、Zhao and Shaoの除外制約とd’Haultfoeuilleのconditional moment equationを各supported blockへ適用し、parametric selection modelを置かずにblock lawを回復します。</w:t>
+      </w:r>
+    </w:p>
+    <w:p>
+      <w:pPr>
+        <w:keepLines/>
+      </w:pPr>
+      <w:r>
+        <w:t>第二に、回復したoverlapping block lawsをanchor itemsとlatent shifterで接続し、Allman、Matias and Rhodesのtensor uniquenessとextension inversionを用いて共通label下の潜在分布と測定核へ分解します。本稿の新規性は、この二段階を一つの識別定理として接続する点です。</w:t>
+      </w:r>
+    </w:p>
+    <w:p>
+      <w:pPr>
+        <w:spacing w:after="20"/>
+      </w:pPr>
+    </w:p>
+    <w:p>
+      <w:pPr>
+        <w:pStyle w:val="Heading1"/>
+      </w:pPr>
+      <w:r>
+        <w:t>Slide 7  A latent shifter is not a Missing IV</w:t>
+      </w:r>
+    </w:p>
+    <w:p>
+      <w:pPr>
+        <w:keepLines/>
+      </w:pPr>
+      <w:r>
+        <w:t>latent shifter WとMissing IV Z Sは区別します。仮にFまで条件づければDとWが独立であっても、Fを積分するとDの条件付き分布にはP of F given Y, W, Xが残ります。WがFの分布を動かすなら、この分布は一般にWへ依存します。</w:t>
+      </w:r>
+    </w:p>
+    <w:p>
+      <w:pPr>
+        <w:keepLines/>
+      </w:pPr>
+      <w:r>
+        <w:t>したがって、Wは周辺化後のMissing IVにはなりません。Z Sはblock lawをMNAR selectionから回復し、Wは回復後のtensorにthird-mode variationを与えます。block lawを回復しただけではQ FとQ Yは分離されないため、この二つの役割を接続する必要があります。</w:t>
+      </w:r>
+    </w:p>
+    <w:p>
+      <w:pPr>
+        <w:spacing w:after="20"/>
+      </w:pPr>
+    </w:p>
+    <w:p>
+      <w:pPr>
+        <w:pStyle w:val="Heading1"/>
+      </w:pPr>
+      <w:r>
+        <w:t>Slide 8  Model and assumptions</w:t>
+      </w:r>
+    </w:p>
+    <w:p>
+      <w:pPr>
+        <w:keepLines/>
+      </w:pPr>
+      <w:r>
+        <w:t>第一段階では、Missing IV、positivity、complete-case completenessを用いて、観測データから各supported-block lawを回復します。この段階ではlatent mixtureの分解は行いません。</w:t>
+      </w:r>
+    </w:p>
+    <w:p>
+      <w:pPr>
+        <w:spacing w:after="20"/>
+      </w:pPr>
+    </w:p>
+    <w:p>
+      <w:pPr>
+        <w:pStyle w:val="Heading1"/>
+      </w:pPr>
+      <w:r>
+        <w:t>Slide 9  A simple multivariate extension</w:t>
       </w:r>
     </w:p>
     <w:p>
@@ -371,131 +524,7 @@
         <w:pStyle w:val="Heading1"/>
       </w:pPr>
       <w:r>
-        <w:t>Slide 5  Latent measurement model</w:t>
-      </w:r>
-    </w:p>
-    <w:p>
-      <w:pPr>
-        <w:keepLines/>
-      </w:pPr>
-      <w:r>
-        <w:t>Fを未観測の潜在変数、Y 1からY mをその測定項目、Xを通常共変量、Wを潜在分布を動かすlatent shifterとします。この構造はstructural equation modeling、SEMやitem response theory、IRTの基礎となる測定モデルです。</w:t>
-      </w:r>
-    </w:p>
-    <w:p>
-      <w:pPr>
-        <w:keepLines/>
-      </w:pPr>
-      <w:r>
-        <w:t>Q FはFの潜在分布、Q jは項目jの測定核です。局所独立性の下で、観測変数の分布はQ FとQ jの積をFについて周辺化したmixtureになります。したがって左辺のfull-data lawが回復されても、Q FとQ Yを一意に分離できるとは限りません。</w:t>
-      </w:r>
-    </w:p>
-    <w:p>
-      <w:pPr>
-        <w:keepLines/>
-      </w:pPr>
-      <w:r>
-        <w:t>今回の識別定理が直接扱うのは有限潜在クラスです。連続因子のSEMやIRTへ拡張するには、測定族やcalibrationなどの追加条件が必要です。</w:t>
-      </w:r>
-    </w:p>
-    <w:p>
-      <w:pPr>
-        <w:spacing w:after="20"/>
-      </w:pPr>
-    </w:p>
-    <w:p>
-      <w:pPr>
-        <w:pStyle w:val="Heading1"/>
-      </w:pPr>
-      <w:r>
-        <w:t>Slide 6  Related identification results</w:t>
-      </w:r>
-    </w:p>
-    <w:p>
-      <w:pPr>
-        <w:keepLines/>
-      </w:pPr>
-      <w:r>
-        <w:t>関連研究には二つの流れがあります。MNAR側では、d’Haultfoeuilleが条件付きmoment equationとcompleteness、Zhao and Shaoがcovariate-adjusted exclusionとsemiparametric pseudo-likelihoodを扱っています。Miaoらはcompletenessを観測可能なcomplete-case law上の条件として整理しています。</w:t>
-      </w:r>
-    </w:p>
-    <w:p>
-      <w:pPr>
-        <w:keepLines/>
-      </w:pPr>
-      <w:r>
-        <w:t>latent structure側では、Allman、Matias and Rhodesが、many observed variablesから構成されるprobability tensorの分解一意性により、latent class比率とmeasurement kernelsを識別しています。latent-MNARのjoint model自体も既に存在します。</w:t>
-      </w:r>
-    </w:p>
-    <w:p>
-      <w:pPr>
-        <w:keepLines/>
-      </w:pPr>
-      <w:r>
-        <w:t>本稿の新規性はlatent-MNAR自体ではありません。parametric selection modelを置かないsupported-block lawの回復と、共通label下でのlatent decompositionを接続し、一つの識別定理として示す点です。</w:t>
-      </w:r>
-    </w:p>
-    <w:p>
-      <w:pPr>
-        <w:spacing w:after="20"/>
-      </w:pPr>
-    </w:p>
-    <w:p>
-      <w:pPr>
-        <w:pStyle w:val="Heading1"/>
-      </w:pPr>
-      <w:r>
-        <w:t>Slide 7  A latent shifter is not a Missing IV</w:t>
-      </w:r>
-    </w:p>
-    <w:p>
-      <w:pPr>
-        <w:keepLines/>
-      </w:pPr>
-      <w:r>
-        <w:t>latent shifter WとMissing IV Z Sは区別します。仮にFまで条件づければDとWが独立であっても、Fを積分するとDの条件付き分布にはP of F given Y, W, Xが残ります。WがFの分布を動かすなら、この分布は一般にWへ依存します。</w:t>
-      </w:r>
-    </w:p>
-    <w:p>
-      <w:pPr>
-        <w:keepLines/>
-      </w:pPr>
-      <w:r>
-        <w:t>したがって、Wは周辺化後のMissing IVにはなりません。Z Sはblock lawをMNAR selectionから回復し、Wは回復後のtensorにthird-mode variationを与えます。</w:t>
-      </w:r>
-    </w:p>
-    <w:p>
-      <w:pPr>
-        <w:spacing w:after="20"/>
-      </w:pPr>
-    </w:p>
-    <w:p>
-      <w:pPr>
-        <w:pStyle w:val="Heading1"/>
-      </w:pPr>
-      <w:r>
-        <w:t>Slide 8  Stage 1</w:t>
-      </w:r>
-    </w:p>
-    <w:p>
-      <w:pPr>
-        <w:keepLines/>
-      </w:pPr>
-      <w:r>
-        <w:t>第一段階では、Missing IV、positivity、complete-case completenessを用いて、観測データから各supported-block lawを回復します。この段階ではlatent mixtureの分解は行いません。</w:t>
-      </w:r>
-    </w:p>
-    <w:p>
-      <w:pPr>
-        <w:spacing w:after="20"/>
-      </w:pPr>
-    </w:p>
-    <w:p>
-      <w:pPr>
-        <w:pStyle w:val="Heading1"/>
-      </w:pPr>
-      <w:r>
-        <w:t>Slide 9  Observed data and supported blocks</w:t>
+        <w:t>Slide 10  Observed data and supported blocks</w:t>
       </w:r>
     </w:p>
     <w:p>
@@ -524,7 +553,7 @@
         <w:pStyle w:val="Heading1"/>
       </w:pPr>
       <w:r>
-        <w:t>Slide 10  Single-block data-generating structure</w:t>
+        <w:t>Slide 11  Single-block data-generating structure</w:t>
       </w:r>
     </w:p>
     <w:p>
@@ -553,7 +582,7 @@
         <w:pStyle w:val="Heading1"/>
       </w:pPr>
       <w:r>
-        <w:t>Slide 11  Overlapping supported blocks replace global complete cases</w:t>
+        <w:t>Slide 12  Overlapping supported blocks replace global complete cases</w:t>
       </w:r>
     </w:p>
     <w:p>
@@ -582,7 +611,7 @@
         <w:pStyle w:val="Heading1"/>
       </w:pPr>
       <w:r>
-        <w:t>Slide 12  Stage-1 assumptions</w:t>
+        <w:t>Slide 13  Stage-1 assumptions</w:t>
       </w:r>
     </w:p>
     <w:p>
@@ -611,7 +640,7 @@
         <w:pStyle w:val="Heading1"/>
       </w:pPr>
       <w:r>
-        <w:t>Slide 13  New Proposition 1</w:t>
+        <w:t>Slide 14  New Proposition 1</w:t>
       </w:r>
     </w:p>
     <w:p>
@@ -640,7 +669,7 @@
         <w:pStyle w:val="Heading1"/>
       </w:pPr>
       <w:r>
-        <w:t>Slide 14  Proof sketch the observable bridge is unique</w:t>
+        <w:t>Slide 15  Proof sketch the observable bridge is unique</w:t>
       </w:r>
     </w:p>
     <w:p>
@@ -669,7 +698,7 @@
         <w:pStyle w:val="Heading1"/>
       </w:pPr>
       <w:r>
-        <w:t>Slide 15  Stage 2</w:t>
+        <w:t>Slide 16  Finite latent-class identification</w:t>
       </w:r>
     </w:p>
     <w:p>
@@ -690,7 +719,7 @@
         <w:pStyle w:val="Heading1"/>
       </w:pPr>
       <w:r>
-        <w:t>Slide 16  The remaining decomposition problem</w:t>
+        <w:t>Slide 17  The remaining decomposition problem</w:t>
       </w:r>
     </w:p>
     <w:p>
@@ -719,7 +748,7 @@
         <w:pStyle w:val="Heading1"/>
       </w:pPr>
       <w:r>
-        <w:t>Slide 17  Identification strategy</w:t>
+        <w:t>Slide 18  Identification strategy</w:t>
       </w:r>
     </w:p>
     <w:p>
@@ -748,7 +777,36 @@
         <w:pStyle w:val="Heading1"/>
       </w:pPr>
       <w:r>
-        <w:t>Slide 18  Lemma 3.1</w:t>
+        <w:t>Slide 19  Assumption 3.1</w:t>
+      </w:r>
+    </w:p>
+    <w:p>
+      <w:pPr>
+        <w:keepLines/>
+      </w:pPr>
+      <w:r>
+        <w:t>仮定3.1はcovariate-assisted anchor-pair structureです。class数rは既知です。anchor decompositionには、anchor pairのsupportedness、正のclass比率とWの周辺確率、M a、M b、GのKruskal rank条件を用います。これはAllman、Matias and Rhodesのthree-view conditionと同じです。</w:t>
+      </w:r>
+    </w:p>
+    <w:p>
+      <w:pPr>
+        <w:keepLines/>
+      </w:pPr>
+      <w:r>
+        <w:t>既知のanchor scoreの厳密順序で共通labelを固定します。extension propagationでは全extension pairsがsupportedであることと、補題3.1からG Khatri–Rao M aがfull column rankになることを用います。</w:t>
+      </w:r>
+    </w:p>
+    <w:p>
+      <w:pPr>
+        <w:spacing w:after="20"/>
+      </w:pPr>
+    </w:p>
+    <w:p>
+      <w:pPr>
+        <w:pStyle w:val="Heading1"/>
+      </w:pPr>
+      <w:r>
+        <w:t>Slide 20  Lemma 3.1</w:t>
       </w:r>
     </w:p>
     <w:p>
@@ -777,36 +835,7 @@
         <w:pStyle w:val="Heading1"/>
       </w:pPr>
       <w:r>
-        <w:t>Slide 19  Assumption 3.1</w:t>
-      </w:r>
-    </w:p>
-    <w:p>
-      <w:pPr>
-        <w:keepLines/>
-      </w:pPr>
-      <w:r>
-        <w:t>仮定3.1はcovariate-assisted anchor-pair structureです。class数rは既知です。anchor decompositionには、anchor pairのsupportedness、正のclass比率とWの周辺確率、M a、M b、GのKruskal rank条件を用います。これはAllman、Matias and Rhodesのthree-view conditionと同じです。</w:t>
-      </w:r>
-    </w:p>
-    <w:p>
-      <w:pPr>
-        <w:keepLines/>
-      </w:pPr>
-      <w:r>
-        <w:t>既知のanchor scoreの厳密順序で共通labelを固定します。extension propagationでは全extension pairsがsupportedであることと、補題3.1からG Khatri–Rao M aがfull column rankになることを用います。</w:t>
-      </w:r>
-    </w:p>
-    <w:p>
-      <w:pPr>
-        <w:spacing w:after="20"/>
-      </w:pPr>
-    </w:p>
-    <w:p>
-      <w:pPr>
-        <w:pStyle w:val="Heading1"/>
-      </w:pPr>
-      <w:r>
-        <w:t>Slide 20  New Theorem 1</w:t>
+        <w:t>Slide 21  New Theorem 1</w:t>
       </w:r>
     </w:p>
     <w:p>
@@ -835,7 +864,7 @@
         <w:pStyle w:val="Heading1"/>
       </w:pPr>
       <w:r>
-        <w:t>Slide 21  Proof map for Theorem 1</w:t>
+        <w:t>Slide 22  Proof map for Theorem 1</w:t>
       </w:r>
     </w:p>
     <w:p>
@@ -864,7 +893,7 @@
         <w:pStyle w:val="Heading1"/>
       </w:pPr>
       <w:r>
-        <w:t>Slide 22  Bridge-weighted composite estimation</w:t>
+        <w:t>Slide 23  Bridge-weighted composite estimation</w:t>
       </w:r>
     </w:p>
     <w:p>
@@ -893,7 +922,7 @@
         <w:pStyle w:val="Heading1"/>
       </w:pPr>
       <w:r>
-        <w:t>Slide 23  Computation</w:t>
+        <w:t>Slide 24  Computation</w:t>
       </w:r>
     </w:p>
     <w:p>
@@ -922,7 +951,7 @@
         <w:pStyle w:val="Heading1"/>
       </w:pPr>
       <w:r>
-        <w:t>Slide 24  Simulation design</w:t>
+        <w:t>Slide 25  Simulation design</w:t>
       </w:r>
     </w:p>
     <w:p>
@@ -959,7 +988,36 @@
         <w:pStyle w:val="Heading1"/>
       </w:pPr>
       <w:r>
-        <w:t>Slide 25  Evaluation targets</w:t>
+        <w:t>Slide 26  Evaluation target: observed-variable law</w:t>
+      </w:r>
+    </w:p>
+    <w:p>
+      <w:pPr>
+        <w:keepLines/>
+      </w:pPr>
+      <w:r>
+        <w:t>第一段階の識別対象は観測変数のfull-data lawです。二値項目についてmu jをP of Y j equals 1、v jをmu j times 1 minus mu jと定義し、周辺確率と分散を評価します。supported pairについてはY 1とY jの4-cell確率を直接比較します。</w:t>
+      </w:r>
+    </w:p>
+    <w:p>
+      <w:pPr>
+        <w:keepLines/>
+      </w:pPr>
+      <w:r>
+        <w:t>population truth、full-data empirical law、respondent-only law、normalized IPWによるStage-1 bridge補正を比較します。さらに各latent-model fitが含意するmu hat j equals sum f p hat f M hat j fを計算し、Stage 2の後にも補正が維持されるか確認します。報告指標はbias、Monte Carlo variance、RMSEです。</w:t>
+      </w:r>
+    </w:p>
+    <w:p>
+      <w:pPr>
+        <w:spacing w:after="20"/>
+      </w:pPr>
+    </w:p>
+    <w:p>
+      <w:pPr>
+        <w:pStyle w:val="Heading1"/>
+      </w:pPr>
+      <w:r>
+        <w:t>Slide 27  Evaluation targets: latent structure</w:t>
       </w:r>
     </w:p>
     <w:p>
@@ -988,7 +1046,36 @@
         <w:pStyle w:val="Heading1"/>
       </w:pPr>
       <w:r>
-        <w:t>Slide 26  Simulation results</w:t>
+        <w:t>Slide 28  Observed-law recovery</w:t>
+      </w:r>
+    </w:p>
+    <w:p>
+      <w:pPr>
+        <w:keepLines/>
+      </w:pPr>
+      <w:r>
+        <w:t>respondent-only analysisではP of Y 2 equals 1とP of Y 3 equals 1のbiasがそれぞれマイナス0.117とマイナス0.121です。高いY jほど観測されにくいため、特にY 1 equals 1、Y j equals 1のcellが過小に表現されています。</w:t>
+      </w:r>
+    </w:p>
+    <w:p>
+      <w:pPr>
+        <w:keepLines/>
+      </w:pPr>
+      <w:r>
+        <w:t>直接bridge補正後のbiasは両項目とも約マイナス0.010となり、absolute biasを約92パーセント縮小しました。RMSEも約0.12から0.04未満へ低下しています。一方、inverse weightingによりMonte Carlo varianceは増加します。latent fit後の周辺分布もStage-1 bridgeとほぼ同じであり、tensor分解が分布補正を損なっていません。</w:t>
+      </w:r>
+    </w:p>
+    <w:p>
+      <w:pPr>
+        <w:spacing w:after="20"/>
+      </w:pPr>
+    </w:p>
+    <w:p>
+      <w:pPr>
+        <w:pStyle w:val="Heading1"/>
+      </w:pPr>
+      <w:r>
+        <w:t>Slide 29  Latent-parameter recovery</w:t>
       </w:r>
     </w:p>
     <w:p>
@@ -1017,7 +1104,7 @@
         <w:pStyle w:val="Heading1"/>
       </w:pPr>
       <w:r>
-        <w:t>Slide 27  Conclusion and limits</w:t>
+        <w:t>Slide 30  Conclusion and limits</w:t>
       </w:r>
     </w:p>
     <w:p>
@@ -1046,7 +1133,7 @@
         <w:pStyle w:val="Heading1"/>
       </w:pPr>
       <w:r>
-        <w:t>Slide 28  Selected references</w:t>
+        <w:t>Slide 31  Selected references</w:t>
       </w:r>
     </w:p>
     <w:p>
@@ -1067,7 +1154,7 @@
         <w:pStyle w:val="Heading1"/>
       </w:pPr>
       <w:r>
-        <w:t>Appendix Slide 29  Steps 1 and 2</w:t>
+        <w:t>Appendix Slide 32  Steps 1 and 2</w:t>
       </w:r>
     </w:p>
     <w:p>
@@ -1088,7 +1175,7 @@
         <w:pStyle w:val="Heading1"/>
       </w:pPr>
       <w:r>
-        <w:t>Appendix Slide 30  Steps 3 and 4</w:t>
+        <w:t>Appendix Slide 33  Steps 3 and 4</w:t>
       </w:r>
     </w:p>
     <w:p>
@@ -1109,7 +1196,7 @@
         <w:pStyle w:val="Heading1"/>
       </w:pPr>
       <w:r>
-        <w:t>Appendix Slide 31  Steps 5 and 6</w:t>
+        <w:t>Appendix Slide 34  Steps 5 and 6</w:t>
       </w:r>
     </w:p>
     <w:p>
@@ -1130,7 +1217,7 @@
         <w:pStyle w:val="Heading1"/>
       </w:pPr>
       <w:r>
-        <w:t>Appendix Slide 32  Steps 7 and 8</w:t>
+        <w:t>Appendix Slide 35  Steps 7 and 8</w:t>
       </w:r>
     </w:p>
     <w:p>
@@ -1151,7 +1238,7 @@
         <w:pStyle w:val="Heading1"/>
       </w:pPr>
       <w:r>
-        <w:t>Appendix Slide 33  Empirical diagnostics and falsification checks</w:t>
+        <w:t>Appendix Slide 36  Empirical diagnostics and falsification checks</w:t>
       </w:r>
     </w:p>
     <w:p>

</xml_diff>

<commit_message>
Align manuscript and presentation with outcome-law checks
</commit_message>
<xml_diff>
--- a/manuscript/vector_missing_iv_presentation_script_ja.docx
+++ b/manuscript/vector_missing_iv_presentation_script_ja.docx
@@ -445,7 +445,28 @@
         <w:pStyle w:val="Heading1"/>
       </w:pPr>
       <w:r>
-        <w:t>Slide 7  A latent shifter is not a Missing IV</w:t>
+        <w:t>Slide 7  Model and assumptions</w:t>
+      </w:r>
+    </w:p>
+    <w:p>
+      <w:pPr>
+        <w:keepLines/>
+      </w:pPr>
+      <w:r>
+        <w:t>第一段階では、Missing IV、positivity、complete-case completenessを用いて、観測データから各supported-block lawを回復します。この段階ではlatent mixtureの分解は行いません。</w:t>
+      </w:r>
+    </w:p>
+    <w:p>
+      <w:pPr>
+        <w:spacing w:after="20"/>
+      </w:pPr>
+    </w:p>
+    <w:p>
+      <w:pPr>
+        <w:pStyle w:val="Heading1"/>
+      </w:pPr>
+      <w:r>
+        <w:t>Slide 8  A latent shifter is not a Missing IV</w:t>
       </w:r>
     </w:p>
     <w:p>
@@ -474,27 +495,6 @@
         <w:pStyle w:val="Heading1"/>
       </w:pPr>
       <w:r>
-        <w:t>Slide 8  Model and assumptions</w:t>
-      </w:r>
-    </w:p>
-    <w:p>
-      <w:pPr>
-        <w:keepLines/>
-      </w:pPr>
-      <w:r>
-        <w:t>第一段階では、Missing IV、positivity、complete-case completenessを用いて、観測データから各supported-block lawを回復します。この段階ではlatent mixtureの分解は行いません。</w:t>
-      </w:r>
-    </w:p>
-    <w:p>
-      <w:pPr>
-        <w:spacing w:after="20"/>
-      </w:pPr>
-    </w:p>
-    <w:p>
-      <w:pPr>
-        <w:pStyle w:val="Heading1"/>
-      </w:pPr>
-      <w:r>
         <w:t>Slide 9  A simple multivariate extension</w:t>
       </w:r>
     </w:p>
@@ -996,7 +996,7 @@
         <w:keepLines/>
       </w:pPr>
       <w:r>
-        <w:t>第一段階の識別対象は観測変数のfull-data lawです。二値項目についてmu jをP of Y j equals 1、v jをmu j times 1 minus mu jと定義し、周辺確率と分散を評価します。supported pairについてはY 1とY jの4-cell確率を直接比較します。</w:t>
+        <w:t>最終的な識別対象には観測変数全体のfull-data lawも含まれます。そこで各latent-model fitのp hat fとM hat j fから、Y 1、Y 2、Y 3の8-cell joint distributionを再構成します。このjoint lawは、各項目の平均とvarianceだけでなく、項目間の依存関係も含みます。</w:t>
       </w:r>
     </w:p>
     <w:p>
@@ -1004,7 +1004,7 @@
         <w:keepLines/>
       </w:pPr>
       <w:r>
-        <w:t>population truth、full-data empirical law、respondent-only law、normalized IPWによるStage-1 bridge補正を比較します。さらに各latent-model fitが含意するmu hat j equals sum f p hat f M hat j fを計算し、Stage 2の後にも補正が維持されるか確認します。報告指標はbias、Monte Carlo variance、RMSEです。</w:t>
+        <w:t>比較対象は五手法です。complete-data oracleは図ではpopulation truthとして示し、MAR、正しく指定したselection likelihood、誤指定selection likelihood、proposed saturated bridgeの平均推定分布を同じ8 cells上で比較します。分布全体の誤差にはtotal variation distanceを用い、補助的にP of Y j equals 1のbias、推定されたoutcome varianceのbias、推定量自体のMonte Carlo varianceを分けて報告します。</w:t>
       </w:r>
     </w:p>
     <w:p>
@@ -1054,7 +1054,7 @@
         <w:keepLines/>
       </w:pPr>
       <w:r>
-        <w:t>respondent-only analysisではP of Y 2 equals 1とP of Y 3 equals 1のbiasがそれぞれマイナス0.117とマイナス0.121です。高いY jほど観測されにくいため、特にY 1 equals 1、Y j equals 1のcellが過小に表現されています。</w:t>
+        <w:t>全体のY分布について、proposed bridgeの平均total variation distanceは0.065です。MARの0.117より約44パーセント、誤指定selection likelihoodの0.101より約35パーセント小さく、8 cells全体をtruthに近く回復しています。MARでは高いY 2、Y 3を含むcellが不足し、誤指定selectionではY 1に関するselection項を落とした影響が反対方向の歪みとして現れます。</w:t>
       </w:r>
     </w:p>
     <w:p>
@@ -1062,7 +1062,7 @@
         <w:keepLines/>
       </w:pPr>
       <w:r>
-        <w:t>直接bridge補正後のbiasは両項目とも約マイナス0.010となり、absolute biasを約92パーセント縮小しました。RMSEも約0.12から0.04未満へ低下しています。一方、inverse weightingによりMonte Carlo varianceは増加します。latent fit後の周辺分布もStage-1 bridgeとほぼ同じであり、tensor分解が分布補正を損なっていません。</w:t>
+        <w:t>周辺確率のbiasも、提案法ではY 2、Y 3とも約マイナス0.010です。outcome varianceのbiasは絶対値0.0021以下でした。一方、inverse bridge weightingのためMonte Carlo varianceはMARより増えます。正指定selection likelihoodのmean total variationは0.070で提案法と同程度ですが、本結果は提案法の一般的な効率優位を意味しません。提案法の利点は、parametric selection linkを指定せずに、block lawの補正をjoint Y distributionとlatent decompositionまで接続できる点です。</w:t>
       </w:r>
     </w:p>
     <w:p>

</xml_diff>

<commit_message>
Report parameter-level outcome recovery
</commit_message>
<xml_diff>
--- a/manuscript/vector_missing_iv_presentation_script_ja.docx
+++ b/manuscript/vector_missing_iv_presentation_script_ja.docx
@@ -23,7 +23,7 @@
     </w:p>
     <w:p>
       <w:r>
-        <w:t>本原稿は、英語Beamer全36枚に対応する日本語の口頭説明用原稿である。本文の識別対象、仮定、定理、推定法、simulation設定と整合させ、証明は本編では論理の流れ、Appendixでは8ステップを説明する。</w:t>
+        <w:t>本原稿は、英語Beamer全38枚に対応する日本語の口頭説明用原稿である。本文の識別対象、仮定、定理、推定法、simulation設定と整合させ、証明は本編では論理の流れ、Appendixでは8ステップを説明する。</w:t>
       </w:r>
     </w:p>
     <w:p>
@@ -192,7 +192,7 @@
                 <w:color w:val="000000"/>
                 <w:sz w:val="21"/>
               </w:rPr>
-              <w:t>Slides 23–31</w:t>
+              <w:t>Slides 23–32</w:t>
             </w:r>
           </w:p>
         </w:tc>
@@ -224,7 +224,7 @@
                 <w:color w:val="000000"/>
                 <w:sz w:val="21"/>
               </w:rPr>
-              <w:t>Appendix 32–36</w:t>
+              <w:t>Appendix 33–38</w:t>
             </w:r>
           </w:p>
         </w:tc>
@@ -239,7 +239,7 @@
                 <w:color w:val="000000"/>
                 <w:sz w:val="21"/>
               </w:rPr>
-              <w:t>定理1の8ステップとempirical diagnostics</w:t>
+              <w:t>定理1の8ステップ、full joint law、empirical diagnostics</w:t>
             </w:r>
           </w:p>
         </w:tc>
@@ -988,7 +988,7 @@
         <w:pStyle w:val="Heading1"/>
       </w:pPr>
       <w:r>
-        <w:t>Slide 26  Evaluation target: observed-variable law</w:t>
+        <w:t>Slide 26  Observed-law inference</w:t>
       </w:r>
     </w:p>
     <w:p>
@@ -996,7 +996,7 @@
         <w:keepLines/>
       </w:pPr>
       <w:r>
-        <w:t>最終的な識別対象には観測変数全体のfull-data lawも含まれます。そこで各latent-model fitのp hat fとM hat j fから、Y 1、Y 2、Y 3の8-cell joint distributionを再構成します。このjoint lawは、各項目の平均とvarianceだけでなく、項目間の依存関係も含みます。</w:t>
+        <w:t>Stage 1の直接の識別対象は、欠測し得る各outcomeの母集団周辺確率mu jと、各supported pairの4-cell確率p S,cです。Y 1は常時観測されるため、欠測outcomeの回復図ではY 2とY 3を示します。提案法では、latent decompositionを行う前に、各blockの推定bridgeによるnormalized inverse probability weightingからこれらを直接推定します。</w:t>
       </w:r>
     </w:p>
     <w:p>
@@ -1004,7 +1004,7 @@
         <w:keepLines/>
       </w:pPr>
       <w:r>
-        <w:t>比較対象は五手法です。complete-data oracleは図ではpopulation truthとして示し、MAR、正しく指定したselection likelihood、誤指定selection likelihood、proposed saturated bridgeの平均推定分布を同じ8 cells上で比較します。分布全体の誤差にはtotal variation distanceを用い、補助的にP of Y j equals 1のbias、推定されたoutcome varianceのbias、推定量自体のMonte Carlo varianceを分けて報告します。</w:t>
+        <w:t>各parameterについてbias、replication間のempirical SD、平均estimated SE、pointwise 95 percent Wald coverageを報告します。likelihoodを用いる4比較法ではrobust sandwichとdelta method、提案bridgeでは個人単位bootstrapを200回行い、各resampleでbridgeを再推定します。4比較法のoutcome lawsは各fitから導くmodel-implied quantitiesであり、直接のStage-1 estimatorと呼ぶのは提案法だけです。</w:t>
       </w:r>
     </w:p>
     <w:p>
@@ -1046,7 +1046,7 @@
         <w:pStyle w:val="Heading1"/>
       </w:pPr>
       <w:r>
-        <w:t>Slide 28  Observed-law recovery</w:t>
+        <w:t>Slide 28  Population outcome recovery</w:t>
       </w:r>
     </w:p>
     <w:p>
@@ -1054,7 +1054,7 @@
         <w:keepLines/>
       </w:pPr>
       <w:r>
-        <w:t>全体のY分布について、proposed bridgeの平均total variation distanceは0.065です。MARの0.117より約44パーセント、誤指定selection likelihoodの0.101より約35パーセント小さく、8 cells全体をtruthに近く回復しています。MARでは高いY 2、Y 3を含むcellが不足し、誤指定selectionではY 1に関するselection項を落とした影響が反対方向の歪みとして現れます。</w:t>
+        <w:t>母集団周辺確率の真値はmu 2 equals 0.475、mu 3 equals 0.4925です。提案Stage-1 bridgeのbiasはそれぞれマイナス0.0099、マイナス0.0096で、empirical SDと平均estimated SEは0.0379対0.0365、0.0345対0.0339でした。95 percent coverageは94 percentと93 percentで、推定SEがreplication variabilityを概ね捉えています。</w:t>
       </w:r>
     </w:p>
     <w:p>
@@ -1062,7 +1062,7 @@
         <w:keepLines/>
       </w:pPr>
       <w:r>
-        <w:t>周辺確率のbiasも、提案法ではY 2、Y 3とも約マイナス0.010です。outcome varianceのbiasは絶対値0.0021以下でした。一方、inverse bridge weightingのためMonte Carlo varianceはMARより増えます。正指定selection likelihoodのmean total variationは0.070で提案法と同程度ですが、本結果は提案法の一般的な効率優位を意味しません。提案法の利点は、parametric selection linkを指定せずに、block lawの補正をjoint Y distributionとlatent decompositionまで接続できる点です。</w:t>
+        <w:t>これに対してMARのcoverageは9 percentと13 percent、誤指定selection likelihoodでは12 percentと11 percentでした。正しく指定したselection likelihoodはbiasがほぼゼロですが、coverageはY 2で86 percentです。本結果は提案法の効率優位を示すものではなく、parametric selection linkを指定せずに、欠測outcomeの周辺分布をStage 1で補正できることを示します。</w:t>
       </w:r>
     </w:p>
     <w:p>
@@ -1075,7 +1075,36 @@
         <w:pStyle w:val="Heading1"/>
       </w:pPr>
       <w:r>
-        <w:t>Slide 29  Latent-parameter recovery</w:t>
+        <w:t>Slide 29  Supported-block law recovery</w:t>
+      </w:r>
+    </w:p>
+    <w:p>
+      <w:pPr>
+        <w:keepLines/>
+      </w:pPr>
+      <w:r>
+        <w:t>次に、supported pairs S 12とS 13の各4 cellsをparameterごとに評価します。提案Stage-1 bridgeのcell biasはマイナス0.0099から0.0067、pointwise coverageは89 percentから95 percentでした。周辺平均だけでなく、各block lawを構成する全セルで欠測選択の補正が確認できます。</w:t>
+      </w:r>
+    </w:p>
+    <w:p>
+      <w:pPr>
+        <w:keepLines/>
+      </w:pPr>
+      <w:r>
+        <w:t>MARでは最大absolute biasが0.068で、coverageは最低10 percentでした。誤指定selection likelihoodでも最大absolute biasは0.048です。100 replicationsでは真のcoverageが95 percentの場合でもMonte Carlo standard errorが約2.2 percentage pointsあるため、個々のcoverage差はこの有限反復誤差を踏まえて解釈します。</w:t>
+      </w:r>
+    </w:p>
+    <w:p>
+      <w:pPr>
+        <w:spacing w:after="20"/>
+      </w:pPr>
+    </w:p>
+    <w:p>
+      <w:pPr>
+        <w:pStyle w:val="Heading1"/>
+      </w:pPr>
+      <w:r>
+        <w:t>Slide 30  Latent-parameter recovery</w:t>
       </w:r>
     </w:p>
     <w:p>
@@ -1104,7 +1133,7 @@
         <w:pStyle w:val="Heading1"/>
       </w:pPr>
       <w:r>
-        <w:t>Slide 30  Conclusion and limits</w:t>
+        <w:t>Slide 31  Conclusion and limits</w:t>
       </w:r>
     </w:p>
     <w:p>
@@ -1133,7 +1162,7 @@
         <w:pStyle w:val="Heading1"/>
       </w:pPr>
       <w:r>
-        <w:t>Slide 31  Selected references</w:t>
+        <w:t>Slide 32  Selected references</w:t>
       </w:r>
     </w:p>
     <w:p>
@@ -1154,7 +1183,7 @@
         <w:pStyle w:val="Heading1"/>
       </w:pPr>
       <w:r>
-        <w:t>Appendix Slide 32  Steps 1 and 2</w:t>
+        <w:t>Appendix Slide 33  Steps 1 and 2</w:t>
       </w:r>
     </w:p>
     <w:p>
@@ -1175,7 +1204,7 @@
         <w:pStyle w:val="Heading1"/>
       </w:pPr>
       <w:r>
-        <w:t>Appendix Slide 33  Steps 3 and 4</w:t>
+        <w:t>Appendix Slide 34  Steps 3 and 4</w:t>
       </w:r>
     </w:p>
     <w:p>
@@ -1196,7 +1225,7 @@
         <w:pStyle w:val="Heading1"/>
       </w:pPr>
       <w:r>
-        <w:t>Appendix Slide 34  Steps 5 and 6</w:t>
+        <w:t>Appendix Slide 35  Steps 5 and 6</w:t>
       </w:r>
     </w:p>
     <w:p>
@@ -1217,7 +1246,7 @@
         <w:pStyle w:val="Heading1"/>
       </w:pPr>
       <w:r>
-        <w:t>Appendix Slide 35  Steps 7 and 8</w:t>
+        <w:t>Appendix Slide 36  Steps 7 and 8</w:t>
       </w:r>
     </w:p>
     <w:p>
@@ -1238,7 +1267,36 @@
         <w:pStyle w:val="Heading1"/>
       </w:pPr>
       <w:r>
-        <w:t>Appendix Slide 36  Empirical diagnostics and falsification checks</w:t>
+        <w:t>Appendix Slide 37  Stage-2 full joint law</w:t>
+      </w:r>
+    </w:p>
+    <w:p>
+      <w:pPr>
+        <w:keepLines/>
+      </w:pPr>
+      <w:r>
+        <w:t>Y 2とY 3は同時に観測される必要がないため、Y 1、Y 2、Y 3の8-cell full joint lawはStage 1だけでは回復できません。これは、Stage 2で推定したclass proportionsと全measurement kernelsを有限mixtureへ代入して初めて構成されます。</w:t>
+      </w:r>
+    </w:p>
+    <w:p>
+      <w:pPr>
+        <w:keepLines/>
+      </w:pPr>
+      <w:r>
+        <w:t>この補助診断では、推定joint lawとtruthのtotal variation distance、すなわち両分布の各cell差の絶対値を合計して2で割った量を用います。提案法のmean TVは0.065、MARは0.117、誤指定selection likelihoodは0.101でした。ただし、これはlatent decompositionを含むStage-2診断であり、直接のStage-1 inference resultとは区別します。</w:t>
+      </w:r>
+    </w:p>
+    <w:p>
+      <w:pPr>
+        <w:spacing w:after="20"/>
+      </w:pPr>
+    </w:p>
+    <w:p>
+      <w:pPr>
+        <w:pStyle w:val="Heading1"/>
+      </w:pPr>
+      <w:r>
+        <w:t>Appendix Slide 38  Empirical diagnostics and falsification checks</w:t>
       </w:r>
     </w:p>
     <w:p>

</xml_diff>

<commit_message>
Clarify simulation DGP and outcome recovery slides
</commit_message>
<xml_diff>
--- a/manuscript/vector_missing_iv_presentation_script_ja.docx
+++ b/manuscript/vector_missing_iv_presentation_script_ja.docx
@@ -192,7 +192,7 @@
                 <w:color w:val="000000"/>
                 <w:sz w:val="21"/>
               </w:rPr>
-              <w:t>Slides 23–32</w:t>
+              <w:t>Slides 23–33</w:t>
             </w:r>
           </w:p>
         </w:tc>
@@ -207,7 +207,7 @@
                 <w:color w:val="000000"/>
                 <w:sz w:val="21"/>
               </w:rPr>
-              <w:t>推定、計算、simulation、結論、参考文献</w:t>
+              <w:t>推定、計算、DGP、simulation、full joint law、結論、参考文献</w:t>
             </w:r>
           </w:p>
         </w:tc>
@@ -224,7 +224,7 @@
                 <w:color w:val="000000"/>
                 <w:sz w:val="21"/>
               </w:rPr>
-              <w:t>Appendix 33–38</w:t>
+              <w:t>Appendix 34–38</w:t>
             </w:r>
           </w:p>
         </w:tc>
@@ -239,7 +239,7 @@
                 <w:color w:val="000000"/>
                 <w:sz w:val="21"/>
               </w:rPr>
-              <w:t>定理1の8ステップ、full joint law、empirical diagnostics</w:t>
+              <w:t>定理1の8ステップ、empirical diagnostics</w:t>
             </w:r>
           </w:p>
         </w:tc>
@@ -951,7 +951,7 @@
         <w:pStyle w:val="Heading1"/>
       </w:pPr>
       <w:r>
-        <w:t>Slide 25  Simulation design</w:t>
+        <w:t>Slide 25  Simulation design: DGP and parameters</w:t>
       </w:r>
     </w:p>
     <w:p>
@@ -959,7 +959,7 @@
         <w:keepLines/>
       </w:pPr>
       <w:r>
-        <w:t>simulationはAllman、Matias and RhodesのSections 3から5に従い、本文式35のr-class、p-feature product mixtureから出発します。Allmanらに従うのはmodel classであり、数値parameterは本研究固有です。p fはlatent class比率、G fはclass別のWの分布、M j fはclass別の項目jの測定核です。</w:t>
+        <w:t>図は先ほどのlatent measurement modelを今回のDGPに合わせたものです。Xを固定し、まず二つのclassを持つFを生成します。FからWと三つの測定項目Y 1、Y 2、Y 3を条件付き独立に生成します。各pair Y 1、Y jから常時観測されるMissing IVのZ Sと観測指標D jを生成します。Y 1は常時観測されるので、pairの観測指標R SはD jに一致します。</w:t>
       </w:r>
     </w:p>
     <w:p>
@@ -967,28 +967,49 @@
         <w:keepLines/>
       </w:pPr>
       <w:r>
-        <w:t>標本サイズは500、Fは2 class、WとY 1、Y 2、Y 3は二値です。Y 1は常時観測とし、Y 2とY 3は自身の値に依存して欠測するMNAR、平均item response rateは80パーセントです。各pairには4カテゴリでfull-rankのMissing IVを置き、100回反復します。</w:t>
+        <w:t>母数の位置も図に対応させます。Fの周辺分布がp f、FからY jへの測定核がM jf、FからWへの核がG fです。Stage 1の評価対象mu jはY jの母集団周辺確率、p S,cはpairのcell probabilityです。これらは潜在classを周辺化した量であり、Stage 2で分離するp fやM jfとは区別します。</w:t>
       </w:r>
     </w:p>
     <w:p>
       <w:pPr>
-        <w:keepLines/>
+        <w:spacing w:after="20"/>
+      </w:pPr>
+    </w:p>
+    <w:p>
+      <w:pPr>
+        <w:pStyle w:val="Heading1"/>
       </w:pPr>
       <w:r>
-        <w:t>比較は五手法です。第一は欠測前のfull product-mixture likelihoodを使うcomplete-data oracle、第二はignorabilityを置くMAR full-information likelihood、第三は真のlogistic selection equationを用いてW、Y obs、Dの周辺尤度を最大化するcorrect selection likelihood、第四はY 1のmain effectとinteractionを除くmisspecified selection likelihoodです。第五の提案法は、各blockで固定4-cellのfinite-cell saturated inverse bridgeを推定し、weighted pairwise latent-class criterionを当てはめます。</w:t>
+        <w:t>Slide 26  Simulation design: calibration and five estimators</w:t>
       </w:r>
     </w:p>
     <w:p>
       <w:pPr>
-        <w:spacing w:after="20"/>
-      </w:pPr>
+        <w:keepLines/>
+      </w:pPr>
+      <w:r>
+        <w:t>Allman、Matias and Rhodesの有限product mixtureを用い、表の数値は本研究で設定しています。class比率は0.55と0.45、測定核は項目とclassごとに表の通りです。標本サイズは500、Monte Carlo反復は100回です。Y 1は常時観測され、Y 2とY 3の観測確率はそれぞれ平均70 percentとなるように切片を調整するため、全三項目の平均観測率は80 percentです。</w:t>
+      </w:r>
     </w:p>
     <w:p>
       <w:pPr>
+        <w:keepLines/>
+      </w:pPr>
+      <w:r>
+        <w:t>五手法を比較します。complete-data oracleは欠測前の尤度、MARはignorabilityの下での観測尤度、正指定selection likelihoodは真のlogistic selection equationを用います。誤指定版ではY 1の主効果とinteractionを除きます。提案法は各blockのMissing IV momentから4-cell inverse bridgeを推定し、Stage 1の法則を得た後、weighted pairwise latent-class criterionを用いて潜在構造を推定します。</w:t>
+      </w:r>
+    </w:p>
+    <w:p>
+      <w:pPr>
+        <w:spacing w:after="20"/>
+      </w:pPr>
+    </w:p>
+    <w:p>
+      <w:pPr>
         <w:pStyle w:val="Heading1"/>
       </w:pPr>
       <w:r>
-        <w:t>Slide 26  Observed-law inference</w:t>
+        <w:t>Slide 27  Observed-law inference</w:t>
       </w:r>
     </w:p>
     <w:p>
@@ -1017,7 +1038,7 @@
         <w:pStyle w:val="Heading1"/>
       </w:pPr>
       <w:r>
-        <w:t>Slide 27  Evaluation targets: latent structure</w:t>
+        <w:t>Slide 28  Evaluation targets: latent structure</w:t>
       </w:r>
     </w:p>
     <w:p>
@@ -1046,7 +1067,15 @@
         <w:pStyle w:val="Heading1"/>
       </w:pPr>
       <w:r>
-        <w:t>Slide 28  Population outcome recovery</w:t>
+        <w:t>Slide 29  Population outcome recovery</w:t>
+      </w:r>
+    </w:p>
+    <w:p>
+      <w:pPr>
+        <w:keepLines/>
+      </w:pPr>
+      <w:r>
+        <w:t>横軸を五手法、青い実線とオレンジの破線をmu 2、mu 3とした折れ線グラフです。上段はbiasとempirical SD、下段はmean estimated SEと95 percent coverageを示します。</w:t>
       </w:r>
     </w:p>
     <w:p>
@@ -1075,7 +1104,7 @@
         <w:pStyle w:val="Heading1"/>
       </w:pPr>
       <w:r>
-        <w:t>Slide 29  Supported-block law recovery</w:t>
+        <w:t>Slide 30  Stage-2 full joint law</w:t>
       </w:r>
     </w:p>
     <w:p>
@@ -1083,7 +1112,7 @@
         <w:keepLines/>
       </w:pPr>
       <w:r>
-        <w:t>次に、supported pairs S 12とS 13の各4 cellsをparameterごとに評価します。提案Stage-1 bridgeのcell biasはマイナス0.0099から0.0067、pointwise coverageは89 percentから95 percentでした。周辺平均だけでなく、各block lawを構成する全セルで欠測選択の補正が確認できます。</w:t>
+        <w:t>続いて、Y 1、Y 2、Y 3のfull joint lawを全体像として示します。横軸は三つのbinary outcomesの8通りの組合せ、縦軸は各cellの確率です。黒い線が母集団の真の分布、そのほかの線は各手法で推定した分布を100反復で平均したものです。</w:t>
       </w:r>
     </w:p>
     <w:p>
@@ -1091,7 +1120,7 @@
         <w:keepLines/>
       </w:pPr>
       <w:r>
-        <w:t>MARでは最大absolute biasが0.068で、coverageは最低10 percentでした。誤指定selection likelihoodでも最大absolute biasは0.048です。100 replicationsでは真のcoverageが95 percentの場合でもMonte Carlo standard errorが約2.2 percentage pointsあるため、個々のcoverage差はこの有限反復誤差を踏まえて解釈します。</w:t>
+        <w:t>青い提案法の線は、Stage 1で回復したoverlapping block lawsをStage 2で共通の潜在構造に接続し、class比率と全measurement kernelsから構成した分布です。周辺確率だけでなく、全項目の組合せとして真の分布をどのように再現しているかを見ます。</w:t>
       </w:r>
     </w:p>
     <w:p>
@@ -1104,7 +1133,7 @@
         <w:pStyle w:val="Heading1"/>
       </w:pPr>
       <w:r>
-        <w:t>Slide 30  Latent-parameter recovery</w:t>
+        <w:t>Slide 31  Latent-parameter recovery</w:t>
       </w:r>
     </w:p>
     <w:p>
@@ -1133,7 +1162,7 @@
         <w:pStyle w:val="Heading1"/>
       </w:pPr>
       <w:r>
-        <w:t>Slide 31  Conclusion and limits</w:t>
+        <w:t>Slide 32  Conclusion and limits</w:t>
       </w:r>
     </w:p>
     <w:p>
@@ -1162,7 +1191,7 @@
         <w:pStyle w:val="Heading1"/>
       </w:pPr>
       <w:r>
-        <w:t>Slide 32  Selected references</w:t>
+        <w:t>Slide 33  Selected references</w:t>
       </w:r>
     </w:p>
     <w:p>
@@ -1183,7 +1212,7 @@
         <w:pStyle w:val="Heading1"/>
       </w:pPr>
       <w:r>
-        <w:t>Appendix Slide 33  Steps 1 and 2</w:t>
+        <w:t>Appendix Slide 34  Proof of Theorem 1 (Steps 1--2)</w:t>
       </w:r>
     </w:p>
     <w:p>
@@ -1204,7 +1233,7 @@
         <w:pStyle w:val="Heading1"/>
       </w:pPr>
       <w:r>
-        <w:t>Appendix Slide 34  Steps 3 and 4</w:t>
+        <w:t>Appendix Slide 35  Proof of Theorem 1 (Steps 3--4)</w:t>
       </w:r>
     </w:p>
     <w:p>
@@ -1225,7 +1254,7 @@
         <w:pStyle w:val="Heading1"/>
       </w:pPr>
       <w:r>
-        <w:t>Appendix Slide 35  Steps 5 and 6</w:t>
+        <w:t>Appendix Slide 36  Proof of Theorem 1 (Steps 5--6)</w:t>
       </w:r>
     </w:p>
     <w:p>
@@ -1246,7 +1275,7 @@
         <w:pStyle w:val="Heading1"/>
       </w:pPr>
       <w:r>
-        <w:t>Appendix Slide 36  Steps 7 and 8</w:t>
+        <w:t>Appendix Slide 37  Proof of Theorem 1 (Steps 7--8)</w:t>
       </w:r>
     </w:p>
     <w:p>
@@ -1255,35 +1284,6 @@
       </w:pPr>
       <w:r>
         <w:t>Step 7では各extension tensorを線形反転して全measurement kernels M jを識別します。Step 8では識別されたlatent weightsとmeasurement kernelsを局所独立モデルへ代入し、一度も同時観測されていない項目集合のjoint lawを構成します。</w:t>
-      </w:r>
-    </w:p>
-    <w:p>
-      <w:pPr>
-        <w:spacing w:after="20"/>
-      </w:pPr>
-    </w:p>
-    <w:p>
-      <w:pPr>
-        <w:pStyle w:val="Heading1"/>
-      </w:pPr>
-      <w:r>
-        <w:t>Appendix Slide 37  Stage-2 full joint law</w:t>
-      </w:r>
-    </w:p>
-    <w:p>
-      <w:pPr>
-        <w:keepLines/>
-      </w:pPr>
-      <w:r>
-        <w:t>Y 2とY 3は同時に観測される必要がないため、Y 1、Y 2、Y 3の8-cell full joint lawはStage 1だけでは回復できません。これは、Stage 2で推定したclass proportionsと全measurement kernelsを有限mixtureへ代入して初めて構成されます。</w:t>
-      </w:r>
-    </w:p>
-    <w:p>
-      <w:pPr>
-        <w:keepLines/>
-      </w:pPr>
-      <w:r>
-        <w:t>この補助診断では、推定joint lawとtruthのtotal variation distance、すなわち両分布の各cell差の絶対値を合計して2で割った量を用います。提案法のmean TVは0.065、MARは0.117、誤指定selection likelihoodは0.101でした。ただし、これはlatent decompositionを含むStage-2診断であり、直接のStage-1 inference resultとは区別します。</w:t>
       </w:r>
     </w:p>
     <w:p>
@@ -2075,9 +2075,6 @@
     <w:qFormat/>
     <w:rsid w:val="00FC693F"/>
     <w:pPr>
-      <w:pBdr>
-        <w:bottom w:val="single" w:sz="8" w:space="4" w:color="4F81BD" w:themeColor="accent1"/>
-      </w:pBdr>
       <w:spacing w:after="240" w:line="240" w:lineRule="auto"/>
       <w:contextualSpacing/>
     </w:pPr>

</xml_diff>

<commit_message>
Restore model DAG and consolidate simulation evaluation slides
</commit_message>
<xml_diff>
--- a/manuscript/vector_missing_iv_presentation_script_ja.docx
+++ b/manuscript/vector_missing_iv_presentation_script_ja.docx
@@ -23,7 +23,7 @@
     </w:p>
     <w:p>
       <w:r>
-        <w:t>本原稿は、英語Beamer全38枚に対応する日本語の口頭説明用原稿である。本文の識別対象、仮定、定理、推定法、simulation設定と整合させ、証明は本編では論理の流れ、Appendixでは8ステップを説明する。</w:t>
+        <w:t>本原稿は、英語Beamer全37枚に対応する日本語の口頭説明用原稿である。識別対象、仮定、定理、推定法と数値結果を説明し、モデルDAGと現行simulationの未解決の不整合も明記する。証明は本編では論理の流れ、Appendixでは8ステップを説明する。</w:t>
       </w:r>
     </w:p>
     <w:p>
@@ -192,7 +192,7 @@
                 <w:color w:val="000000"/>
                 <w:sz w:val="21"/>
               </w:rPr>
-              <w:t>Slides 23–33</w:t>
+              <w:t>Slides 23–31</w:t>
             </w:r>
           </w:p>
         </w:tc>
@@ -207,7 +207,7 @@
                 <w:color w:val="000000"/>
                 <w:sz w:val="21"/>
               </w:rPr>
-              <w:t>推定、計算、DGP、simulation、full joint law、結論、参考文献</w:t>
+              <w:t>推定、計算、評価対象と指標、simulation、full joint law、結論、参考文献</w:t>
             </w:r>
           </w:p>
         </w:tc>
@@ -224,7 +224,7 @@
                 <w:color w:val="000000"/>
                 <w:sz w:val="21"/>
               </w:rPr>
-              <w:t>Appendix 34–38</w:t>
+              <w:t>Appendix 32–37</w:t>
             </w:r>
           </w:p>
         </w:tc>
@@ -239,7 +239,7 @@
                 <w:color w:val="000000"/>
                 <w:sz w:val="21"/>
               </w:rPr>
-              <w:t>定理1の8ステップ、empirical diagnostics</w:t>
+              <w:t>定理1の8ステップ、empirical diagnostics、数値設定</w:t>
             </w:r>
           </w:p>
         </w:tc>
@@ -951,7 +951,7 @@
         <w:pStyle w:val="Heading1"/>
       </w:pPr>
       <w:r>
-        <w:t>Slide 25  Simulation design: DGP and parameters</w:t>
+        <w:t>Slide 25  Simulation targets in the model</w:t>
       </w:r>
     </w:p>
     <w:p>
@@ -959,7 +959,7 @@
         <w:keepLines/>
       </w:pPr>
       <w:r>
-        <w:t>図は先ほどのlatent measurement modelを今回のDGPに合わせたものです。Xを固定し、まず二つのclassを持つFを生成します。FからWと三つの測定項目Y 1、Y 2、Y 3を条件付き独立に生成します。各pair Y 1、Y jから常時観測されるMissing IVのZ Sと観測指標D jを生成します。Y 1は常時観測されるので、pairの観測指標R SはD jに一致します。</w:t>
+        <w:t>ここではp17のモデルDAGを再掲し、評価する母数を書き添えます。Z SからF、共変量U SからF、Z S、Y S、そしてFからY S、Y Sから観測指標R Sへ向かう元の矢印を保っています。Xは固定、Fは2 class、Wと各Yは二値です。Y 1は常時観測されるため、R SはD jに一致します。</w:t>
       </w:r>
     </w:p>
     <w:p>
@@ -967,28 +967,28 @@
         <w:keepLines/>
       </w:pPr>
       <w:r>
-        <w:t>母数の位置も図に対応させます。Fの周辺分布がp f、FからY jへの測定核がM jf、FからWへの核がG fです。Stage 1の評価対象mu jはY jの母集団周辺確率、p S,cはpairのcell probabilityです。これらは潜在classを周辺化した量であり、Stage 2で分離するp fやM jfとは区別します。</w:t>
+        <w:t>Fの周辺class比率がp f、項目とclassの測定関係がM jfです。Stage 1のmu jは母集団周辺確率、p S,cはpairのcell probabilityです。これらと、Stage 2で分離する六つの測定核成分およびp 2を区別します。標本サイズは500、Monte Carlo反復は100回、平均item response rateは80 percentです。</w:t>
       </w:r>
     </w:p>
     <w:p>
       <w:pPr>
-        <w:spacing w:after="20"/>
-      </w:pPr>
-    </w:p>
-    <w:p>
-      <w:pPr>
-        <w:pStyle w:val="Heading1"/>
+        <w:keepLines/>
       </w:pPr>
       <w:r>
-        <w:t>Slide 26  Simulation design: calibration and five estimators</w:t>
+        <w:t>ただし、この図は現行シミュレーションの生成法則そのものではありません。現行コードはY Sを条件にZ Sを生成するため、図が表す、FとWの下でY SとZ Sが独立というmeasurement exclusionを満たしていません。この不整合は未解決であり、現在の数値結果を図の全仮定を満たす検証と解釈することはできません。</w:t>
       </w:r>
     </w:p>
     <w:p>
       <w:pPr>
-        <w:keepLines/>
+        <w:spacing w:after="20"/>
+      </w:pPr>
+    </w:p>
+    <w:p>
+      <w:pPr>
+        <w:pStyle w:val="Heading1"/>
       </w:pPr>
       <w:r>
-        <w:t>Allman、Matias and Rhodesの有限product mixtureを用い、表の数値は本研究で設定しています。class比率は0.55と0.45、測定核は項目とclassごとに表の通りです。標本サイズは500、Monte Carlo反復は100回です。Y 1は常時観測され、Y 2とY 3の観測確率はそれぞれ平均70 percentとなるように切片を調整するため、全三項目の平均観測率は80 percentです。</w:t>
+        <w:t>Slide 26  Simulation design: estimators and evaluation</w:t>
       </w:r>
     </w:p>
     <w:p>
@@ -1001,15 +1001,10 @@
     </w:p>
     <w:p>
       <w:pPr>
-        <w:spacing w:after="20"/>
-      </w:pPr>
-    </w:p>
-    <w:p>
-      <w:pPr>
-        <w:pStyle w:val="Heading1"/>
+        <w:keepLines/>
       </w:pPr>
       <w:r>
-        <w:t>Slide 27  Observed-law inference</w:t>
+        <w:t>outcome parameterごとに四つの指標を報告します。Biasは平均的な推定誤差、empirical SDは反復間のばらつき、平均estimated SEは各標本で得た不確実性の推定値、95 percent coverageは真値を含むpointwise Wald区間の割合です。likelihood法ではdelta-method sandwich SE、提案法では各反復で個人単位bootstrapを200回行い、両bridgeを再推定します。</w:t>
       </w:r>
     </w:p>
     <w:p>
@@ -1017,57 +1012,20 @@
         <w:keepLines/>
       </w:pPr>
       <w:r>
-        <w:t>Stage 1の直接の識別対象は、欠測し得る各outcomeの母集団周辺確率mu jと、各supported pairの4-cell確率p S,cです。Y 1は常時観測されるため、欠測outcomeの回復図ではY 2とY 3を示します。提案法では、latent decompositionを行う前に、各blockの推定bridgeによるnormalized inverse probability weightingからこれらを直接推定します。</w:t>
+        <w:t>潜在母数についてはbiasとRMSEを報告します。測定核のRMSEは、反復と六つのitem-by-class cellsをまとめた二乗誤差の平均の平方根であり、cell別RMSEの単純平均ではありません。p 2は単独で評価します。提案法のoutcome lawはdecomposition前のnormalized IPW推定値であり、他の四手法では推定モデルから導いた法則を比較しています。</w:t>
       </w:r>
     </w:p>
     <w:p>
       <w:pPr>
-        <w:keepLines/>
-      </w:pPr>
-      <w:r>
-        <w:t>各parameterについてbias、replication間のempirical SD、平均estimated SE、pointwise 95 percent Wald coverageを報告します。likelihoodを用いる4比較法ではrobust sandwichとdelta method、提案bridgeでは個人単位bootstrapを200回行い、各resampleでbridgeを再推定します。4比較法のoutcome lawsは各fitから導くmodel-implied quantitiesであり、直接のStage-1 estimatorと呼ぶのは提案法だけです。</w:t>
-      </w:r>
+        <w:spacing w:after="20"/>
+      </w:pPr>
     </w:p>
     <w:p>
       <w:pPr>
-        <w:spacing w:after="20"/>
-      </w:pPr>
-    </w:p>
-    <w:p>
-      <w:pPr>
         <w:pStyle w:val="Heading1"/>
       </w:pPr>
       <w:r>
-        <w:t>Slide 28  Evaluation targets: latent structure</w:t>
-      </w:r>
-    </w:p>
-    <w:p>
-      <w:pPr>
-        <w:keepLines/>
-      </w:pPr>
-      <w:r>
-        <w:t>新しい評価対象の一つ目はmeasurement kernel M jです。二値項目ではM j of 1, fは、latent classがfのときに項目jが1となる確率です。これは項目とlatent classの測定関係を表し、全てのitem-by-class cellsにわたる平均biasと平均RMSEを報告します。</w:t>
-      </w:r>
-    </w:p>
-    <w:p>
-      <w:pPr>
-        <w:keepLines/>
-      </w:pPr>
-      <w:r>
-        <w:t>二つ目はlatent class proportion p f、つまり母集団におけるclass fの比率です。本文の結果表に合わせてp 2を評価し、p 1は1 minus p 2で決まります。Biasは系統誤差を、RMSEはbiasとreplication variabilityを合わせた有限標本誤差を表します。</w:t>
-      </w:r>
-    </w:p>
-    <w:p>
-      <w:pPr>
-        <w:spacing w:after="20"/>
-      </w:pPr>
-    </w:p>
-    <w:p>
-      <w:pPr>
-        <w:pStyle w:val="Heading1"/>
-      </w:pPr>
-      <w:r>
-        <w:t>Slide 29  Population outcome recovery</w:t>
+        <w:t>Slide 27  Population outcome recovery</w:t>
       </w:r>
     </w:p>
     <w:p>
@@ -1104,7 +1062,7 @@
         <w:pStyle w:val="Heading1"/>
       </w:pPr>
       <w:r>
-        <w:t>Slide 30  Stage-2 full joint law</w:t>
+        <w:t>Slide 28  Stage-2 full joint law</w:t>
       </w:r>
     </w:p>
     <w:p>
@@ -1133,7 +1091,7 @@
         <w:pStyle w:val="Heading1"/>
       </w:pPr>
       <w:r>
-        <w:t>Slide 31  Latent-parameter recovery</w:t>
+        <w:t>Slide 29  Latent-parameter recovery</w:t>
       </w:r>
     </w:p>
     <w:p>
@@ -1162,7 +1120,7 @@
         <w:pStyle w:val="Heading1"/>
       </w:pPr>
       <w:r>
-        <w:t>Slide 32  Conclusion and limits</w:t>
+        <w:t>Slide 30  Conclusion and limits</w:t>
       </w:r>
     </w:p>
     <w:p>
@@ -1191,7 +1149,7 @@
         <w:pStyle w:val="Heading1"/>
       </w:pPr>
       <w:r>
-        <w:t>Slide 33  Selected references</w:t>
+        <w:t>Slide 31  Selected references</w:t>
       </w:r>
     </w:p>
     <w:p>
@@ -1212,7 +1170,7 @@
         <w:pStyle w:val="Heading1"/>
       </w:pPr>
       <w:r>
-        <w:t>Appendix Slide 34  Proof of Theorem 1 (Steps 1--2)</w:t>
+        <w:t>Appendix Slide 32  Proof of Theorem 1 (Steps 1--2)</w:t>
       </w:r>
     </w:p>
     <w:p>
@@ -1233,7 +1191,7 @@
         <w:pStyle w:val="Heading1"/>
       </w:pPr>
       <w:r>
-        <w:t>Appendix Slide 35  Proof of Theorem 1 (Steps 3--4)</w:t>
+        <w:t>Appendix Slide 33  Proof of Theorem 1 (Steps 3--4)</w:t>
       </w:r>
     </w:p>
     <w:p>
@@ -1254,7 +1212,7 @@
         <w:pStyle w:val="Heading1"/>
       </w:pPr>
       <w:r>
-        <w:t>Appendix Slide 36  Proof of Theorem 1 (Steps 5--6)</w:t>
+        <w:t>Appendix Slide 34  Proof of Theorem 1 (Steps 5--6)</w:t>
       </w:r>
     </w:p>
     <w:p>
@@ -1275,7 +1233,7 @@
         <w:pStyle w:val="Heading1"/>
       </w:pPr>
       <w:r>
-        <w:t>Appendix Slide 37  Proof of Theorem 1 (Steps 7--8)</w:t>
+        <w:t>Appendix Slide 35  Proof of Theorem 1 (Steps 7--8)</w:t>
       </w:r>
     </w:p>
     <w:p>
@@ -1296,7 +1254,7 @@
         <w:pStyle w:val="Heading1"/>
       </w:pPr>
       <w:r>
-        <w:t>Appendix Slide 38  Empirical diagnostics and falsification checks</w:t>
+        <w:t>Appendix Slide 36  Empirical diagnostics and falsification checks</w:t>
       </w:r>
     </w:p>
     <w:p>
@@ -1313,6 +1271,43 @@
       </w:pPr>
       <w:r>
         <w:t>ただし、診断に適合するだけでMissing IV exclusion、measurement exclusion、局所独立性が検証されたとはいえません。不適合は候補設計を反証できますが、適合は全仮定の正しさを保証しません。</w:t>
+      </w:r>
+    </w:p>
+    <w:p>
+      <w:pPr>
+        <w:spacing w:after="20"/>
+      </w:pPr>
+    </w:p>
+    <w:p>
+      <w:pPr>
+        <w:pStyle w:val="Heading1"/>
+      </w:pPr>
+      <w:r>
+        <w:t>Appendix Slide 37  Simulation calibration</w:t>
+      </w:r>
+    </w:p>
+    <w:p>
+      <w:pPr>
+        <w:keepLines/>
+      </w:pPr>
+      <w:r>
+        <w:t>WとYの周辺モデルにはAllman、Matias and Rhodesの有限product mixtureを用い、数値は本研究で設定しています。class比率は0.55と0.45、G fはFを条件としたWの分布です。class labelsはY 1の測定確率の小さい順に固定します。</w:t>
+      </w:r>
+    </w:p>
+    <w:p>
+      <w:pPr>
+        <w:keepLines/>
+      </w:pPr>
+      <w:r>
+        <w:t>Y 1は常時観測されます。Y 2とY 3の観測確率は自身、Y 1、およびinteractionに依存するlogistic式で、各項目の平均観測率が70 percentとなるよう切片を調整します。全三項目の平均観測率は80 percentです。Z Sはpairの四つのcellに依存するfull-rank行列Hで生成し、常時観測します。</w:t>
+      </w:r>
+    </w:p>
+    <w:p>
+      <w:pPr>
+        <w:keepLines/>
+      </w:pPr>
+      <w:r>
+        <w:t>この生成はMissing IVのselection exclusionを満たしますが、元のモデルDAGが課すmeasurement exclusionは満たしません。二つの有限classだけを通じて四つのpair cellsを予測する元の図では、complete-case operatorのrankは高々2です。そのため、この図と現行の四cell completenessを同時に成立させたDGPではない点を区別する必要があります。</w:t>
       </w:r>
     </w:p>
     <w:sectPr>

</xml_diff>

<commit_message>
Align marginal measurement assumptions and complete slide coverage
</commit_message>
<xml_diff>
--- a/manuscript/vector_missing_iv_presentation_script_ja.docx
+++ b/manuscript/vector_missing_iv_presentation_script_ja.docx
@@ -23,7 +23,7 @@
     </w:p>
     <w:p>
       <w:r>
-        <w:t>本原稿は、英語Beamer全37枚に対応する日本語の口頭説明用原稿である。識別対象、仮定、定理、推定法と数値結果を説明し、モデルDAGと現行simulationの未解決の不整合も明記する。証明は本編では論理の流れ、Appendixでは8ステップを説明する。</w:t>
+        <w:t>本原稿は、英語Beamer全46枚に対応する日本語の口頭説明用原稿である。識別対象、本文の全仮定、定理、推定法と数値結果を説明する。測定モデルはZを周辺化した法則とし、Missing IV exclusionと区別する。証明は本編では論理の流れ、Appendixでは8ステップを説明する。</w:t>
       </w:r>
     </w:p>
     <w:p>
@@ -128,7 +128,7 @@
                 <w:color w:val="000000"/>
                 <w:sz w:val="21"/>
               </w:rPr>
-              <w:t>Slides 8–15</w:t>
+              <w:t>Slides 8–18</w:t>
             </w:r>
           </w:p>
         </w:tc>
@@ -143,7 +143,7 @@
                 <w:color w:val="000000"/>
                 <w:sz w:val="21"/>
               </w:rPr>
-              <w:t>モデルとsupported-block lawの回復</w:t>
+              <w:t>仮定1から7、supported-block lawの回復</w:t>
             </w:r>
           </w:p>
         </w:tc>
@@ -160,7 +160,7 @@
                 <w:color w:val="000000"/>
                 <w:sz w:val="21"/>
               </w:rPr>
-              <w:t>Slides 16–22</w:t>
+              <w:t>Slides 19–26</w:t>
             </w:r>
           </w:p>
         </w:tc>
@@ -175,7 +175,7 @@
                 <w:color w:val="000000"/>
                 <w:sz w:val="21"/>
               </w:rPr>
-              <w:t>有限潜在クラスのtensor分解</w:t>
+              <w:t>仮定3.1、有限潜在クラスのtensor分解</w:t>
             </w:r>
           </w:p>
         </w:tc>
@@ -192,7 +192,7 @@
                 <w:color w:val="000000"/>
                 <w:sz w:val="21"/>
               </w:rPr>
-              <w:t>Slides 23–31</w:t>
+              <w:t>Slides 27–40</w:t>
             </w:r>
           </w:p>
         </w:tc>
@@ -207,7 +207,7 @@
                 <w:color w:val="000000"/>
                 <w:sz w:val="21"/>
               </w:rPr>
-              <w:t>推定、計算、評価対象と指標、simulation、full joint law、結論、参考文献</w:t>
+              <w:t>推定、仮定5.1、漸近理論、計算、simulation、結論、参考文献</w:t>
             </w:r>
           </w:p>
         </w:tc>
@@ -224,7 +224,7 @@
                 <w:color w:val="000000"/>
                 <w:sz w:val="21"/>
               </w:rPr>
-              <w:t>Appendix 32–37</w:t>
+              <w:t>Appendix 41–46</w:t>
             </w:r>
           </w:p>
         </w:tc>
@@ -495,7 +495,94 @@
         <w:pStyle w:val="Heading1"/>
       </w:pPr>
       <w:r>
-        <w:t>Slide 9  A simple multivariate extension</w:t>
+        <w:t>Slide 9  Assumption 1</w:t>
+      </w:r>
+    </w:p>
+    <w:p>
+      <w:pPr>
+        <w:keepLines/>
+      </w:pPr>
+      <w:r>
+        <w:t>仮定1は観測過程です。Yは全測定項目、Dは各項目を観測したかを示す二値指標です。Y jはD jが1の場合にだけ観測され、X、W、Z、Dは常時観測されます。Fは潜在変数で観測されません。</w:t>
+      </w:r>
+    </w:p>
+    <w:p>
+      <w:pPr>
+        <w:keepLines/>
+      </w:pPr>
+      <w:r>
+        <w:t>Oは一個体の観測データを表します。常時観測変数に、実際に観測された項目だけからなるY Dを加えたものです。Zには各blockで必要なMissing IV Z Sが含まれます。</w:t>
+      </w:r>
+    </w:p>
+    <w:p>
+      <w:pPr>
+        <w:spacing w:after="20"/>
+      </w:pPr>
+    </w:p>
+    <w:p>
+      <w:pPr>
+        <w:pStyle w:val="Heading1"/>
+      </w:pPr>
+      <w:r>
+        <w:t>Slide 10  Assumptions 2 and 3</w:t>
+      </w:r>
+    </w:p>
+    <w:p>
+      <w:pPr>
+        <w:keepLines/>
+      </w:pPr>
+      <w:r>
+        <w:t>仮定2では通常共変量をX、潜在分布を動かすlatent shifterをWとします。Q FはWとXを条件とするFの分布です。この分布ではZを周辺化しています。</w:t>
+      </w:r>
+    </w:p>
+    <w:p>
+      <w:pPr>
+        <w:keepLines/>
+      </w:pPr>
+      <w:r>
+        <w:t>仮定3は測定過程です。Q jはFとXを条件とする項目Y jの分布、theta jはそのパラメータです。Q Fは潜在classの構成、Q jは各classと測定項目との関係を記述します。</w:t>
+      </w:r>
+    </w:p>
+    <w:p>
+      <w:pPr>
+        <w:spacing w:after="20"/>
+      </w:pPr>
+    </w:p>
+    <w:p>
+      <w:pPr>
+        <w:pStyle w:val="Heading1"/>
+      </w:pPr>
+      <w:r>
+        <w:t>Slide 11  Assumption 4</w:t>
+      </w:r>
+    </w:p>
+    <w:p>
+      <w:pPr>
+        <w:keepLines/>
+      </w:pPr>
+      <w:r>
+        <w:t>仮定4は、Zを周辺化した測定モデルに局所独立性とWのmeasurement exclusionを課します。F、W、Xを条件としたY全体の分布が、Wを含まない各Q jの積になります。全項目の同時分布に対する条件であって、pairwise independenceだけではありません。</w:t>
+      </w:r>
+    </w:p>
+    <w:p>
+      <w:pPr>
+        <w:keepLines/>
+      </w:pPr>
+      <w:r>
+        <w:t>ここでF、W、Xの下でYとZが独立とは仮定しません。この強い条件は削除し、ZとYの関連を許します。Missing IVとしてのZのexclusionは、仮定6で欠測指標Rに対して別に課します。この区別によって、測定モデルと四cellのshadow operatorを両立できます。</w:t>
+      </w:r>
+    </w:p>
+    <w:p>
+      <w:pPr>
+        <w:spacing w:after="20"/>
+      </w:pPr>
+    </w:p>
+    <w:p>
+      <w:pPr>
+        <w:pStyle w:val="Heading1"/>
+      </w:pPr>
+      <w:r>
+        <w:t>Slide 12  A simple multivariate extension</w:t>
       </w:r>
     </w:p>
     <w:p>
@@ -524,7 +611,7 @@
         <w:pStyle w:val="Heading1"/>
       </w:pPr>
       <w:r>
-        <w:t>Slide 10  Observed data and supported blocks</w:t>
+        <w:t>Slide 13  Assumption 5</w:t>
       </w:r>
     </w:p>
     <w:p>
@@ -532,7 +619,7 @@
         <w:keepLines/>
       </w:pPr>
       <w:r>
-        <w:t>D jをY jの観測指標とし、Oを観測変数の集合とします。Oは常時観測されるX、W、Z、Dと、Dによって選択されたYの成分Y Dから構成されます。R Sは集合Sの全項目が観測されたことを示すblock indicatorです。R SがゼロならY Sは欠測であり、観測データには値を持つ変数として現れません。</w:t>
+        <w:t>仮定5では、Sを測定項目の部分集合、Y Sをその測定ベクトル、U SをXとW、R SをS内のD jの積と定義します。R Sが1ならblock全体が観測されています。一部だけ観測されたblockは、complete blockとしては用いません。</w:t>
       </w:r>
     </w:p>
     <w:p>
@@ -540,7 +627,7 @@
         <w:keepLines/>
       </w:pPr>
       <w:r>
-        <w:t>supported blockとは、対象support上でR Sが1となる条件付き確率pi Sが正のblockです。必要なのはanchor pairとextension pairsがsupportedであることであり、global complete caseではありません。</w:t>
+        <w:t>supported blockとは、対象support上で、Y SとU Sを条件とする観測確率pi Sが正であるblockです。必要なのはanchor pairとextension pairsであり、全項目のglobal complete caseは必要としません。</w:t>
       </w:r>
     </w:p>
     <w:p>
@@ -553,7 +640,7 @@
         <w:pStyle w:val="Heading1"/>
       </w:pPr>
       <w:r>
-        <w:t>Slide 11  Single-block data-generating structure</w:t>
+        <w:t>Slide 14  Two marginal views of the model</w:t>
       </w:r>
     </w:p>
     <w:p>
@@ -561,7 +648,7 @@
         <w:keepLines/>
       </w:pPr>
       <w:r>
-        <w:t>図は一つのsupported blockの構造です。U SはXとWの組であり、F、Z S、Y Sと関連します。Z SはFを通じてY Sを予測しますが、Y SとU Sを条件づけた後にはR Sへ直接影響しません。そのためZ SからR Sへの直接辺は置きません。</w:t>
+        <w:t>図は、一つの完全データ法則の異なる周辺を二つに分けています。上段ではZとDを周辺化し、Fと測定項目の関係を示します。U SからY Sへの辺はXの効果だけであり、Wは測定核へ入りません。項目間の局所独立性は仮定4の積分解によって課しています。</w:t>
       </w:r>
     </w:p>
     <w:p>
@@ -569,7 +656,7 @@
         <w:keepLines/>
       </w:pPr>
       <w:r>
-        <w:t>一方、R Sは欠測し得るY Sに依存してよく、MNARを許容します。ここでのDAGは、本稿が用いる条件付き独立性と分布の関係を整理したものです。</w:t>
+        <w:t>下段はFとblock外の項目を周辺化した顕在変数のfull-data lawです。Y Sはここでも欠測し得る変数です。Y SとU Sの下でZ SとR Sが独立になる分解を表します。上下の図を一つのDAGとして結合したり、FとZの追加の独立性を読んだりするものではありません。</w:t>
       </w:r>
     </w:p>
     <w:p>
@@ -582,7 +669,7 @@
         <w:pStyle w:val="Heading1"/>
       </w:pPr>
       <w:r>
-        <w:t>Slide 12  Overlapping supported blocks replace global complete cases</w:t>
+        <w:t>Slide 15  Overlapping supported blocks replace global complete cases</w:t>
       </w:r>
     </w:p>
     <w:p>
@@ -611,7 +698,7 @@
         <w:pStyle w:val="Heading1"/>
       </w:pPr>
       <w:r>
-        <w:t>Slide 13  Stage-1 assumptions</w:t>
+        <w:t>Slide 16  Assumptions 6 and 7</w:t>
       </w:r>
     </w:p>
     <w:p>
@@ -640,7 +727,7 @@
         <w:pStyle w:val="Heading1"/>
       </w:pPr>
       <w:r>
-        <w:t>Slide 14  New Proposition 1</w:t>
+        <w:t>Slide 17  New Proposition 1</w:t>
       </w:r>
     </w:p>
     <w:p>
@@ -669,7 +756,7 @@
         <w:pStyle w:val="Heading1"/>
       </w:pPr>
       <w:r>
-        <w:t>Slide 15  Proof sketch the observable bridge is unique</w:t>
+        <w:t>Slide 18  Proof sketch the observable bridge is unique</w:t>
       </w:r>
     </w:p>
     <w:p>
@@ -698,7 +785,7 @@
         <w:pStyle w:val="Heading1"/>
       </w:pPr>
       <w:r>
-        <w:t>Slide 16  Finite latent-class identification</w:t>
+        <w:t>Slide 19  Finite latent-class identification</w:t>
       </w:r>
     </w:p>
     <w:p>
@@ -719,7 +806,7 @@
         <w:pStyle w:val="Heading1"/>
       </w:pPr>
       <w:r>
-        <w:t>Slide 17  The remaining decomposition problem</w:t>
+        <w:t>Slide 20  The remaining decomposition problem</w:t>
       </w:r>
     </w:p>
     <w:p>
@@ -748,7 +835,7 @@
         <w:pStyle w:val="Heading1"/>
       </w:pPr>
       <w:r>
-        <w:t>Slide 18  Identification strategy</w:t>
+        <w:t>Slide 21  Identification strategy</w:t>
       </w:r>
     </w:p>
     <w:p>
@@ -777,7 +864,7 @@
         <w:pStyle w:val="Heading1"/>
       </w:pPr>
       <w:r>
-        <w:t>Slide 19  Assumption 3.1</w:t>
+        <w:t>Slide 22  Assumption 3.1: Support and model</w:t>
       </w:r>
     </w:p>
     <w:p>
@@ -785,7 +872,7 @@
         <w:keepLines/>
       </w:pPr>
       <w:r>
-        <w:t>仮定3.1はcovariate-assisted anchor-pair structureです。class数rは既知です。anchor decompositionには、anchor pairのsupportedness、正のclass比率とWの周辺確率、M a、M b、GのKruskal rank条件を用います。これはAllman、Matias and Rhodesのthree-view conditionと同じです。</w:t>
+        <w:t>仮定3.1の前半は、finite latent-class modelの対象範囲と第一段階との接続です。class数rは既知で2以上、項目空間とXで条件づけたWのsupportは有限です。全ての条件を、Xの共通の確率1の集合上で課します。</w:t>
       </w:r>
     </w:p>
     <w:p>
@@ -793,7 +880,7 @@
         <w:keepLines/>
       </w:pPr>
       <w:r>
-        <w:t>既知のanchor scoreの厳密順序で共通labelを固定します。extension propagationでは全extension pairsがsupportedであることと、補題3.1からG Khatri–Rao M aがfull column rankになることを用います。</w:t>
+        <w:t>仮定2から4が成立し、各class比率とWのsupport上の確率は正です。anchor pairと全extension pairsについて仮定1、5から7を満たし、真の逆観測確率はcomplete-case lawの下で二乗可積分とします。これが命題1を各pairへ適用する条件です。</w:t>
       </w:r>
     </w:p>
     <w:p>
@@ -806,7 +893,7 @@
         <w:pStyle w:val="Heading1"/>
       </w:pPr>
       <w:r>
-        <w:t>Slide 20  Lemma 3.1</w:t>
+        <w:t>Slide 23  Assumption 3.1: Rank and labels</w:t>
       </w:r>
     </w:p>
     <w:p>
@@ -814,7 +901,36 @@
         <w:keepLines/>
       </w:pPr>
       <w:r>
-        <w:t>補題3.1はKhatri–Rao積のrank条件です。AとBのcolumn Kruskal rankの和がrプラス1以上なら、B Khatri–Rao Aはfull column rankになります。</w:t>
+        <w:t>後半はrankとlabelです。M a、M b、Gのcolumn Kruskal rankの和を2rプラス2以上とします。三つのviewに対するこの条件自体はAllmanらのTheorem 1と同じです。</w:t>
+      </w:r>
+    </w:p>
+    <w:p>
+      <w:pPr>
+        <w:keepLines/>
+      </w:pPr>
+      <w:r>
+        <w:t>さらに既知のanchor scoreを各classのM aで平均したmu afについて、全てのXで同じ厳密順序を課します。rankが因子を置換を除いて固定し、orderingが共通labelを固定します。GとM aのKhatri–Rao積のfull column rankは、次の補題から導く結論であり、追加仮定ではありません。</w:t>
+      </w:r>
+    </w:p>
+    <w:p>
+      <w:pPr>
+        <w:spacing w:after="20"/>
+      </w:pPr>
+    </w:p>
+    <w:p>
+      <w:pPr>
+        <w:pStyle w:val="Heading1"/>
+      </w:pPr>
+      <w:r>
+        <w:t>Slide 24  Lemma 3.1</w:t>
+      </w:r>
+    </w:p>
+    <w:p>
+      <w:pPr>
+        <w:keepLines/>
+      </w:pPr>
+      <w:r>
+        <w:t>補題3.1はKhatri–Rao積のrank条件です。AとBはゼロ列を持たないとします。column Kruskal rankの和がrプラス1以上なら、B Khatri–Rao Aはfull column rankになります。</w:t>
       </w:r>
     </w:p>
     <w:p>
@@ -835,7 +951,7 @@
         <w:pStyle w:val="Heading1"/>
       </w:pPr>
       <w:r>
-        <w:t>Slide 21  New Theorem 1</w:t>
+        <w:t>Slide 25  New Theorem 1</w:t>
       </w:r>
     </w:p>
     <w:p>
@@ -864,7 +980,7 @@
         <w:pStyle w:val="Heading1"/>
       </w:pPr>
       <w:r>
-        <w:t>Slide 22  Proof map for Theorem 1</w:t>
+        <w:t>Slide 26  Proof map for Theorem 1</w:t>
       </w:r>
     </w:p>
     <w:p>
@@ -893,7 +1009,7 @@
         <w:pStyle w:val="Heading1"/>
       </w:pPr>
       <w:r>
-        <w:t>Slide 23  Bridge-weighted composite estimation</w:t>
+        <w:t>Slide 27  Bridge-weighted composite estimation</w:t>
       </w:r>
     </w:p>
     <w:p>
@@ -922,7 +1038,152 @@
         <w:pStyle w:val="Heading1"/>
       </w:pPr>
       <w:r>
-        <w:t>Slide 24  Computation</w:t>
+        <w:t>Slide 28  Conditions for estimation</w:t>
+      </w:r>
+    </w:p>
+    <w:p>
+      <w:pPr>
+        <w:keepLines/>
+      </w:pPr>
+      <w:r>
+        <w:t>本文の命題4.1の条件も明記します。仮定1から7と3.1に加え、真のthetaが潜在モデルを正しく生成し、全てのpair densityが共通support上で正とします。母集団criterionには真のbridgeと固定された正のblock重みを使います。</w:t>
+      </w:r>
+    </w:p>
+    <w:p>
+      <w:pPr>
+        <w:keepLines/>
+      </w:pPr>
+      <w:r>
+        <w:t>IPWによって各pairのfull-data expectationが回復されます。真値とのcriterionの差はKL divergenceの正の加重和なので、最大値が等しければ全pair lawsが一致し、定理1からthetaも一致します。これが推定の母集団での一意性です。</w:t>
+      </w:r>
+    </w:p>
+    <w:p>
+      <w:pPr>
+        <w:spacing w:after="20"/>
+      </w:pPr>
+    </w:p>
+    <w:p>
+      <w:pPr>
+        <w:pStyle w:val="Heading1"/>
+      </w:pPr>
+      <w:r>
+        <w:t>Slide 29  Assumption 5.1: Regularity</w:t>
+      </w:r>
+    </w:p>
+    <w:p>
+      <w:pPr>
+        <w:keepLines/>
+      </w:pPr>
+      <w:r>
+        <w:t>漸近理論では個体の観測データが独立同分布であるとします。betaを潜在パラメータthetaとbridgeパラメータetaの組とします。確率単体制約を除いた自由座標で、両者は有限次元で正しく指定され、パラメータ空間はcompact、真値は内点です。</w:t>
+      </w:r>
+    </w:p>
+    <w:p>
+      <w:pPr>
+        <w:keepLines/>
+      </w:pPr>
+      <w:r>
+        <w:t>first-stage population momentの零点は真値だけとします。criterionとmomentは真値近傍で二回連続微分可能で、必要なenvelopeは二乗可積分です。bridgeとcomposite scoreのJacobian、および対応するGodambe行列が非特異であることも仮定します。</w:t>
+      </w:r>
+    </w:p>
+    <w:p>
+      <w:pPr>
+        <w:spacing w:after="20"/>
+      </w:pPr>
+    </w:p>
+    <w:p>
+      <w:pPr>
+        <w:pStyle w:val="Heading1"/>
+      </w:pPr>
+      <w:r>
+        <w:t>Slide 30  Assumption 5.1: Uniform convergence</w:t>
+      </w:r>
+    </w:p>
+    <w:p>
+      <w:pPr>
+        <w:keepLines/>
+      </w:pPr>
+      <w:r>
+        <w:t>一致性には真値の近傍の微分可能性だけでは不十分です。sample criterionは、推定したbridgeをplug-inした状態で、パラメータ空間全体にわたり真のbridgeを用いた母集団criterionへ一様に収束すると仮定します。</w:t>
+      </w:r>
+    </w:p>
+    <w:p>
+      <w:pPr>
+        <w:keepLines/>
+      </w:pPr>
+      <w:r>
+        <w:t>また、真値から任意の正の距離だけ離れたパラメータの母集団criterionは、真値での最大値より厳密に小さいとします。この一様収束と分離を用いてargmax theoremを適用することが、一致性の根拠です。</w:t>
+      </w:r>
+    </w:p>
+    <w:p>
+      <w:pPr>
+        <w:spacing w:after="20"/>
+      </w:pPr>
+    </w:p>
+    <w:p>
+      <w:pPr>
+        <w:pStyle w:val="Heading1"/>
+      </w:pPr>
+      <w:r>
+        <w:t>Slide 31  Assumption 5.1: First stage and separation</w:t>
+      </w:r>
+    </w:p>
+    <w:p>
+      <w:pPr>
+        <w:keepLines/>
+      </w:pPr>
+      <w:r>
+        <w:t>仮定5.1の後半では、bridge推定量がregular asymptotically linearであると仮定します。そのinfluence functionは平均ゼロで有限分散を持ちます。</w:t>
+      </w:r>
+    </w:p>
+    <w:p>
+      <w:pPr>
+        <w:keepLines/>
+      </w:pPr>
+      <w:r>
+        <w:t>さらに、class比率、supported-pair propensity、anchor tensorのW-mode unfoldingの最小の非零特異値、Kruskal rankを支えるminor、anchor orderingの隣接gapが一様にゼロから離れているとします。unfoldingはWを行、Y aとY bを列とする行列です。識別だけでは推定の正則性や安定した推論までは従わないので、これらを別に明示しています。</w:t>
+      </w:r>
+    </w:p>
+    <w:p>
+      <w:pPr>
+        <w:spacing w:after="20"/>
+      </w:pPr>
+    </w:p>
+    <w:p>
+      <w:pPr>
+        <w:pStyle w:val="Heading1"/>
+      </w:pPr>
+      <w:r>
+        <w:t>Slide 32  Theorem 5.1</w:t>
+      </w:r>
+    </w:p>
+    <w:p>
+      <w:pPr>
+        <w:keepLines/>
+      </w:pPr>
+      <w:r>
+        <w:t>命題4.1と仮定5.1の下で、有限次元bridgeを用いた推定量の一致性と漸近正規性を得ます。Aはcomposite scoreのtheta微分の期待値、Cはeta微分の期待値です。分散BはscoreだけでなくCとfirst-stage influence functionの積を含みます。</w:t>
+      </w:r>
+    </w:p>
+    <w:p>
+      <w:pPr>
+        <w:keepLines/>
+      </w:pPr>
+      <w:r>
+        <w:t>したがってsandwich分散にはbridgeを推定した誤差も入ります。個人単位bootstrapでも両段階とlabel alignmentをやり直します。増大するsieveについてはこの定理だけでは足りず、推定速度とinverse-problemの条件が追加で必要です。</w:t>
+      </w:r>
+    </w:p>
+    <w:p>
+      <w:pPr>
+        <w:spacing w:after="20"/>
+      </w:pPr>
+    </w:p>
+    <w:p>
+      <w:pPr>
+        <w:pStyle w:val="Heading1"/>
+      </w:pPr>
+      <w:r>
+        <w:t>Slide 33  Computation</w:t>
       </w:r>
     </w:p>
     <w:p>
@@ -951,7 +1212,7 @@
         <w:pStyle w:val="Heading1"/>
       </w:pPr>
       <w:r>
-        <w:t>Slide 25  Simulation targets in the model</w:t>
+        <w:t>Slide 34  Simulation targets in the model</w:t>
       </w:r>
     </w:p>
     <w:p>
@@ -959,7 +1220,7 @@
         <w:keepLines/>
       </w:pPr>
       <w:r>
-        <w:t>ここではp17のモデルDAGを再掲し、評価する母数を書き添えます。Z SからF、共変量U SからF、Z S、Y S、そしてFからY S、Y Sから観測指標R Sへ向かう元の矢印を保っています。Xは固定、Fは2 class、Wと各Yは二値です。Y 1は常時観測されるため、R SはD jに一致します。</w:t>
+        <w:t>ここではシミュレーションで実際に使う生成法則を図示し、評価する母数を書き添えます。Xは固定で、FからWと各Yを条件付き独立に生成し、そのY SからZ SとR Sを生成します。Fは2 class、Wと各Yは二値です。Y 1は常時観測されるため、R SはD jに一致します。</w:t>
       </w:r>
     </w:p>
     <w:p>
@@ -975,7 +1236,7 @@
         <w:keepLines/>
       </w:pPr>
       <w:r>
-        <w:t>ただし、この図は現行シミュレーションの生成法則そのものではありません。現行コードはY Sを条件にZ Sを生成するため、図が表す、FとWの下でY SとZ Sが独立というmeasurement exclusionを満たしていません。この不整合は未解決であり、現在の数値結果を図の全仮定を満たす検証と解釈することはできません。</w:t>
+        <w:t>このDGPは、Zを周辺化した仮定4の測定モデルとMissing IV exclusionを満たします。さらにY Sの下でR SとF、W、Z Sが独立になる具体的な生成例です。この追加の独立性を一般の識別定理の仮定として課しているわけではありません。</w:t>
       </w:r>
     </w:p>
     <w:p>
@@ -988,7 +1249,7 @@
         <w:pStyle w:val="Heading1"/>
       </w:pPr>
       <w:r>
-        <w:t>Slide 26  Simulation design: estimators and evaluation</w:t>
+        <w:t>Slide 35  Simulation design: estimators and evaluation</w:t>
       </w:r>
     </w:p>
     <w:p>
@@ -1025,7 +1286,7 @@
         <w:pStyle w:val="Heading1"/>
       </w:pPr>
       <w:r>
-        <w:t>Slide 27  Population outcome recovery</w:t>
+        <w:t>Slide 36  Population outcome recovery</w:t>
       </w:r>
     </w:p>
     <w:p>
@@ -1062,7 +1323,7 @@
         <w:pStyle w:val="Heading1"/>
       </w:pPr>
       <w:r>
-        <w:t>Slide 28  Stage-2 full joint law</w:t>
+        <w:t>Slide 37  Stage-2 full joint law</w:t>
       </w:r>
     </w:p>
     <w:p>
@@ -1091,7 +1352,7 @@
         <w:pStyle w:val="Heading1"/>
       </w:pPr>
       <w:r>
-        <w:t>Slide 29  Latent-parameter recovery</w:t>
+        <w:t>Slide 38  Latent-parameter recovery</w:t>
       </w:r>
     </w:p>
     <w:p>
@@ -1120,7 +1381,7 @@
         <w:pStyle w:val="Heading1"/>
       </w:pPr>
       <w:r>
-        <w:t>Slide 30  Conclusion and limits</w:t>
+        <w:t>Slide 39  Conclusion and limits</w:t>
       </w:r>
     </w:p>
     <w:p>
@@ -1149,7 +1410,7 @@
         <w:pStyle w:val="Heading1"/>
       </w:pPr>
       <w:r>
-        <w:t>Slide 31  Selected references</w:t>
+        <w:t>Slide 40  Selected references</w:t>
       </w:r>
     </w:p>
     <w:p>
@@ -1170,7 +1431,7 @@
         <w:pStyle w:val="Heading1"/>
       </w:pPr>
       <w:r>
-        <w:t>Appendix Slide 32  Proof of Theorem 1 (Steps 1--2)</w:t>
+        <w:t>Appendix Slide 41  Proof of Theorem 1 (Steps 1--2)</w:t>
       </w:r>
     </w:p>
     <w:p>
@@ -1191,7 +1452,7 @@
         <w:pStyle w:val="Heading1"/>
       </w:pPr>
       <w:r>
-        <w:t>Appendix Slide 33  Proof of Theorem 1 (Steps 3--4)</w:t>
+        <w:t>Appendix Slide 42  Proof of Theorem 1 (Steps 3--4)</w:t>
       </w:r>
     </w:p>
     <w:p>
@@ -1212,7 +1473,7 @@
         <w:pStyle w:val="Heading1"/>
       </w:pPr>
       <w:r>
-        <w:t>Appendix Slide 34  Proof of Theorem 1 (Steps 5--6)</w:t>
+        <w:t>Appendix Slide 43  Proof of Theorem 1 (Steps 5--6)</w:t>
       </w:r>
     </w:p>
     <w:p>
@@ -1233,7 +1494,7 @@
         <w:pStyle w:val="Heading1"/>
       </w:pPr>
       <w:r>
-        <w:t>Appendix Slide 35  Proof of Theorem 1 (Steps 7--8)</w:t>
+        <w:t>Appendix Slide 44  Proof of Theorem 1 (Steps 7--8)</w:t>
       </w:r>
     </w:p>
     <w:p>
@@ -1254,7 +1515,7 @@
         <w:pStyle w:val="Heading1"/>
       </w:pPr>
       <w:r>
-        <w:t>Appendix Slide 36  Empirical diagnostics and falsification checks</w:t>
+        <w:t>Appendix Slide 45  Empirical diagnostics and falsification checks</w:t>
       </w:r>
     </w:p>
     <w:p>
@@ -1283,7 +1544,7 @@
         <w:pStyle w:val="Heading1"/>
       </w:pPr>
       <w:r>
-        <w:t>Appendix Slide 37  Simulation calibration</w:t>
+        <w:t>Appendix Slide 46  Simulation calibration</w:t>
       </w:r>
     </w:p>
     <w:p>
@@ -1307,7 +1568,7 @@
         <w:keepLines/>
       </w:pPr>
       <w:r>
-        <w:t>この生成はMissing IVのselection exclusionを満たしますが、元のモデルDAGが課すmeasurement exclusionは満たしません。二つの有限classだけを通じて四つのpair cellsを予測する元の図では、complete-case operatorのrankは高々2です。そのため、この図と現行の四cell completenessを同時に成立させたDGPではない点を区別する必要があります。</w:t>
+        <w:t>有限supportを全列挙した母集団で検証すると、各Wの下でcomplete-case operatorのrankは4、三つのviewのKruskal rankの和は6、extension inversionのrankは2です。改訂した仮定4では、FとWの下でY SとZ Sが独立という強い条件は不要です。これらは識別条件の確認であり、推定量の全正則条件を数値的に証明するものではありません。</w:t>
       </w:r>
     </w:p>
     <w:sectPr>

</xml_diff>

<commit_message>
Explain inverse-weighted full-law recovery on Missing IV slide
</commit_message>
<xml_diff>
--- a/manuscript/vector_missing_iv_presentation_script_ja.docx
+++ b/manuscript/vector_missing_iv_presentation_script_ja.docx
@@ -330,6 +330,14 @@
       </w:pPr>
       <w:r>
         <w:t>本稿の基本条件は、Yと共変量Uを条件づけるとRとZが独立になることです。Zのrelevanceと、このexclusion、さらにcompletenessを組み合わせて、観測確率を一意に回復します。</w:t>
+      </w:r>
+    </w:p>
+    <w:p>
+      <w:pPr>
+        <w:keepLines/>
+      </w:pPr>
+      <w:r>
+        <w:t>パイは、Yの値ごとの観測確率です。その逆数を使って観測された標本を重み付けすることで、欠測した人も含めた母集団全体のYの分布を回復します。</w:t>
       </w:r>
     </w:p>
     <w:p>

</xml_diff>

<commit_message>
Make the Japanese presentation script conversational
</commit_message>
<xml_diff>
--- a/manuscript/vector_missing_iv_presentation_script_ja.docx
+++ b/manuscript/vector_missing_iv_presentation_script_ja.docx
@@ -7,7 +7,9 @@
         <w:pStyle w:val="Title"/>
       </w:pPr>
       <w:r>
-        <w:t>欠測IVと潜在変数モデリングによる非無作為欠測の識別</w:t>
+        <w:t>欠測IVと潜在変数モデリングによる</w:t>
+        <w:br/>
+        <w:t>非無作為欠測の識別</w:t>
       </w:r>
     </w:p>
     <w:p>
@@ -23,7 +25,7 @@
     </w:p>
     <w:p>
       <w:r>
-        <w:t>本原稿は、英語Beamer全46枚に対応する日本語の口頭説明用原稿である。識別対象、本文の全仮定、定理、推定法と数値結果を説明する。測定モデルはZを周辺化した法則とし、Missing IV exclusionと区別する。証明は本編では論理の流れ、Appendixでは8ステップを説明する。</w:t>
+        <w:t>英語Beamer全46枚に対応した、日本語の発表原稿です。欠測した人も含む分布をまず回復し、その後で潜在クラスの比率と測定核を分ける、という流れで説明します。各スライドの仮定と数値は残し、本編では証明の流れを、Appendixでは8ステップの詳細を説明します。</w:t>
       </w:r>
     </w:p>
     <w:p>
@@ -263,7 +265,7 @@
         <w:keepLines/>
       </w:pPr>
       <w:r>
-        <w:t>本報告の題目は、欠測IVと潜在変数モデリングによる非無作為欠測の識別です。多次元の測定項目がmissing not at random、すなわちMNARで欠測する状況で、潜在分布と測定核をどのように識別するかを議論します。</w:t>
+        <w:t>本日は、欠測IVと潜在変数モデリングによる非無作為欠測の識別についてお話しします。知りたいのは、欠測した項目の分布だけではありません。その項目の背後にある潜在クラスと、各項目がクラスをどう測っているかも知りたい、という問題です。</w:t>
       </w:r>
     </w:p>
     <w:p>
@@ -271,7 +273,7 @@
         <w:keepLines/>
       </w:pPr>
       <w:r>
-        <w:t>中心となる考え方は二段階です。第一段階でMissing IVとsupported blockを用いて観測変数のblock lawを回復し、第二段階でanchor itemsとlatent shifterを用いて、その法則を有限潜在クラスへ一意に分解します。</w:t>
+        <w:t>考え方は二段階です。まず、Missing IVを使って欠測による偏りを取り除きます。その後、重なりのある項目の組と、潜在分布を動かす変数を使って、潜在クラスの比率と測定核を分けていきます。</w:t>
       </w:r>
     </w:p>
     <w:p>
@@ -292,7 +294,7 @@
         <w:keepLines/>
       </w:pPr>
       <w:r>
-        <w:t>まず欠測機構を整理します。Dをresponse pattern、Y obsとY misを観測部分と欠測部分とします。MCARではDはYに依存せず、MARでは観測値だけに依存します。MNARではDが欠測値そのものにも依存するため、通常の補完やrespondent-only analysisではsample-selection biasが生じ得ます。</w:t>
+        <w:t>まず、欠測を三つに分けます。図のDは、どの項目が観測されたかを表します。Y obsは見えている部分、Y misは欠測している部分です。</w:t>
       </w:r>
     </w:p>
     <w:p>
@@ -300,7 +302,15 @@
         <w:keepLines/>
       </w:pPr>
       <w:r>
-        <w:t>本報告では、欠測のためのinstrumental variableを最初にMissing IVまたはshadow variableと呼び、以後はMissing IVに統一します。Missing IVによってfull-data lawを回復した後に、潜在構造を分解することが課題です。</w:t>
+        <w:t>MCARは、欠測がYの値と関係しない場合です。MARは、見えている値で条件づければ、欠測した値には依存しない場合です。今回扱うMNARでは、欠測した値そのものにも依存します。このとき、回答者だけを分析すると、母集団とは違う人たちを見てしまうことがあります。Heckmanの選択バイアスの話にもつながります。</w:t>
+      </w:r>
+    </w:p>
+    <w:p>
+      <w:pPr>
+        <w:keepLines/>
+      </w:pPr>
+      <w:r>
+        <w:t>そこで使うのが、Missing IV、別名shadow variableです。以後はMissing IVと呼びます。これを使って、欠測した人も含む母集団の分布を回復できるかを考えます。</w:t>
       </w:r>
     </w:p>
     <w:p>
@@ -321,7 +331,7 @@
         <w:keepLines/>
       </w:pPr>
       <w:r>
-        <w:t>通常のIVとMissing IVは役割が異なります。通常のIVはoutcome equationから除外され、treatmentや内生変数を動かします。これに対してMissing IVのZは、欠測指標Rへの直接効果を持たず、欠測し得るYを予測します。</w:t>
+        <w:t>左右の図では、Zの役割が違います。左は、欠測への応用で使う通常型のIVです。観測されるかどうかのRには関わる一方、Yのモデルからは除外します。右のMissing IVは逆で、Yとは関連しますが、Yを条件づけた後にはRと独立だと考えます。共変量がある場合は、それも一緒に条件づけます。</w:t>
       </w:r>
     </w:p>
     <w:p>
@@ -329,7 +339,7 @@
         <w:keepLines/>
       </w:pPr>
       <w:r>
-        <w:t>本稿の基本条件は、Yと共変量Uを条件づけるとRとZが独立になることです。Zのrelevanceと、このexclusion、さらにcompletenessを組み合わせて、観測確率を一意に回復します。</w:t>
+        <w:t>式のパイは、Yの値ごとの観測確率です。Missing IVの条件と、観測確率が正であることから、この式が成り立ちます。さらにcompletenessという、Zが識別に十分な情報を持つ条件を置くと、パイが一つに決まります。</w:t>
       </w:r>
     </w:p>
     <w:p>
@@ -337,7 +347,7 @@
         <w:keepLines/>
       </w:pPr>
       <w:r>
-        <w:t>パイは、Yの値ごとの観測確率です。その逆数を使って観測された標本を重み付けすることで、欠測した人も含めた母集団全体のYの分布を回復します。</w:t>
+        <w:t>あとは、その逆数で観測された人を重み付けします。たとえば観測確率が半分なら、重みは2です。観測されにくい人に大きな重みを付けて、欠測した人も含む母集団全体のYの分布を回復する、という考え方です。</w:t>
       </w:r>
     </w:p>
     <w:p>
@@ -358,7 +368,7 @@
         <w:keepLines/>
       </w:pPr>
       <w:r>
-        <w:t>Fを未観測の潜在変数、Y 1からY mをその測定項目、Xを通常共変量、Wを潜在分布を動かすlatent shifterとします。この構造はstructural equation modeling、SEMやitem response theory、IRTの基礎となる測定モデルです。</w:t>
+        <w:t>次に、項目の背後にある潜在変数を考えます。左の丸が、直接は見えないFです。右の四角が、Fを測る項目Y 1からY mです。構造方程式モデリング、SEMや、項目反応理論、IRTで使う測定モデルの基本形です。</w:t>
       </w:r>
     </w:p>
     <w:p>
@@ -366,7 +376,7 @@
         <w:keepLines/>
       </w:pPr>
       <w:r>
-        <w:t>Q FはFの潜在分布、Q jは項目jの測定核です。局所独立性の下で、観測変数の分布はQ FとQ jの積をFについて周辺化したmixtureになります。完全データで三つのviewが十分なrankを持つ場合、Allman、Matias and Rhodesの結果により、有限class比率と測定核はlabelを除いて識別されます。</w:t>
+        <w:t>Q Fは、Fがどのように分布しているかを表します。Wはその分布を動かす変数で、latent shifterと呼びます。Q jは、FとXが決まったときに項目jがどう分布するか、つまり測定核です。Xは通常の共変量で、Fにも各項目にも入ります。</w:t>
       </w:r>
     </w:p>
     <w:p>
@@ -374,7 +384,7 @@
         <w:keepLines/>
       </w:pPr>
       <w:r>
-        <w:t>今回の識別定理が直接扱うのは有限潜在クラスです。連続因子のSEMやIRTへ拡張するには、測定族やcalibrationなどの追加条件が必要です。</w:t>
+        <w:t>下の式では、FとXの下で項目が独立だとして、各測定核を掛けています。それをFの分布で平均すると、Yの分布になります。有限潜在クラスでは、三つのviewに十分なランクがあれば、クラスの入れ替えを除いて分解が一つに決まります。これがAllman、Matias、Rhodesの結果です。連続因子のSEMやIRTまで同じ条件だけで識別できる、という話ではありません。</w:t>
       </w:r>
     </w:p>
     <w:p>
@@ -395,7 +405,7 @@
         <w:keepLines/>
       </w:pPr>
       <w:r>
-        <w:t>関連研究を三つに整理します。scalar Missing IVではd’Haultfoeuille、Zhao and Shao、Miaoらがcompletenessとconditional moment identificationを扱います。multivariate MNARではTangら、Sadinle and Reiter、Liら、Ni and Shaoがpattern restrictionやitemwise nonresponse modelを扱います。</w:t>
+        <w:t>関連研究は、ここでは三つの流れに分けています。一つ目は、d’HaultfoeuilleやZhaoとShaoらのMissing IVです。二つ目は、TangらやNiとShaoらの、複数項目のMNARを扱う研究です。欠測パターンや項目ごとの欠測に、どのような制約を置くかを考えています。</w:t>
       </w:r>
     </w:p>
     <w:p>
@@ -403,7 +413,7 @@
         <w:keepLines/>
       </w:pPr>
       <w:r>
-        <w:t>latent structure側ではAllman、Matias and Rhodesのtensor uniquenessに加え、Muthénら、Holman and Glas、Lee and Tang、Harel and Schafer、Jungら、Kano and Takai、Kuhaらがlatent variableとnonignorable missingnessを同時に扱い、Xieらはdeep latent MNARを検討しています。latent-MNARのjoint model自体は既知です。</w:t>
+        <w:t>三つ目が潜在構造です。Allmanらはテンソル分解の一意性を扱っています。また、Muthénら、LeeとTang、Jungら、KanoとTakai、Kuhaらなど、潜在変数とMNARを一緒に扱う研究も既にあります。近年はXieらの深層学習を使う研究もあります。</w:t>
       </w:r>
     </w:p>
     <w:p>
@@ -411,7 +421,7 @@
         <w:keepLines/>
       </w:pPr>
       <w:r>
-        <w:t>本稿の新規性はlatent-MNAR自体ではありません。parametric selection modelを置かないsupported-block lawの回復と、共通label下でのlatent decompositionを接続し、一つの識別定理として示す点です。</w:t>
+        <w:t>ですので、新しいのは潜在変数とMNARを一緒に扱うこと自体ではありません。欠測モデルのパラメトリックな形を決めずにblockの分布を回復し、それを共通のラベルを持つ潜在構造につなぐ。この二段階を、一つの識別定理として示す点です。</w:t>
       </w:r>
     </w:p>
     <w:p>
@@ -432,7 +442,7 @@
         <w:keepLines/>
       </w:pPr>
       <w:r>
-        <w:t>本稿の方法を先に概観します。第一に、Zhao and Shaoの除外制約とd’Haultfoeuilleのconditional moment equationを各supported blockへ適用し、parametric selection modelを置かずにblock lawを回復します。</w:t>
+        <w:t>先に、本研究の流れをお見せします。第一段階は、欠測した人も含めたblockの分布を回復することです。ZhaoとShaoの除外制約と、d’Haultfoeuilleの条件付きモーメントの式を使います。欠測確率を特定のパラメトリックな形に決める必要はありません。</w:t>
       </w:r>
     </w:p>
     <w:p>
@@ -440,7 +450,7 @@
         <w:keepLines/>
       </w:pPr>
       <w:r>
-        <w:t>第二に、回復したoverlapping block lawsをanchor itemsとlatent shifterで接続し、Allman、Matias and Rhodesのtensor uniquenessとextension inversionを用いて共通label下の潜在分布と測定核へ分解します。本稿の新規性は、この二段階を一つの識別定理として接続する点です。</w:t>
+        <w:t>第二段階は、回復した分布を潜在クラスに分けることです。共通するanchor itemsとWを使い、Allmanらの分解の一意性につなげます。最初のanchorを分けた後、残りの項目を順に解きます。この二段階を接続して、一つの識別定理にするのが今回の提案です。</w:t>
       </w:r>
     </w:p>
     <w:p>
@@ -461,7 +471,7 @@
         <w:keepLines/>
       </w:pPr>
       <w:r>
-        <w:t>第一段階では、Missing IV、positivity、complete-case completenessを用いて、観測データから各supported-block lawを回復します。この段階ではlatent mixtureの分解は行いません。</w:t>
+        <w:t>ここから第一段階です。まずはMissing IVを使って、小さな項目の組ごとに、欠測した人も含めた分布を回復します。まだ潜在クラスには分けません。そのために何を仮定するかを、順に見ていきます。</w:t>
       </w:r>
     </w:p>
     <w:p>
@@ -482,7 +492,7 @@
         <w:keepLines/>
       </w:pPr>
       <w:r>
-        <w:t>latent shifter WとMissing IV Z Sは区別します。仮にFまで条件づければDとWが独立であっても、Fを積分するとDの条件付き分布にはP of F given Y, W, Xが残ります。WがFの分布を動かすなら、この分布は一般にWへ依存します。</w:t>
+        <w:t>ここは少し注意が必要です。潜在分布を動かすWと、欠測を補正するZ Sは、同じ役割ではありません。Fまで条件づけるとDとWが独立でも、Fを平均して消すと、Y、W、Xの下でのFの分布が式に残ります。この分布は、一般にはWによって変わります。</w:t>
       </w:r>
     </w:p>
     <w:p>
@@ -490,7 +500,7 @@
         <w:keepLines/>
       </w:pPr>
       <w:r>
-        <w:t>したがって、Wは周辺化後のMissing IVにはなりません。Z Sはblock lawをMNAR selectionから回復し、Wは回復後のtensorにthird-mode variationを与えます。block lawを回復しただけではQ FとQ Yは分離されないため、この二つの役割を接続する必要があります。</w:t>
+        <w:t>つまり、Wがlatent shifterだからといって、そのままMissing IVに使えるわけではありません。Z Sは欠測による偏りを取り除くために使います。Wは、その後の分布を潜在構造に分けるとき、三つ目のviewとして使います。まず回復して、その後で分解する、という順番になります。</w:t>
       </w:r>
     </w:p>
     <w:p>
@@ -511,7 +521,7 @@
         <w:keepLines/>
       </w:pPr>
       <w:r>
-        <w:t>仮定1は観測過程です。Yは全測定項目、Dは各項目を観測したかを示す二値指標です。Y jはD jが1の場合にだけ観測され、X、W、Z、Dは常時観測されます。Fは潜在変数で観測されません。</w:t>
+        <w:t>仮定1では、何が見えているかを決めます。Yが測定項目全体、D jが項目jを観測したかどうかです。D jが1のときだけY jが見えます。X、W、ZとDはいつも見えていますが、潜在変数Fは見えません。</w:t>
       </w:r>
     </w:p>
     <w:p>
@@ -519,7 +529,7 @@
         <w:keepLines/>
       </w:pPr>
       <w:r>
-        <w:t>Oは一個体の観測データを表します。常時観測変数に、実際に観測された項目だけからなるY Dを加えたものです。Zには各blockで必要なMissing IV Z Sが含まれます。</w:t>
+        <w:t>式のOは、一人分の観測データです。いつも見える変数と、その人について実際に見えたYの成分、Y Dをまとめています。Zの中には、各blockで使うMissing IVのZ Sが含まれます。</w:t>
       </w:r>
     </w:p>
     <w:p>
@@ -540,7 +550,7 @@
         <w:keepLines/>
       </w:pPr>
       <w:r>
-        <w:t>仮定2では通常共変量をX、潜在分布を動かすlatent shifterをWとします。Q FはWとXを条件とするFの分布です。この分布ではZを周辺化しています。</w:t>
+        <w:t>仮定2と3は、先ほどの測定モデルを式にしたものです。仮定2のQ Fは、WとXが与えられたときのFの分布です。Xは通常の共変量、Wは潜在分布を動かす変数です。ここではZについて平均を取っており、Zは条件に入っていません。</w:t>
       </w:r>
     </w:p>
     <w:p>
@@ -548,7 +558,7 @@
         <w:keepLines/>
       </w:pPr>
       <w:r>
-        <w:t>仮定3は測定過程です。Q jはFとXを条件とする項目Y jの分布、theta jはそのパラメータです。Q Fは潜在classの構成、Q jは各classと測定項目との関係を記述します。</w:t>
+        <w:t>仮定3のQ jは、FとXが与えられたときのY jの分布です。シータjが、その測定核のパラメータです。クラスの構成を表すのがQ F、各クラスが項目にどう表れるかを示すのがQ j、と分けて考えます。</w:t>
       </w:r>
     </w:p>
     <w:p>
@@ -569,7 +579,7 @@
         <w:keepLines/>
       </w:pPr>
       <w:r>
-        <w:t>仮定4は、Zを周辺化した測定モデルに局所独立性とWのmeasurement exclusionを課します。F、W、Xを条件としたY全体の分布が、Wを含まない各Q jの積になります。全項目の同時分布に対する条件であって、pairwise independenceだけではありません。</w:t>
+        <w:t>仮定4には二つの内容があります。一つは、FとXを押さえると、項目全体が条件付き独立になることです。二項目ずつ独立というだけではなく、全ての項目の同時分布が、この積に分かれると仮定します。</w:t>
       </w:r>
     </w:p>
     <w:p>
@@ -577,7 +587,15 @@
         <w:keepLines/>
       </w:pPr>
       <w:r>
-        <w:t>ここでF、W、Xの下でYとZが独立とは仮定しません。この強い条件は削除し、ZとYの関連を許します。Missing IVとしてのZのexclusionは、仮定6で欠測指標Rに対して別に課します。この区別によって、測定モデルと四cellのshadow operatorを両立できます。</w:t>
+        <w:t>もう一つは、Wが測定核に直接入らないことです。Wは潜在分布を動かしますが、FとXを決めた後の項目の分布は変えません。これは、Zについて平均を取った測定モデルの条件です。</w:t>
+      </w:r>
+    </w:p>
+    <w:p>
+      <w:pPr>
+        <w:keepLines/>
+      </w:pPr>
+      <w:r>
+        <w:t>F、W、Xを条件づけたらYとZも独立、とは言っていません。ZとYには関連があってよいです。Missing IVとしてのZの条件は、欠測指標Rとの独立性として、後の仮定6で別に置きます。</w:t>
       </w:r>
     </w:p>
     <w:p>
@@ -598,7 +616,7 @@
         <w:keepLines/>
       </w:pPr>
       <w:r>
-        <w:t>単純な多変量拡張では、D jを各項目Y jの観測指標とし、全項目が同時に観測されたcomplete-case indicatorをRと置きます。Rが正の確率を持ち、vector Y全体に対するMissing IV条件とcompletenessが成立すれば、full-data lawを識別できます。</w:t>
+        <w:t>ここで、Yを一つの変数ではなく、複数項目のベクトルにしてみます。一番単純なのは、全項目がそろった人だけをcomplete caseとして使う方法です。各項目が見えたかをD jで表し、その積をRとします。</w:t>
       </w:r>
     </w:p>
     <w:p>
@@ -606,7 +624,7 @@
         <w:keepLines/>
       </w:pPr>
       <w:r>
-        <w:t>ただし、この方法は全項目を同時に観測するglobal complete caseを必要とします。項目数が多い場合にはこの確率が極端に小さくなり得るため、本稿では後でsupported blocksへ置き換えます。</w:t>
+        <w:t>ベクトルYに対しても、Missing IVとcompletenessの条件が成り立ち、対象となる値ごとの観測確率が正なら、同じ考え方で母集団分布を回復できます。ただ、項目が増えると全てがそろう人は少なくなります。そこで、全項目ではなく、小さな組ごとに回復する方法へ進みます。</w:t>
       </w:r>
     </w:p>
     <w:p>
@@ -627,7 +645,7 @@
         <w:keepLines/>
       </w:pPr>
       <w:r>
-        <w:t>仮定5では、Sを測定項目の部分集合、Y Sをその測定ベクトル、U SをXとW、R SをS内のD jの積と定義します。R Sが1ならblock全体が観測されています。一部だけ観測されたblockは、complete blockとしては用いません。</w:t>
+        <w:t>ここで使うblockは、項目の一部分をまとめたものです。Sがその項目の集合、Y Sがその組の測定値、U SがXとWです。R Sは、その組のD jを全部掛けたものです。1なら、そのblockの項目は全て見えています。0なら、少なくとも一つが欠測しています。</w:t>
       </w:r>
     </w:p>
     <w:p>
@@ -635,7 +653,7 @@
         <w:keepLines/>
       </w:pPr>
       <w:r>
-        <w:t>supported blockとは、対象support上で、Y SとU Sを条件とする観測確率pi Sが正であるblockです。必要なのはanchor pairとextension pairsであり、全項目のglobal complete caseは必要としません。</w:t>
+        <w:t>一部だけ見えたblockは、全体が見えたblockとしては使いません。対象となるY SとU Sの値ごとに、block全体が観測される確率パイSが正であることを、supportedと呼びます。後で必要になるのはanchor pairとextension pairで、全項目が同時に見えることではありません。</w:t>
       </w:r>
     </w:p>
     <w:p>
@@ -656,7 +674,7 @@
         <w:keepLines/>
       </w:pPr>
       <w:r>
-        <w:t>図は、一つの完全データ法則の異なる周辺を二つに分けています。上段ではZとDを周辺化し、Fと測定項目の関係を示します。U SからY Sへの辺はXの効果だけであり、Wは測定核へ入りません。項目間の局所独立性は仮定4の積分解によって課しています。</w:t>
+        <w:t>同じモデルを、見る変数を変えて二つに分けた図です。上は、ZとDについて平均した測定モデルです。Fと項目の関係を見ています。U SからY Sへの矢印はXの効果だけで、Wは測定核には入りません。項目間の局所独立性は、仮定4の積の式で置いています。</w:t>
       </w:r>
     </w:p>
     <w:p>
@@ -664,7 +682,15 @@
         <w:keepLines/>
       </w:pPr>
       <w:r>
-        <w:t>下段はFとblock外の項目を周辺化した顕在変数のfull-data lawです。Y Sはここでも欠測し得る変数です。Y SとU Sの下でZ SとR Sが独立になる分解を表します。上下の図を一つのDAGとして結合したり、FとZの追加の独立性を読んだりするものではありません。</w:t>
+        <w:t>下は、Fとblock外の項目について平均した図です。Y SとU Sが決まると、Z SとR Sが独立になる関係を表しています。ここでいうfull-data lawは、回答者だけでなく、欠測した人も含む母集団の分布です。図にY Sがあっても、全員で見えているという意味ではありません。</w:t>
+      </w:r>
+    </w:p>
+    <w:p>
+      <w:pPr>
+        <w:keepLines/>
+      </w:pPr>
+      <w:r>
+        <w:t>上下を合体させて一つのDAGとして読むものではありません。特に、この図からFとZの追加の独立性を読み取ることはしません。</w:t>
       </w:r>
     </w:p>
     <w:p>
@@ -685,7 +711,7 @@
         <w:keepLines/>
       </w:pPr>
       <w:r>
-        <w:t>global complete caseの代わりに、重なりを持つsupported pairsを用います。S 0はanchor itemsのY aとY bを含み、各nonanchor item Y jには、Y jと共通anchor Y aからなるextension pairを用意します。</w:t>
+        <w:t>この図のように、全項目がそろう代わりに、重なりのあるペアを使います。最初のS 0は、基準となるY aとY bのペアです。この二つをanchor itemsと呼びます。残りのY jについては、共通のY aと組にしたextension pairを用意します。</w:t>
       </w:r>
     </w:p>
     <w:p>
@@ -693,7 +719,7 @@
         <w:keepLines/>
       </w:pPr>
       <w:r>
-        <w:t>各pairに固有のMissing IV Z Sとbridgeを置き、第一段階でpair lawを回復します。第二段階では共有されたanchorを通じて、block間のmeasurement kernelとclass labelを接続します。</w:t>
+        <w:t>各ペアには、それぞれMissing IVとbridgeを置きます。まずペアごとの分布を回復し、その後、共通のanchorを使って測定核とクラスのラベルをそろえていきます。全項目を一度に観測する必要はありません。</w:t>
       </w:r>
     </w:p>
     <w:p>
@@ -714,7 +740,7 @@
         <w:keepLines/>
       </w:pPr>
       <w:r>
-        <w:t>仮定6はblockwise covariate-adjusted Missing IVです。各supported blockについて、Y SとU Sを条件づけるとR SとZ Sが独立であるとします。</w:t>
+        <w:t>仮定6は、先ほどのMissing IVの条件をblockごとに置いたものです。Y Sと共変量U Sが同じなら、Z Sは、そのblockが観測されたかどうかのR Sと独立だとします。</w:t>
       </w:r>
     </w:p>
     <w:p>
@@ -722,7 +748,15 @@
         <w:keepLines/>
       </w:pPr>
       <w:r>
-        <w:t>仮定7はcomplete-case completenessです。R Sが1である標本において、Z SとU Sで条件づけたhの期待値がゼロなら、h自体がほとんど確実にゼロであるとします。これは観測可能なcomplete-case conditional operatorの単射性です。positivityはcomplete-case lawとfull lawの零集合を対応させます。</w:t>
+        <w:t>仮定7がcomplete-case completenessです。そのblockが全て見えた人たちの中で考えます。二乗可積分な関数hについて、Z SとU Sのどの条件でも平均がゼロなら、h自体もほとんど確実にゼロだとします。違う関数を条件付き平均だけでは区別できない、ということが起きないための条件です。</w:t>
+      </w:r>
+    </w:p>
+    <w:p>
+      <w:pPr>
+        <w:keepLines/>
+      </w:pPr>
+      <w:r>
+        <w:t>ここで使うのは、全項目のcomplete caseではなく、そのblockのcomplete caseです。さらに観測確率が正なので、そこで確率ゼロとなる集合と、母集団で確率ゼロとなる集合を対応させられます。</w:t>
       </w:r>
     </w:p>
     <w:p>
@@ -743,7 +777,7 @@
         <w:keepLines/>
       </w:pPr>
       <w:r>
-        <w:t>新しい命題1は、本文の命題2.1に対応するsupported-block identificationです。真のpi Sの逆数がcomplete-case lawの下で二乗可積分であると仮定します。その上で、observable bridge momentを満たし、逆数が同じL2空間に属する正値関数のうち、pi Sが唯一の解になります。存在は真のpropensityから与えられ、命題の中心はこのbridge class内の一意性です。</w:t>
+        <w:t>ここが第一段階の結果です。本文では命題2.1に当たります。真の観測確率の逆数について、blockのcomplete caseでの二乗平均が有限だとします。</w:t>
       </w:r>
     </w:p>
     <w:p>
@@ -751,7 +785,15 @@
         <w:keepLines/>
       </w:pPr>
       <w:r>
-        <w:t>pi Sが識別されると、R S divided by pi Sによるinverse probability weightingで任意のblock関数のfull-data expectationを再現できます。したがって各block lawが、parametric selection modelを指定せずに識別されます。</w:t>
+        <w:t>その上で、このbridgeの式を満たす候補を考えます。候補は正の関数で、その逆数も同じ二乗可積分な関数の範囲に入るものです。この範囲では、観測確率パイSが一つに決まる、という命題です。真の観測確率が解になるので、ポイントは解の存在より、一意性にあります。</w:t>
+      </w:r>
+    </w:p>
+    <w:p>
+      <w:pPr>
+        <w:keepLines/>
+      </w:pPr>
+      <w:r>
+        <w:t>パイSが分かれば、観測された人をその逆数で重み付けできます。すると、blockについての可積分な関数、つまり絶対値の期待値が有限な関数の平均を、母集団の平均に戻せます。平均一つだけでなく、blockの分布全体が識別できるわけです。</w:t>
       </w:r>
     </w:p>
     <w:p>
@@ -772,7 +814,7 @@
         <w:keepLines/>
       </w:pPr>
       <w:r>
-        <w:t>証明では仮定の役割を分けます。観測過程、supported blockの定義、Missing IV exclusionから、真のpi Sがbridge momentを満たすことを示します。別の解との差を取ると、complete cases上の条件付き期待値がゼロになります。</w:t>
+        <w:t>証明の流れはこの図の通りです。まず、観測過程とsupported block、Missing IVの条件から、真のパイSがbridgeの式を満たすと分かります。次に、別の解もあるとして、二つの逆数の差を取ります。</w:t>
       </w:r>
     </w:p>
     <w:p>
@@ -780,7 +822,7 @@
         <w:keepLines/>
       </w:pPr>
       <w:r>
-        <w:t>complete-case completenessがその差をゼロにし、positivityが等式を対象support全体へ拡張します。最後にinverse weighting identityからblock lawの識別が従います。</w:t>
+        <w:t>その差の条件付き平均は、blockのcomplete caseではゼロになります。completenessを使うと、差そのものがゼロです。さらにpositivityを使って、この一致を母集団でもほとんど確実な一致に広げます。あとは逆確率で重み付けすれば、blockの分布が回復できます。</w:t>
       </w:r>
     </w:p>
     <w:p>
@@ -801,7 +843,7 @@
         <w:keepLines/>
       </w:pPr>
       <w:r>
-        <w:t>第二段階では、第一段階で回復したblock lawsを有限潜在クラスへ分解します。anchor itemsとlatent shifterを用いてKruskal型の一意性を得ることが目的です。</w:t>
+        <w:t>ここから第二段階です。blockの分布が分かったとして、それを潜在クラスの比率と測定核に分けられるでしょうか。anchor itemsとWを使って、この分解が一つに決まる条件を考えます。</w:t>
       </w:r>
     </w:p>
     <w:p>
@@ -822,7 +864,7 @@
         <w:keepLines/>
       </w:pPr>
       <w:r>
-        <w:t>第一段階の後には、必要なY S、W、Xのfull pair lawsが識別されています。しかし潜在変数Fは未観測であり、同じpair lawを生成するp f、G、M jが複数存在する可能性があります。</w:t>
+        <w:t>第一段階で、必要なペアについて、欠測した人も含むY S、W、Xの分布が分かりました。ただ、Fそのものは見えていません。同じペアの分布を作れる潜在構造が、複数あるかもしれません。</w:t>
       </w:r>
     </w:p>
     <w:p>
@@ -830,7 +872,15 @@
         <w:keepLines/>
       </w:pPr>
       <w:r>
-        <w:t>ここでp fはclass比率、Gはclass別のWの分布、M jはclass別の測定核です。Lewbelの用語では、同じobserved-data lawを生成する二つの値はobservationally equivalentです。anchor orderingを課さないとclass permutationを除く同値類が識別され、orderingを課すと正規化されたparameter space上でpoint identificationを得ます。</w:t>
+        <w:t>分けたいのは三つです。p fがクラスの比率、GがクラスごとのWの分布、M jがクラスごとの測定核です。同じ観測データの分布を作る値どうしは、Lewbelの言葉でobservationally equivalentと呼びます。第一段階によって、観測データの分布が同じなら、回復したテンソルも同じになります。</w:t>
+      </w:r>
+    </w:p>
+    <w:p>
+      <w:pPr>
+        <w:keepLines/>
+      </w:pPr>
+      <w:r>
+        <w:t>ただし、クラス1と2の名前を入れ替えるだけでは、データの分布は変わりません。順序を決めなければ、識別されるのは、この入れ替えを同じものとみなした同値類です。anchorの順序で名前もそろえると、正規化したパラメータ空間で一つの値に決まります。</w:t>
       </w:r>
     </w:p>
     <w:p>
@@ -851,7 +901,7 @@
         <w:keepLines/>
       </w:pPr>
       <w:r>
-        <w:t>識別戦略は四段階です。まずsupported-block lawsを回復し、次にanchor tensorとextension tensorsを構成します。anchor tensorを一意に分解してp、G、M a、M bを得た後、class weightsを回復し、各extension tensorを線形反転して全M jを得ます。</w:t>
+        <w:t>全体の流れを、この図で見ます。まずblockの分布を回復し、それをテンソルに並べます。テンソルは、ここでは確率を並べた多次元の表だと思ってください。</w:t>
       </w:r>
     </w:p>
     <w:p>
@@ -859,7 +909,7 @@
         <w:keepLines/>
       </w:pPr>
       <w:r>
-        <w:t>つまり第二段階は、回復済みblock lawsをanchor decompositionとextension inversionで潜在分布と測定核へ分ける操作です。</w:t>
+        <w:t>最初に、Y a、Y b、Wからなるanchorのテンソルを分解します。これでp、Gと、二つのanchorの測定核が分かります。次にpとGからWごとのクラス比率を求め、残りの項目はextensionの式を一つずつ解いていきます。全部を一度に分解するのではなく、基準を決めてから広げる順番です。</w:t>
       </w:r>
     </w:p>
     <w:p>
@@ -880,7 +930,7 @@
         <w:keepLines/>
       </w:pPr>
       <w:r>
-        <w:t>仮定3.1の前半は、finite latent-class modelの対象範囲と第一段階との接続です。class数rは既知で2以上、項目空間とXで条件づけたWのsupportは有限です。全ての条件を、Xの共通の確率1の集合上で課します。</w:t>
+        <w:t>仮定3.1は二枚に分けています。まず、どのモデルを扱うかです。潜在クラス数rは既知で、2以上とします。項目が取る値も、Xで条件づけたWが取る値も有限です。条件は全て、Xについて共通の確率1の集合上で置きます。</w:t>
       </w:r>
     </w:p>
     <w:p>
@@ -888,7 +938,7 @@
         <w:keepLines/>
       </w:pPr>
       <w:r>
-        <w:t>仮定2から4が成立し、各class比率とWのsupport上の確率は正です。anchor pairと全extension pairsについて仮定1、5から7を満たし、真の逆観測確率はcomplete-case lawの下で二乗可積分とします。これが命題1を各pairへ適用する条件です。</w:t>
+        <w:t>仮定2から4の測定モデルが成り立ち、各クラスの比率と、Wのサポート上の確率は正とします。また、anchor pairと全extension pairが仮定1、5から7を満たします。逆観測確率の二乗平均も、blockのcomplete caseで有限です。これで、命題1を必要な全ペアに使えます。</w:t>
       </w:r>
     </w:p>
     <w:p>
@@ -909,7 +959,7 @@
         <w:keepLines/>
       </w:pPr>
       <w:r>
-        <w:t>後半はrankとlabelです。M a、M b、Gのcolumn Kruskal rankの和を2rプラス2以上とします。三つのviewに対するこの条件自体はAllmanらのTheorem 1と同じです。</w:t>
+        <w:t>次は、分解を一つに決める条件です。M a、M b、Gの列Kruskal rankの和が、2rプラス2以上だとします。三つのviewに対するこのランク条件は、AllmanらのTheorem 1と同じです。</w:t>
       </w:r>
     </w:p>
     <w:p>
@@ -917,7 +967,15 @@
         <w:keepLines/>
       </w:pPr>
       <w:r>
-        <w:t>さらに既知のanchor scoreを各classのM aで平均したmu afについて、全てのXで同じ厳密順序を課します。rankが因子を置換を除いて固定し、orderingが共通labelを固定します。GとM aのKhatri–Rao積のfull column rankは、次の補題から導く結論であり、追加仮定ではありません。</w:t>
+        <w:t>これだけでは、クラスの名前の入れ替えが残ります。そこで、既知のanchor scoreをクラスごとに平均したミューafに、厳密な順序を付けます。先ほどのXの集合上で、同じ順序を使います。ランクで分解を決め、順序で名前をそろえる、という二つの役割です。</w:t>
+      </w:r>
+    </w:p>
+    <w:p>
+      <w:pPr>
+        <w:keepLines/>
+      </w:pPr>
+      <w:r>
+        <w:t>なお、GとM aのKhatri–Rao積が列フルランクになることは、別に仮定しません。次の補題で、今の条件から導きます。</w:t>
       </w:r>
     </w:p>
     <w:p>
@@ -938,7 +996,7 @@
         <w:keepLines/>
       </w:pPr>
       <w:r>
-        <w:t>補題3.1はKhatri–Rao積のrank条件です。AとBはゼロ列を持たないとします。column Kruskal rankの和がrプラス1以上なら、B Khatri–Rao Aはfull column rankになります。</w:t>
+        <w:t>この補題は、残りの項目の式を一つに解けることを保証します。使うのはKhatri–Rao積で、対応する列どうしのクロネッカー積を並べたものです。</w:t>
       </w:r>
     </w:p>
     <w:p>
@@ -946,7 +1004,7 @@
         <w:keepLines/>
       </w:pPr>
       <w:r>
-        <w:t>この補題により、anchor tensorのKruskal条件を、各extension itemを線形反転するためのrank条件へ変換できます。</w:t>
+        <w:t>AとBにはゼロの列がないとします。二つの列Kruskal rankの和がrプラス1以上なら、この積は列フルランクになります。つまり、anchorを分解するときの条件から、extensionを解くためのランクも確保できる、という役割です。</w:t>
       </w:r>
     </w:p>
     <w:p>
@@ -967,7 +1025,7 @@
         <w:keepLines/>
       </w:pPr>
       <w:r>
-        <w:t>新しい定理1は、本文の定理3.1に対応するanchor-pair identificationです。第一段階の仮定と仮定3.1の下で、観測データ法則からp、G、Wごとの潜在class分布Q F、全項目の測定核Q Yが固定された共通labelの下で識別されます。</w:t>
+        <w:t>これが本研究の中心となる定理1で、本文の定理3.1です。第一段階の仮定と仮定3.1の下で、pとG、Wごとの潜在分布Q F、全項目の測定核Q Yが、共通のラベルの下で識別できます。</w:t>
       </w:r>
     </w:p>
     <w:p>
@@ -975,7 +1033,7 @@
         <w:keepLines/>
       </w:pPr>
       <w:r>
-        <w:t>要するに、pair lawsを回復し、一つのanchor tensorを分解すれば、latent-class distributionと全measurement kernelsが得られます。その結果、同時観測されたことのない項目集合についてもjoint lawを構成できます。</w:t>
+        <w:t>要するに、必要なペアの分布を回復して、一つのanchorのテンソルを分解し、残りを順に解けばよい、ということです。潜在クラスの比率だけでも、測定核だけでもなく、両方が分かります。さらに、このモデルの下では、一度も同時に観測されていない項目の組合せについても、同時分布を作れます。</w:t>
       </w:r>
     </w:p>
     <w:p>
@@ -996,7 +1054,7 @@
         <w:keepLines/>
       </w:pPr>
       <w:r>
-        <w:t>証明の流れを一枚で示します。observed-data lawから命題1でanchor tensorとextension tensorsを回復し、Allman型の一意性からM a、M b、p、Gを共通labelの下で得ます。</w:t>
+        <w:t>証明で何を使うかを、この一枚にまとめています。出発点は観測データの分布です。命題1で各テンソルを回復し、Allman型の一意性を使って、M a、M b、p、Gを取り出します。確率の和とanchorの順序を使い、大きさとラベルも固定します。</w:t>
       </w:r>
     </w:p>
     <w:p>
@@ -1004,7 +1062,7 @@
         <w:keepLines/>
       </w:pPr>
       <w:r>
-        <w:t>次に補題3.1でextension inversionのrankを確保します。pとGにはBayes則を適用してWごとのlatent distributionを得た後、各extension tensorを反転して全M jを回復します。詳細な8ステップはAppendixに置いています。</w:t>
+        <w:t>残りは二つの操作です。pとGにはベイズ則を使い、Wごとのクラス比率を求めます。extensionには補題3.1を使い、残りの測定核を一つずつ解きます。詳しい8ステップは、後ろのAppendixに置いています。</w:t>
       </w:r>
     </w:p>
     <w:p>
@@ -1025,7 +1083,7 @@
         <w:keepLines/>
       </w:pPr>
       <w:r>
-        <w:t>推定も識別と同じ順序です。第一段階はd’HaultfoeuilleのSection 3に従い、各blockでconditional moment equationを解いてpair lawをIPWで回復します。第二段階はZhao and Shaoのplug-inの順序に従い、共通のlatent mixtureをoverlapping pair lawsへ当てはめます。</w:t>
+        <w:t>推定も、いまの識別と同じ順番で進めます。まずd’Haultfoeuilleの第3節に沿って、blockごとに条件付きモーメントの式を解き、逆確率重み付け、IPWでペアの分布を回復します。次に、重なりのあるペアに共通の潜在モデルを当てはめます。先に補助的な分布を推定してから代入する順序は、ZhaoとShaoに沿っています。</w:t>
       </w:r>
     </w:p>
     <w:p>
@@ -1033,7 +1091,7 @@
         <w:keepLines/>
       </w:pPr>
       <w:r>
-        <w:t>提案量はfull likelihoodではなくbridge-weighted composite M-estimatorです。一致性と漸近正規性の定理は有限次元bridgeを対象とし、sandwich varianceにはfirst-stage bridgeの推定誤差も含めます。dimensionが増えるsieve bridgeには別途inverse-problem theoryが必要です。</w:t>
+        <w:t>ここで使うのは、一つのfull likelihoodではありません。ペアごとの対数密度をbridgeで重み付けして足す、compositeな基準です。これを最大にするM推定量を使います。分散を求めるときも、最初のbridgeを推定した誤差を含めます。後で示す一致性と漸近正規性は、bridgeの次元を固定した場合の結果です。</w:t>
       </w:r>
     </w:p>
     <w:p>
@@ -1054,7 +1112,7 @@
         <w:keepLines/>
       </w:pPr>
       <w:r>
-        <w:t>本文の命題4.1の条件も明記します。仮定1から7と3.1に加え、真のthetaが潜在モデルを正しく生成し、全てのpair densityが共通support上で正とします。母集団criterionには真のbridgeと固定された正のblock重みを使います。</w:t>
+        <w:t>次に、推定の基準も真値で一つに最大になるかを確認します。ここは本文の命題4.1です。これまでの仮定1から7と3.1に加え、潜在モデルが正しく、全ペアの密度が共通のサポート上で正だとします。母集団の基準には、真のbridgeと、固定した正のblock重みを使います。</w:t>
       </w:r>
     </w:p>
     <w:p>
@@ -1062,7 +1120,7 @@
         <w:keepLines/>
       </w:pPr>
       <w:r>
-        <w:t>IPWによって各pairのfull-data expectationが回復されます。真値とのcriterionの差はKL divergenceの正の加重和なので、最大値が等しければ全pair lawsが一致し、定理1からthetaも一致します。これが推定の母集団での一意性です。</w:t>
+        <w:t>IPWによって、ペアの平均を母集団の平均に戻せます。真値との目的関数の差は、分布の違いを測るKLダイバージェンスの正の加重和になります。差がゼロなら、全ペアの分布が同じです。すると定理1から、潜在パラメータも同じだと分かります。</w:t>
       </w:r>
     </w:p>
     <w:p>
@@ -1083,7 +1141,7 @@
         <w:keepLines/>
       </w:pPr>
       <w:r>
-        <w:t>漸近理論では個体の観測データが独立同分布であるとします。betaを潜在パラメータthetaとbridgeパラメータetaの組とします。確率単体制約を除いた自由座標で、両者は有限次元で正しく指定され、パラメータ空間はcompact、真値は内点です。</w:t>
+        <w:t>ここからは、標本を増やしたときの推定量の性質です。個人ごとの観測データは独立同分布とします。シータが潜在モデルの母数、イータがbridgeの母数で、この二つをまとめたものがベータです。</w:t>
       </w:r>
     </w:p>
     <w:p>
@@ -1091,7 +1149,15 @@
         <w:keepLines/>
       </w:pPr>
       <w:r>
-        <w:t>first-stage population momentの零点は真値だけとします。criterionとmomentは真値近傍で二回連続微分可能で、必要なenvelopeは二乗可積分です。bridgeとcomposite scoreのJacobian、および対応するGodambe行列が非特異であることも仮定します。</w:t>
+        <w:t>確率の和が1という制約を除いた自由な座標で、どちらも有限次元とし、モデルは正しく指定されているとします。パラメータ空間はコンパクトで、真値は境界ではなく内側にあります。第一段階の母集団モーメントがゼロになるのも、真値だけとします。</w:t>
+      </w:r>
+    </w:p>
+    <w:p>
+      <w:pPr>
+        <w:keepLines/>
+      </w:pPr>
+      <w:r>
+        <w:t>計算に必要な滑らかさも置きます。目的関数とモーメントは真値の近くで二回連続微分でき、それらを抑える関数は二乗可積分です。また、bridgeとcomposite scoreのヤコビアン、それに対応するGodambe行列は非特異とします。</w:t>
       </w:r>
     </w:p>
     <w:p>
@@ -1112,7 +1178,7 @@
         <w:keepLines/>
       </w:pPr>
       <w:r>
-        <w:t>一致性には真値の近傍の微分可能性だけでは不十分です。sample criterionは、推定したbridgeをplug-inした状態で、パラメータ空間全体にわたり真のbridgeを用いた母集団criterionへ一様に収束すると仮定します。</w:t>
+        <w:t>真値の近くだけが滑らかでも、推定量がそこへ近づくとは限りません。そこで、推定したbridgeを代入した標本の目的関数が、真のbridgeを使う母集団の目的関数に、パラメータ空間全体で一様に近づくと仮定します。</w:t>
       </w:r>
     </w:p>
     <w:p>
@@ -1120,7 +1186,7 @@
         <w:keepLines/>
       </w:pPr>
       <w:r>
-        <w:t>また、真値から任意の正の距離だけ離れたパラメータの母集団criterionは、真値での最大値より厳密に小さいとします。この一様収束と分離を用いてargmax theoremを適用することが、一致性の根拠です。</w:t>
+        <w:t>もう一つ、真値から一定以上離れた場所では、母集団の目的関数が最大値より確実に低くなるとします。この一様収束と最大値の分離を使い、argmax定理から一致性を得ます。近所の微分条件と、空間全体の条件を分けている点が大事です。</w:t>
       </w:r>
     </w:p>
     <w:p>
@@ -1141,7 +1207,7 @@
         <w:keepLines/>
       </w:pPr>
       <w:r>
-        <w:t>仮定5.1の後半では、bridge推定量がregular asymptotically linearであると仮定します。そのinfluence functionは平均ゼロで有限分散を持ちます。</w:t>
+        <w:t>第一段階の誤差も扱います。bridge推定量は正則で、真値からの誤差を、漸近的に影響関数の標本平均で表せると仮定します。その影響関数は平均ゼロで、分散は有限です。</w:t>
       </w:r>
     </w:p>
     <w:p>
@@ -1149,7 +1215,15 @@
         <w:keepLines/>
       </w:pPr>
       <w:r>
-        <w:t>さらに、class比率、supported-pair propensity、anchor tensorのW-mode unfoldingの最小の非零特異値、Kruskal rankを支えるminor、anchor orderingの隣接gapが一様にゼロから離れているとします。unfoldingはWを行、Y aとY bを列とする行列です。識別だけでは推定の正則性や安定した推論までは従わないので、これらを別に明示しています。</w:t>
+        <w:t>また、識別できるかどうかの境目に近づきすぎない条件を置きます。クラス比率とペアの観測確率は、一様にゼロから離れているとします。anchorのテンソルを、Wが行、Y aとY bが列になる行列に並べ替えたときの、最小の非零特異値も同様です。</w:t>
+      </w:r>
+    </w:p>
+    <w:p>
+      <w:pPr>
+        <w:keepLines/>
+      </w:pPr>
+      <w:r>
+        <w:t>Kruskal rankを支える小行列式の絶対値と、anchorの順序で隣り合う平均スコアの差も、一様にゼロから離す必要があります。識別ができることと、安定した推論ができることは別なので、この条件を加えています。</w:t>
       </w:r>
     </w:p>
     <w:p>
@@ -1170,7 +1244,7 @@
         <w:keepLines/>
       </w:pPr>
       <w:r>
-        <w:t>命題4.1と仮定5.1の下で、有限次元bridgeを用いた推定量の一致性と漸近正規性を得ます。Aはcomposite scoreのtheta微分の期待値、Cはeta微分の期待値です。分散BはscoreだけでなくCとfirst-stage influence functionの積を含みます。</w:t>
+        <w:t>以上の命題4.1と仮定5.1の下で、有限次元のbridgeを使う推定量は一致性と漸近正規性を持ちます。標本が増えると真値に近づき、その誤差をルートn倍したものが、漸近的に正規分布に従うという結果です。</w:t>
       </w:r>
     </w:p>
     <w:p>
@@ -1178,7 +1252,15 @@
         <w:keepLines/>
       </w:pPr>
       <w:r>
-        <w:t>したがってsandwich分散にはbridgeを推定した誤差も入ります。個人単位bootstrapでも両段階とlabel alignmentをやり直します。増大するsieveについてはこの定理だけでは足りず、推定速度とinverse-problemの条件が追加で必要です。</w:t>
+        <w:t>分散の式で大事なのは、bridgeを推定した誤差も入ることです。Aはcomposite scoreをシータで微分した期待値、Cはイータで微分した期待値です。Bにはscoreに加え、Cと第一段階の影響関数の積が入ります。bridgeが既知だとして分散を出してはいけません。</w:t>
+      </w:r>
+    </w:p>
+    <w:p>
+      <w:pPr>
+        <w:keepLines/>
+      </w:pPr>
+      <w:r>
+        <w:t>個人単位のbootstrapを使うなら、両段階の推定とラベル合わせを毎回やり直します。なお、次元を増やしていくsieveは、この定理の範囲外です。推定速度や逆問題としての追加の条件が必要です。</w:t>
       </w:r>
     </w:p>
     <w:p>
@@ -1199,7 +1281,7 @@
         <w:keepLines/>
       </w:pPr>
       <w:r>
-        <w:t>Zhao and ShaoのSection 2.3は、nuisance lawを先に推定してtarget modelへplug-inする順序の先例です。本稿の更新アルゴリズムそのものの先例ではありません。本稿のcriterionは非凸なlatent mixtureを含むため、tensor initialization、複数初期値、制約付き更新を組み合わせます。</w:t>
+        <w:t>計算も、回復、分解、更新の順番です。まずbridgeを推定し、重み付きのテンソルを作ります。anchorを分解してラベルをそろえ、残りの測定核の初期値を出します。</w:t>
       </w:r>
     </w:p>
     <w:p>
@@ -1207,7 +1289,7 @@
         <w:keepLines/>
       </w:pPr>
       <w:r>
-        <w:t>具体的にはbridgeを推定してweighted tensorsを作り、anchor tensorを分解してlabelを正規化し、extension kernelsを初期化します。その後、確率単体制約の下で全パラメータを更新し、最大criterionの解を採用します。</w:t>
+        <w:t>その後、確率が非負で和が1になる制約を守りながら、全体を更新します。目的関数は非凸なので、初期値は複数試し、得られた解の中で目的関数が最大のものを採ります。これだけで大域的な最大値を保証するわけではありません。ZhaoとShaoの第2.3節から引き継ぐのはplug-inの順序で、更新法をそのまま移しているわけではありません。</w:t>
       </w:r>
     </w:p>
     <w:p>
@@ -1228,7 +1310,7 @@
         <w:keepLines/>
       </w:pPr>
       <w:r>
-        <w:t>ここではシミュレーションで実際に使う生成法則を図示し、評価する母数を書き添えます。Xは固定で、FからWと各Yを条件付き独立に生成し、そのY SからZ SとR Sを生成します。Fは2 class、Wと各Yは二値です。Y 1は常時観測されるため、R SはD jに一致します。</w:t>
+        <w:t>ここからシミュレーションです。Xは固定し、Fは二つのクラスとします。Fが決まると、Wと各Yを条件付き独立に作ります。その後、ペアの値Y SからZ SとR Sを作ります。Wと三つのYは全て二値です。Y 1はいつも見えているので、ペアが全部見えるかどうかは、もう一方のD jで決まります。</w:t>
       </w:r>
     </w:p>
     <w:p>
@@ -1236,7 +1318,7 @@
         <w:keepLines/>
       </w:pPr>
       <w:r>
-        <w:t>Fの周辺class比率がp f、項目とclassの測定関係がM jfです。Stage 1のmu jは母集団周辺確率、p S,cはpairのcell probabilityです。これらと、Stage 2で分離する六つの測定核成分およびp 2を区別します。標本サイズは500、Monte Carlo反復は100回、平均item response rateは80 percentです。</w:t>
+        <w:t>右側は、何を評価するかです。第一段階のミューjは、母集団全体でY jが1になる確率です。p S,cは、ペアの00、01、10、11それぞれの確率です。これに対して第二段階のp fはクラスの比率、M jfはクラスfで項目jが1になる確率を表します。M jfは三項目かける二クラスで六つ、クラス比率はp 2を評価します。</w:t>
       </w:r>
     </w:p>
     <w:p>
@@ -1244,7 +1326,7 @@
         <w:keepLines/>
       </w:pPr>
       <w:r>
-        <w:t>このDGPは、Zを周辺化した仮定4の測定モデルとMissing IV exclusionを満たします。さらにY Sの下でR SとF、W、Z Sが独立になる具体的な生成例です。この追加の独立性を一般の識別定理の仮定として課しているわけではありません。</w:t>
+        <w:t>標本サイズは500で、データを作って推定する作業を100回繰り返します。全項目の平均観測率は80パーセントです。この生成モデルは、Zを平均して消した仮定4とMissing IVの条件を満たします。さらに、Y Sの下でR SとF、W、Z Sが独立になる作り方ですが、この追加条件を一般の識別定理にも求めるわけではありません。</w:t>
       </w:r>
     </w:p>
     <w:p>
@@ -1265,7 +1347,7 @@
         <w:keepLines/>
       </w:pPr>
       <w:r>
-        <w:t>五手法を比較します。complete-data oracleは欠測前の尤度、MARはignorabilityの下での観測尤度、正指定selection likelihoodは真のlogistic selection equationを用います。誤指定版ではY 1の主効果とinteractionを除きます。提案法は各blockのMissing IV momentから4-cell inverse bridgeを推定し、Stage 1の法則を得た後、weighted pairwise latent-class criterionを用いて潜在構造を推定します。</w:t>
+        <w:t>比較するのは五つです。一つ目は、欠測前の全データを使うoracleです。二つ目は、欠測を無視できると考えて観測尤度を使うMARです。三つ目は、欠測のlogisticモデルを正しく指定したselection likelihoodです。四つ目は、そこからY 1の主効果と交互作用を落とした誤指定版です。この二つのselection likelihoodには、どちらもZ Sを入れません。</w:t>
       </w:r>
     </w:p>
     <w:p>
@@ -1273,7 +1355,7 @@
         <w:keepLines/>
       </w:pPr>
       <w:r>
-        <w:t>outcome parameterごとに四つの指標を報告します。Biasは平均的な推定誤差、empirical SDは反復間のばらつき、平均estimated SEは各標本で得た不確実性の推定値、95 percent coverageは真値を含むpointwise Wald区間の割合です。likelihood法ではdelta-method sandwich SE、提案法では各反復で個人単位bootstrapを200回行い、両bridgeを再推定します。</w:t>
+        <w:t>五つ目が提案法です。各blockのMissing IVの式から、四つのセルに対応する逆観測確率のbridgeを推定します。まず正規化したIPWで分布を回復し、その後、重み付きのペアの基準で潜在モデルを当てはめます。次の図で見る提案法のYの分布は、潜在分解をする前の第一段階の結果です。他の四手法は、当てはめたモデルからYの分布を求めています。</w:t>
       </w:r>
     </w:p>
     <w:p>
@@ -1281,7 +1363,15 @@
         <w:keepLines/>
       </w:pPr>
       <w:r>
-        <w:t>潜在母数についてはbiasとRMSEを報告します。測定核のRMSEは、反復と六つのitem-by-class cellsをまとめた二乗誤差の平均の平方根であり、cell別RMSEの単純平均ではありません。p 2は単独で評価します。提案法のoutcome lawはdecomposition前のnormalized IPW推定値であり、他の四手法では推定モデルから導いた法則を比較しています。</w:t>
+        <w:t>Yの母数ごとに、四つを見ます。Biasは平均的なずれ、SDは100回の推定値のばらつきです。平均SEは、各データから推定した標準誤差の平均なので、SDと近いかを見ます。95パーセントcoverageは、母数ごとのWald信頼区間が真値を含んだ割合です。区間は推定値プラスマイナス1.96 SEで作ります。</w:t>
+      </w:r>
+    </w:p>
+    <w:p>
+      <w:pPr>
+        <w:keepLines/>
+      </w:pPr>
+      <w:r>
+        <w:t>尤度法のSEにはデルタ法とsandwich分散を使います。提案法では、各反復の中で個人単位のbootstrapを200回行い、二つのbridgeを毎回推定し直します。潜在母数はbiasとRMSEで見ます。測定核のRMSEは、100反復と六つの成分の二乗誤差をまとめて平均し、平方根を取ります。成分ごとのRMSEの単純平均ではありません。p 2は別に評価します。</w:t>
       </w:r>
     </w:p>
     <w:p>
@@ -1302,7 +1392,7 @@
         <w:keepLines/>
       </w:pPr>
       <w:r>
-        <w:t>横軸を五手法、青い実線とオレンジの破線をmu 2、mu 3とした折れ線グラフです。上段はbiasとempirical SD、下段はmean estimated SEと95 percent coverageを示します。</w:t>
+        <w:t>まず、潜在構造に分ける前に、Yの分布が戻っているかを見ます。横軸が五つの手法、青い実線がミュー2、オレンジの破線がミュー3です。上がbiasとSD、下が平均SEとcoverageです。</w:t>
       </w:r>
     </w:p>
     <w:p>
@@ -1310,7 +1400,7 @@
         <w:keepLines/>
       </w:pPr>
       <w:r>
-        <w:t>母集団周辺確率の真値はmu 2 equals 0.475、mu 3 equals 0.4925です。提案Stage-1 bridgeのbiasはそれぞれマイナス0.0099、マイナス0.0096で、empirical SDと平均estimated SEは0.0379対0.0365、0.0345対0.0339でした。95 percent coverageは94 percentと93 percentで、推定SEがreplication variabilityを概ね捉えています。</w:t>
+        <w:t>提案法は、MARと誤指定したselection likelihoodよりbiasの絶対値が小さくなっています。SDと平均SEも近く、coverageは94パーセントと93パーセントでした。この設定では、推定した標準誤差が、実際の推定値のばらつきをおおむね捉えています。</w:t>
       </w:r>
     </w:p>
     <w:p>
@@ -1318,7 +1408,15 @@
         <w:keepLines/>
       </w:pPr>
       <w:r>
-        <w:t>これに対してMARのcoverageは9 percentと13 percent、誤指定selection likelihoodでは12 percentと11 percentでした。正しく指定したselection likelihoodはbiasがほぼゼロですが、coverageはY 2で86 percentです。本結果は提案法の効率優位を示すものではなく、parametric selection linkを指定せずに、欠測outcomeの周辺分布をStage 1で補正できることを示します。</w:t>
+        <w:t>数字を補足すると、ミュー2とミュー3の真値は0.475と0.4925です。提案法のbiasはマイナス0.0099とマイナス0.0096です。SDと平均SEは、ミュー2で0.0379と0.0365、ミュー3で0.0345と0.0339でした。</w:t>
+      </w:r>
+    </w:p>
+    <w:p>
+      <w:pPr>
+        <w:keepLines/>
+      </w:pPr>
+      <w:r>
+        <w:t>一方、MARのcoverageは9パーセントと13パーセント、誤指定版は12パーセントと11パーセントです。正指定版のbiasはほぼゼロですが、Y 2のcoverageは86パーセントでした。100反復の結果なので、常にこの被覆率になるとは言えません。ここで言いたいのは、提案法が常に最も効率的ということではなく、欠測モデルの形を決めずに第一段階でYの偏りを補正できた、という点です。</w:t>
       </w:r>
     </w:p>
     <w:p>
@@ -1339,7 +1437,7 @@
         <w:keepLines/>
       </w:pPr>
       <w:r>
-        <w:t>続いて、Y 1、Y 2、Y 3のfull joint lawを全体像として示します。横軸は三つのbinary outcomesの8通りの組合せ、縦軸は各cellの確率です。黒い線が母集団の真の分布、そのほかの線は各手法で推定した分布を100反復で平均したものです。</w:t>
+        <w:t>今度は、三つのYの同時分布を見ます。横軸は0と1の八通りの組合せ、縦軸はそれぞれが起こる確率です。黒い線が母集団の真の分布で、ほかの線は100反復の推定結果を平均しています。</w:t>
       </w:r>
     </w:p>
     <w:p>
@@ -1347,7 +1445,7 @@
         <w:keepLines/>
       </w:pPr>
       <w:r>
-        <w:t>青い提案法の線は、Stage 1で回復したoverlapping block lawsをStage 2で共通の潜在構造に接続し、class比率と全measurement kernelsから構成した分布です。周辺確率だけでなく、全項目の組合せとして真の分布をどのように再現しているかを見ます。</w:t>
+        <w:t>ここでの青い提案法の線は、第二段階まで使った結果です。回復したペアの分布を共通の潜在構造につなぎ、クラス比率と全ての測定核から、三項目の同時分布を作っています。先ほどの項目ごとの確率と違い、今度は項目の組合せまで再現できているかを見ています。</w:t>
       </w:r>
     </w:p>
     <w:p>
@@ -1368,7 +1466,7 @@
         <w:keepLines/>
       </w:pPr>
       <w:r>
-        <w:t>measurement kernelsについて、提案法はMARと誤指定selection likelihoodよりabsolute biasとRMSEが小さく、測定関係をより正確に回復しています。これは、selection equationを直接指定せず、Missing IVからblock lawsを回復しているためと考えられます。</w:t>
+        <w:t>こちらは、潜在構造まで分けた後の結果です。測定核では、提案法のbiasの絶対値とRMSEが、MARと誤指定したselection likelihoodより小さくなっています。欠測モデルの形を直接決めず、Missing IVからペアの分布を回復していることが効いていると考えられます。</w:t>
       </w:r>
     </w:p>
     <w:p>
@@ -1376,7 +1474,7 @@
         <w:keepLines/>
       </w:pPr>
       <w:r>
-        <w:t>latent class proportionsについても提案法のbiasはほぼゼロですが、RMSEが全比較で常に最小になるわけではありません。正しく指定されたparametric selection likelihoodは効率面で競争的であり、提案法の利点は誤指定回避と引き換えの頑健性にあります。</w:t>
+        <w:t>クラス比率のbiasもほぼゼロです。ただし、RMSEがどの手法よりも小さいわけではありません。欠測モデルを正しく指定できれば、パラメトリックな方法も効率の面で有力です。提案法の利点は、常に一番精度が高いことではなく、欠測モデルの形の誤指定を避けられる点にあります。</w:t>
       </w:r>
     </w:p>
     <w:p>
@@ -1397,7 +1495,7 @@
         <w:keepLines/>
       </w:pPr>
       <w:r>
-        <w:t>第一段階ではMissing IVとcomplete-case completenessにより、parametric selection modelを置かずに各supported-block lawを識別します。第二段階ではanchor itemsとWにより、有限latent-class proportionsと全measurement kernelsを共通labelの下で識別します。推定量もこの順序に沿います。</w:t>
+        <w:t>最後にまとめます。第一段階では、Missing IVとblockのcomplete-case completenessを使って、欠測モデルの形をパラメトリックに決めずに各blockの分布を回復します。第二段階では、anchor itemsとWを使い、潜在クラス比率と全ての測定核を共通のラベルで識別します。この接続を定理にして、同じ順序で推定量も作りました。</w:t>
       </w:r>
     </w:p>
     <w:p>
@@ -1405,7 +1503,15 @@
         <w:keepLines/>
       </w:pPr>
       <w:r>
-        <w:t>限界もあります。識別には、既知のclass数r、anchor ordering、supported pairs、Missing IV exclusion、completeness、局所独立性、rank条件、有限latent-class modelが必要です。提案法はselection-link misspecificationには頑健ですが、これらの仮定やlatent-class modelの誤指定まで許すものではありません。また、class proportionのRMSEは正指定selection likelihoodを上回り得ます。漸近正規性は有限次元bridgeに対する結果であり、sieve inferenceには追加のinverse-problem theoryが必要です。</w:t>
+        <w:t>ただし、何にでも頑健というわけではありません。クラス数は既知で、有限潜在クラスの測定モデルが正しいことが前提です。必要なペアが観測されること、Missing IVの除外制約、completeness、局所独立性、ランク条件、anchorの順序も必要です。</w:t>
+      </w:r>
+    </w:p>
+    <w:p>
+      <w:pPr>
+        <w:keepLines/>
+      </w:pPr>
+      <w:r>
+        <w:t>また、クラス比率のRMSEは、正しく指定したselection likelihoodより大きくなることがあります。漸近理論も、ここでは有限次元のbridgeに限ります。次元を増やすsieveまで広げるには、逆問題としての追加の条件が要ります。欠測モデルの形を決めずに回復と分解をつなげられることが、今回のポイントです。</w:t>
       </w:r>
     </w:p>
     <w:p>
@@ -1426,7 +1532,7 @@
         <w:keepLines/>
       </w:pPr>
       <w:r>
-        <w:t>Stage 1はd’HaultfoeuilleとZhao and Shao、complete-case-law上のcompletenessはMiaoら、Stage 2はAllman、Matias and Rhodesに依拠しています。Lewbelはobservational equivalenceとpoint identificationの用語、Little and Rubinは欠測機構、Heckmanはsample-selection biasの基礎として参照しています。</w:t>
+        <w:t>主に参照した文献はこちらです。第一段階はd’HaultfoeuilleとZhao、Shao、complete-caseでのcompletenessはMiaoらを参照しています。第二段階はAllman、Matias、Rhodesです。識別の言葉遣いはLewbel、欠測の分類はLittleとRubin、選択バイアスはHeckmanに沿っています。</w:t>
       </w:r>
     </w:p>
     <w:p>
@@ -1447,7 +1553,15 @@
         <w:keepLines/>
       </w:pPr>
       <w:r>
-        <w:t>Step 1では命題1によりanchor pairと全extension pairsのfull lawsを回復します。Step 2ではX equals xを固定し、局所独立性からY a、Y b、WをFとX equals xの下で三つの条件付き独立なviewとするanchor tensorを構成します。</w:t>
+        <w:t>最初の二つのステップです。Step 1では、命題1でanchor pairと全extension pairの分布を回復します。Step 2ではXをxに固定し、Y a、Y b、Wの確率をテンソルに並べます。</w:t>
+      </w:r>
+    </w:p>
+    <w:p>
+      <w:pPr>
+        <w:keepLines/>
+      </w:pPr>
+      <w:r>
+        <w:t>仮定した測定モデルから、FとXの下でこの三つは条件付き独立です。そのため、クラスごとの三つの確率ベクトルの積を、クラス比率で重み付けして足す形に書けます。これが分解の出発点です。</w:t>
       </w:r>
     </w:p>
     <w:p>
@@ -1468,7 +1582,15 @@
         <w:keepLines/>
       </w:pPr>
       <w:r>
-        <w:t>Step 3ではKruskal rank conditionからanchor tensorの分解をcommon permutationとcolumn scalingを除いて一意にします。Step 4では確率ベクトルの列和でscalingを固定し、anchor orderingでclass labelsを固定します。</w:t>
+        <w:t>Step 3では、Kruskalのランク条件を使います。これで、テンソルの分解は、クラスの入れ替えと列の大きさの調整を除いて一つに決まります。</w:t>
+      </w:r>
+    </w:p>
+    <w:p>
+      <w:pPr>
+        <w:keepLines/>
+      </w:pPr>
+      <w:r>
+        <w:t>Step 4では、その二つの曖昧さをなくします。確率ベクトルは和が1なので、列の大きさを固定できます。クラスの名前は、anchorの平均スコアが小さい順にそろえます。</w:t>
       </w:r>
     </w:p>
     <w:p>
@@ -1489,7 +1611,15 @@
         <w:keepLines/>
       </w:pPr>
       <w:r>
-        <w:t>Step 5では補題3.1によりG Khatri–Rao M aがfull column rankであることを示し、extension inversionを一意にします。Step 6では識別されたpとGへBayes則を適用し、WとXを条件とするlatent class distributionを得ます。</w:t>
+        <w:t>Step 5では補題3.1を使い、GとM aのKhatri–Rao積が列フルランクだと示します。これで、残りの項目の測定核を求める線形の式が、一つに解けます。</w:t>
+      </w:r>
+    </w:p>
+    <w:p>
+      <w:pPr>
+        <w:keepLines/>
+      </w:pPr>
+      <w:r>
+        <w:t>Step 6では、既に分かったpとGにベイズ則を使います。クラスごとのWの分布から、今度はWとXが与えられたときのクラス比率を求めます。これがQ Fです。</w:t>
       </w:r>
     </w:p>
     <w:p>
@@ -1510,7 +1640,15 @@
         <w:keepLines/>
       </w:pPr>
       <w:r>
-        <w:t>Step 7では各extension tensorを線形反転して全measurement kernels M jを識別します。Step 8では識別されたlatent weightsとmeasurement kernelsを局所独立モデルへ代入し、一度も同時観測されていない項目集合のjoint lawを構成します。</w:t>
+        <w:t>Step 7では、各extensionのテンソルから、残りのM jを順に解きます。これで全項目の測定核がそろいます。</w:t>
+      </w:r>
+    </w:p>
+    <w:p>
+      <w:pPr>
+        <w:keepLines/>
+      </w:pPr>
+      <w:r>
+        <w:t>最後のStep 8では、その測定核と潜在クラスの比率を、局所独立モデルの式に戻します。すると、一度も同時に観測されていない項目の組合せについても、モデルの下で同時分布を作れます。ここまでで、回復と分解がつながります。</w:t>
       </w:r>
     </w:p>
     <w:p>
@@ -1531,7 +1669,7 @@
         <w:keepLines/>
       </w:pPr>
       <w:r>
-        <w:t>候補となるMissing IV、latent shifter、covariates、anchor itemsの割当てについて、relevance、finite complete-case operatorのrank、supported-block positivity、third-mode rank、anchor separationを診断できます。冗長なblocksから得られるmeasurement kernelsの一致はoveridentifying restrictionになります。</w:t>
+        <w:t>応用では、どの変数をMissing IV、W、通常共変量、anchorにするかを決めます。その割当てについて、データで確認できる部分もあります。たとえばZの関連の強さ、有限カテゴリでのcomplete-case行列のランク、必要なblockが観測される確率、Wのviewのランク、anchorの分離です。</w:t>
       </w:r>
     </w:p>
     <w:p>
@@ -1539,7 +1677,7 @@
         <w:keepLines/>
       </w:pPr>
       <w:r>
-        <w:t>ただし、診断に適合するだけでMissing IV exclusion、measurement exclusion、局所独立性が検証されたとはいえません。不適合は候補設計を反証できますが、適合は全仮定の正しさを保証しません。</w:t>
+        <w:t>余分なblockも回復できれば、別のblockから求めた測定核が一致するかも調べられます。ただし、これらを通過しただけで、Missing IVの除外制約や測定モデルの除外制約、局所独立性まで正しいとは言えません。合わなければ設計を疑えますが、合えば全て証明できる、というものではありません。</w:t>
       </w:r>
     </w:p>
     <w:p>
@@ -1560,7 +1698,7 @@
         <w:keepLines/>
       </w:pPr>
       <w:r>
-        <w:t>WとYの周辺モデルにはAllman、Matias and Rhodesの有限product mixtureを用い、数値は本研究で設定しています。class比率は0.55と0.45、G fはFを条件としたWの分布です。class labelsはY 1の測定確率の小さい順に固定します。</w:t>
+        <w:t>こちらは、シミュレーションの具体的な設定です。WとYのモデルの形は、Allman、Matias、Rhodesの有限クラスのproduct mixtureに沿っています。ただし、数値は本研究で決めています。クラス比率は0.55と0.45です。G fはクラスごとのWの分布で、ラベルはY 1が1となる確率の小さい順にそろえます。</w:t>
       </w:r>
     </w:p>
     <w:p>
@@ -1568,7 +1706,7 @@
         <w:keepLines/>
       </w:pPr>
       <w:r>
-        <w:t>Y 1は常時観測されます。Y 2とY 3の観測確率は自身、Y 1、およびinteractionに依存するlogistic式で、各項目の平均観測率が70 percentとなるよう切片を調整します。全三項目の平均観測率は80 percentです。Z Sはpairの四つのcellに依存するfull-rank行列Hで生成し、常時観測します。</w:t>
+        <w:t>Y 1はいつも観測されます。Y 2とY 3は、自分自身の値、Y 1、その交互作用に依存するlogistic式で観測を決めます。切片を調整し、それぞれの平均観測率を70パーセントにします。Y 1の100パーセントと合わせて、三項目平均で80パーセントです。Z Sは、ペアの四つのセルに依存するフルランクの行列Hから作り、いつも観測します。</w:t>
       </w:r>
     </w:p>
     <w:p>
@@ -1576,7 +1714,7 @@
         <w:keepLines/>
       </w:pPr>
       <w:r>
-        <w:t>有限supportを全列挙した母集団で検証すると、各Wの下でcomplete-case operatorのrankは4、三つのviewのKruskal rankの和は6、extension inversionのrankは2です。改訂した仮定4では、FとWの下でY SとZ Sが独立という強い条件は不要です。これらは識別条件の確認であり、推定量の全正則条件を数値的に証明するものではありません。</w:t>
+        <w:t>取り得る値を全て並べ、母集団で条件も確認しています。各Wの下でcomplete-caseの行列のランクは4、三つのviewのKruskal rankの和は6、extensionを解く行列のランクは2でした。FとWの下でY SとZ Sまで独立にする必要はありません。これは識別条件の確認であって、推定に必要な正則条件を全て数値的に証明した、という意味ではありません。</w:t>
       </w:r>
     </w:p>
     <w:sectPr>

</xml_diff>

<commit_message>
Distribute related literature across introductory slides
</commit_message>
<xml_diff>
--- a/manuscript/vector_missing_iv_presentation_script_ja.docx
+++ b/manuscript/vector_missing_iv_presentation_script_ja.docx
@@ -25,7 +25,7 @@
     </w:p>
     <w:p>
       <w:r>
-        <w:t>英語Beamer全46枚に対応した、日本語の発表原稿です。欠測した人も含む分布をまず回復し、その後で潜在クラスの比率と測定核を分ける、という流れで説明します。各スライドの仮定と数値は残し、本編では証明の流れを、Appendixでは8ステップの詳細を説明します。</w:t>
+        <w:t>英語Beamer全47枚に対応した、日本語の発表原稿です。欠測した人も含む分布をまず回復し、その後で潜在クラスの比率と測定核を分ける、という流れで説明します。各スライドの仮定と数値は残し、本編では証明の流れを、Appendixでは8ステップの詳細を説明します。</w:t>
       </w:r>
     </w:p>
     <w:p>
@@ -130,7 +130,7 @@
                 <w:color w:val="000000"/>
                 <w:sz w:val="21"/>
               </w:rPr>
-              <w:t>Slides 8–18</w:t>
+              <w:t>Slides 8–19</w:t>
             </w:r>
           </w:p>
         </w:tc>
@@ -162,7 +162,7 @@
                 <w:color w:val="000000"/>
                 <w:sz w:val="21"/>
               </w:rPr>
-              <w:t>Slides 19–26</w:t>
+              <w:t>Slides 20–27</w:t>
             </w:r>
           </w:p>
         </w:tc>
@@ -194,7 +194,7 @@
                 <w:color w:val="000000"/>
                 <w:sz w:val="21"/>
               </w:rPr>
-              <w:t>Slides 27–40</w:t>
+              <w:t>Slides 28–41</w:t>
             </w:r>
           </w:p>
         </w:tc>
@@ -226,7 +226,7 @@
                 <w:color w:val="000000"/>
                 <w:sz w:val="21"/>
               </w:rPr>
-              <w:t>Appendix 41–46</w:t>
+              <w:t>Appendix 42–47</w:t>
             </w:r>
           </w:p>
         </w:tc>
@@ -347,6 +347,14 @@
         <w:keepLines/>
       </w:pPr>
       <w:r>
+        <w:t>この考え方の背景にあるのが、ここに挙げた三つの研究です。d’Haultfoeuilleは、条件付きモーメントの式から母集団の分布を識別します。ZhaoとShaoは共変量を調整した除外制約の下で、GLMのパラメータを識別します。Miaoらはshadow variableによる識別を扱い、観測されたcomplete-caseの分布でcompletenessを考えます。三つとも、識別の対象や条件が全く同じというわけではありません。</w:t>
+      </w:r>
+    </w:p>
+    <w:p>
+      <w:pPr>
+        <w:keepLines/>
+      </w:pPr>
+      <w:r>
         <w:t>あとは、その逆数で観測された人を重み付けします。たとえば観測確率が半分なら、重みは2です。観測されにくい人に大きな重みを付けて、欠測した人も含む母集団全体のYの分布を回復する、という考え方です。</w:t>
       </w:r>
     </w:p>
@@ -389,23 +397,23 @@
     </w:p>
     <w:p>
       <w:pPr>
-        <w:spacing w:after="20"/>
-      </w:pPr>
-    </w:p>
-    <w:p>
-      <w:pPr>
-        <w:pStyle w:val="Heading1"/>
+        <w:keepLines/>
       </w:pPr>
       <w:r>
-        <w:t>Slide 5  Related identification results</w:t>
+        <w:t>一方、潜在変数とMNARを一緒に扱うモデルや推定の研究もあります。Muthénら、HolmanとGlas、LeeとTang、HarelとSchafer、Jungら、Kuhaらがこの流れです。KanoとTakaiは、通常のSEMの識別制約を置いた上での線形モデルの推定を扱っています。近年はXieらのように、深層潜在変数モデルを使う研究もあります。なので、潜在変数と欠測を一緒に扱うこと自体が、新しいわけではありません。</w:t>
       </w:r>
     </w:p>
     <w:p>
       <w:pPr>
-        <w:keepLines/>
+        <w:spacing w:after="20"/>
+      </w:pPr>
+    </w:p>
+    <w:p>
+      <w:pPr>
+        <w:pStyle w:val="Heading1"/>
       </w:pPr>
       <w:r>
-        <w:t>関連研究は、ここでは三つの流れに分けています。一つ目は、d’HaultfoeuilleやZhaoとShaoらのMissing IVです。二つ目は、TangらやNiとShaoらの、複数項目のMNARを扱う研究です。欠測パターンや項目ごとの欠測に、どのような制約を置くかを考えています。</w:t>
+        <w:t>Slide 5  Multivariate MNAR and the remaining gap</w:t>
       </w:r>
     </w:p>
     <w:p>
@@ -413,7 +421,7 @@
         <w:keepLines/>
       </w:pPr>
       <w:r>
-        <w:t>三つ目が潜在構造です。Allmanらはテンソル分解の一意性を扱っています。また、Muthénら、LeeとTang、Jungら、KanoとTakai、Kuhaらなど、潜在変数とMNARを一緒に扱う研究も既にあります。近年はXieらの深層学習を使う研究もあります。</w:t>
+        <w:t>もう一つが、複数項目のMNARを扱う研究です。Tangらは、complete-caseの条件付き分布を使って、多変量の回帰パラメータを識別します。SadinleとReiterは、項目ごとの条件付き独立な欠測を考え、外部IVを使わずに多変量のfull-data lawを識別する流れです。</w:t>
       </w:r>
     </w:p>
     <w:p>
@@ -421,28 +429,73 @@
         <w:keepLines/>
       </w:pPr>
       <w:r>
-        <w:t>ですので、新しいのは潜在変数とMNARを一緒に扱うこと自体ではありません。欠測モデルのパラメトリックな形を決めずにblockの分布を回復し、それを共通のラベルを持つ潜在構造につなぐ。この二段階を、一つの識別定理として示す点です。</w:t>
+        <w:t>Liらはself-censoringのモデルとcompletenessを、NiとShaoはnonresponse instrumentとパラメトリックな観測確率を使います。研究によって、分布全体、回帰パラメータ、母集団の要約量と、知りたい対象が違います。</w:t>
       </w:r>
     </w:p>
     <w:p>
       <w:pPr>
-        <w:spacing w:after="20"/>
-      </w:pPr>
-    </w:p>
-    <w:p>
-      <w:pPr>
-        <w:pStyle w:val="Heading1"/>
+        <w:keepLines/>
       </w:pPr>
       <w:r>
-        <w:t>Slide 6  Proposed two-stage identification</w:t>
+        <w:t>ここで本稿が考えるのは、その先です。欠測を補正してYの分布が分かっても、それだけでQ Fと各Q jが別々に分かるわけではありません。MNARの下での分布の回復を、潜在クラス比率と測定核の一意な分解へ、どうつなぐか。ここが今回の問題です。</w:t>
       </w:r>
     </w:p>
     <w:p>
       <w:pPr>
+        <w:spacing w:after="20"/>
+      </w:pPr>
+    </w:p>
+    <w:p>
+      <w:pPr>
+        <w:pStyle w:val="Heading1"/>
+      </w:pPr>
+      <w:r>
+        <w:t>Slide 6  Motivation and objective</w:t>
+      </w:r>
+    </w:p>
+    <w:p>
+      <w:pPr>
         <w:keepLines/>
       </w:pPr>
       <w:r>
-        <w:t>先に、本研究の流れをお見せします。第一段階は、欠測した人も含めたblockの分布を回復することです。ZhaoとShaoの除外制約と、d’Haultfoeuilleの条件付きモーメントの式を使います。欠測確率を特定のパラメトリックな形に決める必要はありません。</w:t>
+        <w:t>たとえば、認知機能の検査を最後まで受けられない人がいる場合を考えます。ほかにも、パーキンソン病の運動機能や認知機能、バイオマーカーが一部の人だけで測られる場合や、重症度によって検査が選ばれる場合があります。答えにくい質問だけが欠測する、という場面もあります。これらは、今回の枠組みで考えたい応用例です。</w:t>
+      </w:r>
+    </w:p>
+    <w:p>
+      <w:pPr>
+        <w:keepLines/>
+      </w:pPr>
+      <w:r>
+        <w:t>こうした場面では、各項目の平均や分布だけでなく、背後にあるクラスの構成と、そのクラスが各項目にどう表れるかを分けて知りたいわけです。それがQ FとQ jです。観測された項目の分布だけを比べても、この二つは区別できません。</w:t>
+      </w:r>
+    </w:p>
+    <w:p>
+      <w:pPr>
+        <w:keepLines/>
+      </w:pPr>
+      <w:r>
+        <w:t>そこで、有限潜在クラスの比率と全項目の測定核を、共通のラベルの下で識別することを目指します。特定のパラメトリックな欠測モデルや、全項目がそろうcomplete caseは要求せず、必要なblockで回復して、それらをつなぎます。さらに、bridgeで重み付けした推定量を作ります。新規性は、この回復と分解の接続を、一つの識別定理として示す点にあります。</w:t>
+      </w:r>
+    </w:p>
+    <w:p>
+      <w:pPr>
+        <w:spacing w:after="20"/>
+      </w:pPr>
+    </w:p>
+    <w:p>
+      <w:pPr>
+        <w:pStyle w:val="Heading1"/>
+      </w:pPr>
+      <w:r>
+        <w:t>Slide 7  Proposed two-stage identification</w:t>
+      </w:r>
+    </w:p>
+    <w:p>
+      <w:pPr>
+        <w:keepLines/>
+      </w:pPr>
+      <w:r>
+        <w:t>この目的に対して、二段階で進めます。第一段階は、欠測した人も含めたblockの分布を回復することです。ZhaoとShaoの除外制約と、d’Haultfoeuilleの条件付きモーメントの式を使います。欠測確率を特定のパラメトリックな形に決める必要はありません。</w:t>
       </w:r>
     </w:p>
     <w:p>
@@ -463,7 +516,7 @@
         <w:pStyle w:val="Heading1"/>
       </w:pPr>
       <w:r>
-        <w:t>Slide 7  Model and assumptions</w:t>
+        <w:t>Slide 8  Model and assumptions</w:t>
       </w:r>
     </w:p>
     <w:p>
@@ -484,7 +537,7 @@
         <w:pStyle w:val="Heading1"/>
       </w:pPr>
       <w:r>
-        <w:t>Slide 8  A latent shifter is not a Missing IV</w:t>
+        <w:t>Slide 9  A latent shifter is not a Missing IV</w:t>
       </w:r>
     </w:p>
     <w:p>
@@ -513,7 +566,7 @@
         <w:pStyle w:val="Heading1"/>
       </w:pPr>
       <w:r>
-        <w:t>Slide 9  Assumption 1</w:t>
+        <w:t>Slide 10  Assumption 1</w:t>
       </w:r>
     </w:p>
     <w:p>
@@ -542,7 +595,7 @@
         <w:pStyle w:val="Heading1"/>
       </w:pPr>
       <w:r>
-        <w:t>Slide 10  Assumptions 2 and 3</w:t>
+        <w:t>Slide 11  Assumptions 2 and 3</w:t>
       </w:r>
     </w:p>
     <w:p>
@@ -571,7 +624,7 @@
         <w:pStyle w:val="Heading1"/>
       </w:pPr>
       <w:r>
-        <w:t>Slide 11  Assumption 4</w:t>
+        <w:t>Slide 12  Assumption 4</w:t>
       </w:r>
     </w:p>
     <w:p>
@@ -608,7 +661,7 @@
         <w:pStyle w:val="Heading1"/>
       </w:pPr>
       <w:r>
-        <w:t>Slide 12  A simple multivariate extension</w:t>
+        <w:t>Slide 13  A simple multivariate extension</w:t>
       </w:r>
     </w:p>
     <w:p>
@@ -637,7 +690,7 @@
         <w:pStyle w:val="Heading1"/>
       </w:pPr>
       <w:r>
-        <w:t>Slide 13  Assumption 5</w:t>
+        <w:t>Slide 14  Assumption 5</w:t>
       </w:r>
     </w:p>
     <w:p>
@@ -666,7 +719,7 @@
         <w:pStyle w:val="Heading1"/>
       </w:pPr>
       <w:r>
-        <w:t>Slide 14  Two marginal views of the model</w:t>
+        <w:t>Slide 15  Two marginal views of the model</w:t>
       </w:r>
     </w:p>
     <w:p>
@@ -703,7 +756,7 @@
         <w:pStyle w:val="Heading1"/>
       </w:pPr>
       <w:r>
-        <w:t>Slide 15  Overlapping supported blocks replace global complete cases</w:t>
+        <w:t>Slide 16  Overlapping supported blocks replace global complete cases</w:t>
       </w:r>
     </w:p>
     <w:p>
@@ -732,7 +785,7 @@
         <w:pStyle w:val="Heading1"/>
       </w:pPr>
       <w:r>
-        <w:t>Slide 16  Assumptions 6 and 7</w:t>
+        <w:t>Slide 17  Assumptions 6 and 7</w:t>
       </w:r>
     </w:p>
     <w:p>
@@ -769,7 +822,7 @@
         <w:pStyle w:val="Heading1"/>
       </w:pPr>
       <w:r>
-        <w:t>Slide 17  New Proposition 1</w:t>
+        <w:t>Slide 18  New Proposition 1</w:t>
       </w:r>
     </w:p>
     <w:p>
@@ -806,7 +859,7 @@
         <w:pStyle w:val="Heading1"/>
       </w:pPr>
       <w:r>
-        <w:t>Slide 18  Proof sketch the observable bridge is unique</w:t>
+        <w:t>Slide 19  Proof sketch the observable bridge is unique</w:t>
       </w:r>
     </w:p>
     <w:p>
@@ -835,7 +888,7 @@
         <w:pStyle w:val="Heading1"/>
       </w:pPr>
       <w:r>
-        <w:t>Slide 19  Finite latent-class identification</w:t>
+        <w:t>Slide 20  Finite latent-class identification</w:t>
       </w:r>
     </w:p>
     <w:p>
@@ -856,7 +909,7 @@
         <w:pStyle w:val="Heading1"/>
       </w:pPr>
       <w:r>
-        <w:t>Slide 20  The remaining decomposition problem</w:t>
+        <w:t>Slide 21  The remaining decomposition problem</w:t>
       </w:r>
     </w:p>
     <w:p>
@@ -893,7 +946,7 @@
         <w:pStyle w:val="Heading1"/>
       </w:pPr>
       <w:r>
-        <w:t>Slide 21  Identification strategy</w:t>
+        <w:t>Slide 22  Identification strategy</w:t>
       </w:r>
     </w:p>
     <w:p>
@@ -922,7 +975,7 @@
         <w:pStyle w:val="Heading1"/>
       </w:pPr>
       <w:r>
-        <w:t>Slide 22  Assumption 3.1: Support and model</w:t>
+        <w:t>Slide 23  Assumption 3.1: Support and model</w:t>
       </w:r>
     </w:p>
     <w:p>
@@ -951,7 +1004,7 @@
         <w:pStyle w:val="Heading1"/>
       </w:pPr>
       <w:r>
-        <w:t>Slide 23  Assumption 3.1: Rank and labels</w:t>
+        <w:t>Slide 24  Assumption 3.1: Rank and labels</w:t>
       </w:r>
     </w:p>
     <w:p>
@@ -988,7 +1041,7 @@
         <w:pStyle w:val="Heading1"/>
       </w:pPr>
       <w:r>
-        <w:t>Slide 24  Lemma 3.1</w:t>
+        <w:t>Slide 25  Lemma 3.1</w:t>
       </w:r>
     </w:p>
     <w:p>
@@ -1017,7 +1070,7 @@
         <w:pStyle w:val="Heading1"/>
       </w:pPr>
       <w:r>
-        <w:t>Slide 25  New Theorem 1</w:t>
+        <w:t>Slide 26  New Theorem 1</w:t>
       </w:r>
     </w:p>
     <w:p>
@@ -1046,7 +1099,7 @@
         <w:pStyle w:val="Heading1"/>
       </w:pPr>
       <w:r>
-        <w:t>Slide 26  Proof map for Theorem 1</w:t>
+        <w:t>Slide 27  Proof map for Theorem 1</w:t>
       </w:r>
     </w:p>
     <w:p>
@@ -1075,7 +1128,7 @@
         <w:pStyle w:val="Heading1"/>
       </w:pPr>
       <w:r>
-        <w:t>Slide 27  Bridge-weighted composite estimation</w:t>
+        <w:t>Slide 28  Bridge-weighted composite estimation</w:t>
       </w:r>
     </w:p>
     <w:p>
@@ -1104,7 +1157,7 @@
         <w:pStyle w:val="Heading1"/>
       </w:pPr>
       <w:r>
-        <w:t>Slide 28  Conditions for estimation</w:t>
+        <w:t>Slide 29  Conditions for estimation</w:t>
       </w:r>
     </w:p>
     <w:p>
@@ -1133,7 +1186,7 @@
         <w:pStyle w:val="Heading1"/>
       </w:pPr>
       <w:r>
-        <w:t>Slide 29  Assumption 5.1: Regularity</w:t>
+        <w:t>Slide 30  Assumption 5.1: Regularity</w:t>
       </w:r>
     </w:p>
     <w:p>
@@ -1170,7 +1223,7 @@
         <w:pStyle w:val="Heading1"/>
       </w:pPr>
       <w:r>
-        <w:t>Slide 30  Assumption 5.1: Uniform convergence</w:t>
+        <w:t>Slide 31  Assumption 5.1: Uniform convergence</w:t>
       </w:r>
     </w:p>
     <w:p>
@@ -1199,7 +1252,7 @@
         <w:pStyle w:val="Heading1"/>
       </w:pPr>
       <w:r>
-        <w:t>Slide 31  Assumption 5.1: First stage and separation</w:t>
+        <w:t>Slide 32  Assumption 5.1: First stage and separation</w:t>
       </w:r>
     </w:p>
     <w:p>
@@ -1236,7 +1289,7 @@
         <w:pStyle w:val="Heading1"/>
       </w:pPr>
       <w:r>
-        <w:t>Slide 32  Theorem 5.1</w:t>
+        <w:t>Slide 33  Theorem 5.1</w:t>
       </w:r>
     </w:p>
     <w:p>
@@ -1273,7 +1326,7 @@
         <w:pStyle w:val="Heading1"/>
       </w:pPr>
       <w:r>
-        <w:t>Slide 33  Computation</w:t>
+        <w:t>Slide 34  Computation</w:t>
       </w:r>
     </w:p>
     <w:p>
@@ -1302,7 +1355,7 @@
         <w:pStyle w:val="Heading1"/>
       </w:pPr>
       <w:r>
-        <w:t>Slide 34  Simulation targets in the model</w:t>
+        <w:t>Slide 35  Simulation targets in the model</w:t>
       </w:r>
     </w:p>
     <w:p>
@@ -1339,7 +1392,7 @@
         <w:pStyle w:val="Heading1"/>
       </w:pPr>
       <w:r>
-        <w:t>Slide 35  Simulation design: estimators and evaluation</w:t>
+        <w:t>Slide 36  Simulation design: estimators and evaluation</w:t>
       </w:r>
     </w:p>
     <w:p>
@@ -1384,7 +1437,7 @@
         <w:pStyle w:val="Heading1"/>
       </w:pPr>
       <w:r>
-        <w:t>Slide 36  Population outcome recovery</w:t>
+        <w:t>Slide 37  Population outcome recovery</w:t>
       </w:r>
     </w:p>
     <w:p>
@@ -1429,7 +1482,7 @@
         <w:pStyle w:val="Heading1"/>
       </w:pPr>
       <w:r>
-        <w:t>Slide 37  Stage-2 full joint law</w:t>
+        <w:t>Slide 38  Stage-2 full joint law</w:t>
       </w:r>
     </w:p>
     <w:p>
@@ -1458,7 +1511,7 @@
         <w:pStyle w:val="Heading1"/>
       </w:pPr>
       <w:r>
-        <w:t>Slide 38  Latent-parameter recovery</w:t>
+        <w:t>Slide 39  Latent-parameter recovery</w:t>
       </w:r>
     </w:p>
     <w:p>
@@ -1487,7 +1540,7 @@
         <w:pStyle w:val="Heading1"/>
       </w:pPr>
       <w:r>
-        <w:t>Slide 39  Conclusion and limits</w:t>
+        <w:t>Slide 40  Conclusion and limits</w:t>
       </w:r>
     </w:p>
     <w:p>
@@ -1524,7 +1577,7 @@
         <w:pStyle w:val="Heading1"/>
       </w:pPr>
       <w:r>
-        <w:t>Slide 40  Selected references</w:t>
+        <w:t>Slide 41  Selected references</w:t>
       </w:r>
     </w:p>
     <w:p>
@@ -1545,7 +1598,7 @@
         <w:pStyle w:val="Heading1"/>
       </w:pPr>
       <w:r>
-        <w:t>Appendix Slide 41  Proof of Theorem 1 (Steps 1--2)</w:t>
+        <w:t>Appendix Slide 42  Proof of Theorem 1 (Steps 1--2)</w:t>
       </w:r>
     </w:p>
     <w:p>
@@ -1574,7 +1627,7 @@
         <w:pStyle w:val="Heading1"/>
       </w:pPr>
       <w:r>
-        <w:t>Appendix Slide 42  Proof of Theorem 1 (Steps 3--4)</w:t>
+        <w:t>Appendix Slide 43  Proof of Theorem 1 (Steps 3--4)</w:t>
       </w:r>
     </w:p>
     <w:p>
@@ -1603,7 +1656,7 @@
         <w:pStyle w:val="Heading1"/>
       </w:pPr>
       <w:r>
-        <w:t>Appendix Slide 43  Proof of Theorem 1 (Steps 5--6)</w:t>
+        <w:t>Appendix Slide 44  Proof of Theorem 1 (Steps 5--6)</w:t>
       </w:r>
     </w:p>
     <w:p>
@@ -1632,7 +1685,7 @@
         <w:pStyle w:val="Heading1"/>
       </w:pPr>
       <w:r>
-        <w:t>Appendix Slide 44  Proof of Theorem 1 (Steps 7--8)</w:t>
+        <w:t>Appendix Slide 45  Proof of Theorem 1 (Steps 7--8)</w:t>
       </w:r>
     </w:p>
     <w:p>
@@ -1661,7 +1714,7 @@
         <w:pStyle w:val="Heading1"/>
       </w:pPr>
       <w:r>
-        <w:t>Appendix Slide 45  Empirical diagnostics and falsification checks</w:t>
+        <w:t>Appendix Slide 46  Empirical diagnostics and falsification checks</w:t>
       </w:r>
     </w:p>
     <w:p>
@@ -1690,7 +1743,7 @@
         <w:pStyle w:val="Heading1"/>
       </w:pPr>
       <w:r>
-        <w:t>Appendix Slide 46  Simulation calibration</w:t>
+        <w:t>Appendix Slide 47  Simulation calibration</w:t>
       </w:r>
     </w:p>
     <w:p>

</xml_diff>

<commit_message>
Clarify selection motivation and synchronize identification diagrams
</commit_message>
<xml_diff>
--- a/manuscript/vector_missing_iv_presentation_script_ja.docx
+++ b/manuscript/vector_missing_iv_presentation_script_ja.docx
@@ -437,6 +437,22 @@
         <w:keepLines/>
       </w:pPr>
       <w:r>
+        <w:t>もう一つ、欠測モデルをどこまで決めるか、という問題があります。ZhaoとShaoが議論しているように、outcomeと欠測機構を含むモデル全体を正しく指定できれば、パラメトリックな尤度法は効率の面で有力です。ただし、selectionの関数形を間違えるとバイアスが出ます。そこで彼らは、outcomeのモデルを残しつつ、欠測機構は特定しない半パラメトリックな方法を考えています。</w:t>
+      </w:r>
+    </w:p>
+    <w:p>
+      <w:pPr>
+        <w:keepLines/>
+      </w:pPr>
+      <w:r>
+        <w:t>本稿でも、selectionの関数形を決めずにノンパラメトリックに分布を回復することを重視します。ただし、何も仮定しなくてよいという意味ではありません。Missing IVやcompletenessは必要です。後半で正指定と誤指定のselection likelihoodを比べるのも、この違いを見るためです。</w:t>
+      </w:r>
+    </w:p>
+    <w:p>
+      <w:pPr>
+        <w:keepLines/>
+      </w:pPr>
+      <w:r>
         <w:t>ここで本稿が考えるのは、その先です。欠測を補正してYの分布が分かっても、それだけでQ Fと各Q jが別々に分かるわけではありません。MNARの下での分布の回復を、潜在クラス比率と測定核の一意な分解へ、どうつなぐか。ここが今回の問題です。</w:t>
       </w:r>
     </w:p>
@@ -458,7 +474,7 @@
         <w:keepLines/>
       </w:pPr>
       <w:r>
-        <w:t>たとえば、認知機能の検査を最後まで受けられない人がいる場合を考えます。ほかにも、パーキンソン病の運動機能や認知機能、バイオマーカーが一部の人だけで測られる場合や、重症度によって検査が選ばれる場合があります。答えにくい質問だけが欠測する、という場面もあります。これらは、今回の枠組みで考えたい応用例です。</w:t>
+        <w:t>ここで、なぜ二つの識別をつなぐ必要があるのかを、本文の式5と6で見ます。Dはどの項目が見えたか、Wは潜在分布を動かす変数です。仮に、Y、F、Xを条件づけると、DとWは独立だとします。これが式5です。</w:t>
       </w:r>
     </w:p>
     <w:p>
@@ -466,7 +482,7 @@
         <w:keepLines/>
       </w:pPr>
       <w:r>
-        <w:t>こうした場面では、各項目の平均や分布だけでなく、背後にあるクラスの構成と、そのクラスが各項目にどう表れるかを分けて知りたいわけです。それがQ FとQ jです。観測された項目の分布だけを比べても、この二つは区別できません。</w:t>
+        <w:t>でもFは見えないので、平均して消す必要があります。すると式6の赤い部分、Y、W、Xを見た後のFの分布が残ります。この分布はWによって変わりうるので、積分した後までDとWが独立とは言えません。つまり、latent shifterのWを、そのままMissing IVとしては使えないわけです。</w:t>
       </w:r>
     </w:p>
     <w:p>
@@ -474,7 +490,7 @@
         <w:keepLines/>
       </w:pPr>
       <w:r>
-        <w:t>そこで、有限潜在クラスの比率と全項目の測定核を、共通のラベルの下で識別することを目指します。特定のパラメトリックな欠測モデルや、全項目がそろうcomplete caseは要求せず、必要なblockで回復して、それらをつなぎます。さらに、bridgeで重み付けした推定量を作ります。新規性は、この回復と分解の接続を、一つの識別定理として示す点にあります。</w:t>
+        <w:t>逆に、Missing IVでYの分布だけを回復しても、Q Fと各Q jへの分解が一つに決まるとは限りません。そこで、Stage 1の分布の回復と、Stage 2の潜在分解を接続します。selection modelの関数形を決めず、有限潜在クラスの比率と測定核を同時に識別するのが目的です。もちろん、有限クラスの測定モデル、ランクや共通ラベルの条件は置きます。この目的に対して、次のページで具体的な識別戦略を示します。</w:t>
       </w:r>
     </w:p>
     <w:p>
@@ -661,7 +677,7 @@
         <w:pStyle w:val="Heading1"/>
       </w:pPr>
       <w:r>
-        <w:t>Slide 13  A simple multivariate extension</w:t>
+        <w:t>Slide 13  Lemma 2.1</w:t>
       </w:r>
     </w:p>
     <w:p>
@@ -669,7 +685,7 @@
         <w:keepLines/>
       </w:pPr>
       <w:r>
-        <w:t>ここで、Yを一つの変数ではなく、複数項目のベクトルにしてみます。一番単純なのは、全項目がそろった人だけをcomplete caseとして使う方法です。各項目が見えたかをD jで表し、その積をRとします。</w:t>
+        <w:t>まず、Missing IVをベクトルYへそのまま広げる方法を、補題2.1として整理します。全項目がそろった人をcomplete caseとし、各D jの積をRとします。UはXとW、P 1はcomplete caseの中でのYとUの分布です。</w:t>
       </w:r>
     </w:p>
     <w:p>
@@ -677,7 +693,23 @@
         <w:keepLines/>
       </w:pPr>
       <w:r>
-        <w:t>ベクトルYに対しても、Missing IVとcompletenessの条件が成り立ち、対象となる値ごとの観測確率が正なら、同じ考え方で母集団分布を回復できます。ただ、項目が増えると全てがそろう人は少なくなります。そこで、全項目ではなく、小さな組ごとに回復する方法へ進みます。</w:t>
+        <w:t>条件は、YとUを押さえたときのRとZの独立性、対象全体で正の観測確率、それからcomplete-caseでのcompletenessです。正確には、観測確率の逆数と候補の逆数を、P 1の下で二乗平均が有限な関数に限ります。この範囲で、式を満たすパイが一つに決まります。</w:t>
+      </w:r>
+    </w:p>
+    <w:p>
+      <w:pPr>
+        <w:keepLines/>
+      </w:pPr>
+      <w:r>
+        <w:t>証明は、二つの解があるとして逆数の差を取ります。completenessでその差がゼロと分かり、positivityでその一致を母集団全体へ広げます。あとは逆確率で重み付けすれば、Y、Z、Uの分布を回復できます。</w:t>
+      </w:r>
+    </w:p>
+    <w:p>
+      <w:pPr>
+        <w:keepLines/>
+      </w:pPr>
+      <w:r>
+        <w:t>これは既存のMissing IVの直接の多次元拡張です。ただし、全項目がそろう確率が、対象全体で正である必要があります。そこで次に、この条件を小さなblockごとに置き直します。</w:t>
       </w:r>
     </w:p>
     <w:p>
@@ -735,7 +767,7 @@
         <w:keepLines/>
       </w:pPr>
       <w:r>
-        <w:t>下は、Fとblock外の項目について平均した図です。Y SとU Sが決まると、Z SとR Sが独立になる関係を表しています。ここでいうfull-data lawは、回答者だけでなく、欠測した人も含む母集団の分布です。図にY Sがあっても、全員で見えているという意味ではありません。</w:t>
+        <w:t>下は、Fとblock外の項目について平均した図です。Z SからY S、Y SからR Sへ矢印を引いています。Y SとU Sが決まると、Z SとR Sが独立になる関係です。ここでいうfull-data lawは、回答者だけでなく、欠測した人も含む母集団の分布です。図にY Sがあっても、全員で見えているという意味ではありません。</w:t>
       </w:r>
     </w:p>
     <w:p>
@@ -1363,7 +1395,15 @@
         <w:keepLines/>
       </w:pPr>
       <w:r>
-        <w:t>ここからシミュレーションです。Xは固定し、Fは二つのクラスとします。Fが決まると、Wと各Yを条件付き独立に作ります。その後、ペアの値Y SからZ SとR Sを作ります。Wと三つのYは全て二値です。Y 1はいつも見えているので、ペアが全部見えるかどうかは、もう一方のD jで決まります。</w:t>
+        <w:t>ここからシミュレーションです。Xは固定し、Fは二つのクラスとします。図の下は、Z SからY S、Y SからR Sという流れです。FからZ Sへも矢印があります。FとZ Sは関連するので、ここを独立にしてはいけません。Wと三つのYは全て二値です。Y 1はいつも見えているので、ペアが全部見えるかどうかは、もう一方のD jで決まります。</w:t>
+      </w:r>
+    </w:p>
+    <w:p>
+      <w:pPr>
+        <w:keepLines/>
+      </w:pPr>
+      <w:r>
+        <w:t>生成するときは、FとWの後に、Zの組を先に、Yの組を後に作ります。AがFの下でのZの分布、BがFとZの下でのYの分布です。最後に、そのYを使ってD 2とD 3を独立に生成します。ここはBayes則で書き直しているだけなので、欠測指標まで含めた同時分布は変わりません。Zについて平均すると、元の測定核の積に戻ります。図はそのうち一つのblockを示しています。</w:t>
       </w:r>
     </w:p>
     <w:p>
@@ -1759,7 +1799,15 @@
         <w:keepLines/>
       </w:pPr>
       <w:r>
-        <w:t>Y 1はいつも観測されます。Y 2とY 3は、自分自身の値、Y 1、その交互作用に依存するlogistic式で観測を決めます。切片を調整し、それぞれの平均観測率を70パーセントにします。Y 1の100パーセントと合わせて、三項目平均で80パーセントです。Z Sは、ペアの四つのセルに依存するフルランクの行列Hから作り、いつも観測します。</w:t>
+        <w:t>Y 1はいつも観測されます。Y 2とY 3は、自分自身の値、Y 1、その交互作用に依存するlogistic式で観測を決めます。切片を調整し、それぞれの平均観測率を70パーセントにします。Y 1の100パーセントと合わせて、三項目平均で80パーセントです。行列Hは、ペアの値とZ Sの関連を決めるためのものです。そこからBayes則でZを先に作る条件付き分布を計算します。Z Sは常に観測します。</w:t>
+      </w:r>
+    </w:p>
+    <w:p>
+      <w:pPr>
+        <w:keepLines/>
+      </w:pPr>
+      <w:r>
+        <w:t>今回掲載している100反復の結果は、同じ同時分布をY先行で生成したものです。Z先行の生成方法へ書き直しても、母集団の分布は変わりません。ただし、同じseedでも出てくる標本は変わるため、数値を完全に再現するための旧生成方法も残しています。生成順序を変えたことだけで、因果効果まで識別したという話ではありません。</w:t>
       </w:r>
     </w:p>
     <w:p>

</xml_diff>

<commit_message>
Merge latent-shifter discussion into motivation slide
</commit_message>
<xml_diff>
--- a/manuscript/vector_missing_iv_presentation_script_ja.docx
+++ b/manuscript/vector_missing_iv_presentation_script_ja.docx
@@ -25,7 +25,7 @@
     </w:p>
     <w:p>
       <w:r>
-        <w:t>英語Beamer全47枚に対応した、日本語の発表原稿です。欠測した人も含む分布をまず回復し、その後で潜在クラスの比率と測定核を分ける、という流れで説明します。各スライドの仮定と数値は残し、本編では証明の流れを、Appendixでは8ステップの詳細を説明します。</w:t>
+        <w:t>英語Beamer全46枚に対応した、日本語の発表原稿です。欠測した人も含む分布をまず回復し、その後で潜在クラスの比率と測定核を分ける、という流れで説明します。各スライドの仮定と数値は残し、本編では証明の流れを、Appendixでは8ステップの詳細を説明します。</w:t>
       </w:r>
     </w:p>
     <w:p>
@@ -130,7 +130,7 @@
                 <w:color w:val="000000"/>
                 <w:sz w:val="21"/>
               </w:rPr>
-              <w:t>Slides 8–19</w:t>
+              <w:t>Slides 8–18</w:t>
             </w:r>
           </w:p>
         </w:tc>
@@ -162,7 +162,7 @@
                 <w:color w:val="000000"/>
                 <w:sz w:val="21"/>
               </w:rPr>
-              <w:t>Slides 20–27</w:t>
+              <w:t>Slides 19–26</w:t>
             </w:r>
           </w:p>
         </w:tc>
@@ -194,7 +194,7 @@
                 <w:color w:val="000000"/>
                 <w:sz w:val="21"/>
               </w:rPr>
-              <w:t>Slides 28–41</w:t>
+              <w:t>Slides 27–40</w:t>
             </w:r>
           </w:p>
         </w:tc>
@@ -226,7 +226,7 @@
                 <w:color w:val="000000"/>
                 <w:sz w:val="21"/>
               </w:rPr>
-              <w:t>Appendix 42–47</w:t>
+              <w:t>Appendix 41–46</w:t>
             </w:r>
           </w:p>
         </w:tc>
@@ -490,6 +490,14 @@
         <w:keepLines/>
       </w:pPr>
       <w:r>
+        <w:t>右側で二つの役割を分けています。Z SはY Sと関連し、Y Sと共変量を押さえると欠測指標R Sとは独立になる変数です。これを使って、第一段階で欠測による偏りを補正します。一方、WはFの分布を動かし、第二段階で潜在構造を分けるための三つ目のviewを与えます。</w:t>
+      </w:r>
+    </w:p>
+    <w:p>
+      <w:pPr>
+        <w:keepLines/>
+      </w:pPr>
+      <w:r>
         <w:t>逆に、Missing IVでYの分布だけを回復しても、Q Fと各Q jへの分解が一つに決まるとは限りません。そこで、Stage 1の分布の回復と、Stage 2の潜在分解を接続します。selection modelの関数形を決めず、有限潜在クラスの比率と測定核を同時に識別するのが目的です。もちろん、有限クラスの測定モデル、ランクや共通ラベルの条件は置きます。この目的に対して、次のページで具体的な識別戦略を示します。</w:t>
       </w:r>
     </w:p>
@@ -553,36 +561,7 @@
         <w:pStyle w:val="Heading1"/>
       </w:pPr>
       <w:r>
-        <w:t>Slide 9  A latent shifter is not a Missing IV</w:t>
-      </w:r>
-    </w:p>
-    <w:p>
-      <w:pPr>
-        <w:keepLines/>
-      </w:pPr>
-      <w:r>
-        <w:t>ここは少し注意が必要です。潜在分布を動かすWと、欠測を補正するZ Sは、同じ役割ではありません。Fまで条件づけるとDとWが独立でも、Fを平均して消すと、Y、W、Xの下でのFの分布が式に残ります。この分布は、一般にはWによって変わります。</w:t>
-      </w:r>
-    </w:p>
-    <w:p>
-      <w:pPr>
-        <w:keepLines/>
-      </w:pPr>
-      <w:r>
-        <w:t>つまり、Wがlatent shifterだからといって、そのままMissing IVに使えるわけではありません。Z Sは欠測による偏りを取り除くために使います。Wは、その後の分布を潜在構造に分けるとき、三つ目のviewとして使います。まず回復して、その後で分解する、という順番になります。</w:t>
-      </w:r>
-    </w:p>
-    <w:p>
-      <w:pPr>
-        <w:spacing w:after="20"/>
-      </w:pPr>
-    </w:p>
-    <w:p>
-      <w:pPr>
-        <w:pStyle w:val="Heading1"/>
-      </w:pPr>
-      <w:r>
-        <w:t>Slide 10  Assumption 1</w:t>
+        <w:t>Slide 9  Assumption 1</w:t>
       </w:r>
     </w:p>
     <w:p>
@@ -611,7 +590,7 @@
         <w:pStyle w:val="Heading1"/>
       </w:pPr>
       <w:r>
-        <w:t>Slide 11  Assumptions 2 and 3</w:t>
+        <w:t>Slide 10  Assumptions 2 and 3</w:t>
       </w:r>
     </w:p>
     <w:p>
@@ -640,7 +619,7 @@
         <w:pStyle w:val="Heading1"/>
       </w:pPr>
       <w:r>
-        <w:t>Slide 12  Assumption 4</w:t>
+        <w:t>Slide 11  Assumption 4</w:t>
       </w:r>
     </w:p>
     <w:p>
@@ -677,7 +656,7 @@
         <w:pStyle w:val="Heading1"/>
       </w:pPr>
       <w:r>
-        <w:t>Slide 13  Lemma 2.1</w:t>
+        <w:t>Slide 12  Lemma 2.1</w:t>
       </w:r>
     </w:p>
     <w:p>
@@ -722,7 +701,7 @@
         <w:pStyle w:val="Heading1"/>
       </w:pPr>
       <w:r>
-        <w:t>Slide 14  Assumption 5</w:t>
+        <w:t>Slide 13  Assumption 5</w:t>
       </w:r>
     </w:p>
     <w:p>
@@ -751,7 +730,7 @@
         <w:pStyle w:val="Heading1"/>
       </w:pPr>
       <w:r>
-        <w:t>Slide 15  Two marginal views of the model</w:t>
+        <w:t>Slide 14  Two marginal views of the model</w:t>
       </w:r>
     </w:p>
     <w:p>
@@ -788,7 +767,7 @@
         <w:pStyle w:val="Heading1"/>
       </w:pPr>
       <w:r>
-        <w:t>Slide 16  Overlapping supported blocks replace global complete cases</w:t>
+        <w:t>Slide 15  Overlapping supported blocks replace global complete cases</w:t>
       </w:r>
     </w:p>
     <w:p>
@@ -817,7 +796,7 @@
         <w:pStyle w:val="Heading1"/>
       </w:pPr>
       <w:r>
-        <w:t>Slide 17  Assumptions 6 and 7</w:t>
+        <w:t>Slide 16  Assumptions 6 and 7</w:t>
       </w:r>
     </w:p>
     <w:p>
@@ -854,7 +833,7 @@
         <w:pStyle w:val="Heading1"/>
       </w:pPr>
       <w:r>
-        <w:t>Slide 18  New Proposition 1</w:t>
+        <w:t>Slide 17  New Proposition 1</w:t>
       </w:r>
     </w:p>
     <w:p>
@@ -891,7 +870,7 @@
         <w:pStyle w:val="Heading1"/>
       </w:pPr>
       <w:r>
-        <w:t>Slide 19  Proof sketch the observable bridge is unique</w:t>
+        <w:t>Slide 18  Proof sketch the observable bridge is unique</w:t>
       </w:r>
     </w:p>
     <w:p>
@@ -920,7 +899,7 @@
         <w:pStyle w:val="Heading1"/>
       </w:pPr>
       <w:r>
-        <w:t>Slide 20  Finite latent-class identification</w:t>
+        <w:t>Slide 19  Finite latent-class identification</w:t>
       </w:r>
     </w:p>
     <w:p>
@@ -941,7 +920,7 @@
         <w:pStyle w:val="Heading1"/>
       </w:pPr>
       <w:r>
-        <w:t>Slide 21  The remaining decomposition problem</w:t>
+        <w:t>Slide 20  The remaining decomposition problem</w:t>
       </w:r>
     </w:p>
     <w:p>
@@ -978,7 +957,7 @@
         <w:pStyle w:val="Heading1"/>
       </w:pPr>
       <w:r>
-        <w:t>Slide 22  Identification strategy</w:t>
+        <w:t>Slide 21  Identification strategy</w:t>
       </w:r>
     </w:p>
     <w:p>
@@ -1007,7 +986,7 @@
         <w:pStyle w:val="Heading1"/>
       </w:pPr>
       <w:r>
-        <w:t>Slide 23  Assumption 3.1: Support and model</w:t>
+        <w:t>Slide 22  Assumption 3.1: Support and model</w:t>
       </w:r>
     </w:p>
     <w:p>
@@ -1036,7 +1015,7 @@
         <w:pStyle w:val="Heading1"/>
       </w:pPr>
       <w:r>
-        <w:t>Slide 24  Assumption 3.1: Rank and labels</w:t>
+        <w:t>Slide 23  Assumption 3.1: Rank and labels</w:t>
       </w:r>
     </w:p>
     <w:p>
@@ -1073,7 +1052,7 @@
         <w:pStyle w:val="Heading1"/>
       </w:pPr>
       <w:r>
-        <w:t>Slide 25  Lemma 3.1</w:t>
+        <w:t>Slide 24  Lemma 3.1</w:t>
       </w:r>
     </w:p>
     <w:p>
@@ -1102,7 +1081,7 @@
         <w:pStyle w:val="Heading1"/>
       </w:pPr>
       <w:r>
-        <w:t>Slide 26  New Theorem 1</w:t>
+        <w:t>Slide 25  New Theorem 1</w:t>
       </w:r>
     </w:p>
     <w:p>
@@ -1131,7 +1110,7 @@
         <w:pStyle w:val="Heading1"/>
       </w:pPr>
       <w:r>
-        <w:t>Slide 27  Proof map for Theorem 1</w:t>
+        <w:t>Slide 26  Proof map for Theorem 1</w:t>
       </w:r>
     </w:p>
     <w:p>
@@ -1160,7 +1139,7 @@
         <w:pStyle w:val="Heading1"/>
       </w:pPr>
       <w:r>
-        <w:t>Slide 28  Bridge-weighted composite estimation</w:t>
+        <w:t>Slide 27  Bridge-weighted composite estimation</w:t>
       </w:r>
     </w:p>
     <w:p>
@@ -1189,7 +1168,7 @@
         <w:pStyle w:val="Heading1"/>
       </w:pPr>
       <w:r>
-        <w:t>Slide 29  Conditions for estimation</w:t>
+        <w:t>Slide 28  Conditions for estimation</w:t>
       </w:r>
     </w:p>
     <w:p>
@@ -1218,7 +1197,7 @@
         <w:pStyle w:val="Heading1"/>
       </w:pPr>
       <w:r>
-        <w:t>Slide 30  Assumption 5.1: Regularity</w:t>
+        <w:t>Slide 29  Assumption 5.1: Regularity</w:t>
       </w:r>
     </w:p>
     <w:p>
@@ -1255,7 +1234,7 @@
         <w:pStyle w:val="Heading1"/>
       </w:pPr>
       <w:r>
-        <w:t>Slide 31  Assumption 5.1: Uniform convergence</w:t>
+        <w:t>Slide 30  Assumption 5.1: Uniform convergence</w:t>
       </w:r>
     </w:p>
     <w:p>
@@ -1284,7 +1263,7 @@
         <w:pStyle w:val="Heading1"/>
       </w:pPr>
       <w:r>
-        <w:t>Slide 32  Assumption 5.1: First stage and separation</w:t>
+        <w:t>Slide 31  Assumption 5.1: First stage and separation</w:t>
       </w:r>
     </w:p>
     <w:p>
@@ -1321,7 +1300,7 @@
         <w:pStyle w:val="Heading1"/>
       </w:pPr>
       <w:r>
-        <w:t>Slide 33  Theorem 5.1</w:t>
+        <w:t>Slide 32  Theorem 5.1</w:t>
       </w:r>
     </w:p>
     <w:p>
@@ -1358,7 +1337,7 @@
         <w:pStyle w:val="Heading1"/>
       </w:pPr>
       <w:r>
-        <w:t>Slide 34  Computation</w:t>
+        <w:t>Slide 33  Computation</w:t>
       </w:r>
     </w:p>
     <w:p>
@@ -1387,7 +1366,7 @@
         <w:pStyle w:val="Heading1"/>
       </w:pPr>
       <w:r>
-        <w:t>Slide 35  Simulation targets in the model</w:t>
+        <w:t>Slide 34  Simulation targets in the model</w:t>
       </w:r>
     </w:p>
     <w:p>
@@ -1432,7 +1411,7 @@
         <w:pStyle w:val="Heading1"/>
       </w:pPr>
       <w:r>
-        <w:t>Slide 36  Simulation design: estimators and evaluation</w:t>
+        <w:t>Slide 35  Simulation design: estimators and evaluation</w:t>
       </w:r>
     </w:p>
     <w:p>
@@ -1477,7 +1456,7 @@
         <w:pStyle w:val="Heading1"/>
       </w:pPr>
       <w:r>
-        <w:t>Slide 37  Population outcome recovery</w:t>
+        <w:t>Slide 36  Population outcome recovery</w:t>
       </w:r>
     </w:p>
     <w:p>
@@ -1522,7 +1501,7 @@
         <w:pStyle w:val="Heading1"/>
       </w:pPr>
       <w:r>
-        <w:t>Slide 38  Stage-2 full joint law</w:t>
+        <w:t>Slide 37  Stage-2 full joint law</w:t>
       </w:r>
     </w:p>
     <w:p>
@@ -1551,7 +1530,7 @@
         <w:pStyle w:val="Heading1"/>
       </w:pPr>
       <w:r>
-        <w:t>Slide 39  Latent-parameter recovery</w:t>
+        <w:t>Slide 38  Latent-parameter recovery</w:t>
       </w:r>
     </w:p>
     <w:p>
@@ -1580,7 +1559,7 @@
         <w:pStyle w:val="Heading1"/>
       </w:pPr>
       <w:r>
-        <w:t>Slide 40  Conclusion and limits</w:t>
+        <w:t>Slide 39  Conclusion and limits</w:t>
       </w:r>
     </w:p>
     <w:p>
@@ -1617,7 +1596,7 @@
         <w:pStyle w:val="Heading1"/>
       </w:pPr>
       <w:r>
-        <w:t>Slide 41  Selected references</w:t>
+        <w:t>Slide 40  Selected references</w:t>
       </w:r>
     </w:p>
     <w:p>
@@ -1638,7 +1617,7 @@
         <w:pStyle w:val="Heading1"/>
       </w:pPr>
       <w:r>
-        <w:t>Appendix Slide 42  Proof of Theorem 1 (Steps 1--2)</w:t>
+        <w:t>Appendix Slide 41  Proof of Theorem 1 (Steps 1--2)</w:t>
       </w:r>
     </w:p>
     <w:p>
@@ -1667,7 +1646,7 @@
         <w:pStyle w:val="Heading1"/>
       </w:pPr>
       <w:r>
-        <w:t>Appendix Slide 43  Proof of Theorem 1 (Steps 3--4)</w:t>
+        <w:t>Appendix Slide 42  Proof of Theorem 1 (Steps 3--4)</w:t>
       </w:r>
     </w:p>
     <w:p>
@@ -1696,7 +1675,7 @@
         <w:pStyle w:val="Heading1"/>
       </w:pPr>
       <w:r>
-        <w:t>Appendix Slide 44  Proof of Theorem 1 (Steps 5--6)</w:t>
+        <w:t>Appendix Slide 43  Proof of Theorem 1 (Steps 5--6)</w:t>
       </w:r>
     </w:p>
     <w:p>
@@ -1725,7 +1704,7 @@
         <w:pStyle w:val="Heading1"/>
       </w:pPr>
       <w:r>
-        <w:t>Appendix Slide 45  Proof of Theorem 1 (Steps 7--8)</w:t>
+        <w:t>Appendix Slide 44  Proof of Theorem 1 (Steps 7--8)</w:t>
       </w:r>
     </w:p>
     <w:p>
@@ -1754,7 +1733,7 @@
         <w:pStyle w:val="Heading1"/>
       </w:pPr>
       <w:r>
-        <w:t>Appendix Slide 46  Empirical diagnostics and falsification checks</w:t>
+        <w:t>Appendix Slide 45  Empirical diagnostics and falsification checks</w:t>
       </w:r>
     </w:p>
     <w:p>
@@ -1783,7 +1762,7 @@
         <w:pStyle w:val="Heading1"/>
       </w:pPr>
       <w:r>
-        <w:t>Appendix Slide 47  Simulation calibration</w:t>
+        <w:t>Appendix Slide 46  Simulation calibration</w:t>
       </w:r>
     </w:p>
     <w:p>

</xml_diff>

<commit_message>
Move proof sketches to presentation appendix
</commit_message>
<xml_diff>
--- a/manuscript/vector_missing_iv_presentation_script_ja.docx
+++ b/manuscript/vector_missing_iv_presentation_script_ja.docx
@@ -130,7 +130,7 @@
                 <w:color w:val="000000"/>
                 <w:sz w:val="21"/>
               </w:rPr>
-              <w:t>Slides 8–18</w:t>
+              <w:t>Slides 8–17</w:t>
             </w:r>
           </w:p>
         </w:tc>
@@ -162,7 +162,7 @@
                 <w:color w:val="000000"/>
                 <w:sz w:val="21"/>
               </w:rPr>
-              <w:t>Slides 19–26</w:t>
+              <w:t>Slides 18–24</w:t>
             </w:r>
           </w:p>
         </w:tc>
@@ -194,7 +194,7 @@
                 <w:color w:val="000000"/>
                 <w:sz w:val="21"/>
               </w:rPr>
-              <w:t>Slides 27–40</w:t>
+              <w:t>Slides 25–38</w:t>
             </w:r>
           </w:p>
         </w:tc>
@@ -226,7 +226,7 @@
                 <w:color w:val="000000"/>
                 <w:sz w:val="21"/>
               </w:rPr>
-              <w:t>Appendix 41–46</w:t>
+              <w:t>Appendix 39–46</w:t>
             </w:r>
           </w:p>
         </w:tc>
@@ -241,7 +241,7 @@
                 <w:color w:val="000000"/>
                 <w:sz w:val="21"/>
               </w:rPr>
-              <w:t>定理1の8ステップ、empirical diagnostics、数値設定</w:t>
+              <w:t>証明スケッチ、定理1の8ステップ、empirical diagnostics、数値設定</w:t>
             </w:r>
           </w:p>
         </w:tc>
@@ -680,14 +680,6 @@
         <w:keepLines/>
       </w:pPr>
       <w:r>
-        <w:t>証明は、二つの解があるとして逆数の差を取ります。completenessでその差がゼロと分かり、positivityでその一致を母集団全体へ広げます。あとは逆確率で重み付けすれば、Y、Z、Uの分布を回復できます。</w:t>
-      </w:r>
-    </w:p>
-    <w:p>
-      <w:pPr>
-        <w:keepLines/>
-      </w:pPr>
-      <w:r>
         <w:t>これは既存のMissing IVの直接の多次元拡張です。ただし、全項目がそろう確率が、対象全体で正である必要があります。そこで次に、この条件を小さなblockごとに置き直します。</w:t>
       </w:r>
     </w:p>
@@ -870,7 +862,696 @@
         <w:pStyle w:val="Heading1"/>
       </w:pPr>
       <w:r>
-        <w:t>Slide 18  Proof sketch the observable bridge is unique</w:t>
+        <w:t>Slide 18  Finite latent-class identification</w:t>
+      </w:r>
+    </w:p>
+    <w:p>
+      <w:pPr>
+        <w:keepLines/>
+      </w:pPr>
+      <w:r>
+        <w:t>ここから第二段階です。blockの分布が分かったとして、それを潜在クラスの比率と測定核に分けられるでしょうか。anchor itemsとWを使って、この分解が一つに決まる条件を考えます。</w:t>
+      </w:r>
+    </w:p>
+    <w:p>
+      <w:pPr>
+        <w:spacing w:after="20"/>
+      </w:pPr>
+    </w:p>
+    <w:p>
+      <w:pPr>
+        <w:pStyle w:val="Heading1"/>
+      </w:pPr>
+      <w:r>
+        <w:t>Slide 19  The remaining decomposition problem</w:t>
+      </w:r>
+    </w:p>
+    <w:p>
+      <w:pPr>
+        <w:keepLines/>
+      </w:pPr>
+      <w:r>
+        <w:t>第一段階で、必要なペアについて、欠測した人も含むY S、W、Xの分布が分かりました。ただ、Fそのものは見えていません。同じペアの分布を作れる潜在構造が、複数あるかもしれません。</w:t>
+      </w:r>
+    </w:p>
+    <w:p>
+      <w:pPr>
+        <w:keepLines/>
+      </w:pPr>
+      <w:r>
+        <w:t>分けたいのは三つです。p fがクラスの比率、GがクラスごとのWの分布、M jがクラスごとの測定核です。同じ観測データの分布を作る値どうしは、Lewbelの言葉でobservationally equivalentと呼びます。第一段階によって、観測データの分布が同じなら、回復したテンソルも同じになります。</w:t>
+      </w:r>
+    </w:p>
+    <w:p>
+      <w:pPr>
+        <w:keepLines/>
+      </w:pPr>
+      <w:r>
+        <w:t>ただし、クラス1と2の名前を入れ替えるだけでは、データの分布は変わりません。順序を決めなければ、識別されるのは、この入れ替えを同じものとみなした同値類です。anchorの順序で名前もそろえると、正規化したパラメータ空間で一つの値に決まります。</w:t>
+      </w:r>
+    </w:p>
+    <w:p>
+      <w:pPr>
+        <w:spacing w:after="20"/>
+      </w:pPr>
+    </w:p>
+    <w:p>
+      <w:pPr>
+        <w:pStyle w:val="Heading1"/>
+      </w:pPr>
+      <w:r>
+        <w:t>Slide 20  Identification strategy</w:t>
+      </w:r>
+    </w:p>
+    <w:p>
+      <w:pPr>
+        <w:keepLines/>
+      </w:pPr>
+      <w:r>
+        <w:t>全体の流れを、この図で見ます。まずblockの分布を回復し、それをテンソルに並べます。テンソルは、ここでは確率を並べた多次元の表だと思ってください。</w:t>
+      </w:r>
+    </w:p>
+    <w:p>
+      <w:pPr>
+        <w:keepLines/>
+      </w:pPr>
+      <w:r>
+        <w:t>最初に、Y a、Y b、Wからなるanchorのテンソルを分解します。これでp、Gと、二つのanchorの測定核が分かります。次にpとGからWごとのクラス比率を求め、残りの項目はextensionの式を一つずつ解いていきます。全部を一度に分解するのではなく、基準を決めてから広げる順番です。</w:t>
+      </w:r>
+    </w:p>
+    <w:p>
+      <w:pPr>
+        <w:spacing w:after="20"/>
+      </w:pPr>
+    </w:p>
+    <w:p>
+      <w:pPr>
+        <w:pStyle w:val="Heading1"/>
+      </w:pPr>
+      <w:r>
+        <w:t>Slide 21  Assumption 3.1: Support and model</w:t>
+      </w:r>
+    </w:p>
+    <w:p>
+      <w:pPr>
+        <w:keepLines/>
+      </w:pPr>
+      <w:r>
+        <w:t>仮定3.1は二枚に分けています。まず、どのモデルを扱うかです。潜在クラス数rは既知で、2以上とします。項目が取る値も、Xで条件づけたWが取る値も有限です。条件は全て、Xについて共通の確率1の集合上で置きます。</w:t>
+      </w:r>
+    </w:p>
+    <w:p>
+      <w:pPr>
+        <w:keepLines/>
+      </w:pPr>
+      <w:r>
+        <w:t>仮定2から4の測定モデルが成り立ち、各クラスの比率と、Wのサポート上の確率は正とします。また、anchor pairと全extension pairが仮定1、5から7を満たします。逆観測確率の二乗平均も、blockのcomplete caseで有限です。これで、命題1を必要な全ペアに使えます。</w:t>
+      </w:r>
+    </w:p>
+    <w:p>
+      <w:pPr>
+        <w:spacing w:after="20"/>
+      </w:pPr>
+    </w:p>
+    <w:p>
+      <w:pPr>
+        <w:pStyle w:val="Heading1"/>
+      </w:pPr>
+      <w:r>
+        <w:t>Slide 22  Assumption 3.1: Rank and labels</w:t>
+      </w:r>
+    </w:p>
+    <w:p>
+      <w:pPr>
+        <w:keepLines/>
+      </w:pPr>
+      <w:r>
+        <w:t>次は、分解を一つに決める条件です。M a、M b、Gの列Kruskal rankの和が、2rプラス2以上だとします。三つのviewに対するこのランク条件は、AllmanらのTheorem 1と同じです。</w:t>
+      </w:r>
+    </w:p>
+    <w:p>
+      <w:pPr>
+        <w:keepLines/>
+      </w:pPr>
+      <w:r>
+        <w:t>これだけでは、クラスの名前の入れ替えが残ります。そこで、既知のanchor scoreをクラスごとに平均したミューafに、厳密な順序を付けます。先ほどのXの集合上で、同じ順序を使います。ランクで分解を決め、順序で名前をそろえる、という二つの役割です。</w:t>
+      </w:r>
+    </w:p>
+    <w:p>
+      <w:pPr>
+        <w:keepLines/>
+      </w:pPr>
+      <w:r>
+        <w:t>なお、GとM aのKhatri–Rao積が列フルランクになることは、別に仮定しません。次の補題で、今の条件から導きます。</w:t>
+      </w:r>
+    </w:p>
+    <w:p>
+      <w:pPr>
+        <w:spacing w:after="20"/>
+      </w:pPr>
+    </w:p>
+    <w:p>
+      <w:pPr>
+        <w:pStyle w:val="Heading1"/>
+      </w:pPr>
+      <w:r>
+        <w:t>Slide 23  Lemma 3.1</w:t>
+      </w:r>
+    </w:p>
+    <w:p>
+      <w:pPr>
+        <w:keepLines/>
+      </w:pPr>
+      <w:r>
+        <w:t>この補題は、残りの項目の式を一つに解けることを保証します。使うのはKhatri–Rao積で、対応する列どうしのクロネッカー積を並べたものです。</w:t>
+      </w:r>
+    </w:p>
+    <w:p>
+      <w:pPr>
+        <w:keepLines/>
+      </w:pPr>
+      <w:r>
+        <w:t>AとBにはゼロの列がないとします。二つの列Kruskal rankの和がrプラス1以上なら、この積は列フルランクになります。つまり、anchorを分解するときの条件から、extensionを解くためのランクも確保できる、という役割です。</w:t>
+      </w:r>
+    </w:p>
+    <w:p>
+      <w:pPr>
+        <w:spacing w:after="20"/>
+      </w:pPr>
+    </w:p>
+    <w:p>
+      <w:pPr>
+        <w:pStyle w:val="Heading1"/>
+      </w:pPr>
+      <w:r>
+        <w:t>Slide 24  New Theorem 1</w:t>
+      </w:r>
+    </w:p>
+    <w:p>
+      <w:pPr>
+        <w:keepLines/>
+      </w:pPr>
+      <w:r>
+        <w:t>これが本研究の中心となる定理1で、本文の定理3.1です。第一段階の仮定と仮定3.1の下で、pとG、Wごとの潜在分布Q F、全項目の測定核Q Yが、共通のラベルの下で識別できます。</w:t>
+      </w:r>
+    </w:p>
+    <w:p>
+      <w:pPr>
+        <w:keepLines/>
+      </w:pPr>
+      <w:r>
+        <w:t>要するに、必要なペアの分布を回復して、一つのanchorのテンソルを分解し、残りを順に解けばよい、ということです。潜在クラスの比率だけでも、測定核だけでもなく、両方が分かります。さらに、このモデルの下では、一度も同時に観測されていない項目の組合せについても、同時分布を作れます。</w:t>
+      </w:r>
+    </w:p>
+    <w:p>
+      <w:pPr>
+        <w:spacing w:after="20"/>
+      </w:pPr>
+    </w:p>
+    <w:p>
+      <w:pPr>
+        <w:pStyle w:val="Heading1"/>
+      </w:pPr>
+      <w:r>
+        <w:t>Slide 25  Bridge-weighted composite estimation</w:t>
+      </w:r>
+    </w:p>
+    <w:p>
+      <w:pPr>
+        <w:keepLines/>
+      </w:pPr>
+      <w:r>
+        <w:t>推定も、いまの識別と同じ順番で進めます。まずd’Haultfoeuilleの第3節に沿って、blockごとに条件付きモーメントの式を解き、逆確率重み付け、IPWでペアの分布を回復します。次に、重なりのあるペアに共通の潜在モデルを当てはめます。先に補助的な分布を推定してから代入する順序は、ZhaoとShaoに沿っています。</w:t>
+      </w:r>
+    </w:p>
+    <w:p>
+      <w:pPr>
+        <w:keepLines/>
+      </w:pPr>
+      <w:r>
+        <w:t>ここで使うのは、一つのfull likelihoodではありません。ペアごとの対数密度をbridgeで重み付けして足す、compositeな基準です。これを最大にするM推定量を使います。分散を求めるときも、最初のbridgeを推定した誤差を含めます。後で示す一致性と漸近正規性は、bridgeの次元を固定した場合の結果です。</w:t>
+      </w:r>
+    </w:p>
+    <w:p>
+      <w:pPr>
+        <w:spacing w:after="20"/>
+      </w:pPr>
+    </w:p>
+    <w:p>
+      <w:pPr>
+        <w:pStyle w:val="Heading1"/>
+      </w:pPr>
+      <w:r>
+        <w:t>Slide 26  Conditions for estimation</w:t>
+      </w:r>
+    </w:p>
+    <w:p>
+      <w:pPr>
+        <w:keepLines/>
+      </w:pPr>
+      <w:r>
+        <w:t>次に、推定の基準も真値で一つに最大になるかを確認します。ここは本文の命題4.1です。これまでの仮定1から7と3.1に加え、潜在モデルが正しく、全ペアの密度が共通のサポート上で正だとします。母集団の基準には、真のbridgeと、固定した正のblock重みを使います。</w:t>
+      </w:r>
+    </w:p>
+    <w:p>
+      <w:pPr>
+        <w:keepLines/>
+      </w:pPr>
+      <w:r>
+        <w:t>IPWによって、ペアの平均を母集団の平均に戻せます。真値との目的関数の差は、分布の違いを測るKLダイバージェンスの正の加重和になります。差がゼロなら、全ペアの分布が同じです。すると定理1から、潜在パラメータも同じだと分かります。</w:t>
+      </w:r>
+    </w:p>
+    <w:p>
+      <w:pPr>
+        <w:spacing w:after="20"/>
+      </w:pPr>
+    </w:p>
+    <w:p>
+      <w:pPr>
+        <w:pStyle w:val="Heading1"/>
+      </w:pPr>
+      <w:r>
+        <w:t>Slide 27  Assumption 5.1: Regularity</w:t>
+      </w:r>
+    </w:p>
+    <w:p>
+      <w:pPr>
+        <w:keepLines/>
+      </w:pPr>
+      <w:r>
+        <w:t>ここからは、標本を増やしたときの推定量の性質です。個人ごとの観測データは独立同分布とします。シータが潜在モデルの母数、イータがbridgeの母数で、この二つをまとめたものがベータです。</w:t>
+      </w:r>
+    </w:p>
+    <w:p>
+      <w:pPr>
+        <w:keepLines/>
+      </w:pPr>
+      <w:r>
+        <w:t>確率の和が1という制約を除いた自由な座標で、どちらも有限次元とし、モデルは正しく指定されているとします。パラメータ空間はコンパクトで、真値は境界ではなく内側にあります。第一段階の母集団モーメントがゼロになるのも、真値だけとします。</w:t>
+      </w:r>
+    </w:p>
+    <w:p>
+      <w:pPr>
+        <w:keepLines/>
+      </w:pPr>
+      <w:r>
+        <w:t>計算に必要な滑らかさも置きます。目的関数とモーメントは真値の近くで二回連続微分でき、それらを抑える関数は二乗可積分です。また、bridgeとcomposite scoreのヤコビアン、それに対応するGodambe行列は非特異とします。</w:t>
+      </w:r>
+    </w:p>
+    <w:p>
+      <w:pPr>
+        <w:spacing w:after="20"/>
+      </w:pPr>
+    </w:p>
+    <w:p>
+      <w:pPr>
+        <w:pStyle w:val="Heading1"/>
+      </w:pPr>
+      <w:r>
+        <w:t>Slide 28  Assumption 5.1: Uniform convergence</w:t>
+      </w:r>
+    </w:p>
+    <w:p>
+      <w:pPr>
+        <w:keepLines/>
+      </w:pPr>
+      <w:r>
+        <w:t>真値の近くだけが滑らかでも、推定量がそこへ近づくとは限りません。そこで、推定したbridgeを代入した標本の目的関数が、真のbridgeを使う母集団の目的関数に、パラメータ空間全体で一様に近づくと仮定します。</w:t>
+      </w:r>
+    </w:p>
+    <w:p>
+      <w:pPr>
+        <w:keepLines/>
+      </w:pPr>
+      <w:r>
+        <w:t>もう一つ、真値から一定以上離れた場所では、母集団の目的関数が最大値より確実に低くなるとします。この一様収束と最大値の分離を使い、argmax定理から一致性を得ます。近所の微分条件と、空間全体の条件を分けている点が大事です。</w:t>
+      </w:r>
+    </w:p>
+    <w:p>
+      <w:pPr>
+        <w:spacing w:after="20"/>
+      </w:pPr>
+    </w:p>
+    <w:p>
+      <w:pPr>
+        <w:pStyle w:val="Heading1"/>
+      </w:pPr>
+      <w:r>
+        <w:t>Slide 29  Assumption 5.1: First stage and separation</w:t>
+      </w:r>
+    </w:p>
+    <w:p>
+      <w:pPr>
+        <w:keepLines/>
+      </w:pPr>
+      <w:r>
+        <w:t>第一段階の誤差も扱います。bridge推定量は正則で、真値からの誤差を、漸近的に影響関数の標本平均で表せると仮定します。その影響関数は平均ゼロで、分散は有限です。</w:t>
+      </w:r>
+    </w:p>
+    <w:p>
+      <w:pPr>
+        <w:keepLines/>
+      </w:pPr>
+      <w:r>
+        <w:t>また、識別できるかどうかの境目に近づきすぎない条件を置きます。クラス比率とペアの観測確率は、一様にゼロから離れているとします。anchorのテンソルを、Wが行、Y aとY bが列になる行列に並べ替えたときの、最小の非零特異値も同様です。</w:t>
+      </w:r>
+    </w:p>
+    <w:p>
+      <w:pPr>
+        <w:keepLines/>
+      </w:pPr>
+      <w:r>
+        <w:t>Kruskal rankを支える小行列式の絶対値と、anchorの順序で隣り合う平均スコアの差も、一様にゼロから離す必要があります。識別ができることと、安定した推論ができることは別なので、この条件を加えています。</w:t>
+      </w:r>
+    </w:p>
+    <w:p>
+      <w:pPr>
+        <w:spacing w:after="20"/>
+      </w:pPr>
+    </w:p>
+    <w:p>
+      <w:pPr>
+        <w:pStyle w:val="Heading1"/>
+      </w:pPr>
+      <w:r>
+        <w:t>Slide 30  Theorem 5.1</w:t>
+      </w:r>
+    </w:p>
+    <w:p>
+      <w:pPr>
+        <w:keepLines/>
+      </w:pPr>
+      <w:r>
+        <w:t>以上の命題4.1と仮定5.1の下で、有限次元のbridgeを使う推定量は一致性と漸近正規性を持ちます。標本が増えると真値に近づき、その誤差をルートn倍したものが、漸近的に正規分布に従うという結果です。</w:t>
+      </w:r>
+    </w:p>
+    <w:p>
+      <w:pPr>
+        <w:keepLines/>
+      </w:pPr>
+      <w:r>
+        <w:t>分散の式で大事なのは、bridgeを推定した誤差も入ることです。Aはcomposite scoreをシータで微分した期待値、Cはイータで微分した期待値です。Bにはscoreに加え、Cと第一段階の影響関数の積が入ります。bridgeが既知だとして分散を出してはいけません。</w:t>
+      </w:r>
+    </w:p>
+    <w:p>
+      <w:pPr>
+        <w:keepLines/>
+      </w:pPr>
+      <w:r>
+        <w:t>個人単位のbootstrapを使うなら、両段階の推定とラベル合わせを毎回やり直します。なお、次元を増やしていくsieveは、この定理の範囲外です。推定速度や逆問題としての追加の条件が必要です。</w:t>
+      </w:r>
+    </w:p>
+    <w:p>
+      <w:pPr>
+        <w:spacing w:after="20"/>
+      </w:pPr>
+    </w:p>
+    <w:p>
+      <w:pPr>
+        <w:pStyle w:val="Heading1"/>
+      </w:pPr>
+      <w:r>
+        <w:t>Slide 31  Computation</w:t>
+      </w:r>
+    </w:p>
+    <w:p>
+      <w:pPr>
+        <w:keepLines/>
+      </w:pPr>
+      <w:r>
+        <w:t>計算も、回復、分解、更新の順番です。まずbridgeを推定し、重み付きのテンソルを作ります。anchorを分解してラベルをそろえ、残りの測定核の初期値を出します。</w:t>
+      </w:r>
+    </w:p>
+    <w:p>
+      <w:pPr>
+        <w:keepLines/>
+      </w:pPr>
+      <w:r>
+        <w:t>その後、確率が非負で和が1になる制約を守りながら、全体を更新します。目的関数は非凸なので、初期値は複数試し、得られた解の中で目的関数が最大のものを採ります。これだけで大域的な最大値を保証するわけではありません。ZhaoとShaoの第2.3節から引き継ぐのはplug-inの順序で、更新法をそのまま移しているわけではありません。</w:t>
+      </w:r>
+    </w:p>
+    <w:p>
+      <w:pPr>
+        <w:spacing w:after="20"/>
+      </w:pPr>
+    </w:p>
+    <w:p>
+      <w:pPr>
+        <w:pStyle w:val="Heading1"/>
+      </w:pPr>
+      <w:r>
+        <w:t>Slide 32  Simulation targets in the model</w:t>
+      </w:r>
+    </w:p>
+    <w:p>
+      <w:pPr>
+        <w:keepLines/>
+      </w:pPr>
+      <w:r>
+        <w:t>ここからシミュレーションです。Xは固定し、Fは二つのクラスとします。図の下は、Z SからY S、Y SからR Sという流れです。FからZ Sへも矢印があります。FとZ Sは関連するので、ここを独立にしてはいけません。Wと三つのYは全て二値です。Y 1はいつも見えているので、ペアが全部見えるかどうかは、もう一方のD jで決まります。</w:t>
+      </w:r>
+    </w:p>
+    <w:p>
+      <w:pPr>
+        <w:keepLines/>
+      </w:pPr>
+      <w:r>
+        <w:t>生成するときは、FとWの後に、Zの組を先に、Yの組を後に作ります。AがFの下でのZの分布、BがFとZの下でのYの分布です。最後に、そのYを使ってD 2とD 3を独立に生成します。ここはBayes則で書き直しているだけなので、欠測指標まで含めた同時分布は変わりません。Zについて平均すると、元の測定核の積に戻ります。図はそのうち一つのblockを示しています。</w:t>
+      </w:r>
+    </w:p>
+    <w:p>
+      <w:pPr>
+        <w:keepLines/>
+      </w:pPr>
+      <w:r>
+        <w:t>右側は、何を評価するかです。第一段階のミューjは、母集団全体でY jが1になる確率です。p S,cは、ペアの00、01、10、11それぞれの確率です。これに対して第二段階のp fはクラスの比率、M jfはクラスfで項目jが1になる確率を表します。M jfは三項目かける二クラスで六つ、クラス比率はp 2を評価します。</w:t>
+      </w:r>
+    </w:p>
+    <w:p>
+      <w:pPr>
+        <w:keepLines/>
+      </w:pPr>
+      <w:r>
+        <w:t>標本サイズは500で、データを作って推定する作業を100回繰り返します。全項目の平均観測率は80パーセントです。この生成モデルは、Zを平均して消した仮定4とMissing IVの条件を満たします。さらに、Y Sの下でR SとF、W、Z Sが独立になる作り方ですが、この追加条件を一般の識別定理にも求めるわけではありません。</w:t>
+      </w:r>
+    </w:p>
+    <w:p>
+      <w:pPr>
+        <w:spacing w:after="20"/>
+      </w:pPr>
+    </w:p>
+    <w:p>
+      <w:pPr>
+        <w:pStyle w:val="Heading1"/>
+      </w:pPr>
+      <w:r>
+        <w:t>Slide 33  Simulation design: estimators and evaluation</w:t>
+      </w:r>
+    </w:p>
+    <w:p>
+      <w:pPr>
+        <w:keepLines/>
+      </w:pPr>
+      <w:r>
+        <w:t>比較するのは五つです。一つ目は、欠測前の全データを使うoracleです。二つ目は、欠測を無視できると考えて観測尤度を使うMARです。三つ目は、欠測のlogisticモデルを正しく指定したselection likelihoodです。四つ目は、そこからY 1の主効果と交互作用を落とした誤指定版です。この二つのselection likelihoodには、どちらもZ Sを入れません。</w:t>
+      </w:r>
+    </w:p>
+    <w:p>
+      <w:pPr>
+        <w:keepLines/>
+      </w:pPr>
+      <w:r>
+        <w:t>五つ目が提案法です。各blockのMissing IVの式から、四つのセルに対応する逆観測確率のbridgeを推定します。まず正規化したIPWで分布を回復し、その後、重み付きのペアの基準で潜在モデルを当てはめます。次の図で見る提案法のYの分布は、潜在分解をする前の第一段階の結果です。他の四手法は、当てはめたモデルからYの分布を求めています。</w:t>
+      </w:r>
+    </w:p>
+    <w:p>
+      <w:pPr>
+        <w:keepLines/>
+      </w:pPr>
+      <w:r>
+        <w:t>Yの母数ごとに、四つを見ます。Biasは平均的なずれ、SDは100回の推定値のばらつきです。平均SEは、各データから推定した標準誤差の平均なので、SDと近いかを見ます。95パーセントcoverageは、母数ごとのWald信頼区間が真値を含んだ割合です。区間は推定値プラスマイナス1.96 SEで作ります。</w:t>
+      </w:r>
+    </w:p>
+    <w:p>
+      <w:pPr>
+        <w:keepLines/>
+      </w:pPr>
+      <w:r>
+        <w:t>尤度法のSEにはデルタ法とsandwich分散を使います。提案法では、各反復の中で個人単位のbootstrapを200回行い、二つのbridgeを毎回推定し直します。潜在母数はbiasとRMSEで見ます。測定核のRMSEは、100反復と六つの成分の二乗誤差をまとめて平均し、平方根を取ります。成分ごとのRMSEの単純平均ではありません。p 2は別に評価します。</w:t>
+      </w:r>
+    </w:p>
+    <w:p>
+      <w:pPr>
+        <w:spacing w:after="20"/>
+      </w:pPr>
+    </w:p>
+    <w:p>
+      <w:pPr>
+        <w:pStyle w:val="Heading1"/>
+      </w:pPr>
+      <w:r>
+        <w:t>Slide 34  Population outcome recovery</w:t>
+      </w:r>
+    </w:p>
+    <w:p>
+      <w:pPr>
+        <w:keepLines/>
+      </w:pPr>
+      <w:r>
+        <w:t>まず、潜在構造に分ける前に、Yの分布が戻っているかを見ます。横軸が五つの手法、青い実線がミュー2、オレンジの破線がミュー3です。上がbiasとSD、下が平均SEとcoverageです。</w:t>
+      </w:r>
+    </w:p>
+    <w:p>
+      <w:pPr>
+        <w:keepLines/>
+      </w:pPr>
+      <w:r>
+        <w:t>提案法は、MARと誤指定したselection likelihoodよりbiasの絶対値が小さくなっています。SDと平均SEも近く、coverageは94パーセントと93パーセントでした。この設定では、推定した標準誤差が、実際の推定値のばらつきをおおむね捉えています。</w:t>
+      </w:r>
+    </w:p>
+    <w:p>
+      <w:pPr>
+        <w:keepLines/>
+      </w:pPr>
+      <w:r>
+        <w:t>数字を補足すると、ミュー2とミュー3の真値は0.475と0.4925です。提案法のbiasはマイナス0.0099とマイナス0.0096です。SDと平均SEは、ミュー2で0.0379と0.0365、ミュー3で0.0345と0.0339でした。</w:t>
+      </w:r>
+    </w:p>
+    <w:p>
+      <w:pPr>
+        <w:keepLines/>
+      </w:pPr>
+      <w:r>
+        <w:t>一方、MARのcoverageは9パーセントと13パーセント、誤指定版は12パーセントと11パーセントです。正指定版のbiasはほぼゼロですが、Y 2のcoverageは86パーセントでした。100反復の結果なので、常にこの被覆率になるとは言えません。ここで言いたいのは、提案法が常に最も効率的ということではなく、欠測モデルの形を決めずに第一段階でYの偏りを補正できた、という点です。</w:t>
+      </w:r>
+    </w:p>
+    <w:p>
+      <w:pPr>
+        <w:spacing w:after="20"/>
+      </w:pPr>
+    </w:p>
+    <w:p>
+      <w:pPr>
+        <w:pStyle w:val="Heading1"/>
+      </w:pPr>
+      <w:r>
+        <w:t>Slide 35  Stage-2 full joint law</w:t>
+      </w:r>
+    </w:p>
+    <w:p>
+      <w:pPr>
+        <w:keepLines/>
+      </w:pPr>
+      <w:r>
+        <w:t>今度は、三つのYの同時分布を見ます。横軸は0と1の八通りの組合せ、縦軸はそれぞれが起こる確率です。黒い線が母集団の真の分布で、ほかの線は100反復の推定結果を平均しています。</w:t>
+      </w:r>
+    </w:p>
+    <w:p>
+      <w:pPr>
+        <w:keepLines/>
+      </w:pPr>
+      <w:r>
+        <w:t>ここでの青い提案法の線は、第二段階まで使った結果です。回復したペアの分布を共通の潜在構造につなぎ、クラス比率と全ての測定核から、三項目の同時分布を作っています。先ほどの項目ごとの確率と違い、今度は項目の組合せまで再現できているかを見ています。</w:t>
+      </w:r>
+    </w:p>
+    <w:p>
+      <w:pPr>
+        <w:spacing w:after="20"/>
+      </w:pPr>
+    </w:p>
+    <w:p>
+      <w:pPr>
+        <w:pStyle w:val="Heading1"/>
+      </w:pPr>
+      <w:r>
+        <w:t>Slide 36  Latent-parameter recovery</w:t>
+      </w:r>
+    </w:p>
+    <w:p>
+      <w:pPr>
+        <w:keepLines/>
+      </w:pPr>
+      <w:r>
+        <w:t>こちらは、潜在構造まで分けた後の結果です。測定核では、提案法のbiasの絶対値とRMSEが、MARと誤指定したselection likelihoodより小さくなっています。欠測モデルの形を直接決めず、Missing IVからペアの分布を回復していることが効いていると考えられます。</w:t>
+      </w:r>
+    </w:p>
+    <w:p>
+      <w:pPr>
+        <w:keepLines/>
+      </w:pPr>
+      <w:r>
+        <w:t>クラス比率のbiasもほぼゼロです。ただし、RMSEがどの手法よりも小さいわけではありません。欠測モデルを正しく指定できれば、パラメトリックな方法も効率の面で有力です。提案法の利点は、常に一番精度が高いことではなく、欠測モデルの形の誤指定を避けられる点にあります。</w:t>
+      </w:r>
+    </w:p>
+    <w:p>
+      <w:pPr>
+        <w:spacing w:after="20"/>
+      </w:pPr>
+    </w:p>
+    <w:p>
+      <w:pPr>
+        <w:pStyle w:val="Heading1"/>
+      </w:pPr>
+      <w:r>
+        <w:t>Slide 37  Conclusion and limits</w:t>
+      </w:r>
+    </w:p>
+    <w:p>
+      <w:pPr>
+        <w:keepLines/>
+      </w:pPr>
+      <w:r>
+        <w:t>最後にまとめます。第一段階では、Missing IVとblockのcomplete-case completenessを使って、欠測モデルの形をパラメトリックに決めずに各blockの分布を回復します。第二段階では、anchor itemsとWを使い、潜在クラス比率と全ての測定核を共通のラベルで識別します。この接続を定理にして、同じ順序で推定量も作りました。</w:t>
+      </w:r>
+    </w:p>
+    <w:p>
+      <w:pPr>
+        <w:keepLines/>
+      </w:pPr>
+      <w:r>
+        <w:t>ただし、何にでも頑健というわけではありません。クラス数は既知で、有限潜在クラスの測定モデルが正しいことが前提です。必要なペアが観測されること、Missing IVの除外制約、completeness、局所独立性、ランク条件、anchorの順序も必要です。</w:t>
+      </w:r>
+    </w:p>
+    <w:p>
+      <w:pPr>
+        <w:keepLines/>
+      </w:pPr>
+      <w:r>
+        <w:t>また、クラス比率のRMSEは、正しく指定したselection likelihoodより大きくなることがあります。漸近理論も、ここでは有限次元のbridgeに限ります。次元を増やすsieveまで広げるには、逆問題としての追加の条件が要ります。欠測モデルの形を決めずに回復と分解をつなげられることが、今回のポイントです。</w:t>
+      </w:r>
+    </w:p>
+    <w:p>
+      <w:pPr>
+        <w:spacing w:after="20"/>
+      </w:pPr>
+    </w:p>
+    <w:p>
+      <w:pPr>
+        <w:pStyle w:val="Heading1"/>
+      </w:pPr>
+      <w:r>
+        <w:t>Slide 38  Selected references</w:t>
+      </w:r>
+    </w:p>
+    <w:p>
+      <w:pPr>
+        <w:keepLines/>
+      </w:pPr>
+      <w:r>
+        <w:t>主に参照した文献はこちらです。第一段階はd’HaultfoeuilleとZhao、Shao、complete-caseでのcompletenessはMiaoらを参照しています。第二段階はAllman、Matias、Rhodesです。識別の言葉遣いはLewbel、欠測の分類はLittleとRubin、選択バイアスはHeckmanに沿っています。</w:t>
+      </w:r>
+    </w:p>
+    <w:p>
+      <w:pPr>
+        <w:spacing w:after="20"/>
+      </w:pPr>
+    </w:p>
+    <w:p>
+      <w:pPr>
+        <w:pStyle w:val="Heading1"/>
+      </w:pPr>
+      <w:r>
+        <w:t>Appendix Slide 39  Proof sketch for Proposition 1</w:t>
       </w:r>
     </w:p>
     <w:p>
@@ -891,226 +1572,23 @@
     </w:p>
     <w:p>
       <w:pPr>
-        <w:spacing w:after="20"/>
-      </w:pPr>
-    </w:p>
-    <w:p>
-      <w:pPr>
-        <w:pStyle w:val="Heading1"/>
+        <w:keepLines/>
       </w:pPr>
       <w:r>
-        <w:t>Slide 19  Finite latent-class identification</w:t>
+        <w:t>補題2.1も同じ証明です。全項目を一つのblockと見て、二つのbridgeの逆数の差を取り、complete-case completenessとpositivityで一意性を示します。最後にIPWで全体の分布を回復します。</w:t>
       </w:r>
     </w:p>
     <w:p>
       <w:pPr>
-        <w:keepLines/>
-      </w:pPr>
-      <w:r>
-        <w:t>ここから第二段階です。blockの分布が分かったとして、それを潜在クラスの比率と測定核に分けられるでしょうか。anchor itemsとWを使って、この分解が一つに決まる条件を考えます。</w:t>
-      </w:r>
+        <w:spacing w:after="20"/>
+      </w:pPr>
     </w:p>
     <w:p>
       <w:pPr>
-        <w:spacing w:after="20"/>
-      </w:pPr>
-    </w:p>
-    <w:p>
-      <w:pPr>
         <w:pStyle w:val="Heading1"/>
       </w:pPr>
       <w:r>
-        <w:t>Slide 20  The remaining decomposition problem</w:t>
-      </w:r>
-    </w:p>
-    <w:p>
-      <w:pPr>
-        <w:keepLines/>
-      </w:pPr>
-      <w:r>
-        <w:t>第一段階で、必要なペアについて、欠測した人も含むY S、W、Xの分布が分かりました。ただ、Fそのものは見えていません。同じペアの分布を作れる潜在構造が、複数あるかもしれません。</w:t>
-      </w:r>
-    </w:p>
-    <w:p>
-      <w:pPr>
-        <w:keepLines/>
-      </w:pPr>
-      <w:r>
-        <w:t>分けたいのは三つです。p fがクラスの比率、GがクラスごとのWの分布、M jがクラスごとの測定核です。同じ観測データの分布を作る値どうしは、Lewbelの言葉でobservationally equivalentと呼びます。第一段階によって、観測データの分布が同じなら、回復したテンソルも同じになります。</w:t>
-      </w:r>
-    </w:p>
-    <w:p>
-      <w:pPr>
-        <w:keepLines/>
-      </w:pPr>
-      <w:r>
-        <w:t>ただし、クラス1と2の名前を入れ替えるだけでは、データの分布は変わりません。順序を決めなければ、識別されるのは、この入れ替えを同じものとみなした同値類です。anchorの順序で名前もそろえると、正規化したパラメータ空間で一つの値に決まります。</w:t>
-      </w:r>
-    </w:p>
-    <w:p>
-      <w:pPr>
-        <w:spacing w:after="20"/>
-      </w:pPr>
-    </w:p>
-    <w:p>
-      <w:pPr>
-        <w:pStyle w:val="Heading1"/>
-      </w:pPr>
-      <w:r>
-        <w:t>Slide 21  Identification strategy</w:t>
-      </w:r>
-    </w:p>
-    <w:p>
-      <w:pPr>
-        <w:keepLines/>
-      </w:pPr>
-      <w:r>
-        <w:t>全体の流れを、この図で見ます。まずblockの分布を回復し、それをテンソルに並べます。テンソルは、ここでは確率を並べた多次元の表だと思ってください。</w:t>
-      </w:r>
-    </w:p>
-    <w:p>
-      <w:pPr>
-        <w:keepLines/>
-      </w:pPr>
-      <w:r>
-        <w:t>最初に、Y a、Y b、Wからなるanchorのテンソルを分解します。これでp、Gと、二つのanchorの測定核が分かります。次にpとGからWごとのクラス比率を求め、残りの項目はextensionの式を一つずつ解いていきます。全部を一度に分解するのではなく、基準を決めてから広げる順番です。</w:t>
-      </w:r>
-    </w:p>
-    <w:p>
-      <w:pPr>
-        <w:spacing w:after="20"/>
-      </w:pPr>
-    </w:p>
-    <w:p>
-      <w:pPr>
-        <w:pStyle w:val="Heading1"/>
-      </w:pPr>
-      <w:r>
-        <w:t>Slide 22  Assumption 3.1: Support and model</w:t>
-      </w:r>
-    </w:p>
-    <w:p>
-      <w:pPr>
-        <w:keepLines/>
-      </w:pPr>
-      <w:r>
-        <w:t>仮定3.1は二枚に分けています。まず、どのモデルを扱うかです。潜在クラス数rは既知で、2以上とします。項目が取る値も、Xで条件づけたWが取る値も有限です。条件は全て、Xについて共通の確率1の集合上で置きます。</w:t>
-      </w:r>
-    </w:p>
-    <w:p>
-      <w:pPr>
-        <w:keepLines/>
-      </w:pPr>
-      <w:r>
-        <w:t>仮定2から4の測定モデルが成り立ち、各クラスの比率と、Wのサポート上の確率は正とします。また、anchor pairと全extension pairが仮定1、5から7を満たします。逆観測確率の二乗平均も、blockのcomplete caseで有限です。これで、命題1を必要な全ペアに使えます。</w:t>
-      </w:r>
-    </w:p>
-    <w:p>
-      <w:pPr>
-        <w:spacing w:after="20"/>
-      </w:pPr>
-    </w:p>
-    <w:p>
-      <w:pPr>
-        <w:pStyle w:val="Heading1"/>
-      </w:pPr>
-      <w:r>
-        <w:t>Slide 23  Assumption 3.1: Rank and labels</w:t>
-      </w:r>
-    </w:p>
-    <w:p>
-      <w:pPr>
-        <w:keepLines/>
-      </w:pPr>
-      <w:r>
-        <w:t>次は、分解を一つに決める条件です。M a、M b、Gの列Kruskal rankの和が、2rプラス2以上だとします。三つのviewに対するこのランク条件は、AllmanらのTheorem 1と同じです。</w:t>
-      </w:r>
-    </w:p>
-    <w:p>
-      <w:pPr>
-        <w:keepLines/>
-      </w:pPr>
-      <w:r>
-        <w:t>これだけでは、クラスの名前の入れ替えが残ります。そこで、既知のanchor scoreをクラスごとに平均したミューafに、厳密な順序を付けます。先ほどのXの集合上で、同じ順序を使います。ランクで分解を決め、順序で名前をそろえる、という二つの役割です。</w:t>
-      </w:r>
-    </w:p>
-    <w:p>
-      <w:pPr>
-        <w:keepLines/>
-      </w:pPr>
-      <w:r>
-        <w:t>なお、GとM aのKhatri–Rao積が列フルランクになることは、別に仮定しません。次の補題で、今の条件から導きます。</w:t>
-      </w:r>
-    </w:p>
-    <w:p>
-      <w:pPr>
-        <w:spacing w:after="20"/>
-      </w:pPr>
-    </w:p>
-    <w:p>
-      <w:pPr>
-        <w:pStyle w:val="Heading1"/>
-      </w:pPr>
-      <w:r>
-        <w:t>Slide 24  Lemma 3.1</w:t>
-      </w:r>
-    </w:p>
-    <w:p>
-      <w:pPr>
-        <w:keepLines/>
-      </w:pPr>
-      <w:r>
-        <w:t>この補題は、残りの項目の式を一つに解けることを保証します。使うのはKhatri–Rao積で、対応する列どうしのクロネッカー積を並べたものです。</w:t>
-      </w:r>
-    </w:p>
-    <w:p>
-      <w:pPr>
-        <w:keepLines/>
-      </w:pPr>
-      <w:r>
-        <w:t>AとBにはゼロの列がないとします。二つの列Kruskal rankの和がrプラス1以上なら、この積は列フルランクになります。つまり、anchorを分解するときの条件から、extensionを解くためのランクも確保できる、という役割です。</w:t>
-      </w:r>
-    </w:p>
-    <w:p>
-      <w:pPr>
-        <w:spacing w:after="20"/>
-      </w:pPr>
-    </w:p>
-    <w:p>
-      <w:pPr>
-        <w:pStyle w:val="Heading1"/>
-      </w:pPr>
-      <w:r>
-        <w:t>Slide 25  New Theorem 1</w:t>
-      </w:r>
-    </w:p>
-    <w:p>
-      <w:pPr>
-        <w:keepLines/>
-      </w:pPr>
-      <w:r>
-        <w:t>これが本研究の中心となる定理1で、本文の定理3.1です。第一段階の仮定と仮定3.1の下で、pとG、Wごとの潜在分布Q F、全項目の測定核Q Yが、共通のラベルの下で識別できます。</w:t>
-      </w:r>
-    </w:p>
-    <w:p>
-      <w:pPr>
-        <w:keepLines/>
-      </w:pPr>
-      <w:r>
-        <w:t>要するに、必要なペアの分布を回復して、一つのanchorのテンソルを分解し、残りを順に解けばよい、ということです。潜在クラスの比率だけでも、測定核だけでもなく、両方が分かります。さらに、このモデルの下では、一度も同時に観測されていない項目の組合せについても、同時分布を作れます。</w:t>
-      </w:r>
-    </w:p>
-    <w:p>
-      <w:pPr>
-        <w:spacing w:after="20"/>
-      </w:pPr>
-    </w:p>
-    <w:p>
-      <w:pPr>
-        <w:pStyle w:val="Heading1"/>
-      </w:pPr>
-      <w:r>
-        <w:t>Slide 26  Proof map for Theorem 1</w:t>
+        <w:t>Appendix Slide 40  Proof map for Theorem 1</w:t>
       </w:r>
     </w:p>
     <w:p>
@@ -1127,484 +1605,6 @@
       </w:pPr>
       <w:r>
         <w:t>残りは二つの操作です。pとGにはベイズ則を使い、Wごとのクラス比率を求めます。extensionには補題3.1を使い、残りの測定核を一つずつ解きます。詳しい8ステップは、後ろのAppendixに置いています。</w:t>
-      </w:r>
-    </w:p>
-    <w:p>
-      <w:pPr>
-        <w:spacing w:after="20"/>
-      </w:pPr>
-    </w:p>
-    <w:p>
-      <w:pPr>
-        <w:pStyle w:val="Heading1"/>
-      </w:pPr>
-      <w:r>
-        <w:t>Slide 27  Bridge-weighted composite estimation</w:t>
-      </w:r>
-    </w:p>
-    <w:p>
-      <w:pPr>
-        <w:keepLines/>
-      </w:pPr>
-      <w:r>
-        <w:t>推定も、いまの識別と同じ順番で進めます。まずd’Haultfoeuilleの第3節に沿って、blockごとに条件付きモーメントの式を解き、逆確率重み付け、IPWでペアの分布を回復します。次に、重なりのあるペアに共通の潜在モデルを当てはめます。先に補助的な分布を推定してから代入する順序は、ZhaoとShaoに沿っています。</w:t>
-      </w:r>
-    </w:p>
-    <w:p>
-      <w:pPr>
-        <w:keepLines/>
-      </w:pPr>
-      <w:r>
-        <w:t>ここで使うのは、一つのfull likelihoodではありません。ペアごとの対数密度をbridgeで重み付けして足す、compositeな基準です。これを最大にするM推定量を使います。分散を求めるときも、最初のbridgeを推定した誤差を含めます。後で示す一致性と漸近正規性は、bridgeの次元を固定した場合の結果です。</w:t>
-      </w:r>
-    </w:p>
-    <w:p>
-      <w:pPr>
-        <w:spacing w:after="20"/>
-      </w:pPr>
-    </w:p>
-    <w:p>
-      <w:pPr>
-        <w:pStyle w:val="Heading1"/>
-      </w:pPr>
-      <w:r>
-        <w:t>Slide 28  Conditions for estimation</w:t>
-      </w:r>
-    </w:p>
-    <w:p>
-      <w:pPr>
-        <w:keepLines/>
-      </w:pPr>
-      <w:r>
-        <w:t>次に、推定の基準も真値で一つに最大になるかを確認します。ここは本文の命題4.1です。これまでの仮定1から7と3.1に加え、潜在モデルが正しく、全ペアの密度が共通のサポート上で正だとします。母集団の基準には、真のbridgeと、固定した正のblock重みを使います。</w:t>
-      </w:r>
-    </w:p>
-    <w:p>
-      <w:pPr>
-        <w:keepLines/>
-      </w:pPr>
-      <w:r>
-        <w:t>IPWによって、ペアの平均を母集団の平均に戻せます。真値との目的関数の差は、分布の違いを測るKLダイバージェンスの正の加重和になります。差がゼロなら、全ペアの分布が同じです。すると定理1から、潜在パラメータも同じだと分かります。</w:t>
-      </w:r>
-    </w:p>
-    <w:p>
-      <w:pPr>
-        <w:spacing w:after="20"/>
-      </w:pPr>
-    </w:p>
-    <w:p>
-      <w:pPr>
-        <w:pStyle w:val="Heading1"/>
-      </w:pPr>
-      <w:r>
-        <w:t>Slide 29  Assumption 5.1: Regularity</w:t>
-      </w:r>
-    </w:p>
-    <w:p>
-      <w:pPr>
-        <w:keepLines/>
-      </w:pPr>
-      <w:r>
-        <w:t>ここからは、標本を増やしたときの推定量の性質です。個人ごとの観測データは独立同分布とします。シータが潜在モデルの母数、イータがbridgeの母数で、この二つをまとめたものがベータです。</w:t>
-      </w:r>
-    </w:p>
-    <w:p>
-      <w:pPr>
-        <w:keepLines/>
-      </w:pPr>
-      <w:r>
-        <w:t>確率の和が1という制約を除いた自由な座標で、どちらも有限次元とし、モデルは正しく指定されているとします。パラメータ空間はコンパクトで、真値は境界ではなく内側にあります。第一段階の母集団モーメントがゼロになるのも、真値だけとします。</w:t>
-      </w:r>
-    </w:p>
-    <w:p>
-      <w:pPr>
-        <w:keepLines/>
-      </w:pPr>
-      <w:r>
-        <w:t>計算に必要な滑らかさも置きます。目的関数とモーメントは真値の近くで二回連続微分でき、それらを抑える関数は二乗可積分です。また、bridgeとcomposite scoreのヤコビアン、それに対応するGodambe行列は非特異とします。</w:t>
-      </w:r>
-    </w:p>
-    <w:p>
-      <w:pPr>
-        <w:spacing w:after="20"/>
-      </w:pPr>
-    </w:p>
-    <w:p>
-      <w:pPr>
-        <w:pStyle w:val="Heading1"/>
-      </w:pPr>
-      <w:r>
-        <w:t>Slide 30  Assumption 5.1: Uniform convergence</w:t>
-      </w:r>
-    </w:p>
-    <w:p>
-      <w:pPr>
-        <w:keepLines/>
-      </w:pPr>
-      <w:r>
-        <w:t>真値の近くだけが滑らかでも、推定量がそこへ近づくとは限りません。そこで、推定したbridgeを代入した標本の目的関数が、真のbridgeを使う母集団の目的関数に、パラメータ空間全体で一様に近づくと仮定します。</w:t>
-      </w:r>
-    </w:p>
-    <w:p>
-      <w:pPr>
-        <w:keepLines/>
-      </w:pPr>
-      <w:r>
-        <w:t>もう一つ、真値から一定以上離れた場所では、母集団の目的関数が最大値より確実に低くなるとします。この一様収束と最大値の分離を使い、argmax定理から一致性を得ます。近所の微分条件と、空間全体の条件を分けている点が大事です。</w:t>
-      </w:r>
-    </w:p>
-    <w:p>
-      <w:pPr>
-        <w:spacing w:after="20"/>
-      </w:pPr>
-    </w:p>
-    <w:p>
-      <w:pPr>
-        <w:pStyle w:val="Heading1"/>
-      </w:pPr>
-      <w:r>
-        <w:t>Slide 31  Assumption 5.1: First stage and separation</w:t>
-      </w:r>
-    </w:p>
-    <w:p>
-      <w:pPr>
-        <w:keepLines/>
-      </w:pPr>
-      <w:r>
-        <w:t>第一段階の誤差も扱います。bridge推定量は正則で、真値からの誤差を、漸近的に影響関数の標本平均で表せると仮定します。その影響関数は平均ゼロで、分散は有限です。</w:t>
-      </w:r>
-    </w:p>
-    <w:p>
-      <w:pPr>
-        <w:keepLines/>
-      </w:pPr>
-      <w:r>
-        <w:t>また、識別できるかどうかの境目に近づきすぎない条件を置きます。クラス比率とペアの観測確率は、一様にゼロから離れているとします。anchorのテンソルを、Wが行、Y aとY bが列になる行列に並べ替えたときの、最小の非零特異値も同様です。</w:t>
-      </w:r>
-    </w:p>
-    <w:p>
-      <w:pPr>
-        <w:keepLines/>
-      </w:pPr>
-      <w:r>
-        <w:t>Kruskal rankを支える小行列式の絶対値と、anchorの順序で隣り合う平均スコアの差も、一様にゼロから離す必要があります。識別ができることと、安定した推論ができることは別なので、この条件を加えています。</w:t>
-      </w:r>
-    </w:p>
-    <w:p>
-      <w:pPr>
-        <w:spacing w:after="20"/>
-      </w:pPr>
-    </w:p>
-    <w:p>
-      <w:pPr>
-        <w:pStyle w:val="Heading1"/>
-      </w:pPr>
-      <w:r>
-        <w:t>Slide 32  Theorem 5.1</w:t>
-      </w:r>
-    </w:p>
-    <w:p>
-      <w:pPr>
-        <w:keepLines/>
-      </w:pPr>
-      <w:r>
-        <w:t>以上の命題4.1と仮定5.1の下で、有限次元のbridgeを使う推定量は一致性と漸近正規性を持ちます。標本が増えると真値に近づき、その誤差をルートn倍したものが、漸近的に正規分布に従うという結果です。</w:t>
-      </w:r>
-    </w:p>
-    <w:p>
-      <w:pPr>
-        <w:keepLines/>
-      </w:pPr>
-      <w:r>
-        <w:t>分散の式で大事なのは、bridgeを推定した誤差も入ることです。Aはcomposite scoreをシータで微分した期待値、Cはイータで微分した期待値です。Bにはscoreに加え、Cと第一段階の影響関数の積が入ります。bridgeが既知だとして分散を出してはいけません。</w:t>
-      </w:r>
-    </w:p>
-    <w:p>
-      <w:pPr>
-        <w:keepLines/>
-      </w:pPr>
-      <w:r>
-        <w:t>個人単位のbootstrapを使うなら、両段階の推定とラベル合わせを毎回やり直します。なお、次元を増やしていくsieveは、この定理の範囲外です。推定速度や逆問題としての追加の条件が必要です。</w:t>
-      </w:r>
-    </w:p>
-    <w:p>
-      <w:pPr>
-        <w:spacing w:after="20"/>
-      </w:pPr>
-    </w:p>
-    <w:p>
-      <w:pPr>
-        <w:pStyle w:val="Heading1"/>
-      </w:pPr>
-      <w:r>
-        <w:t>Slide 33  Computation</w:t>
-      </w:r>
-    </w:p>
-    <w:p>
-      <w:pPr>
-        <w:keepLines/>
-      </w:pPr>
-      <w:r>
-        <w:t>計算も、回復、分解、更新の順番です。まずbridgeを推定し、重み付きのテンソルを作ります。anchorを分解してラベルをそろえ、残りの測定核の初期値を出します。</w:t>
-      </w:r>
-    </w:p>
-    <w:p>
-      <w:pPr>
-        <w:keepLines/>
-      </w:pPr>
-      <w:r>
-        <w:t>その後、確率が非負で和が1になる制約を守りながら、全体を更新します。目的関数は非凸なので、初期値は複数試し、得られた解の中で目的関数が最大のものを採ります。これだけで大域的な最大値を保証するわけではありません。ZhaoとShaoの第2.3節から引き継ぐのはplug-inの順序で、更新法をそのまま移しているわけではありません。</w:t>
-      </w:r>
-    </w:p>
-    <w:p>
-      <w:pPr>
-        <w:spacing w:after="20"/>
-      </w:pPr>
-    </w:p>
-    <w:p>
-      <w:pPr>
-        <w:pStyle w:val="Heading1"/>
-      </w:pPr>
-      <w:r>
-        <w:t>Slide 34  Simulation targets in the model</w:t>
-      </w:r>
-    </w:p>
-    <w:p>
-      <w:pPr>
-        <w:keepLines/>
-      </w:pPr>
-      <w:r>
-        <w:t>ここからシミュレーションです。Xは固定し、Fは二つのクラスとします。図の下は、Z SからY S、Y SからR Sという流れです。FからZ Sへも矢印があります。FとZ Sは関連するので、ここを独立にしてはいけません。Wと三つのYは全て二値です。Y 1はいつも見えているので、ペアが全部見えるかどうかは、もう一方のD jで決まります。</w:t>
-      </w:r>
-    </w:p>
-    <w:p>
-      <w:pPr>
-        <w:keepLines/>
-      </w:pPr>
-      <w:r>
-        <w:t>生成するときは、FとWの後に、Zの組を先に、Yの組を後に作ります。AがFの下でのZの分布、BがFとZの下でのYの分布です。最後に、そのYを使ってD 2とD 3を独立に生成します。ここはBayes則で書き直しているだけなので、欠測指標まで含めた同時分布は変わりません。Zについて平均すると、元の測定核の積に戻ります。図はそのうち一つのblockを示しています。</w:t>
-      </w:r>
-    </w:p>
-    <w:p>
-      <w:pPr>
-        <w:keepLines/>
-      </w:pPr>
-      <w:r>
-        <w:t>右側は、何を評価するかです。第一段階のミューjは、母集団全体でY jが1になる確率です。p S,cは、ペアの00、01、10、11それぞれの確率です。これに対して第二段階のp fはクラスの比率、M jfはクラスfで項目jが1になる確率を表します。M jfは三項目かける二クラスで六つ、クラス比率はp 2を評価します。</w:t>
-      </w:r>
-    </w:p>
-    <w:p>
-      <w:pPr>
-        <w:keepLines/>
-      </w:pPr>
-      <w:r>
-        <w:t>標本サイズは500で、データを作って推定する作業を100回繰り返します。全項目の平均観測率は80パーセントです。この生成モデルは、Zを平均して消した仮定4とMissing IVの条件を満たします。さらに、Y Sの下でR SとF、W、Z Sが独立になる作り方ですが、この追加条件を一般の識別定理にも求めるわけではありません。</w:t>
-      </w:r>
-    </w:p>
-    <w:p>
-      <w:pPr>
-        <w:spacing w:after="20"/>
-      </w:pPr>
-    </w:p>
-    <w:p>
-      <w:pPr>
-        <w:pStyle w:val="Heading1"/>
-      </w:pPr>
-      <w:r>
-        <w:t>Slide 35  Simulation design: estimators and evaluation</w:t>
-      </w:r>
-    </w:p>
-    <w:p>
-      <w:pPr>
-        <w:keepLines/>
-      </w:pPr>
-      <w:r>
-        <w:t>比較するのは五つです。一つ目は、欠測前の全データを使うoracleです。二つ目は、欠測を無視できると考えて観測尤度を使うMARです。三つ目は、欠測のlogisticモデルを正しく指定したselection likelihoodです。四つ目は、そこからY 1の主効果と交互作用を落とした誤指定版です。この二つのselection likelihoodには、どちらもZ Sを入れません。</w:t>
-      </w:r>
-    </w:p>
-    <w:p>
-      <w:pPr>
-        <w:keepLines/>
-      </w:pPr>
-      <w:r>
-        <w:t>五つ目が提案法です。各blockのMissing IVの式から、四つのセルに対応する逆観測確率のbridgeを推定します。まず正規化したIPWで分布を回復し、その後、重み付きのペアの基準で潜在モデルを当てはめます。次の図で見る提案法のYの分布は、潜在分解をする前の第一段階の結果です。他の四手法は、当てはめたモデルからYの分布を求めています。</w:t>
-      </w:r>
-    </w:p>
-    <w:p>
-      <w:pPr>
-        <w:keepLines/>
-      </w:pPr>
-      <w:r>
-        <w:t>Yの母数ごとに、四つを見ます。Biasは平均的なずれ、SDは100回の推定値のばらつきです。平均SEは、各データから推定した標準誤差の平均なので、SDと近いかを見ます。95パーセントcoverageは、母数ごとのWald信頼区間が真値を含んだ割合です。区間は推定値プラスマイナス1.96 SEで作ります。</w:t>
-      </w:r>
-    </w:p>
-    <w:p>
-      <w:pPr>
-        <w:keepLines/>
-      </w:pPr>
-      <w:r>
-        <w:t>尤度法のSEにはデルタ法とsandwich分散を使います。提案法では、各反復の中で個人単位のbootstrapを200回行い、二つのbridgeを毎回推定し直します。潜在母数はbiasとRMSEで見ます。測定核のRMSEは、100反復と六つの成分の二乗誤差をまとめて平均し、平方根を取ります。成分ごとのRMSEの単純平均ではありません。p 2は別に評価します。</w:t>
-      </w:r>
-    </w:p>
-    <w:p>
-      <w:pPr>
-        <w:spacing w:after="20"/>
-      </w:pPr>
-    </w:p>
-    <w:p>
-      <w:pPr>
-        <w:pStyle w:val="Heading1"/>
-      </w:pPr>
-      <w:r>
-        <w:t>Slide 36  Population outcome recovery</w:t>
-      </w:r>
-    </w:p>
-    <w:p>
-      <w:pPr>
-        <w:keepLines/>
-      </w:pPr>
-      <w:r>
-        <w:t>まず、潜在構造に分ける前に、Yの分布が戻っているかを見ます。横軸が五つの手法、青い実線がミュー2、オレンジの破線がミュー3です。上がbiasとSD、下が平均SEとcoverageです。</w:t>
-      </w:r>
-    </w:p>
-    <w:p>
-      <w:pPr>
-        <w:keepLines/>
-      </w:pPr>
-      <w:r>
-        <w:t>提案法は、MARと誤指定したselection likelihoodよりbiasの絶対値が小さくなっています。SDと平均SEも近く、coverageは94パーセントと93パーセントでした。この設定では、推定した標準誤差が、実際の推定値のばらつきをおおむね捉えています。</w:t>
-      </w:r>
-    </w:p>
-    <w:p>
-      <w:pPr>
-        <w:keepLines/>
-      </w:pPr>
-      <w:r>
-        <w:t>数字を補足すると、ミュー2とミュー3の真値は0.475と0.4925です。提案法のbiasはマイナス0.0099とマイナス0.0096です。SDと平均SEは、ミュー2で0.0379と0.0365、ミュー3で0.0345と0.0339でした。</w:t>
-      </w:r>
-    </w:p>
-    <w:p>
-      <w:pPr>
-        <w:keepLines/>
-      </w:pPr>
-      <w:r>
-        <w:t>一方、MARのcoverageは9パーセントと13パーセント、誤指定版は12パーセントと11パーセントです。正指定版のbiasはほぼゼロですが、Y 2のcoverageは86パーセントでした。100反復の結果なので、常にこの被覆率になるとは言えません。ここで言いたいのは、提案法が常に最も効率的ということではなく、欠測モデルの形を決めずに第一段階でYの偏りを補正できた、という点です。</w:t>
-      </w:r>
-    </w:p>
-    <w:p>
-      <w:pPr>
-        <w:spacing w:after="20"/>
-      </w:pPr>
-    </w:p>
-    <w:p>
-      <w:pPr>
-        <w:pStyle w:val="Heading1"/>
-      </w:pPr>
-      <w:r>
-        <w:t>Slide 37  Stage-2 full joint law</w:t>
-      </w:r>
-    </w:p>
-    <w:p>
-      <w:pPr>
-        <w:keepLines/>
-      </w:pPr>
-      <w:r>
-        <w:t>今度は、三つのYの同時分布を見ます。横軸は0と1の八通りの組合せ、縦軸はそれぞれが起こる確率です。黒い線が母集団の真の分布で、ほかの線は100反復の推定結果を平均しています。</w:t>
-      </w:r>
-    </w:p>
-    <w:p>
-      <w:pPr>
-        <w:keepLines/>
-      </w:pPr>
-      <w:r>
-        <w:t>ここでの青い提案法の線は、第二段階まで使った結果です。回復したペアの分布を共通の潜在構造につなぎ、クラス比率と全ての測定核から、三項目の同時分布を作っています。先ほどの項目ごとの確率と違い、今度は項目の組合せまで再現できているかを見ています。</w:t>
-      </w:r>
-    </w:p>
-    <w:p>
-      <w:pPr>
-        <w:spacing w:after="20"/>
-      </w:pPr>
-    </w:p>
-    <w:p>
-      <w:pPr>
-        <w:pStyle w:val="Heading1"/>
-      </w:pPr>
-      <w:r>
-        <w:t>Slide 38  Latent-parameter recovery</w:t>
-      </w:r>
-    </w:p>
-    <w:p>
-      <w:pPr>
-        <w:keepLines/>
-      </w:pPr>
-      <w:r>
-        <w:t>こちらは、潜在構造まで分けた後の結果です。測定核では、提案法のbiasの絶対値とRMSEが、MARと誤指定したselection likelihoodより小さくなっています。欠測モデルの形を直接決めず、Missing IVからペアの分布を回復していることが効いていると考えられます。</w:t>
-      </w:r>
-    </w:p>
-    <w:p>
-      <w:pPr>
-        <w:keepLines/>
-      </w:pPr>
-      <w:r>
-        <w:t>クラス比率のbiasもほぼゼロです。ただし、RMSEがどの手法よりも小さいわけではありません。欠測モデルを正しく指定できれば、パラメトリックな方法も効率の面で有力です。提案法の利点は、常に一番精度が高いことではなく、欠測モデルの形の誤指定を避けられる点にあります。</w:t>
-      </w:r>
-    </w:p>
-    <w:p>
-      <w:pPr>
-        <w:spacing w:after="20"/>
-      </w:pPr>
-    </w:p>
-    <w:p>
-      <w:pPr>
-        <w:pStyle w:val="Heading1"/>
-      </w:pPr>
-      <w:r>
-        <w:t>Slide 39  Conclusion and limits</w:t>
-      </w:r>
-    </w:p>
-    <w:p>
-      <w:pPr>
-        <w:keepLines/>
-      </w:pPr>
-      <w:r>
-        <w:t>最後にまとめます。第一段階では、Missing IVとblockのcomplete-case completenessを使って、欠測モデルの形をパラメトリックに決めずに各blockの分布を回復します。第二段階では、anchor itemsとWを使い、潜在クラス比率と全ての測定核を共通のラベルで識別します。この接続を定理にして、同じ順序で推定量も作りました。</w:t>
-      </w:r>
-    </w:p>
-    <w:p>
-      <w:pPr>
-        <w:keepLines/>
-      </w:pPr>
-      <w:r>
-        <w:t>ただし、何にでも頑健というわけではありません。クラス数は既知で、有限潜在クラスの測定モデルが正しいことが前提です。必要なペアが観測されること、Missing IVの除外制約、completeness、局所独立性、ランク条件、anchorの順序も必要です。</w:t>
-      </w:r>
-    </w:p>
-    <w:p>
-      <w:pPr>
-        <w:keepLines/>
-      </w:pPr>
-      <w:r>
-        <w:t>また、クラス比率のRMSEは、正しく指定したselection likelihoodより大きくなることがあります。漸近理論も、ここでは有限次元のbridgeに限ります。次元を増やすsieveまで広げるには、逆問題としての追加の条件が要ります。欠測モデルの形を決めずに回復と分解をつなげられることが、今回のポイントです。</w:t>
-      </w:r>
-    </w:p>
-    <w:p>
-      <w:pPr>
-        <w:spacing w:after="20"/>
-      </w:pPr>
-    </w:p>
-    <w:p>
-      <w:pPr>
-        <w:pStyle w:val="Heading1"/>
-      </w:pPr>
-      <w:r>
-        <w:t>Slide 40  Selected references</w:t>
-      </w:r>
-    </w:p>
-    <w:p>
-      <w:pPr>
-        <w:keepLines/>
-      </w:pPr>
-      <w:r>
-        <w:t>主に参照した文献はこちらです。第一段階はd’HaultfoeuilleとZhao、Shao、complete-caseでのcompletenessはMiaoらを参照しています。第二段階はAllman、Matias、Rhodesです。識別の言葉遣いはLewbel、欠測の分類はLittleとRubin、選択バイアスはHeckmanに沿っています。</w:t>
       </w:r>
     </w:p>
     <w:p>

</xml_diff>

<commit_message>
Remove manuscript equation numbering from motivation slide
</commit_message>
<xml_diff>
--- a/manuscript/vector_missing_iv_presentation_script_ja.docx
+++ b/manuscript/vector_missing_iv_presentation_script_ja.docx
@@ -474,7 +474,7 @@
         <w:keepLines/>
       </w:pPr>
       <w:r>
-        <w:t>ここで、なぜ二つの識別をつなぐ必要があるのかを、本文の式5と6で見ます。Dはどの項目が見えたか、Wは潜在分布を動かす変数です。仮に、Y、F、Xを条件づけると、DとWは独立だとします。これが式5です。</w:t>
+        <w:t>ここで、なぜ二つの識別をつなぐ必要があるのかを見ます。Dはどの項目が見えたか、Wは潜在分布を動かす変数です。仮に、Y、F、Xを条件づけると、DとWは独立だとします。これが上の式です。</w:t>
       </w:r>
     </w:p>
     <w:p>
@@ -482,7 +482,7 @@
         <w:keepLines/>
       </w:pPr>
       <w:r>
-        <w:t>でもFは見えないので、平均して消す必要があります。すると式6の赤い部分、Y、W、Xを見た後のFの分布が残ります。この分布はWによって変わりうるので、積分した後までDとWが独立とは言えません。つまり、latent shifterのWを、そのままMissing IVとしては使えないわけです。</w:t>
+        <w:t>でもFは見えないので、平均して消す必要があります。すると下の式の赤い部分、Y、W、Xを見た後のFの分布が残ります。この分布はWによって変わりうるので、積分した後までDとWが独立とは言えません。つまり、latent shifterのWを、そのままMissing IVとしては使えないわけです。</w:t>
       </w:r>
     </w:p>
     <w:p>
@@ -1234,7 +1234,7 @@
         <w:pStyle w:val="Heading1"/>
       </w:pPr>
       <w:r>
-        <w:t>Slide 30  Theorem 5.1</w:t>
+        <w:t>Slide 30  New Theorem 5.1</w:t>
       </w:r>
     </w:p>
     <w:p>

</xml_diff>

<commit_message>
Enlarge presentation typography and rebuild readable figures
</commit_message>
<xml_diff>
--- a/manuscript/vector_missing_iv_presentation_script_ja.docx
+++ b/manuscript/vector_missing_iv_presentation_script_ja.docx
@@ -25,7 +25,7 @@
     </w:p>
     <w:p>
       <w:r>
-        <w:t>英語Beamer全46枚に対応した、日本語の発表原稿です。欠測した人も含む分布をまず回復し、その後で潜在クラスの比率と測定核を分ける、という流れで説明します。各スライドの仮定と数値は残し、本編では証明の流れを、Appendixでは8ステップの詳細を説明します。</w:t>
+        <w:t>英語Beamer全53枚に対応した、日本語の発表原稿です。欠測した人も含む分布をまず回復し、その後で潜在クラスの比率と測定核を分ける、という流れで説明します。各スライドの仮定と数値は残し、本編では証明の流れを、Appendixでは8ステップの詳細を説明します。</w:t>
       </w:r>
     </w:p>
     <w:p>
@@ -98,7 +98,7 @@
                 <w:color w:val="000000"/>
                 <w:sz w:val="21"/>
               </w:rPr>
-              <w:t>Slides 1–7</w:t>
+              <w:t>Slides 1–9</w:t>
             </w:r>
           </w:p>
         </w:tc>
@@ -130,7 +130,7 @@
                 <w:color w:val="000000"/>
                 <w:sz w:val="21"/>
               </w:rPr>
-              <w:t>Slides 8–17</w:t>
+              <w:t>Slides 10–19</w:t>
             </w:r>
           </w:p>
         </w:tc>
@@ -162,7 +162,7 @@
                 <w:color w:val="000000"/>
                 <w:sz w:val="21"/>
               </w:rPr>
-              <w:t>Slides 18–24</w:t>
+              <w:t>Slides 20–26</w:t>
             </w:r>
           </w:p>
         </w:tc>
@@ -194,7 +194,7 @@
                 <w:color w:val="000000"/>
                 <w:sz w:val="21"/>
               </w:rPr>
-              <w:t>Slides 25–38</w:t>
+              <w:t>Slides 27–44</w:t>
             </w:r>
           </w:p>
         </w:tc>
@@ -226,7 +226,7 @@
                 <w:color w:val="000000"/>
                 <w:sz w:val="21"/>
               </w:rPr>
-              <w:t>Appendix 39–46</w:t>
+              <w:t>Appendix 45–53</w:t>
             </w:r>
           </w:p>
         </w:tc>
@@ -397,6 +397,19 @@
     </w:p>
     <w:p>
       <w:pPr>
+        <w:spacing w:after="20"/>
+      </w:pPr>
+    </w:p>
+    <w:p>
+      <w:pPr>
+        <w:pStyle w:val="Heading1"/>
+      </w:pPr>
+      <w:r>
+        <w:t>Slide 5  Latent models with nonignorable missingness</w:t>
+      </w:r>
+    </w:p>
+    <w:p>
+      <w:pPr>
         <w:keepLines/>
       </w:pPr>
       <w:r>
@@ -413,7 +426,7 @@
         <w:pStyle w:val="Heading1"/>
       </w:pPr>
       <w:r>
-        <w:t>Slide 5  Multivariate MNAR and the remaining gap</w:t>
+        <w:t>Slide 6  Multivariate MNAR and the remaining gap</w:t>
       </w:r>
     </w:p>
     <w:p>
@@ -434,6 +447,19 @@
     </w:p>
     <w:p>
       <w:pPr>
+        <w:spacing w:after="20"/>
+      </w:pPr>
+    </w:p>
+    <w:p>
+      <w:pPr>
+        <w:pStyle w:val="Heading1"/>
+      </w:pPr>
+      <w:r>
+        <w:t>Slide 7  Why leave the selection model unspecified?</w:t>
+      </w:r>
+    </w:p>
+    <w:p>
+      <w:pPr>
         <w:keepLines/>
       </w:pPr>
       <w:r>
@@ -466,7 +492,7 @@
         <w:pStyle w:val="Heading1"/>
       </w:pPr>
       <w:r>
-        <w:t>Slide 6  Motivation and objective</w:t>
+        <w:t>Slide 8  Motivation and objective</w:t>
       </w:r>
     </w:p>
     <w:p>
@@ -490,7 +516,7 @@
         <w:keepLines/>
       </w:pPr>
       <w:r>
-        <w:t>右側で二つの役割を分けています。Z SはY Sと関連し、Y Sと共変量を押さえると欠測指標R Sとは独立になる変数です。これを使って、第一段階で欠測による偏りを補正します。一方、WはFの分布を動かし、第二段階で潜在構造を分けるための三つ目のviewを与えます。</w:t>
+        <w:t>下の二つの欄で役割を分けています。Z SはY Sと関連し、Y Sと共変量を押さえると欠測指標R Sとは独立になる変数です。これを使って、第一段階で欠測による偏りを補正します。一方、WはFの分布を動かし、第二段階で潜在構造を分けるための三つ目のviewを与えます。</w:t>
       </w:r>
     </w:p>
     <w:p>
@@ -511,7 +537,7 @@
         <w:pStyle w:val="Heading1"/>
       </w:pPr>
       <w:r>
-        <w:t>Slide 7  Proposed two-stage identification</w:t>
+        <w:t>Slide 9  Proposed two-stage identification</w:t>
       </w:r>
     </w:p>
     <w:p>
@@ -540,7 +566,7 @@
         <w:pStyle w:val="Heading1"/>
       </w:pPr>
       <w:r>
-        <w:t>Slide 8  Model and assumptions</w:t>
+        <w:t>Slide 10  Model and assumptions</w:t>
       </w:r>
     </w:p>
     <w:p>
@@ -561,7 +587,7 @@
         <w:pStyle w:val="Heading1"/>
       </w:pPr>
       <w:r>
-        <w:t>Slide 9  Assumption 1</w:t>
+        <w:t>Slide 11  Assumption 1</w:t>
       </w:r>
     </w:p>
     <w:p>
@@ -590,7 +616,7 @@
         <w:pStyle w:val="Heading1"/>
       </w:pPr>
       <w:r>
-        <w:t>Slide 10  Assumptions 2 and 3</w:t>
+        <w:t>Slide 12  Assumptions 2 and 3</w:t>
       </w:r>
     </w:p>
     <w:p>
@@ -619,7 +645,7 @@
         <w:pStyle w:val="Heading1"/>
       </w:pPr>
       <w:r>
-        <w:t>Slide 11  Assumption 4</w:t>
+        <w:t>Slide 13  Assumption 4</w:t>
       </w:r>
     </w:p>
     <w:p>
@@ -656,7 +682,7 @@
         <w:pStyle w:val="Heading1"/>
       </w:pPr>
       <w:r>
-        <w:t>Slide 12  Lemma 2.1</w:t>
+        <w:t>Slide 14  Lemma 2.1</w:t>
       </w:r>
     </w:p>
     <w:p>
@@ -693,7 +719,7 @@
         <w:pStyle w:val="Heading1"/>
       </w:pPr>
       <w:r>
-        <w:t>Slide 13  Assumption 5</w:t>
+        <w:t>Slide 15  Assumption 5</w:t>
       </w:r>
     </w:p>
     <w:p>
@@ -722,7 +748,7 @@
         <w:pStyle w:val="Heading1"/>
       </w:pPr>
       <w:r>
-        <w:t>Slide 14  Two marginal views of the model</w:t>
+        <w:t>Slide 16  Two marginal views of the model</w:t>
       </w:r>
     </w:p>
     <w:p>
@@ -730,7 +756,7 @@
         <w:keepLines/>
       </w:pPr>
       <w:r>
-        <w:t>同じモデルを、見る変数を変えて二つに分けた図です。上は、ZとDについて平均した測定モデルです。Fと項目の関係を見ています。U SからY Sへの矢印はXの効果だけで、Wは測定核には入りません。項目間の局所独立性は、仮定4の積の式で置いています。</w:t>
+        <w:t>同じモデルを、見る変数を変えて二つに分けた図です。左は、ZとDについて平均した測定モデルです。Fと項目の関係を見ています。U SからY Sへの矢印はXの効果だけで、Wは測定核には入りません。項目間の局所独立性は、仮定4の積の式で置いています。</w:t>
       </w:r>
     </w:p>
     <w:p>
@@ -738,7 +764,7 @@
         <w:keepLines/>
       </w:pPr>
       <w:r>
-        <w:t>下は、Fとblock外の項目について平均した図です。Z SからY S、Y SからR Sへ矢印を引いています。Y SとU Sが決まると、Z SとR Sが独立になる関係です。ここでいうfull-data lawは、回答者だけでなく、欠測した人も含む母集団の分布です。図にY Sがあっても、全員で見えているという意味ではありません。</w:t>
+        <w:t>右は、Fとblock外の項目について平均した図です。Z SからY S、Y SからR Sへ矢印を引いています。Y SとU Sが決まると、Z SとR Sが独立になる関係です。ここでいうfull-data lawは、回答者だけでなく、欠測した人も含む母集団の分布です。図にY Sがあっても、全員で見えているという意味ではありません。</w:t>
       </w:r>
     </w:p>
     <w:p>
@@ -746,7 +772,7 @@
         <w:keepLines/>
       </w:pPr>
       <w:r>
-        <w:t>上下を合体させて一つのDAGとして読むものではありません。特に、この図からFとZの追加の独立性を読み取ることはしません。</w:t>
+        <w:t>左右を合体させて一つのDAGとして読むものではありません。特に、この図からFとZの追加の独立性を読み取ることはしません。</w:t>
       </w:r>
     </w:p>
     <w:p>
@@ -759,7 +785,7 @@
         <w:pStyle w:val="Heading1"/>
       </w:pPr>
       <w:r>
-        <w:t>Slide 15  Overlapping supported blocks replace global complete cases</w:t>
+        <w:t>Slide 17  Overlapping supported blocks</w:t>
       </w:r>
     </w:p>
     <w:p>
@@ -788,7 +814,7 @@
         <w:pStyle w:val="Heading1"/>
       </w:pPr>
       <w:r>
-        <w:t>Slide 16  Assumptions 6 and 7</w:t>
+        <w:t>Slide 18  Assumptions 6 and 7</w:t>
       </w:r>
     </w:p>
     <w:p>
@@ -825,7 +851,7 @@
         <w:pStyle w:val="Heading1"/>
       </w:pPr>
       <w:r>
-        <w:t>Slide 17  New Proposition 1</w:t>
+        <w:t>Slide 19  New Proposition 1</w:t>
       </w:r>
     </w:p>
     <w:p>
@@ -862,7 +888,7 @@
         <w:pStyle w:val="Heading1"/>
       </w:pPr>
       <w:r>
-        <w:t>Slide 18  Finite latent-class identification</w:t>
+        <w:t>Slide 20  Finite latent-class identification</w:t>
       </w:r>
     </w:p>
     <w:p>
@@ -883,7 +909,7 @@
         <w:pStyle w:val="Heading1"/>
       </w:pPr>
       <w:r>
-        <w:t>Slide 19  The remaining decomposition problem</w:t>
+        <w:t>Slide 21  The remaining decomposition problem</w:t>
       </w:r>
     </w:p>
     <w:p>
@@ -899,7 +925,7 @@
         <w:keepLines/>
       </w:pPr>
       <w:r>
-        <w:t>分けたいのは三つです。p fがクラスの比率、GがクラスごとのWの分布、M jがクラスごとの測定核です。同じ観測データの分布を作る値どうしは、Lewbelの言葉でobservationally equivalentと呼びます。第一段階によって、観測データの分布が同じなら、回復したテンソルも同じになります。</w:t>
+        <w:t>ここではXをxに固定します。式のp fがクラスの比率、GがクラスごとのWの分布、M jがクラスごとの測定核です。これらをまとめたものがシータで、ファイxは、シータからペアの確率を並べたテンソルTを作る対応です。同じ観測データの分布を作る値どうしは、Lewbelの言葉でobservationally equivalentと呼びます。第一段階によって、観測データの分布が同じなら、回復したテンソルも同じになります。</w:t>
       </w:r>
     </w:p>
     <w:p>
@@ -920,7 +946,7 @@
         <w:pStyle w:val="Heading1"/>
       </w:pPr>
       <w:r>
-        <w:t>Slide 20  Identification strategy</w:t>
+        <w:t>Slide 22  Identification strategy</w:t>
       </w:r>
     </w:p>
     <w:p>
@@ -949,7 +975,7 @@
         <w:pStyle w:val="Heading1"/>
       </w:pPr>
       <w:r>
-        <w:t>Slide 21  Assumption 3.1: Support and model</w:t>
+        <w:t>Slide 23  Assumption 3.1: Support and model</w:t>
       </w:r>
     </w:p>
     <w:p>
@@ -978,7 +1004,7 @@
         <w:pStyle w:val="Heading1"/>
       </w:pPr>
       <w:r>
-        <w:t>Slide 22  Assumption 3.1: Rank and labels</w:t>
+        <w:t>Slide 24  Assumption 3.1: Rank and labels</w:t>
       </w:r>
     </w:p>
     <w:p>
@@ -1015,7 +1041,7 @@
         <w:pStyle w:val="Heading1"/>
       </w:pPr>
       <w:r>
-        <w:t>Slide 23  Lemma 3.1</w:t>
+        <w:t>Slide 25  Lemma 3.1</w:t>
       </w:r>
     </w:p>
     <w:p>
@@ -1044,7 +1070,7 @@
         <w:pStyle w:val="Heading1"/>
       </w:pPr>
       <w:r>
-        <w:t>Slide 24  New Theorem 1</w:t>
+        <w:t>Slide 26  New Theorem 1</w:t>
       </w:r>
     </w:p>
     <w:p>
@@ -1073,7 +1099,7 @@
         <w:pStyle w:val="Heading1"/>
       </w:pPr>
       <w:r>
-        <w:t>Slide 25  Bridge-weighted composite estimation</w:t>
+        <w:t>Slide 27  Bridge-weighted composite estimation</w:t>
       </w:r>
     </w:p>
     <w:p>
@@ -1102,7 +1128,7 @@
         <w:pStyle w:val="Heading1"/>
       </w:pPr>
       <w:r>
-        <w:t>Slide 26  Conditions for estimation</w:t>
+        <w:t>Slide 28  Conditions for estimation</w:t>
       </w:r>
     </w:p>
     <w:p>
@@ -1131,7 +1157,7 @@
         <w:pStyle w:val="Heading1"/>
       </w:pPr>
       <w:r>
-        <w:t>Slide 27  Assumption 5.1: Regularity</w:t>
+        <w:t>Slide 29  Assumption 5.1: Regularity</w:t>
       </w:r>
     </w:p>
     <w:p>
@@ -1168,7 +1194,7 @@
         <w:pStyle w:val="Heading1"/>
       </w:pPr>
       <w:r>
-        <w:t>Slide 28  Assumption 5.1: Uniform convergence</w:t>
+        <w:t>Slide 30  Assumption 5.1: Uniform convergence</w:t>
       </w:r>
     </w:p>
     <w:p>
@@ -1197,7 +1223,7 @@
         <w:pStyle w:val="Heading1"/>
       </w:pPr>
       <w:r>
-        <w:t>Slide 29  Assumption 5.1: First stage and separation</w:t>
+        <w:t>Slide 31  Assumption 5.1: First stage and separation</w:t>
       </w:r>
     </w:p>
     <w:p>
@@ -1234,7 +1260,7 @@
         <w:pStyle w:val="Heading1"/>
       </w:pPr>
       <w:r>
-        <w:t>Slide 30  New Theorem 5.1</w:t>
+        <w:t>Slide 32  New Theorem 5.1</w:t>
       </w:r>
     </w:p>
     <w:p>
@@ -1271,7 +1297,7 @@
         <w:pStyle w:val="Heading1"/>
       </w:pPr>
       <w:r>
-        <w:t>Slide 31  Computation</w:t>
+        <w:t>Slide 33  Computation</w:t>
       </w:r>
     </w:p>
     <w:p>
@@ -1300,7 +1326,7 @@
         <w:pStyle w:val="Heading1"/>
       </w:pPr>
       <w:r>
-        <w:t>Slide 32  Simulation targets in the model</w:t>
+        <w:t>Slide 34  Simulation targets in the model</w:t>
       </w:r>
     </w:p>
     <w:p>
@@ -1308,7 +1334,7 @@
         <w:keepLines/>
       </w:pPr>
       <w:r>
-        <w:t>ここからシミュレーションです。Xは固定し、Fは二つのクラスとします。図の下は、Z SからY S、Y SからR Sという流れです。FからZ Sへも矢印があります。FとZ Sは関連するので、ここを独立にしてはいけません。Wと三つのYは全て二値です。Y 1はいつも見えているので、ペアが全部見えるかどうかは、もう一方のD jで決まります。</w:t>
+        <w:t>ここからシミュレーションです。Xは固定し、Fは二つのクラスとします。図は、Z SからY S、Y SからR Sという流れです。FからZ Sへも矢印があります。FとZ Sは関連するので、ここを独立にしてはいけません。Wと三つのYは全て二値です。Y 1はいつも見えているので、ペアが全部見えるかどうかは、もう一方のD jで決まります。</w:t>
       </w:r>
     </w:p>
     <w:p>
@@ -1324,14 +1350,6 @@
         <w:keepLines/>
       </w:pPr>
       <w:r>
-        <w:t>右側は、何を評価するかです。第一段階のミューjは、母集団全体でY jが1になる確率です。p S,cは、ペアの00、01、10、11それぞれの確率です。これに対して第二段階のp fはクラスの比率、M jfはクラスfで項目jが1になる確率を表します。M jfは三項目かける二クラスで六つ、クラス比率はp 2を評価します。</w:t>
-      </w:r>
-    </w:p>
-    <w:p>
-      <w:pPr>
-        <w:keepLines/>
-      </w:pPr>
-      <w:r>
         <w:t>標本サイズは500で、データを作って推定する作業を100回繰り返します。全項目の平均観測率は80パーセントです。この生成モデルは、Zを平均して消した仮定4とMissing IVの条件を満たします。さらに、Y Sの下でR SとF、W、Z Sが独立になる作り方ですが、この追加条件を一般の識別定理にも求めるわけではありません。</w:t>
       </w:r>
     </w:p>
@@ -1345,7 +1363,36 @@
         <w:pStyle w:val="Heading1"/>
       </w:pPr>
       <w:r>
-        <w:t>Slide 33  Simulation design: estimators and evaluation</w:t>
+        <w:t>Slide 35  Outcome and latent parameters</w:t>
+      </w:r>
+    </w:p>
+    <w:p>
+      <w:pPr>
+        <w:keepLines/>
+      </w:pPr>
+      <w:r>
+        <w:t>次に、何を評価するかです。第一段階のミューjは、母集団全体でY jが1になる確率です。p S,cは、ペアの00、01、10、11それぞれの確率です。Y 2とY 3、およびY 1とそれぞれを組にしたペアを見ます。</w:t>
+      </w:r>
+    </w:p>
+    <w:p>
+      <w:pPr>
+        <w:keepLines/>
+      </w:pPr>
+      <w:r>
+        <w:t>これに対して第二段階のp fはクラスの比率、M jfはクラスfで項目jが1になる確率を表します。M jfは三項目かける二クラスで六つ、クラス比率はp 2を評価します。Yの分布が戻ることと、その背後の潜在構造が分かることを、分けて見ていきます。</w:t>
+      </w:r>
+    </w:p>
+    <w:p>
+      <w:pPr>
+        <w:spacing w:after="20"/>
+      </w:pPr>
+    </w:p>
+    <w:p>
+      <w:pPr>
+        <w:pStyle w:val="Heading1"/>
+      </w:pPr>
+      <w:r>
+        <w:t>Slide 36  Simulation design: five estimators</w:t>
       </w:r>
     </w:p>
     <w:p>
@@ -1361,7 +1408,20 @@
         <w:keepLines/>
       </w:pPr>
       <w:r>
-        <w:t>五つ目が提案法です。各blockのMissing IVの式から、四つのセルに対応する逆観測確率のbridgeを推定します。まず正規化したIPWで分布を回復し、その後、重み付きのペアの基準で潜在モデルを当てはめます。次の図で見る提案法のYの分布は、潜在分解をする前の第一段階の結果です。他の四手法は、当てはめたモデルからYの分布を求めています。</w:t>
+        <w:t>五つ目が提案法です。各blockのMissing IVの式から、四つのセルに対応する逆観測確率のbridgeを推定します。まず正規化したIPWで分布を回復し、その後、重み付きのペアの基準で潜在モデルを当てはめます。後で見る提案法の項目ごとの確率は、潜在分解をする前の第一段階の結果です。他の四手法は、当てはめたモデルからYの分布を求めています。</w:t>
+      </w:r>
+    </w:p>
+    <w:p>
+      <w:pPr>
+        <w:spacing w:after="20"/>
+      </w:pPr>
+    </w:p>
+    <w:p>
+      <w:pPr>
+        <w:pStyle w:val="Heading1"/>
+      </w:pPr>
+      <w:r>
+        <w:t>Slide 37  Simulation evaluation criteria</w:t>
       </w:r>
     </w:p>
     <w:p>
@@ -1390,7 +1450,7 @@
         <w:pStyle w:val="Heading1"/>
       </w:pPr>
       <w:r>
-        <w:t>Slide 34  Population outcome recovery</w:t>
+        <w:t>Slide 38  Population outcome recovery: bias and SD</w:t>
       </w:r>
     </w:p>
     <w:p>
@@ -1398,7 +1458,7 @@
         <w:keepLines/>
       </w:pPr>
       <w:r>
-        <w:t>まず、潜在構造に分ける前に、Yの分布が戻っているかを見ます。横軸が五つの手法、青い実線がミュー2、オレンジの破線がミュー3です。上がbiasとSD、下が平均SEとcoverageです。</w:t>
+        <w:t>まず、潜在構造に分ける前に、Yの分布が戻っているかを見ます。このページでは、ミュー2とミュー3について、五つの手法のbiasとSDを比べます。</w:t>
       </w:r>
     </w:p>
     <w:p>
@@ -1406,15 +1466,28 @@
         <w:keepLines/>
       </w:pPr>
       <w:r>
-        <w:t>提案法は、MARと誤指定したselection likelihoodよりbiasの絶対値が小さくなっています。SDと平均SEも近く、coverageは94パーセントと93パーセントでした。この設定では、推定した標準誤差が、実際の推定値のばらつきをおおむね捉えています。</w:t>
+        <w:t>提案法は、MARと誤指定したselection likelihoodよりbiasの絶対値が小さくなっています。ミュー2とミュー3の真値は0.475と0.4925で、提案法のbiasはマイナス0.0099とマイナス0.0096です。SDはそれぞれ0.0379と0.0345でした。平均的なずれと、反復ごとのばらつきを分けて見ています。</w:t>
       </w:r>
     </w:p>
     <w:p>
       <w:pPr>
+        <w:spacing w:after="20"/>
+      </w:pPr>
+    </w:p>
+    <w:p>
+      <w:pPr>
+        <w:pStyle w:val="Heading1"/>
+      </w:pPr>
+      <w:r>
+        <w:t>Slide 39  Population outcome recovery: SE and coverage</w:t>
+      </w:r>
+    </w:p>
+    <w:p>
+      <w:pPr>
         <w:keepLines/>
       </w:pPr>
       <w:r>
-        <w:t>数字を補足すると、ミュー2とミュー3の真値は0.475と0.4925です。提案法のbiasはマイナス0.0099とマイナス0.0096です。SDと平均SEは、ミュー2で0.0379と0.0365、ミュー3で0.0345と0.0339でした。</w:t>
+        <w:t>続いて、不確実性をうまく測れているかを見ます。提案法の平均SEは、ミュー2で0.0365、ミュー3で0.0339です。前のページのSD、0.0379と0.0345に近く、実際の推定値のばらつきをおおむね捉えています。coverageは94パーセントと93パーセントでした。</w:t>
       </w:r>
     </w:p>
     <w:p>
@@ -1435,7 +1508,7 @@
         <w:pStyle w:val="Heading1"/>
       </w:pPr>
       <w:r>
-        <w:t>Slide 35  Stage-2 full joint law</w:t>
+        <w:t>Slide 40  Stage-2 full joint law</w:t>
       </w:r>
     </w:p>
     <w:p>
@@ -1464,7 +1537,7 @@
         <w:pStyle w:val="Heading1"/>
       </w:pPr>
       <w:r>
-        <w:t>Slide 36  Latent-parameter recovery</w:t>
+        <w:t>Slide 41  Latent-parameter recovery</w:t>
       </w:r>
     </w:p>
     <w:p>
@@ -1493,7 +1566,7 @@
         <w:pStyle w:val="Heading1"/>
       </w:pPr>
       <w:r>
-        <w:t>Slide 37  Conclusion and limits</w:t>
+        <w:t>Slide 42  Conclusion and limits</w:t>
       </w:r>
     </w:p>
     <w:p>
@@ -1530,7 +1603,7 @@
         <w:pStyle w:val="Heading1"/>
       </w:pPr>
       <w:r>
-        <w:t>Slide 38  Selected references</w:t>
+        <w:t>Slide 43  Selected references</w:t>
       </w:r>
     </w:p>
     <w:p>
@@ -1538,7 +1611,7 @@
         <w:keepLines/>
       </w:pPr>
       <w:r>
-        <w:t>主に参照した文献はこちらです。第一段階はd’HaultfoeuilleとZhao、Shao、complete-caseでのcompletenessはMiaoらを参照しています。第二段階はAllman、Matias、Rhodesです。識別の言葉遣いはLewbel、欠測の分類はLittleとRubin、選択バイアスはHeckmanに沿っています。</w:t>
+        <w:t>主に参照した文献を二枚に分けています。このページのAllman、Matias、Rhodesは潜在分解の一意性、d’HaultfoeuilleはMissing IVを使った分布の回復、Heckmanは選択バイアスの議論に対応します。</w:t>
       </w:r>
     </w:p>
     <w:p>
@@ -1551,7 +1624,28 @@
         <w:pStyle w:val="Heading1"/>
       </w:pPr>
       <w:r>
-        <w:t>Appendix Slide 39  Proof sketch for Proposition 1</w:t>
+        <w:t>Slide 44  Selected references (continued)</w:t>
+      </w:r>
+    </w:p>
+    <w:p>
+      <w:pPr>
+        <w:keepLines/>
+      </w:pPr>
+      <w:r>
+        <w:t>こちらは続きです。識別の言葉遣いはLewbel、欠測の分類はLittleとRubinを参照しています。Miaoらはshadow variableとcomplete-caseでのcompleteness、ZhaoとShaoは共変量を調整した除外制約と半パラメトリックな推定の背景です。</w:t>
+      </w:r>
+    </w:p>
+    <w:p>
+      <w:pPr>
+        <w:spacing w:after="20"/>
+      </w:pPr>
+    </w:p>
+    <w:p>
+      <w:pPr>
+        <w:pStyle w:val="Heading1"/>
+      </w:pPr>
+      <w:r>
+        <w:t>Appendix Slide 45  Proof sketch for Proposition 1</w:t>
       </w:r>
     </w:p>
     <w:p>
@@ -1588,7 +1682,7 @@
         <w:pStyle w:val="Heading1"/>
       </w:pPr>
       <w:r>
-        <w:t>Appendix Slide 40  Proof map for Theorem 1</w:t>
+        <w:t>Appendix Slide 46  Proof map for Theorem 1</w:t>
       </w:r>
     </w:p>
     <w:p>
@@ -1617,7 +1711,7 @@
         <w:pStyle w:val="Heading1"/>
       </w:pPr>
       <w:r>
-        <w:t>Appendix Slide 41  Proof of Theorem 1 (Steps 1--2)</w:t>
+        <w:t>Appendix Slide 47  Proof of Theorem 1 (Steps 1--2)</w:t>
       </w:r>
     </w:p>
     <w:p>
@@ -1646,7 +1740,7 @@
         <w:pStyle w:val="Heading1"/>
       </w:pPr>
       <w:r>
-        <w:t>Appendix Slide 42  Proof of Theorem 1 (Steps 3--4)</w:t>
+        <w:t>Appendix Slide 48  Proof of Theorem 1 (Steps 3--4)</w:t>
       </w:r>
     </w:p>
     <w:p>
@@ -1675,7 +1769,7 @@
         <w:pStyle w:val="Heading1"/>
       </w:pPr>
       <w:r>
-        <w:t>Appendix Slide 43  Proof of Theorem 1 (Steps 5--6)</w:t>
+        <w:t>Appendix Slide 49  Proof of Theorem 1 (Steps 5--6)</w:t>
       </w:r>
     </w:p>
     <w:p>
@@ -1704,7 +1798,7 @@
         <w:pStyle w:val="Heading1"/>
       </w:pPr>
       <w:r>
-        <w:t>Appendix Slide 44  Proof of Theorem 1 (Steps 7--8)</w:t>
+        <w:t>Appendix Slide 50  Proof of Theorem 1 (Steps 7--8)</w:t>
       </w:r>
     </w:p>
     <w:p>
@@ -1733,7 +1827,7 @@
         <w:pStyle w:val="Heading1"/>
       </w:pPr>
       <w:r>
-        <w:t>Appendix Slide 45  Empirical diagnostics and falsification checks</w:t>
+        <w:t>Appendix Slide 51  empirical diagnostics and falsification checks</w:t>
       </w:r>
     </w:p>
     <w:p>
@@ -1762,7 +1856,7 @@
         <w:pStyle w:val="Heading1"/>
       </w:pPr>
       <w:r>
-        <w:t>Appendix Slide 46  Simulation calibration</w:t>
+        <w:t>Appendix Slide 52  simulation calibration</w:t>
       </w:r>
     </w:p>
     <w:p>
@@ -1771,6 +1865,27 @@
       </w:pPr>
       <w:r>
         <w:t>こちらは、シミュレーションの具体的な設定です。WとYのモデルの形は、Allman、Matias、Rhodesの有限クラスのproduct mixtureに沿っています。ただし、数値は本研究で決めています。クラス比率は0.55と0.45です。G fはクラスごとのWの分布で、ラベルはY 1が1となる確率の小さい順にそろえます。</w:t>
+      </w:r>
+    </w:p>
+    <w:p>
+      <w:pPr>
+        <w:keepLines/>
+      </w:pPr>
+      <w:r>
+        <w:t>クラス1と2で、Wが1となる確率は0.20と0.80です。Y 1が1となる確率は0.15と0.80、Y 2は0.25と0.75、Y 3は0.20と0.85です。これらの測定核をクラスごとに掛け、クラス比率で平均すると、母集団の分布になります。</w:t>
+      </w:r>
+    </w:p>
+    <w:p>
+      <w:pPr>
+        <w:spacing w:after="20"/>
+      </w:pPr>
+    </w:p>
+    <w:p>
+      <w:pPr>
+        <w:pStyle w:val="Heading1"/>
+      </w:pPr>
+      <w:r>
+        <w:t>Appendix Slide 53  selection and shadow calibration</w:t>
       </w:r>
     </w:p>
     <w:p>

</xml_diff>

<commit_message>
Summarize identification stages and move details to appendix
</commit_message>
<xml_diff>
--- a/manuscript/vector_missing_iv_presentation_script_ja.docx
+++ b/manuscript/vector_missing_iv_presentation_script_ja.docx
@@ -25,7 +25,7 @@
     </w:p>
     <w:p>
       <w:r>
-        <w:t>英語Beamer全53枚に対応した、日本語の発表原稿です。欠測した人も含む分布をまず回復し、その後で潜在クラスの比率と測定核を分ける、という流れで説明します。各スライドの仮定と数値は残し、本編では証明の流れを、Appendixでは8ステップの詳細を説明します。</w:t>
+        <w:t>英語Beamer全57枚に対応した、日本語の発表原稿です。欠測した人も含む分布をまず回復し、その後で潜在クラスの比率と測定核を分ける、という流れで説明します。本編24枚では二段階の要約、推定理論と数値結果を説明します。25枚目からのAppendixには、元の詳細な動機、仮定、識別と推定の議論を残し、その後に証明と数値設定を収めています。</w:t>
       </w:r>
     </w:p>
     <w:p>
@@ -98,7 +98,7 @@
                 <w:color w:val="000000"/>
                 <w:sz w:val="21"/>
               </w:rPr>
-              <w:t>Slides 1–9</w:t>
+              <w:t>Slides 1–7</w:t>
             </w:r>
           </w:p>
         </w:tc>
@@ -113,7 +113,7 @@
                 <w:color w:val="000000"/>
                 <w:sz w:val="21"/>
               </w:rPr>
-              <w:t>基礎概念、既存研究、二段階の識別戦略</w:t>
+              <w:t>基礎概念、既存研究、問題設定</w:t>
             </w:r>
           </w:p>
         </w:tc>
@@ -130,7 +130,7 @@
                 <w:color w:val="000000"/>
                 <w:sz w:val="21"/>
               </w:rPr>
-              <w:t>Slides 10–19</w:t>
+              <w:t>Slides 8–11</w:t>
             </w:r>
           </w:p>
         </w:tc>
@@ -145,7 +145,7 @@
                 <w:color w:val="000000"/>
                 <w:sz w:val="21"/>
               </w:rPr>
-              <w:t>仮定1から7、supported-block lawの回復</w:t>
+              <w:t>二段階の要約 分布の回復、重なるペア、潜在構造の識別、推定への接続</w:t>
             </w:r>
           </w:p>
         </w:tc>
@@ -162,7 +162,7 @@
                 <w:color w:val="000000"/>
                 <w:sz w:val="21"/>
               </w:rPr>
-              <w:t>Slides 20–26</w:t>
+              <w:t>Slides 12–24</w:t>
             </w:r>
           </w:p>
         </w:tc>
@@ -177,7 +177,7 @@
                 <w:color w:val="000000"/>
                 <w:sz w:val="21"/>
               </w:rPr>
-              <w:t>仮定3.1、有限潜在クラスのtensor分解</w:t>
+              <w:t>漸近理論、計算、simulation、結論、参考文献</w:t>
             </w:r>
           </w:p>
         </w:tc>
@@ -194,7 +194,7 @@
                 <w:color w:val="000000"/>
                 <w:sz w:val="21"/>
               </w:rPr>
-              <w:t>Slides 27–44</w:t>
+              <w:t>Appendix 25–48</w:t>
             </w:r>
           </w:p>
         </w:tc>
@@ -209,7 +209,7 @@
                 <w:color w:val="000000"/>
                 <w:sz w:val="21"/>
               </w:rPr>
-              <w:t>推定、仮定5.1、漸近理論、計算、simulation、結論、参考文献</w:t>
+              <w:t>詳細な動機、モデルと仮定、block lawの回復、潜在識別、推定条件</w:t>
             </w:r>
           </w:p>
         </w:tc>
@@ -226,7 +226,7 @@
                 <w:color w:val="000000"/>
                 <w:sz w:val="21"/>
               </w:rPr>
-              <w:t>Appendix 45–53</w:t>
+              <w:t>Appendix 49–57</w:t>
             </w:r>
           </w:p>
         </w:tc>
@@ -492,7 +492,548 @@
         <w:pStyle w:val="Heading1"/>
       </w:pPr>
       <w:r>
-        <w:t>Slide 8  Motivation and objective</w:t>
+        <w:t>Slide 8  Stage 1 (1): Recover the block law</w:t>
+      </w:r>
+    </w:p>
+    <w:p>
+      <w:pPr>
+        <w:keepLines/>
+      </w:pPr>
+      <w:r>
+        <w:t>まず第一段階です。知りたいのは、回答した人だけでなく、欠測した人も含めたblockの分布です。Sは一緒に扱う項目の組、R Sはその組が全部見えているかを表します。U SにはXとWをまとめています。</w:t>
+      </w:r>
+    </w:p>
+    <w:p>
+      <w:pPr>
+        <w:keepLines/>
+      </w:pPr>
+      <w:r>
+        <w:t>ここで使うZ SがMissing IVです。項目の値とは関連しますが、その値とU Sを押さえると、blockが見えるかどうかとは独立になります。この条件から、逆観測確率を重みにした条件付きモーメントの式が出てきます。complete-caseでのcompletenessとpositivityを置くと、bridgeが一つに決まります。</w:t>
+      </w:r>
+    </w:p>
+    <w:p>
+      <w:pPr>
+        <w:keepLines/>
+      </w:pPr>
+      <w:r>
+        <w:t>あとは、blockが全部見えた人をその重みで重み付けします。すると、Y S、Z S、U Sの母集団の同時分布が戻ります。一意性は、逆観測確率がcomplete caseで二乗可積分になる、ここで定めたbridgeの範囲での結果です。欠測確率をlogisticなどの形に決めなくてよい、というのが、この段階のポイントです。</w:t>
+      </w:r>
+    </w:p>
+    <w:p>
+      <w:pPr>
+        <w:spacing w:after="20"/>
+      </w:pPr>
+    </w:p>
+    <w:p>
+      <w:pPr>
+        <w:pStyle w:val="Heading1"/>
+      </w:pPr>
+      <w:r>
+        <w:t>Slide 9  Stage 1 (2): Use overlapping pairs</w:t>
+      </w:r>
+    </w:p>
+    <w:p>
+      <w:pPr>
+        <w:keepLines/>
+      </w:pPr>
+      <w:r>
+        <w:t>次に、どのblockを回復するかです。全項目が同時に見える人を集める必要はありません。基準になる二つの項目aとbのペアと、aと残りの項目jを組にしたペアを使います。項目aが共通しているので、ペアどうしが重なっています。</w:t>
+      </w:r>
+    </w:p>
+    <w:p>
+      <w:pPr>
+        <w:keepLines/>
+      </w:pPr>
+      <w:r>
+        <w:t>必要なペアごとに、先ほどのMissing IV、completeness、positivityの条件を置いて分布を回復します。得られるのは、各ペアとWの母集団の分布です。まだ潜在クラスや測定核まで分かったわけではないので、それを次の段階で分けます。</w:t>
+      </w:r>
+    </w:p>
+    <w:p>
+      <w:pPr>
+        <w:keepLines/>
+      </w:pPr>
+      <w:r>
+        <w:t>ここではZ SとWの役割も分けておきます。Z Sは欠測の偏りを補正するための変数です。Wは潜在構造を分けるための三つ目のviewになります。潜在分布を動かすWを、そのままMissing IVとして使えるとは限りません。</w:t>
+      </w:r>
+    </w:p>
+    <w:p>
+      <w:pPr>
+        <w:spacing w:after="20"/>
+      </w:pPr>
+    </w:p>
+    <w:p>
+      <w:pPr>
+        <w:pStyle w:val="Heading1"/>
+      </w:pPr>
+      <w:r>
+        <w:t>Slide 10  Stage 2 (1): Identify the latent structure</w:t>
+      </w:r>
+    </w:p>
+    <w:p>
+      <w:pPr>
+        <w:keepLines/>
+      </w:pPr>
+      <w:r>
+        <w:t>第二段階では、戻したペアの分布から、その背後の潜在構造を取り出します。クラス数rは既知で有限、項目とWが取り得る値も有限とします。さらに、FとXの下での局所独立性と、Wが測定核に直接入らないことを仮定します。ランク条件は、三つのviewのKruskal rank、k a、k b、k Gの和が2rプラス2以上、というものです。</w:t>
+      </w:r>
+    </w:p>
+    <w:p>
+      <w:pPr>
+        <w:keepLines/>
+      </w:pPr>
+      <w:r>
+        <w:t>まずanchorの二項目とWの確率を、三つの方向を持つ表、テンソルに並べます。Kruskalのランク条件があると、この分解はクラスの入れ替えと大きさの調整を除いて一つに決まります。確率の和を1にし、anchorのスコアで順序をそろえると、クラス比率p、Wのクラス別分布G、二つの測定核が分かります。</w:t>
+      </w:r>
+    </w:p>
+    <w:p>
+      <w:pPr>
+        <w:keepLines/>
+      </w:pPr>
+      <w:r>
+        <w:t>残りの項目は、共通のanchorを含むペアから線形の式を解いて求めます。これで全ての測定核が同じクラス名でそろい、ベイズ則からWごとのクラス比率も分かります。この測定モデルの下では、全項目の同時分布も組み立てられます。</w:t>
+      </w:r>
+    </w:p>
+    <w:p>
+      <w:pPr>
+        <w:spacing w:after="20"/>
+      </w:pPr>
+    </w:p>
+    <w:p>
+      <w:pPr>
+        <w:pStyle w:val="Heading1"/>
+      </w:pPr>
+      <w:r>
+        <w:t>Slide 11  Stage 2 (2): Connect identification to estimation</w:t>
+      </w:r>
+    </w:p>
+    <w:p>
+      <w:pPr>
+        <w:keepLines/>
+      </w:pPr>
+      <w:r>
+        <w:t>ここまでで分かったWごとのクラス比率と各測定核を使うと、任意の項目集合Aの同時分布を作れます。クラスごとに各項目の確率を掛け、ラムダfで重み付けして足す、という式です。一度も一緒に観測されていない項目にも使えますが、局所独立性など、いまの測定モデルの下での結果です。</w:t>
+      </w:r>
+    </w:p>
+    <w:p>
+      <w:pPr>
+        <w:keepLines/>
+      </w:pPr>
+      <w:r>
+        <w:t>推定も、いま説明した順番で進めます。まず各ペアのbridgeを推定して、重み付きの分布を作ります。その後、ペアどうしに共通する潜在クラスモデルを当てはめます。使うのは、ペアごとの対数密度をbridgeで重み付けして足したcompositeな基準です。</w:t>
+      </w:r>
+    </w:p>
+    <w:p>
+      <w:pPr>
+        <w:keepLines/>
+      </w:pPr>
+      <w:r>
+        <w:t>識別の結果によって、母集団でどの値を目指すかが決まります。ただ、それだけで標本からの推定が安定するわけではありません。一様収束や真値での最大値の分離、滑らかさ、bridgeの正則性など、推定の条件も必要です。詳しい条件はAppendixに残しています。</w:t>
+      </w:r>
+    </w:p>
+    <w:p>
+      <w:pPr>
+        <w:keepLines/>
+      </w:pPr>
+      <w:r>
+        <w:t>次の定理では、固定した有限次元のbridgeについて、一致性と漸近正規性を示します。分散には、最初にbridgeを推定した誤差も入れます。bridgeの次元を増やすsieveの理論まで示しているわけではない、という範囲も押さえておきます。</w:t>
+      </w:r>
+    </w:p>
+    <w:p>
+      <w:pPr>
+        <w:spacing w:after="20"/>
+      </w:pPr>
+    </w:p>
+    <w:p>
+      <w:pPr>
+        <w:pStyle w:val="Heading1"/>
+      </w:pPr>
+      <w:r>
+        <w:t>Slide 12  New Theorem 5.1</w:t>
+      </w:r>
+    </w:p>
+    <w:p>
+      <w:pPr>
+        <w:keepLines/>
+      </w:pPr>
+      <w:r>
+        <w:t>以上の命題4.1と仮定5.1の下で、有限次元のbridgeを使う推定量は一致性と漸近正規性を持ちます。標本が増えると真値に近づき、その誤差をルートn倍したものが、漸近的に正規分布に従うという結果です。</w:t>
+      </w:r>
+    </w:p>
+    <w:p>
+      <w:pPr>
+        <w:keepLines/>
+      </w:pPr>
+      <w:r>
+        <w:t>分散の式で大事なのは、bridgeを推定した誤差も入ることです。Aはcomposite scoreをシータで微分した期待値、Cはイータで微分した期待値です。Bにはscoreに加え、Cと第一段階の影響関数の積が入ります。bridgeが既知だとして分散を出してはいけません。</w:t>
+      </w:r>
+    </w:p>
+    <w:p>
+      <w:pPr>
+        <w:keepLines/>
+      </w:pPr>
+      <w:r>
+        <w:t>個人単位のbootstrapを使うなら、両段階の推定とラベル合わせを毎回やり直します。なお、次元を増やしていくsieveは、この定理の範囲外です。推定速度や逆問題としての追加の条件が必要です。</w:t>
+      </w:r>
+    </w:p>
+    <w:p>
+      <w:pPr>
+        <w:spacing w:after="20"/>
+      </w:pPr>
+    </w:p>
+    <w:p>
+      <w:pPr>
+        <w:pStyle w:val="Heading1"/>
+      </w:pPr>
+      <w:r>
+        <w:t>Slide 13  Computation</w:t>
+      </w:r>
+    </w:p>
+    <w:p>
+      <w:pPr>
+        <w:keepLines/>
+      </w:pPr>
+      <w:r>
+        <w:t>計算も、回復、分解、更新の順番です。まずbridgeを推定し、重み付きのテンソルを作ります。anchorを分解してラベルをそろえ、残りの測定核の初期値を出します。</w:t>
+      </w:r>
+    </w:p>
+    <w:p>
+      <w:pPr>
+        <w:keepLines/>
+      </w:pPr>
+      <w:r>
+        <w:t>その後、確率が非負で和が1になる制約を守りながら、全体を更新します。目的関数は非凸なので、初期値は複数試し、得られた解の中で目的関数が最大のものを採ります。これだけで大域的な最大値を保証するわけではありません。ZhaoとShaoの第2.3節から引き継ぐのはplug-inの順序で、更新法をそのまま移しているわけではありません。</w:t>
+      </w:r>
+    </w:p>
+    <w:p>
+      <w:pPr>
+        <w:spacing w:after="20"/>
+      </w:pPr>
+    </w:p>
+    <w:p>
+      <w:pPr>
+        <w:pStyle w:val="Heading1"/>
+      </w:pPr>
+      <w:r>
+        <w:t>Slide 14  Simulation targets in the model</w:t>
+      </w:r>
+    </w:p>
+    <w:p>
+      <w:pPr>
+        <w:keepLines/>
+      </w:pPr>
+      <w:r>
+        <w:t>ここからシミュレーションです。Xは固定し、Fは二つのクラスとします。図は、Z SからY S、Y SからR Sという流れです。FからZ Sへも矢印があります。FとZ Sは関連するので、ここを独立にしてはいけません。Wと三つのYは全て二値です。Y 1はいつも見えているので、ペアが全部見えるかどうかは、もう一方のD jで決まります。</w:t>
+      </w:r>
+    </w:p>
+    <w:p>
+      <w:pPr>
+        <w:keepLines/>
+      </w:pPr>
+      <w:r>
+        <w:t>生成するときは、FとWの後に、Zの組を先に、Yの組を後に作ります。AがFの下でのZの分布、BがFとZの下でのYの分布です。最後に、そのYを使ってD 2とD 3を独立に生成します。ここはBayes則で書き直しているだけなので、欠測指標まで含めた同時分布は変わりません。Zについて平均すると、元の測定核の積に戻ります。図はそのうち一つのblockを示しています。</w:t>
+      </w:r>
+    </w:p>
+    <w:p>
+      <w:pPr>
+        <w:keepLines/>
+      </w:pPr>
+      <w:r>
+        <w:t>標本サイズは500で、データを作って推定する作業を100回繰り返します。全項目の平均観測率は80パーセントです。この生成モデルは、Zを平均して消した仮定4とMissing IVの条件を満たします。さらに、Y Sの下でR SとF、W、Z Sが独立になる作り方ですが、この追加条件を一般の識別定理にも求めるわけではありません。</w:t>
+      </w:r>
+    </w:p>
+    <w:p>
+      <w:pPr>
+        <w:spacing w:after="20"/>
+      </w:pPr>
+    </w:p>
+    <w:p>
+      <w:pPr>
+        <w:pStyle w:val="Heading1"/>
+      </w:pPr>
+      <w:r>
+        <w:t>Slide 15  Outcome and latent parameters</w:t>
+      </w:r>
+    </w:p>
+    <w:p>
+      <w:pPr>
+        <w:keepLines/>
+      </w:pPr>
+      <w:r>
+        <w:t>次に、何を評価するかです。第一段階のミューjは、母集団全体でY jが1になる確率です。p S,cは、ペアの00、01、10、11それぞれの確率です。Y 2とY 3、およびY 1とそれぞれを組にしたペアを見ます。</w:t>
+      </w:r>
+    </w:p>
+    <w:p>
+      <w:pPr>
+        <w:keepLines/>
+      </w:pPr>
+      <w:r>
+        <w:t>これに対して第二段階のp fはクラスの比率、M jfはクラスfで項目jが1になる確率を表します。M jfは三項目かける二クラスで六つ、クラス比率はp 2を評価します。Yの分布が戻ることと、その背後の潜在構造が分かることを、分けて見ていきます。</w:t>
+      </w:r>
+    </w:p>
+    <w:p>
+      <w:pPr>
+        <w:spacing w:after="20"/>
+      </w:pPr>
+    </w:p>
+    <w:p>
+      <w:pPr>
+        <w:pStyle w:val="Heading1"/>
+      </w:pPr>
+      <w:r>
+        <w:t>Slide 16  Simulation design: five estimators</w:t>
+      </w:r>
+    </w:p>
+    <w:p>
+      <w:pPr>
+        <w:keepLines/>
+      </w:pPr>
+      <w:r>
+        <w:t>比較するのは五つです。一つ目は、欠測前の全データを使うoracleです。二つ目は、欠測を無視できると考えて観測尤度を使うMARです。三つ目は、欠測のlogisticモデルを正しく指定したselection likelihoodです。四つ目は、そこからY 1の主効果と交互作用を落とした誤指定版です。この二つのselection likelihoodには、どちらもZ Sを入れません。</w:t>
+      </w:r>
+    </w:p>
+    <w:p>
+      <w:pPr>
+        <w:keepLines/>
+      </w:pPr>
+      <w:r>
+        <w:t>五つ目が提案法です。各blockのMissing IVの式から、四つのセルに対応する逆観測確率のbridgeを推定します。まず正規化したIPWで分布を回復し、その後、重み付きのペアの基準で潜在モデルを当てはめます。後で見る提案法の項目ごとの確率は、潜在分解をする前の第一段階の結果です。他の四手法は、当てはめたモデルからYの分布を求めています。</w:t>
+      </w:r>
+    </w:p>
+    <w:p>
+      <w:pPr>
+        <w:spacing w:after="20"/>
+      </w:pPr>
+    </w:p>
+    <w:p>
+      <w:pPr>
+        <w:pStyle w:val="Heading1"/>
+      </w:pPr>
+      <w:r>
+        <w:t>Slide 17  Simulation evaluation criteria</w:t>
+      </w:r>
+    </w:p>
+    <w:p>
+      <w:pPr>
+        <w:keepLines/>
+      </w:pPr>
+      <w:r>
+        <w:t>Yの母数ごとに、四つを見ます。Biasは平均的なずれ、SDは100回の推定値のばらつきです。平均SEは、各データから推定した標準誤差の平均なので、SDと近いかを見ます。95パーセントcoverageは、母数ごとのWald信頼区間が真値を含んだ割合です。区間は推定値プラスマイナス1.96 SEで作ります。</w:t>
+      </w:r>
+    </w:p>
+    <w:p>
+      <w:pPr>
+        <w:keepLines/>
+      </w:pPr>
+      <w:r>
+        <w:t>尤度法のSEにはデルタ法とsandwich分散を使います。提案法では、各反復の中で個人単位のbootstrapを200回行い、二つのbridgeを毎回推定し直します。潜在母数はbiasとRMSEで見ます。測定核のRMSEは、100反復と六つの成分の二乗誤差をまとめて平均し、平方根を取ります。成分ごとのRMSEの単純平均ではありません。p 2は別に評価します。</w:t>
+      </w:r>
+    </w:p>
+    <w:p>
+      <w:pPr>
+        <w:spacing w:after="20"/>
+      </w:pPr>
+    </w:p>
+    <w:p>
+      <w:pPr>
+        <w:pStyle w:val="Heading1"/>
+      </w:pPr>
+      <w:r>
+        <w:t>Slide 18  Population outcome recovery: bias and SD</w:t>
+      </w:r>
+    </w:p>
+    <w:p>
+      <w:pPr>
+        <w:keepLines/>
+      </w:pPr>
+      <w:r>
+        <w:t>まず、潜在構造に分ける前に、Yの分布が戻っているかを見ます。このページでは、ミュー2とミュー3について、五つの手法のbiasとSDを比べます。</w:t>
+      </w:r>
+    </w:p>
+    <w:p>
+      <w:pPr>
+        <w:keepLines/>
+      </w:pPr>
+      <w:r>
+        <w:t>提案法は、MARと誤指定したselection likelihoodよりbiasの絶対値が小さくなっています。ミュー2とミュー3の真値は0.475と0.4925で、提案法のbiasはマイナス0.0099とマイナス0.0096です。SDはそれぞれ0.0379と0.0345でした。平均的なずれと、反復ごとのばらつきを分けて見ています。</w:t>
+      </w:r>
+    </w:p>
+    <w:p>
+      <w:pPr>
+        <w:spacing w:after="20"/>
+      </w:pPr>
+    </w:p>
+    <w:p>
+      <w:pPr>
+        <w:pStyle w:val="Heading1"/>
+      </w:pPr>
+      <w:r>
+        <w:t>Slide 19  Population outcome recovery: SE and coverage</w:t>
+      </w:r>
+    </w:p>
+    <w:p>
+      <w:pPr>
+        <w:keepLines/>
+      </w:pPr>
+      <w:r>
+        <w:t>続いて、不確実性をうまく測れているかを見ます。提案法の平均SEは、ミュー2で0.0365、ミュー3で0.0339です。前のページのSD、0.0379と0.0345に近く、実際の推定値のばらつきをおおむね捉えています。coverageは94パーセントと93パーセントでした。</w:t>
+      </w:r>
+    </w:p>
+    <w:p>
+      <w:pPr>
+        <w:keepLines/>
+      </w:pPr>
+      <w:r>
+        <w:t>一方、MARのcoverageは9パーセントと13パーセント、誤指定版は12パーセントと11パーセントです。正指定版のbiasはほぼゼロですが、Y 2のcoverageは86パーセントでした。100反復の結果なので、常にこの被覆率になるとは言えません。ここで言いたいのは、提案法が常に最も効率的ということではなく、欠測モデルの形を決めずに第一段階でYの偏りを補正できた、という点です。</w:t>
+      </w:r>
+    </w:p>
+    <w:p>
+      <w:pPr>
+        <w:spacing w:after="20"/>
+      </w:pPr>
+    </w:p>
+    <w:p>
+      <w:pPr>
+        <w:pStyle w:val="Heading1"/>
+      </w:pPr>
+      <w:r>
+        <w:t>Slide 20  Stage-2 full joint law</w:t>
+      </w:r>
+    </w:p>
+    <w:p>
+      <w:pPr>
+        <w:keepLines/>
+      </w:pPr>
+      <w:r>
+        <w:t>今度は、三つのYの同時分布を見ます。横軸は0と1の八通りの組合せ、縦軸はそれぞれが起こる確率です。黒い線が母集団の真の分布で、ほかの線は100反復の推定結果を平均しています。</w:t>
+      </w:r>
+    </w:p>
+    <w:p>
+      <w:pPr>
+        <w:keepLines/>
+      </w:pPr>
+      <w:r>
+        <w:t>ここでの青い提案法の線は、第二段階まで使った結果です。回復したペアの分布を共通の潜在構造につなぎ、クラス比率と全ての測定核から、三項目の同時分布を作っています。先ほどの項目ごとの確率と違い、今度は項目の組合せまで再現できているかを見ています。</w:t>
+      </w:r>
+    </w:p>
+    <w:p>
+      <w:pPr>
+        <w:spacing w:after="20"/>
+      </w:pPr>
+    </w:p>
+    <w:p>
+      <w:pPr>
+        <w:pStyle w:val="Heading1"/>
+      </w:pPr>
+      <w:r>
+        <w:t>Slide 21  Latent-parameter recovery</w:t>
+      </w:r>
+    </w:p>
+    <w:p>
+      <w:pPr>
+        <w:keepLines/>
+      </w:pPr>
+      <w:r>
+        <w:t>こちらは、潜在構造まで分けた後の結果です。測定核では、提案法のbiasの絶対値とRMSEが、MARと誤指定したselection likelihoodより小さくなっています。欠測モデルの形を直接決めず、Missing IVからペアの分布を回復していることが効いていると考えられます。</w:t>
+      </w:r>
+    </w:p>
+    <w:p>
+      <w:pPr>
+        <w:keepLines/>
+      </w:pPr>
+      <w:r>
+        <w:t>クラス比率のbiasもほぼゼロです。ただし、RMSEがどの手法よりも小さいわけではありません。欠測モデルを正しく指定できれば、パラメトリックな方法も効率の面で有力です。提案法の利点は、常に一番精度が高いことではなく、欠測モデルの形の誤指定を避けられる点にあります。</w:t>
+      </w:r>
+    </w:p>
+    <w:p>
+      <w:pPr>
+        <w:spacing w:after="20"/>
+      </w:pPr>
+    </w:p>
+    <w:p>
+      <w:pPr>
+        <w:pStyle w:val="Heading1"/>
+      </w:pPr>
+      <w:r>
+        <w:t>Slide 22  Conclusion and limits</w:t>
+      </w:r>
+    </w:p>
+    <w:p>
+      <w:pPr>
+        <w:keepLines/>
+      </w:pPr>
+      <w:r>
+        <w:t>最後にまとめます。第一段階では、Missing IVとblockのcomplete-case completenessを使って、欠測モデルの形をパラメトリックに決めずに各blockの分布を回復します。第二段階では、anchor itemsとWを使い、潜在クラス比率と全ての測定核を共通のラベルで識別します。この接続を定理にして、同じ順序で推定量も作りました。</w:t>
+      </w:r>
+    </w:p>
+    <w:p>
+      <w:pPr>
+        <w:keepLines/>
+      </w:pPr>
+      <w:r>
+        <w:t>ただし、何にでも頑健というわけではありません。クラス数は既知で、有限潜在クラスの測定モデルが正しいことが前提です。必要なペアが観測されること、Missing IVの除外制約、completeness、局所独立性、ランク条件、anchorの順序も必要です。</w:t>
+      </w:r>
+    </w:p>
+    <w:p>
+      <w:pPr>
+        <w:keepLines/>
+      </w:pPr>
+      <w:r>
+        <w:t>また、クラス比率のRMSEは、正しく指定したselection likelihoodより大きくなることがあります。漸近理論も、ここでは有限次元のbridgeに限ります。次元を増やすsieveまで広げるには、逆問題としての追加の条件が要ります。欠測モデルの形を決めずに回復と分解をつなげられることが、今回のポイントです。</w:t>
+      </w:r>
+    </w:p>
+    <w:p>
+      <w:pPr>
+        <w:spacing w:after="20"/>
+      </w:pPr>
+    </w:p>
+    <w:p>
+      <w:pPr>
+        <w:pStyle w:val="Heading1"/>
+      </w:pPr>
+      <w:r>
+        <w:t>Slide 23  Selected references</w:t>
+      </w:r>
+    </w:p>
+    <w:p>
+      <w:pPr>
+        <w:keepLines/>
+      </w:pPr>
+      <w:r>
+        <w:t>主に参照した文献を二枚に分けています。このページのAllman、Matias、Rhodesは潜在分解の一意性、d’HaultfoeuilleはMissing IVを使った分布の回復、Heckmanは選択バイアスの議論に対応します。</w:t>
+      </w:r>
+    </w:p>
+    <w:p>
+      <w:pPr>
+        <w:spacing w:after="20"/>
+      </w:pPr>
+    </w:p>
+    <w:p>
+      <w:pPr>
+        <w:pStyle w:val="Heading1"/>
+      </w:pPr>
+      <w:r>
+        <w:t>Slide 24  Selected references (continued)</w:t>
+      </w:r>
+    </w:p>
+    <w:p>
+      <w:pPr>
+        <w:keepLines/>
+      </w:pPr>
+      <w:r>
+        <w:t>こちらは続きです。識別の言葉遣いはLewbel、欠測の分類はLittleとRubinを参照しています。Miaoらはshadow variableとcomplete-caseでのcompleteness、ZhaoとShaoは共変量を調整した除外制約と半パラメトリックな推定の背景です。</w:t>
+      </w:r>
+    </w:p>
+    <w:p>
+      <w:pPr>
+        <w:spacing w:after="20"/>
+      </w:pPr>
+    </w:p>
+    <w:p>
+      <w:pPr>
+        <w:pStyle w:val="Heading1"/>
+      </w:pPr>
+      <w:r>
+        <w:t>Appendix Slide 25  Motivation and objective</w:t>
       </w:r>
     </w:p>
     <w:p>
@@ -537,7 +1078,7 @@
         <w:pStyle w:val="Heading1"/>
       </w:pPr>
       <w:r>
-        <w:t>Slide 9  Proposed two-stage identification</w:t>
+        <w:t>Appendix Slide 26  Proposed two-stage identification</w:t>
       </w:r>
     </w:p>
     <w:p>
@@ -566,7 +1107,7 @@
         <w:pStyle w:val="Heading1"/>
       </w:pPr>
       <w:r>
-        <w:t>Slide 10  Model and assumptions</w:t>
+        <w:t>Appendix Slide 27  Model and assumptions</w:t>
       </w:r>
     </w:p>
     <w:p>
@@ -587,7 +1128,7 @@
         <w:pStyle w:val="Heading1"/>
       </w:pPr>
       <w:r>
-        <w:t>Slide 11  Assumption 1</w:t>
+        <w:t>Appendix Slide 28  Assumption 1</w:t>
       </w:r>
     </w:p>
     <w:p>
@@ -616,7 +1157,7 @@
         <w:pStyle w:val="Heading1"/>
       </w:pPr>
       <w:r>
-        <w:t>Slide 12  Assumptions 2 and 3</w:t>
+        <w:t>Appendix Slide 29  Assumptions 2 and 3</w:t>
       </w:r>
     </w:p>
     <w:p>
@@ -645,7 +1186,7 @@
         <w:pStyle w:val="Heading1"/>
       </w:pPr>
       <w:r>
-        <w:t>Slide 13  Assumption 4</w:t>
+        <w:t>Appendix Slide 30  Assumption 4</w:t>
       </w:r>
     </w:p>
     <w:p>
@@ -682,7 +1223,7 @@
         <w:pStyle w:val="Heading1"/>
       </w:pPr>
       <w:r>
-        <w:t>Slide 14  Lemma 2.1</w:t>
+        <w:t>Appendix Slide 31  Lemma 2.1</w:t>
       </w:r>
     </w:p>
     <w:p>
@@ -719,7 +1260,7 @@
         <w:pStyle w:val="Heading1"/>
       </w:pPr>
       <w:r>
-        <w:t>Slide 15  Assumption 5</w:t>
+        <w:t>Appendix Slide 32  Assumption 5</w:t>
       </w:r>
     </w:p>
     <w:p>
@@ -748,7 +1289,7 @@
         <w:pStyle w:val="Heading1"/>
       </w:pPr>
       <w:r>
-        <w:t>Slide 16  Two marginal views of the model</w:t>
+        <w:t>Appendix Slide 33  Two marginal views of the model</w:t>
       </w:r>
     </w:p>
     <w:p>
@@ -785,7 +1326,7 @@
         <w:pStyle w:val="Heading1"/>
       </w:pPr>
       <w:r>
-        <w:t>Slide 17  Overlapping supported blocks</w:t>
+        <w:t>Appendix Slide 34  Overlapping supported blocks</w:t>
       </w:r>
     </w:p>
     <w:p>
@@ -814,7 +1355,7 @@
         <w:pStyle w:val="Heading1"/>
       </w:pPr>
       <w:r>
-        <w:t>Slide 18  Assumptions 6 and 7</w:t>
+        <w:t>Appendix Slide 35  Assumptions 6 and 7</w:t>
       </w:r>
     </w:p>
     <w:p>
@@ -851,7 +1392,7 @@
         <w:pStyle w:val="Heading1"/>
       </w:pPr>
       <w:r>
-        <w:t>Slide 19  New Proposition 1</w:t>
+        <w:t>Appendix Slide 36  New Proposition 1</w:t>
       </w:r>
     </w:p>
     <w:p>
@@ -888,7 +1429,7 @@
         <w:pStyle w:val="Heading1"/>
       </w:pPr>
       <w:r>
-        <w:t>Slide 20  Finite latent-class identification</w:t>
+        <w:t>Appendix Slide 37  Finite latent-class identification</w:t>
       </w:r>
     </w:p>
     <w:p>
@@ -909,7 +1450,7 @@
         <w:pStyle w:val="Heading1"/>
       </w:pPr>
       <w:r>
-        <w:t>Slide 21  The remaining decomposition problem</w:t>
+        <w:t>Appendix Slide 38  The remaining decomposition problem</w:t>
       </w:r>
     </w:p>
     <w:p>
@@ -946,7 +1487,7 @@
         <w:pStyle w:val="Heading1"/>
       </w:pPr>
       <w:r>
-        <w:t>Slide 22  Identification strategy</w:t>
+        <w:t>Appendix Slide 39  Identification strategy</w:t>
       </w:r>
     </w:p>
     <w:p>
@@ -975,7 +1516,7 @@
         <w:pStyle w:val="Heading1"/>
       </w:pPr>
       <w:r>
-        <w:t>Slide 23  Assumption 3.1: Support and model</w:t>
+        <w:t>Appendix Slide 40  Assumption 3.1: Support and model</w:t>
       </w:r>
     </w:p>
     <w:p>
@@ -1004,7 +1545,7 @@
         <w:pStyle w:val="Heading1"/>
       </w:pPr>
       <w:r>
-        <w:t>Slide 24  Assumption 3.1: Rank and labels</w:t>
+        <w:t>Appendix Slide 41  Assumption 3.1: Rank and labels</w:t>
       </w:r>
     </w:p>
     <w:p>
@@ -1041,7 +1582,7 @@
         <w:pStyle w:val="Heading1"/>
       </w:pPr>
       <w:r>
-        <w:t>Slide 25  Lemma 3.1</w:t>
+        <w:t>Appendix Slide 42  Lemma 3.1</w:t>
       </w:r>
     </w:p>
     <w:p>
@@ -1070,7 +1611,7 @@
         <w:pStyle w:val="Heading1"/>
       </w:pPr>
       <w:r>
-        <w:t>Slide 26  New Theorem 1</w:t>
+        <w:t>Appendix Slide 43  New Theorem 1</w:t>
       </w:r>
     </w:p>
     <w:p>
@@ -1099,7 +1640,7 @@
         <w:pStyle w:val="Heading1"/>
       </w:pPr>
       <w:r>
-        <w:t>Slide 27  Bridge-weighted composite estimation</w:t>
+        <w:t>Appendix Slide 44  Bridge-weighted composite estimation</w:t>
       </w:r>
     </w:p>
     <w:p>
@@ -1128,7 +1669,7 @@
         <w:pStyle w:val="Heading1"/>
       </w:pPr>
       <w:r>
-        <w:t>Slide 28  Conditions for estimation</w:t>
+        <w:t>Appendix Slide 45  Conditions for estimation</w:t>
       </w:r>
     </w:p>
     <w:p>
@@ -1157,7 +1698,7 @@
         <w:pStyle w:val="Heading1"/>
       </w:pPr>
       <w:r>
-        <w:t>Slide 29  Assumption 5.1: Regularity</w:t>
+        <w:t>Appendix Slide 46  Assumption 5.1: Regularity</w:t>
       </w:r>
     </w:p>
     <w:p>
@@ -1194,7 +1735,7 @@
         <w:pStyle w:val="Heading1"/>
       </w:pPr>
       <w:r>
-        <w:t>Slide 30  Assumption 5.1: Uniform convergence</w:t>
+        <w:t>Appendix Slide 47  Assumption 5.1: Uniform convergence</w:t>
       </w:r>
     </w:p>
     <w:p>
@@ -1223,7 +1764,7 @@
         <w:pStyle w:val="Heading1"/>
       </w:pPr>
       <w:r>
-        <w:t>Slide 31  Assumption 5.1: First stage and separation</w:t>
+        <w:t>Appendix Slide 48  Assumption 5.1: First stage and separation</w:t>
       </w:r>
     </w:p>
     <w:p>
@@ -1260,392 +1801,7 @@
         <w:pStyle w:val="Heading1"/>
       </w:pPr>
       <w:r>
-        <w:t>Slide 32  New Theorem 5.1</w:t>
-      </w:r>
-    </w:p>
-    <w:p>
-      <w:pPr>
-        <w:keepLines/>
-      </w:pPr>
-      <w:r>
-        <w:t>以上の命題4.1と仮定5.1の下で、有限次元のbridgeを使う推定量は一致性と漸近正規性を持ちます。標本が増えると真値に近づき、その誤差をルートn倍したものが、漸近的に正規分布に従うという結果です。</w:t>
-      </w:r>
-    </w:p>
-    <w:p>
-      <w:pPr>
-        <w:keepLines/>
-      </w:pPr>
-      <w:r>
-        <w:t>分散の式で大事なのは、bridgeを推定した誤差も入ることです。Aはcomposite scoreをシータで微分した期待値、Cはイータで微分した期待値です。Bにはscoreに加え、Cと第一段階の影響関数の積が入ります。bridgeが既知だとして分散を出してはいけません。</w:t>
-      </w:r>
-    </w:p>
-    <w:p>
-      <w:pPr>
-        <w:keepLines/>
-      </w:pPr>
-      <w:r>
-        <w:t>個人単位のbootstrapを使うなら、両段階の推定とラベル合わせを毎回やり直します。なお、次元を増やしていくsieveは、この定理の範囲外です。推定速度や逆問題としての追加の条件が必要です。</w:t>
-      </w:r>
-    </w:p>
-    <w:p>
-      <w:pPr>
-        <w:spacing w:after="20"/>
-      </w:pPr>
-    </w:p>
-    <w:p>
-      <w:pPr>
-        <w:pStyle w:val="Heading1"/>
-      </w:pPr>
-      <w:r>
-        <w:t>Slide 33  Computation</w:t>
-      </w:r>
-    </w:p>
-    <w:p>
-      <w:pPr>
-        <w:keepLines/>
-      </w:pPr>
-      <w:r>
-        <w:t>計算も、回復、分解、更新の順番です。まずbridgeを推定し、重み付きのテンソルを作ります。anchorを分解してラベルをそろえ、残りの測定核の初期値を出します。</w:t>
-      </w:r>
-    </w:p>
-    <w:p>
-      <w:pPr>
-        <w:keepLines/>
-      </w:pPr>
-      <w:r>
-        <w:t>その後、確率が非負で和が1になる制約を守りながら、全体を更新します。目的関数は非凸なので、初期値は複数試し、得られた解の中で目的関数が最大のものを採ります。これだけで大域的な最大値を保証するわけではありません。ZhaoとShaoの第2.3節から引き継ぐのはplug-inの順序で、更新法をそのまま移しているわけではありません。</w:t>
-      </w:r>
-    </w:p>
-    <w:p>
-      <w:pPr>
-        <w:spacing w:after="20"/>
-      </w:pPr>
-    </w:p>
-    <w:p>
-      <w:pPr>
-        <w:pStyle w:val="Heading1"/>
-      </w:pPr>
-      <w:r>
-        <w:t>Slide 34  Simulation targets in the model</w:t>
-      </w:r>
-    </w:p>
-    <w:p>
-      <w:pPr>
-        <w:keepLines/>
-      </w:pPr>
-      <w:r>
-        <w:t>ここからシミュレーションです。Xは固定し、Fは二つのクラスとします。図は、Z SからY S、Y SからR Sという流れです。FからZ Sへも矢印があります。FとZ Sは関連するので、ここを独立にしてはいけません。Wと三つのYは全て二値です。Y 1はいつも見えているので、ペアが全部見えるかどうかは、もう一方のD jで決まります。</w:t>
-      </w:r>
-    </w:p>
-    <w:p>
-      <w:pPr>
-        <w:keepLines/>
-      </w:pPr>
-      <w:r>
-        <w:t>生成するときは、FとWの後に、Zの組を先に、Yの組を後に作ります。AがFの下でのZの分布、BがFとZの下でのYの分布です。最後に、そのYを使ってD 2とD 3を独立に生成します。ここはBayes則で書き直しているだけなので、欠測指標まで含めた同時分布は変わりません。Zについて平均すると、元の測定核の積に戻ります。図はそのうち一つのblockを示しています。</w:t>
-      </w:r>
-    </w:p>
-    <w:p>
-      <w:pPr>
-        <w:keepLines/>
-      </w:pPr>
-      <w:r>
-        <w:t>標本サイズは500で、データを作って推定する作業を100回繰り返します。全項目の平均観測率は80パーセントです。この生成モデルは、Zを平均して消した仮定4とMissing IVの条件を満たします。さらに、Y Sの下でR SとF、W、Z Sが独立になる作り方ですが、この追加条件を一般の識別定理にも求めるわけではありません。</w:t>
-      </w:r>
-    </w:p>
-    <w:p>
-      <w:pPr>
-        <w:spacing w:after="20"/>
-      </w:pPr>
-    </w:p>
-    <w:p>
-      <w:pPr>
-        <w:pStyle w:val="Heading1"/>
-      </w:pPr>
-      <w:r>
-        <w:t>Slide 35  Outcome and latent parameters</w:t>
-      </w:r>
-    </w:p>
-    <w:p>
-      <w:pPr>
-        <w:keepLines/>
-      </w:pPr>
-      <w:r>
-        <w:t>次に、何を評価するかです。第一段階のミューjは、母集団全体でY jが1になる確率です。p S,cは、ペアの00、01、10、11それぞれの確率です。Y 2とY 3、およびY 1とそれぞれを組にしたペアを見ます。</w:t>
-      </w:r>
-    </w:p>
-    <w:p>
-      <w:pPr>
-        <w:keepLines/>
-      </w:pPr>
-      <w:r>
-        <w:t>これに対して第二段階のp fはクラスの比率、M jfはクラスfで項目jが1になる確率を表します。M jfは三項目かける二クラスで六つ、クラス比率はp 2を評価します。Yの分布が戻ることと、その背後の潜在構造が分かることを、分けて見ていきます。</w:t>
-      </w:r>
-    </w:p>
-    <w:p>
-      <w:pPr>
-        <w:spacing w:after="20"/>
-      </w:pPr>
-    </w:p>
-    <w:p>
-      <w:pPr>
-        <w:pStyle w:val="Heading1"/>
-      </w:pPr>
-      <w:r>
-        <w:t>Slide 36  Simulation design: five estimators</w:t>
-      </w:r>
-    </w:p>
-    <w:p>
-      <w:pPr>
-        <w:keepLines/>
-      </w:pPr>
-      <w:r>
-        <w:t>比較するのは五つです。一つ目は、欠測前の全データを使うoracleです。二つ目は、欠測を無視できると考えて観測尤度を使うMARです。三つ目は、欠測のlogisticモデルを正しく指定したselection likelihoodです。四つ目は、そこからY 1の主効果と交互作用を落とした誤指定版です。この二つのselection likelihoodには、どちらもZ Sを入れません。</w:t>
-      </w:r>
-    </w:p>
-    <w:p>
-      <w:pPr>
-        <w:keepLines/>
-      </w:pPr>
-      <w:r>
-        <w:t>五つ目が提案法です。各blockのMissing IVの式から、四つのセルに対応する逆観測確率のbridgeを推定します。まず正規化したIPWで分布を回復し、その後、重み付きのペアの基準で潜在モデルを当てはめます。後で見る提案法の項目ごとの確率は、潜在分解をする前の第一段階の結果です。他の四手法は、当てはめたモデルからYの分布を求めています。</w:t>
-      </w:r>
-    </w:p>
-    <w:p>
-      <w:pPr>
-        <w:spacing w:after="20"/>
-      </w:pPr>
-    </w:p>
-    <w:p>
-      <w:pPr>
-        <w:pStyle w:val="Heading1"/>
-      </w:pPr>
-      <w:r>
-        <w:t>Slide 37  Simulation evaluation criteria</w:t>
-      </w:r>
-    </w:p>
-    <w:p>
-      <w:pPr>
-        <w:keepLines/>
-      </w:pPr>
-      <w:r>
-        <w:t>Yの母数ごとに、四つを見ます。Biasは平均的なずれ、SDは100回の推定値のばらつきです。平均SEは、各データから推定した標準誤差の平均なので、SDと近いかを見ます。95パーセントcoverageは、母数ごとのWald信頼区間が真値を含んだ割合です。区間は推定値プラスマイナス1.96 SEで作ります。</w:t>
-      </w:r>
-    </w:p>
-    <w:p>
-      <w:pPr>
-        <w:keepLines/>
-      </w:pPr>
-      <w:r>
-        <w:t>尤度法のSEにはデルタ法とsandwich分散を使います。提案法では、各反復の中で個人単位のbootstrapを200回行い、二つのbridgeを毎回推定し直します。潜在母数はbiasとRMSEで見ます。測定核のRMSEは、100反復と六つの成分の二乗誤差をまとめて平均し、平方根を取ります。成分ごとのRMSEの単純平均ではありません。p 2は別に評価します。</w:t>
-      </w:r>
-    </w:p>
-    <w:p>
-      <w:pPr>
-        <w:spacing w:after="20"/>
-      </w:pPr>
-    </w:p>
-    <w:p>
-      <w:pPr>
-        <w:pStyle w:val="Heading1"/>
-      </w:pPr>
-      <w:r>
-        <w:t>Slide 38  Population outcome recovery: bias and SD</w:t>
-      </w:r>
-    </w:p>
-    <w:p>
-      <w:pPr>
-        <w:keepLines/>
-      </w:pPr>
-      <w:r>
-        <w:t>まず、潜在構造に分ける前に、Yの分布が戻っているかを見ます。このページでは、ミュー2とミュー3について、五つの手法のbiasとSDを比べます。</w:t>
-      </w:r>
-    </w:p>
-    <w:p>
-      <w:pPr>
-        <w:keepLines/>
-      </w:pPr>
-      <w:r>
-        <w:t>提案法は、MARと誤指定したselection likelihoodよりbiasの絶対値が小さくなっています。ミュー2とミュー3の真値は0.475と0.4925で、提案法のbiasはマイナス0.0099とマイナス0.0096です。SDはそれぞれ0.0379と0.0345でした。平均的なずれと、反復ごとのばらつきを分けて見ています。</w:t>
-      </w:r>
-    </w:p>
-    <w:p>
-      <w:pPr>
-        <w:spacing w:after="20"/>
-      </w:pPr>
-    </w:p>
-    <w:p>
-      <w:pPr>
-        <w:pStyle w:val="Heading1"/>
-      </w:pPr>
-      <w:r>
-        <w:t>Slide 39  Population outcome recovery: SE and coverage</w:t>
-      </w:r>
-    </w:p>
-    <w:p>
-      <w:pPr>
-        <w:keepLines/>
-      </w:pPr>
-      <w:r>
-        <w:t>続いて、不確実性をうまく測れているかを見ます。提案法の平均SEは、ミュー2で0.0365、ミュー3で0.0339です。前のページのSD、0.0379と0.0345に近く、実際の推定値のばらつきをおおむね捉えています。coverageは94パーセントと93パーセントでした。</w:t>
-      </w:r>
-    </w:p>
-    <w:p>
-      <w:pPr>
-        <w:keepLines/>
-      </w:pPr>
-      <w:r>
-        <w:t>一方、MARのcoverageは9パーセントと13パーセント、誤指定版は12パーセントと11パーセントです。正指定版のbiasはほぼゼロですが、Y 2のcoverageは86パーセントでした。100反復の結果なので、常にこの被覆率になるとは言えません。ここで言いたいのは、提案法が常に最も効率的ということではなく、欠測モデルの形を決めずに第一段階でYの偏りを補正できた、という点です。</w:t>
-      </w:r>
-    </w:p>
-    <w:p>
-      <w:pPr>
-        <w:spacing w:after="20"/>
-      </w:pPr>
-    </w:p>
-    <w:p>
-      <w:pPr>
-        <w:pStyle w:val="Heading1"/>
-      </w:pPr>
-      <w:r>
-        <w:t>Slide 40  Stage-2 full joint law</w:t>
-      </w:r>
-    </w:p>
-    <w:p>
-      <w:pPr>
-        <w:keepLines/>
-      </w:pPr>
-      <w:r>
-        <w:t>今度は、三つのYの同時分布を見ます。横軸は0と1の八通りの組合せ、縦軸はそれぞれが起こる確率です。黒い線が母集団の真の分布で、ほかの線は100反復の推定結果を平均しています。</w:t>
-      </w:r>
-    </w:p>
-    <w:p>
-      <w:pPr>
-        <w:keepLines/>
-      </w:pPr>
-      <w:r>
-        <w:t>ここでの青い提案法の線は、第二段階まで使った結果です。回復したペアの分布を共通の潜在構造につなぎ、クラス比率と全ての測定核から、三項目の同時分布を作っています。先ほどの項目ごとの確率と違い、今度は項目の組合せまで再現できているかを見ています。</w:t>
-      </w:r>
-    </w:p>
-    <w:p>
-      <w:pPr>
-        <w:spacing w:after="20"/>
-      </w:pPr>
-    </w:p>
-    <w:p>
-      <w:pPr>
-        <w:pStyle w:val="Heading1"/>
-      </w:pPr>
-      <w:r>
-        <w:t>Slide 41  Latent-parameter recovery</w:t>
-      </w:r>
-    </w:p>
-    <w:p>
-      <w:pPr>
-        <w:keepLines/>
-      </w:pPr>
-      <w:r>
-        <w:t>こちらは、潜在構造まで分けた後の結果です。測定核では、提案法のbiasの絶対値とRMSEが、MARと誤指定したselection likelihoodより小さくなっています。欠測モデルの形を直接決めず、Missing IVからペアの分布を回復していることが効いていると考えられます。</w:t>
-      </w:r>
-    </w:p>
-    <w:p>
-      <w:pPr>
-        <w:keepLines/>
-      </w:pPr>
-      <w:r>
-        <w:t>クラス比率のbiasもほぼゼロです。ただし、RMSEがどの手法よりも小さいわけではありません。欠測モデルを正しく指定できれば、パラメトリックな方法も効率の面で有力です。提案法の利点は、常に一番精度が高いことではなく、欠測モデルの形の誤指定を避けられる点にあります。</w:t>
-      </w:r>
-    </w:p>
-    <w:p>
-      <w:pPr>
-        <w:spacing w:after="20"/>
-      </w:pPr>
-    </w:p>
-    <w:p>
-      <w:pPr>
-        <w:pStyle w:val="Heading1"/>
-      </w:pPr>
-      <w:r>
-        <w:t>Slide 42  Conclusion and limits</w:t>
-      </w:r>
-    </w:p>
-    <w:p>
-      <w:pPr>
-        <w:keepLines/>
-      </w:pPr>
-      <w:r>
-        <w:t>最後にまとめます。第一段階では、Missing IVとblockのcomplete-case completenessを使って、欠測モデルの形をパラメトリックに決めずに各blockの分布を回復します。第二段階では、anchor itemsとWを使い、潜在クラス比率と全ての測定核を共通のラベルで識別します。この接続を定理にして、同じ順序で推定量も作りました。</w:t>
-      </w:r>
-    </w:p>
-    <w:p>
-      <w:pPr>
-        <w:keepLines/>
-      </w:pPr>
-      <w:r>
-        <w:t>ただし、何にでも頑健というわけではありません。クラス数は既知で、有限潜在クラスの測定モデルが正しいことが前提です。必要なペアが観測されること、Missing IVの除外制約、completeness、局所独立性、ランク条件、anchorの順序も必要です。</w:t>
-      </w:r>
-    </w:p>
-    <w:p>
-      <w:pPr>
-        <w:keepLines/>
-      </w:pPr>
-      <w:r>
-        <w:t>また、クラス比率のRMSEは、正しく指定したselection likelihoodより大きくなることがあります。漸近理論も、ここでは有限次元のbridgeに限ります。次元を増やすsieveまで広げるには、逆問題としての追加の条件が要ります。欠測モデルの形を決めずに回復と分解をつなげられることが、今回のポイントです。</w:t>
-      </w:r>
-    </w:p>
-    <w:p>
-      <w:pPr>
-        <w:spacing w:after="20"/>
-      </w:pPr>
-    </w:p>
-    <w:p>
-      <w:pPr>
-        <w:pStyle w:val="Heading1"/>
-      </w:pPr>
-      <w:r>
-        <w:t>Slide 43  Selected references</w:t>
-      </w:r>
-    </w:p>
-    <w:p>
-      <w:pPr>
-        <w:keepLines/>
-      </w:pPr>
-      <w:r>
-        <w:t>主に参照した文献を二枚に分けています。このページのAllman、Matias、Rhodesは潜在分解の一意性、d’HaultfoeuilleはMissing IVを使った分布の回復、Heckmanは選択バイアスの議論に対応します。</w:t>
-      </w:r>
-    </w:p>
-    <w:p>
-      <w:pPr>
-        <w:spacing w:after="20"/>
-      </w:pPr>
-    </w:p>
-    <w:p>
-      <w:pPr>
-        <w:pStyle w:val="Heading1"/>
-      </w:pPr>
-      <w:r>
-        <w:t>Slide 44  Selected references (continued)</w:t>
-      </w:r>
-    </w:p>
-    <w:p>
-      <w:pPr>
-        <w:keepLines/>
-      </w:pPr>
-      <w:r>
-        <w:t>こちらは続きです。識別の言葉遣いはLewbel、欠測の分類はLittleとRubinを参照しています。Miaoらはshadow variableとcomplete-caseでのcompleteness、ZhaoとShaoは共変量を調整した除外制約と半パラメトリックな推定の背景です。</w:t>
-      </w:r>
-    </w:p>
-    <w:p>
-      <w:pPr>
-        <w:spacing w:after="20"/>
-      </w:pPr>
-    </w:p>
-    <w:p>
-      <w:pPr>
-        <w:pStyle w:val="Heading1"/>
-      </w:pPr>
-      <w:r>
-        <w:t>Appendix Slide 45  Proof sketch for Proposition 1</w:t>
+        <w:t>Appendix Slide 49  Proof sketch for Proposition 1</w:t>
       </w:r>
     </w:p>
     <w:p>
@@ -1682,7 +1838,7 @@
         <w:pStyle w:val="Heading1"/>
       </w:pPr>
       <w:r>
-        <w:t>Appendix Slide 46  Proof map for Theorem 1</w:t>
+        <w:t>Appendix Slide 50  Proof map for Theorem 1</w:t>
       </w:r>
     </w:p>
     <w:p>
@@ -1711,7 +1867,7 @@
         <w:pStyle w:val="Heading1"/>
       </w:pPr>
       <w:r>
-        <w:t>Appendix Slide 47  Proof of Theorem 1 (Steps 1--2)</w:t>
+        <w:t>Appendix Slide 51  Proof of Theorem 1 (Steps 1--2)</w:t>
       </w:r>
     </w:p>
     <w:p>
@@ -1740,7 +1896,7 @@
         <w:pStyle w:val="Heading1"/>
       </w:pPr>
       <w:r>
-        <w:t>Appendix Slide 48  Proof of Theorem 1 (Steps 3--4)</w:t>
+        <w:t>Appendix Slide 52  Proof of Theorem 1 (Steps 3--4)</w:t>
       </w:r>
     </w:p>
     <w:p>
@@ -1769,7 +1925,7 @@
         <w:pStyle w:val="Heading1"/>
       </w:pPr>
       <w:r>
-        <w:t>Appendix Slide 49  Proof of Theorem 1 (Steps 5--6)</w:t>
+        <w:t>Appendix Slide 53  Proof of Theorem 1 (Steps 5--6)</w:t>
       </w:r>
     </w:p>
     <w:p>
@@ -1798,7 +1954,7 @@
         <w:pStyle w:val="Heading1"/>
       </w:pPr>
       <w:r>
-        <w:t>Appendix Slide 50  Proof of Theorem 1 (Steps 7--8)</w:t>
+        <w:t>Appendix Slide 54  Proof of Theorem 1 (Steps 7--8)</w:t>
       </w:r>
     </w:p>
     <w:p>
@@ -1827,7 +1983,7 @@
         <w:pStyle w:val="Heading1"/>
       </w:pPr>
       <w:r>
-        <w:t>Appendix Slide 51  empirical diagnostics and falsification checks</w:t>
+        <w:t>Appendix Slide 55  empirical diagnostics and falsification checks</w:t>
       </w:r>
     </w:p>
     <w:p>
@@ -1856,7 +2012,7 @@
         <w:pStyle w:val="Heading1"/>
       </w:pPr>
       <w:r>
-        <w:t>Appendix Slide 52  simulation calibration</w:t>
+        <w:t>Appendix Slide 56  simulation calibration</w:t>
       </w:r>
     </w:p>
     <w:p>
@@ -1885,7 +2041,7 @@
         <w:pStyle w:val="Heading1"/>
       </w:pPr>
       <w:r>
-        <w:t>Appendix Slide 53  selection and shadow calibration</w:t>
+        <w:t>Appendix Slide 57  selection and shadow calibration</w:t>
       </w:r>
     </w:p>
     <w:p>

</xml_diff>

<commit_message>
Organize closing slide into contribution limitation and future work
</commit_message>
<xml_diff>
--- a/manuscript/vector_missing_iv_presentation_script_ja.docx
+++ b/manuscript/vector_missing_iv_presentation_script_ja.docx
@@ -954,7 +954,7 @@
         <w:pStyle w:val="Heading1"/>
       </w:pPr>
       <w:r>
-        <w:t>Slide 22  Conclusion and limits</w:t>
+        <w:t>Slide 22  Contribution &amp; Limitation &amp; Future Work</w:t>
       </w:r>
     </w:p>
     <w:p>
@@ -978,7 +978,15 @@
         <w:keepLines/>
       </w:pPr>
       <w:r>
-        <w:t>また、クラス比率のRMSEは、正しく指定したselection likelihoodより大きくなることがあります。漸近理論も、ここでは有限次元のbridgeに限ります。次元を増やすsieveまで広げるには、逆問題としての追加の条件が要ります。欠測モデルの形を決めずに回復と分解をつなげられることが、今回のポイントです。</w:t>
+        <w:t>効率の面でも、クラス比率のRMSEは、正しく指定したselection likelihoodより大きくなることがあります。常に一番精度が高い、と言っているわけではありません。</w:t>
+      </w:r>
+    </w:p>
+    <w:p>
+      <w:pPr>
+        <w:keepLines/>
+      </w:pPr>
+      <w:r>
+        <w:t>今後の課題は、有限次元のbridgeについて示した推測理論を、標本数とともに次元を増やすsieveへ広げることです。そのためには、収束速度や逆問題について追加の理論が必要です。</w:t>
       </w:r>
     </w:p>
     <w:p>

</xml_diff>

<commit_message>
Explain outcome marginalization and latent identification targets
</commit_message>
<xml_diff>
--- a/manuscript/vector_missing_iv_presentation_script_ja.docx
+++ b/manuscript/vector_missing_iv_presentation_script_ja.docx
@@ -25,7 +25,7 @@
     </w:p>
     <w:p>
       <w:r>
-        <w:t>英語Beamer全57枚に対応した、日本語の発表原稿です。欠測した人も含む分布をまず回復し、その後で潜在クラスの比率と測定核を分ける、という流れで説明します。本編24枚では二段階の要約、推定理論と数値結果を説明します。25枚目からのAppendixには、元の詳細な動機、仮定、識別と推定の議論を残し、その後に証明と数値設定を収めています。</w:t>
+        <w:t>英語Beamer全58枚に対応した、日本語の発表原稿です。欠測した人も含む分布をまず回復し、その後で潜在クラスの比率と測定核を分ける、という流れで説明します。本編25枚では二段階の要約、推定理論と数値結果を説明します。26枚目からのAppendixには、元の詳細な動機、仮定、識別と推定の議論を残し、その後に証明と数値設定を収めています。</w:t>
       </w:r>
     </w:p>
     <w:p>
@@ -98,7 +98,7 @@
                 <w:color w:val="000000"/>
                 <w:sz w:val="21"/>
               </w:rPr>
-              <w:t>Slides 1–7</w:t>
+              <w:t>Slides 1–8</w:t>
             </w:r>
           </w:p>
         </w:tc>
@@ -130,7 +130,7 @@
                 <w:color w:val="000000"/>
                 <w:sz w:val="21"/>
               </w:rPr>
-              <w:t>Slides 8–11</w:t>
+              <w:t>Slides 9–12</w:t>
             </w:r>
           </w:p>
         </w:tc>
@@ -162,7 +162,7 @@
                 <w:color w:val="000000"/>
                 <w:sz w:val="21"/>
               </w:rPr>
-              <w:t>Slides 12–24</w:t>
+              <w:t>Slides 13–25</w:t>
             </w:r>
           </w:p>
         </w:tc>
@@ -194,7 +194,7 @@
                 <w:color w:val="000000"/>
                 <w:sz w:val="21"/>
               </w:rPr>
-              <w:t>Appendix 25–48</w:t>
+              <w:t>Appendix 26–49</w:t>
             </w:r>
           </w:p>
         </w:tc>
@@ -226,7 +226,7 @@
                 <w:color w:val="000000"/>
                 <w:sz w:val="21"/>
               </w:rPr>
-              <w:t>Appendix 49–57</w:t>
+              <w:t>Appendix 50–58</w:t>
             </w:r>
           </w:p>
         </w:tc>
@@ -368,7 +368,44 @@
         <w:pStyle w:val="Heading1"/>
       </w:pPr>
       <w:r>
-        <w:t>Slide 4  Latent measurement model</w:t>
+        <w:t>Slide 4  From outcome-law recovery to latent identification</w:t>
+      </w:r>
+    </w:p>
+    <w:p>
+      <w:pPr>
+        <w:keepLines/>
+      </w:pPr>
+      <w:r>
+        <w:t>ここで、観測される項目の分布を戻すことと、その背後にある潜在構造を知ることを分けます。この図では、ZとYの関係を潜在変数Fが媒介し、Yから観測指標Rへつながる、という簡単な場合を描いています。共変量Uは条件づけて省略しています。これは私たちの問題を説明するための図で、ZhaoとShaoがこの潜在変数モデルを仮定しているという意味ではありません。</w:t>
+      </w:r>
+    </w:p>
+    <w:p>
+      <w:pPr>
+        <w:keepLines/>
+      </w:pPr>
+      <w:r>
+        <w:t>潜在分布と測定核が与えられれば、Fを積分することで、ZとUごとのYの分布が得られます。既存のMissing IVの理論が扱うのは、この積分後のoutcome law、あるいはZhaoとShaoの場合にはGLMのパラメータです。潜在変数を明示的に置くことや、実際に積分計算することが、既存法の必須条件というわけではありません。</w:t>
+      </w:r>
+    </w:p>
+    <w:p>
+      <w:pPr>
+        <w:keepLines/>
+      </w:pPr>
+      <w:r>
+        <w:t>私たちが知りたいのは、その先です。戻したoutcomeの分布から、潜在分布と測定核をそれぞれ取り出せるか。積分する向きは書けても、逆向きの分解が一つに決まるとは限りません。そこで、その追加の識別に必要な条件を考えます。</w:t>
+      </w:r>
+    </w:p>
+    <w:p>
+      <w:pPr>
+        <w:spacing w:after="20"/>
+      </w:pPr>
+    </w:p>
+    <w:p>
+      <w:pPr>
+        <w:pStyle w:val="Heading1"/>
+      </w:pPr>
+      <w:r>
+        <w:t>Slide 5  Latent measurement model</w:t>
       </w:r>
     </w:p>
     <w:p>
@@ -405,7 +442,7 @@
         <w:pStyle w:val="Heading1"/>
       </w:pPr>
       <w:r>
-        <w:t>Slide 5  Latent models with nonignorable missingness</w:t>
+        <w:t>Slide 6  Latent models with nonignorable missingness</w:t>
       </w:r>
     </w:p>
     <w:p>
@@ -426,7 +463,7 @@
         <w:pStyle w:val="Heading1"/>
       </w:pPr>
       <w:r>
-        <w:t>Slide 6  Multivariate MNAR and the remaining gap</w:t>
+        <w:t>Slide 7  Multivariate MNAR and the remaining gap</w:t>
       </w:r>
     </w:p>
     <w:p>
@@ -455,7 +492,7 @@
         <w:pStyle w:val="Heading1"/>
       </w:pPr>
       <w:r>
-        <w:t>Slide 7  Why leave the selection model unspecified?</w:t>
+        <w:t>Slide 8  Why leave the selection model unspecified?</w:t>
       </w:r>
     </w:p>
     <w:p>
@@ -492,7 +529,7 @@
         <w:pStyle w:val="Heading1"/>
       </w:pPr>
       <w:r>
-        <w:t>Slide 8  Stage 1 (1): Recover the block law</w:t>
+        <w:t>Slide 9  Stage 1 (1): Recover the block law</w:t>
       </w:r>
     </w:p>
     <w:p>
@@ -529,7 +566,7 @@
         <w:pStyle w:val="Heading1"/>
       </w:pPr>
       <w:r>
-        <w:t>Slide 9  Stage 1 (2): Use overlapping pairs</w:t>
+        <w:t>Slide 10  Stage 1 (2): Use overlapping pairs</w:t>
       </w:r>
     </w:p>
     <w:p>
@@ -566,7 +603,7 @@
         <w:pStyle w:val="Heading1"/>
       </w:pPr>
       <w:r>
-        <w:t>Slide 10  Stage 2 (1): Identify the latent structure</w:t>
+        <w:t>Slide 11  Stage 2 (1): Identify the latent structure</w:t>
       </w:r>
     </w:p>
     <w:p>
@@ -603,7 +640,7 @@
         <w:pStyle w:val="Heading1"/>
       </w:pPr>
       <w:r>
-        <w:t>Slide 11  Stage 2 (2): Connect identification to estimation</w:t>
+        <w:t>Slide 12  Stage 2 (2): Connect identification to estimation</w:t>
       </w:r>
     </w:p>
     <w:p>
@@ -648,7 +685,7 @@
         <w:pStyle w:val="Heading1"/>
       </w:pPr>
       <w:r>
-        <w:t>Slide 12  New Theorem 5.1</w:t>
+        <w:t>Slide 13  New Theorem 5.1</w:t>
       </w:r>
     </w:p>
     <w:p>
@@ -685,7 +722,7 @@
         <w:pStyle w:val="Heading1"/>
       </w:pPr>
       <w:r>
-        <w:t>Slide 13  Computation</w:t>
+        <w:t>Slide 14  Computation</w:t>
       </w:r>
     </w:p>
     <w:p>
@@ -714,7 +751,7 @@
         <w:pStyle w:val="Heading1"/>
       </w:pPr>
       <w:r>
-        <w:t>Slide 14  Simulation targets in the model</w:t>
+        <w:t>Slide 15  Simulation targets in the model</w:t>
       </w:r>
     </w:p>
     <w:p>
@@ -751,7 +788,7 @@
         <w:pStyle w:val="Heading1"/>
       </w:pPr>
       <w:r>
-        <w:t>Slide 15  Outcome and latent parameters</w:t>
+        <w:t>Slide 16  Outcome and latent parameters</w:t>
       </w:r>
     </w:p>
     <w:p>
@@ -780,7 +817,7 @@
         <w:pStyle w:val="Heading1"/>
       </w:pPr>
       <w:r>
-        <w:t>Slide 16  Simulation design: five estimators</w:t>
+        <w:t>Slide 17  Simulation design: five estimators</w:t>
       </w:r>
     </w:p>
     <w:p>
@@ -809,7 +846,7 @@
         <w:pStyle w:val="Heading1"/>
       </w:pPr>
       <w:r>
-        <w:t>Slide 17  Simulation evaluation criteria</w:t>
+        <w:t>Slide 18  Simulation evaluation criteria</w:t>
       </w:r>
     </w:p>
     <w:p>
@@ -838,7 +875,7 @@
         <w:pStyle w:val="Heading1"/>
       </w:pPr>
       <w:r>
-        <w:t>Slide 18  Population outcome recovery: bias and SD</w:t>
+        <w:t>Slide 19  Population outcome recovery: bias and SD</w:t>
       </w:r>
     </w:p>
     <w:p>
@@ -867,7 +904,7 @@
         <w:pStyle w:val="Heading1"/>
       </w:pPr>
       <w:r>
-        <w:t>Slide 19  Population outcome recovery: SE and coverage</w:t>
+        <w:t>Slide 20  Population outcome recovery: SE and coverage</w:t>
       </w:r>
     </w:p>
     <w:p>
@@ -896,7 +933,7 @@
         <w:pStyle w:val="Heading1"/>
       </w:pPr>
       <w:r>
-        <w:t>Slide 20  Stage-2 full joint law</w:t>
+        <w:t>Slide 21  Stage-2 full joint law</w:t>
       </w:r>
     </w:p>
     <w:p>
@@ -925,7 +962,7 @@
         <w:pStyle w:val="Heading1"/>
       </w:pPr>
       <w:r>
-        <w:t>Slide 21  Latent-parameter recovery</w:t>
+        <w:t>Slide 22  Latent-parameter recovery</w:t>
       </w:r>
     </w:p>
     <w:p>
@@ -954,7 +991,7 @@
         <w:pStyle w:val="Heading1"/>
       </w:pPr>
       <w:r>
-        <w:t>Slide 22  Contribution &amp; Limitation &amp; Future Work</w:t>
+        <w:t>Slide 23  Contribution &amp; Limitation &amp; Future Work</w:t>
       </w:r>
     </w:p>
     <w:p>
@@ -999,7 +1036,7 @@
         <w:pStyle w:val="Heading1"/>
       </w:pPr>
       <w:r>
-        <w:t>Slide 23  Selected references</w:t>
+        <w:t>Slide 24  Selected references</w:t>
       </w:r>
     </w:p>
     <w:p>
@@ -1020,7 +1057,7 @@
         <w:pStyle w:val="Heading1"/>
       </w:pPr>
       <w:r>
-        <w:t>Slide 24  Selected references (continued)</w:t>
+        <w:t>Slide 25  Selected references (continued)</w:t>
       </w:r>
     </w:p>
     <w:p>
@@ -1041,7 +1078,7 @@
         <w:pStyle w:val="Heading1"/>
       </w:pPr>
       <w:r>
-        <w:t>Appendix Slide 25  Motivation and objective</w:t>
+        <w:t>Appendix Slide 26  Motivation and objective</w:t>
       </w:r>
     </w:p>
     <w:p>
@@ -1086,7 +1123,7 @@
         <w:pStyle w:val="Heading1"/>
       </w:pPr>
       <w:r>
-        <w:t>Appendix Slide 26  Proposed two-stage identification</w:t>
+        <w:t>Appendix Slide 27  Proposed two-stage identification</w:t>
       </w:r>
     </w:p>
     <w:p>
@@ -1115,7 +1152,7 @@
         <w:pStyle w:val="Heading1"/>
       </w:pPr>
       <w:r>
-        <w:t>Appendix Slide 27  Model and assumptions</w:t>
+        <w:t>Appendix Slide 28  Model and assumptions</w:t>
       </w:r>
     </w:p>
     <w:p>
@@ -1136,7 +1173,7 @@
         <w:pStyle w:val="Heading1"/>
       </w:pPr>
       <w:r>
-        <w:t>Appendix Slide 28  Assumption 1</w:t>
+        <w:t>Appendix Slide 29  Assumption 1</w:t>
       </w:r>
     </w:p>
     <w:p>
@@ -1165,7 +1202,7 @@
         <w:pStyle w:val="Heading1"/>
       </w:pPr>
       <w:r>
-        <w:t>Appendix Slide 29  Assumptions 2 and 3</w:t>
+        <w:t>Appendix Slide 30  Assumptions 2 and 3</w:t>
       </w:r>
     </w:p>
     <w:p>
@@ -1194,7 +1231,7 @@
         <w:pStyle w:val="Heading1"/>
       </w:pPr>
       <w:r>
-        <w:t>Appendix Slide 30  Assumption 4</w:t>
+        <w:t>Appendix Slide 31  Assumption 4</w:t>
       </w:r>
     </w:p>
     <w:p>
@@ -1231,7 +1268,7 @@
         <w:pStyle w:val="Heading1"/>
       </w:pPr>
       <w:r>
-        <w:t>Appendix Slide 31  Lemma 2.1</w:t>
+        <w:t>Appendix Slide 32  Lemma 2.1</w:t>
       </w:r>
     </w:p>
     <w:p>
@@ -1268,7 +1305,7 @@
         <w:pStyle w:val="Heading1"/>
       </w:pPr>
       <w:r>
-        <w:t>Appendix Slide 32  Assumption 5</w:t>
+        <w:t>Appendix Slide 33  Assumption 5</w:t>
       </w:r>
     </w:p>
     <w:p>
@@ -1297,7 +1334,7 @@
         <w:pStyle w:val="Heading1"/>
       </w:pPr>
       <w:r>
-        <w:t>Appendix Slide 33  Two marginal views of the model</w:t>
+        <w:t>Appendix Slide 34  Two marginal views of the model</w:t>
       </w:r>
     </w:p>
     <w:p>
@@ -1334,7 +1371,7 @@
         <w:pStyle w:val="Heading1"/>
       </w:pPr>
       <w:r>
-        <w:t>Appendix Slide 34  Overlapping supported blocks</w:t>
+        <w:t>Appendix Slide 35  Overlapping supported blocks</w:t>
       </w:r>
     </w:p>
     <w:p>
@@ -1363,7 +1400,7 @@
         <w:pStyle w:val="Heading1"/>
       </w:pPr>
       <w:r>
-        <w:t>Appendix Slide 35  Assumptions 6 and 7</w:t>
+        <w:t>Appendix Slide 36  Assumptions 6 and 7</w:t>
       </w:r>
     </w:p>
     <w:p>
@@ -1400,7 +1437,7 @@
         <w:pStyle w:val="Heading1"/>
       </w:pPr>
       <w:r>
-        <w:t>Appendix Slide 36  New Proposition 1</w:t>
+        <w:t>Appendix Slide 37  New Proposition 1</w:t>
       </w:r>
     </w:p>
     <w:p>
@@ -1437,7 +1474,7 @@
         <w:pStyle w:val="Heading1"/>
       </w:pPr>
       <w:r>
-        <w:t>Appendix Slide 37  Finite latent-class identification</w:t>
+        <w:t>Appendix Slide 38  Finite latent-class identification</w:t>
       </w:r>
     </w:p>
     <w:p>
@@ -1458,7 +1495,7 @@
         <w:pStyle w:val="Heading1"/>
       </w:pPr>
       <w:r>
-        <w:t>Appendix Slide 38  The remaining decomposition problem</w:t>
+        <w:t>Appendix Slide 39  The remaining decomposition problem</w:t>
       </w:r>
     </w:p>
     <w:p>
@@ -1495,7 +1532,7 @@
         <w:pStyle w:val="Heading1"/>
       </w:pPr>
       <w:r>
-        <w:t>Appendix Slide 39  Identification strategy</w:t>
+        <w:t>Appendix Slide 40  Identification strategy</w:t>
       </w:r>
     </w:p>
     <w:p>
@@ -1524,7 +1561,7 @@
         <w:pStyle w:val="Heading1"/>
       </w:pPr>
       <w:r>
-        <w:t>Appendix Slide 40  Assumption 3.1: Support and model</w:t>
+        <w:t>Appendix Slide 41  Assumption 3.1: Support and model</w:t>
       </w:r>
     </w:p>
     <w:p>
@@ -1553,7 +1590,7 @@
         <w:pStyle w:val="Heading1"/>
       </w:pPr>
       <w:r>
-        <w:t>Appendix Slide 41  Assumption 3.1: Rank and labels</w:t>
+        <w:t>Appendix Slide 42  Assumption 3.1: Rank and labels</w:t>
       </w:r>
     </w:p>
     <w:p>
@@ -1590,7 +1627,7 @@
         <w:pStyle w:val="Heading1"/>
       </w:pPr>
       <w:r>
-        <w:t>Appendix Slide 42  Lemma 3.1</w:t>
+        <w:t>Appendix Slide 43  Lemma 3.1</w:t>
       </w:r>
     </w:p>
     <w:p>
@@ -1619,7 +1656,7 @@
         <w:pStyle w:val="Heading1"/>
       </w:pPr>
       <w:r>
-        <w:t>Appendix Slide 43  New Theorem 1</w:t>
+        <w:t>Appendix Slide 44  New Theorem 1</w:t>
       </w:r>
     </w:p>
     <w:p>
@@ -1648,7 +1685,7 @@
         <w:pStyle w:val="Heading1"/>
       </w:pPr>
       <w:r>
-        <w:t>Appendix Slide 44  Bridge-weighted composite estimation</w:t>
+        <w:t>Appendix Slide 45  Bridge-weighted composite estimation</w:t>
       </w:r>
     </w:p>
     <w:p>
@@ -1677,7 +1714,7 @@
         <w:pStyle w:val="Heading1"/>
       </w:pPr>
       <w:r>
-        <w:t>Appendix Slide 45  Conditions for estimation</w:t>
+        <w:t>Appendix Slide 46  Conditions for estimation</w:t>
       </w:r>
     </w:p>
     <w:p>
@@ -1706,7 +1743,7 @@
         <w:pStyle w:val="Heading1"/>
       </w:pPr>
       <w:r>
-        <w:t>Appendix Slide 46  Assumption 5.1: Regularity</w:t>
+        <w:t>Appendix Slide 47  Assumption 5.1: Regularity</w:t>
       </w:r>
     </w:p>
     <w:p>
@@ -1743,7 +1780,7 @@
         <w:pStyle w:val="Heading1"/>
       </w:pPr>
       <w:r>
-        <w:t>Appendix Slide 47  Assumption 5.1: Uniform convergence</w:t>
+        <w:t>Appendix Slide 48  Assumption 5.1: Uniform convergence</w:t>
       </w:r>
     </w:p>
     <w:p>
@@ -1772,7 +1809,7 @@
         <w:pStyle w:val="Heading1"/>
       </w:pPr>
       <w:r>
-        <w:t>Appendix Slide 48  Assumption 5.1: First stage and separation</w:t>
+        <w:t>Appendix Slide 49  Assumption 5.1: First stage and separation</w:t>
       </w:r>
     </w:p>
     <w:p>
@@ -1809,7 +1846,7 @@
         <w:pStyle w:val="Heading1"/>
       </w:pPr>
       <w:r>
-        <w:t>Appendix Slide 49  Proof sketch for Proposition 1</w:t>
+        <w:t>Appendix Slide 50  Proof sketch for Proposition 1</w:t>
       </w:r>
     </w:p>
     <w:p>
@@ -1846,7 +1883,7 @@
         <w:pStyle w:val="Heading1"/>
       </w:pPr>
       <w:r>
-        <w:t>Appendix Slide 50  Proof map for Theorem 1</w:t>
+        <w:t>Appendix Slide 51  Proof map for Theorem 1</w:t>
       </w:r>
     </w:p>
     <w:p>
@@ -1875,7 +1912,7 @@
         <w:pStyle w:val="Heading1"/>
       </w:pPr>
       <w:r>
-        <w:t>Appendix Slide 51  Proof of Theorem 1 (Steps 1--2)</w:t>
+        <w:t>Appendix Slide 52  Proof of Theorem 1 (Steps 1--2)</w:t>
       </w:r>
     </w:p>
     <w:p>
@@ -1904,7 +1941,7 @@
         <w:pStyle w:val="Heading1"/>
       </w:pPr>
       <w:r>
-        <w:t>Appendix Slide 52  Proof of Theorem 1 (Steps 3--4)</w:t>
+        <w:t>Appendix Slide 53  Proof of Theorem 1 (Steps 3--4)</w:t>
       </w:r>
     </w:p>
     <w:p>
@@ -1933,7 +1970,7 @@
         <w:pStyle w:val="Heading1"/>
       </w:pPr>
       <w:r>
-        <w:t>Appendix Slide 53  Proof of Theorem 1 (Steps 5--6)</w:t>
+        <w:t>Appendix Slide 54  Proof of Theorem 1 (Steps 5--6)</w:t>
       </w:r>
     </w:p>
     <w:p>
@@ -1962,7 +1999,7 @@
         <w:pStyle w:val="Heading1"/>
       </w:pPr>
       <w:r>
-        <w:t>Appendix Slide 54  Proof of Theorem 1 (Steps 7--8)</w:t>
+        <w:t>Appendix Slide 55  Proof of Theorem 1 (Steps 7--8)</w:t>
       </w:r>
     </w:p>
     <w:p>
@@ -1991,7 +2028,7 @@
         <w:pStyle w:val="Heading1"/>
       </w:pPr>
       <w:r>
-        <w:t>Appendix Slide 55  empirical diagnostics and falsification checks</w:t>
+        <w:t>Appendix Slide 56  empirical diagnostics and falsification checks</w:t>
       </w:r>
     </w:p>
     <w:p>
@@ -2020,7 +2057,7 @@
         <w:pStyle w:val="Heading1"/>
       </w:pPr>
       <w:r>
-        <w:t>Appendix Slide 56  simulation calibration</w:t>
+        <w:t>Appendix Slide 57  simulation calibration</w:t>
       </w:r>
     </w:p>
     <w:p>
@@ -2049,7 +2086,7 @@
         <w:pStyle w:val="Heading1"/>
       </w:pPr>
       <w:r>
-        <w:t>Appendix Slide 57  selection and shadow calibration</w:t>
+        <w:t>Appendix Slide 58  selection and shadow calibration</w:t>
       </w:r>
     </w:p>
     <w:p>

</xml_diff>

<commit_message>
Reframe simulation comparison by MCAR MAR and MNAR mechanisms
</commit_message>
<xml_diff>
--- a/manuscript/vector_missing_iv_presentation_script_ja.docx
+++ b/manuscript/vector_missing_iv_presentation_script_ja.docx
@@ -25,7 +25,7 @@
     </w:p>
     <w:p>
       <w:r>
-        <w:t>英語Beamer全58枚に対応した、日本語の発表原稿です。欠測した人も含む分布をまず回復し、その後で潜在クラスの比率と測定核を分ける、という流れで説明します。本編25枚では二段階の要約、推定理論と数値結果を説明します。26枚目からのAppendixには、元の詳細な動機、仮定、識別と推定の議論を残し、その後に証明と数値設定を収めています。</w:t>
+        <w:t>英語Beamer全59枚に対応した、日本語の発表原稿です。欠測した人も含む分布をまず回復し、その後で潜在クラスの比率と測定核を分ける、という流れで説明します。本編26枚では二段階の要約、推定理論、三つの欠測機構の比較設計とMNARの数値結果を説明します。MCARとMARの比較は未実行で、掲載数値は既存のMNAR実験の五手法比較に限ります。27枚目からのAppendixには、元の詳細な動機、仮定、識別と推定の議論を残し、その後に証明と数値設定を収めています。</w:t>
       </w:r>
     </w:p>
     <w:p>
@@ -162,7 +162,7 @@
                 <w:color w:val="000000"/>
                 <w:sz w:val="21"/>
               </w:rPr>
-              <w:t>Slides 13–25</w:t>
+              <w:t>Slides 13–16</w:t>
             </w:r>
           </w:p>
         </w:tc>
@@ -177,7 +177,7 @@
                 <w:color w:val="000000"/>
                 <w:sz w:val="21"/>
               </w:rPr>
-              <w:t>漸近理論、計算、simulation、結論、参考文献</w:t>
+              <w:t>漸近理論、計算、simulationのモデルと評価対象</w:t>
             </w:r>
           </w:p>
         </w:tc>
@@ -194,7 +194,71 @@
                 <w:color w:val="000000"/>
                 <w:sz w:val="21"/>
               </w:rPr>
-              <w:t>Appendix 26–49</w:t>
+              <w:t>Slide 17</w:t>
+            </w:r>
+          </w:p>
+        </w:tc>
+        <w:tc>
+          <w:tcPr>
+            <w:tcW w:type="dxa" w:w="7344"/>
+          </w:tcPr>
+          <w:p>
+            <w:r>
+              <w:rPr>
+                <w:rFonts w:ascii="Arial" w:hAnsi="Arial" w:eastAsia="BIZ UDPGothic"/>
+                <w:color w:val="000000"/>
+                <w:sz w:val="21"/>
+              </w:rPr>
+              <w:t>MCAR・MAR・MNARの比較設計 MCARとMARは未実行</w:t>
+            </w:r>
+          </w:p>
+        </w:tc>
+      </w:tr>
+      <w:tr>
+        <w:tc>
+          <w:tcPr>
+            <w:tcW w:type="dxa" w:w="2232"/>
+          </w:tcPr>
+          <w:p>
+            <w:r>
+              <w:rPr>
+                <w:rFonts w:ascii="Arial" w:hAnsi="Arial" w:eastAsia="BIZ UDPGothic"/>
+                <w:color w:val="000000"/>
+                <w:sz w:val="21"/>
+              </w:rPr>
+              <w:t>Slides 18–26</w:t>
+            </w:r>
+          </w:p>
+        </w:tc>
+        <w:tc>
+          <w:tcPr>
+            <w:tcW w:type="dxa" w:w="7344"/>
+          </w:tcPr>
+          <w:p>
+            <w:r>
+              <w:rPr>
+                <w:rFonts w:ascii="Arial" w:hAnsi="Arial" w:eastAsia="BIZ UDPGothic"/>
+                <w:color w:val="000000"/>
+                <w:sz w:val="21"/>
+              </w:rPr>
+              <w:t>既存MNAR実験の五手法比較、数値結果、結論、参考文献</w:t>
+            </w:r>
+          </w:p>
+        </w:tc>
+      </w:tr>
+      <w:tr>
+        <w:tc>
+          <w:tcPr>
+            <w:tcW w:type="dxa" w:w="2232"/>
+          </w:tcPr>
+          <w:p>
+            <w:r>
+              <w:rPr>
+                <w:rFonts w:ascii="Arial" w:hAnsi="Arial" w:eastAsia="BIZ UDPGothic"/>
+                <w:color w:val="000000"/>
+                <w:sz w:val="21"/>
+              </w:rPr>
+              <w:t>Appendix 27–50</w:t>
             </w:r>
           </w:p>
         </w:tc>
@@ -226,7 +290,7 @@
                 <w:color w:val="000000"/>
                 <w:sz w:val="21"/>
               </w:rPr>
-              <w:t>Appendix 50–58</w:t>
+              <w:t>Appendix 51–59</w:t>
             </w:r>
           </w:p>
         </w:tc>
@@ -817,7 +881,7 @@
         <w:pStyle w:val="Heading1"/>
       </w:pPr>
       <w:r>
-        <w:t>Slide 17  Simulation design: five estimators</w:t>
+        <w:t>Slide 17  Simulation comparison: MCAR, MAR and MNAR</w:t>
       </w:r>
     </w:p>
     <w:p>
@@ -825,7 +889,68 @@
         <w:keepLines/>
       </w:pPr>
       <w:r>
-        <w:t>比較するのは五つです。一つ目は、欠測前の全データを使うoracleです。二つ目は、欠測を無視できると考えて観測尤度を使うMARです。三つ目は、欠測のlogisticモデルを正しく指定したselection likelihoodです。四つ目は、そこからY 1の主効果と交互作用を落とした誤指定版です。この二つのselection likelihoodには、どちらもZ Sを入れません。</w:t>
+        <w:t>比較の設計を、ここで整理します。Allmanらの有限潜在クラスのproduct mixtureに沿った、同じ潜在モデルの分布を使います。クラス比率と測定核は固定し、標本サイズも500、全項目の平均観測率も80パーセントにそろえて、欠測の起こり方だけを変えます。Y 1はいつも観測するので、Y 2とY 3の平均観測率はそれぞれ70パーセントです。</w:t>
+      </w:r>
+    </w:p>
+    <w:p>
+      <w:pPr>
+        <w:keepLines/>
+      </w:pPr>
+      <w:r>
+        <w:t>MCARでは、観測確率パイを定数にします。MARでは、いつも見えているY 1だけに観測確率を依存させます。MNARでは、現在の実験と同じく、Y 1、欠測する項目自身のY j、その交互作用に依存させます。</w:t>
+      </w:r>
+    </w:p>
+    <w:p>
+      <w:pPr>
+        <w:keepLines/>
+      </w:pPr>
+      <w:r>
+        <w:t>三つの設定それぞれで、通常の潜在クラスFIMLと、bridgeで補正する提案法を比べます。通常のFIMLは、欠測機構を無視できるとして観測データの尤度を使う方法です。欠測前の全データを使うoracleも、比較の基準として置きます。評価するのは、Yの確率、測定核M j、クラス比率p fです。</w:t>
+      </w:r>
+    </w:p>
+    <w:p>
+      <w:pPr>
+        <w:keepLines/>
+      </w:pPr>
+      <w:r>
+        <w:t>MCARとMARでは、潜在モデルが正しく、識別などの条件が満たされれば、通常のFIMLでも母集団の値を回復できるはずです。提案法も回復できるか、それに補正の分だけばらつきが増える可能性があるかを見ます。ただし、通常のFIMLはZを使わず、提案法はZを使います。同じ情報を使った効率比較ではないので、分散の差を補正のコストだけで説明することはできません。MNARでは、欠測を無視したときの偏りを、提案法がどこまで補正できるかを見ます。</w:t>
+      </w:r>
+    </w:p>
+    <w:p>
+      <w:pPr>
+        <w:keepLines/>
+      </w:pPr>
+      <w:r>
+        <w:t>ただし、これは比較の設計です。MCARとMARでの比較は、まだ実行していません。この後の数値と図は全て、既に実行したMNAR実験の五手法比較です。MCARやMARでも同じ結果が出た、という意味ではありません。</w:t>
+      </w:r>
+    </w:p>
+    <w:p>
+      <w:pPr>
+        <w:spacing w:after="20"/>
+      </w:pPr>
+    </w:p>
+    <w:p>
+      <w:pPr>
+        <w:pStyle w:val="Heading1"/>
+      </w:pPr>
+      <w:r>
+        <w:t>Slide 18  MNAR benchmark: five estimators</w:t>
+      </w:r>
+    </w:p>
+    <w:p>
+      <w:pPr>
+        <w:keepLines/>
+      </w:pPr>
+      <w:r>
+        <w:t>ここからは、既に実行したMNAR実験の結果です。先ほどの三つの欠測機構の比較とは別に、この実験では五つの推定法を比べています。図や表に残っているMARというラベルは、真の欠測機構の名前ではなく、欠測を無視できると仮定した通常の潜在クラスFIMLを指します。MCARとMARのデータでの比較は、まだ実行していません。</w:t>
+      </w:r>
+    </w:p>
+    <w:p>
+      <w:pPr>
+        <w:keepLines/>
+      </w:pPr>
+      <w:r>
+        <w:t>比較するのは五つです。一つ目は、欠測前の全データを使うoracleです。二つ目は、欠測を無視できると考えて観測尤度を使う、通常の潜在クラスFIMLです。図ではMARと表記しています。三つ目は、欠測のlogisticモデルを正しく指定したselection likelihoodです。四つ目は、そこからY 1の主効果と交互作用を落とした誤指定版です。この二つのselection likelihoodには、どちらもZ Sを入れません。</w:t>
       </w:r>
     </w:p>
     <w:p>
@@ -846,7 +971,7 @@
         <w:pStyle w:val="Heading1"/>
       </w:pPr>
       <w:r>
-        <w:t>Slide 18  Simulation evaluation criteria</w:t>
+        <w:t>Slide 19  Simulation evaluation criteria</w:t>
       </w:r>
     </w:p>
     <w:p>
@@ -875,7 +1000,7 @@
         <w:pStyle w:val="Heading1"/>
       </w:pPr>
       <w:r>
-        <w:t>Slide 19  Population outcome recovery: bias and SD</w:t>
+        <w:t>Slide 20  Population outcome recovery: bias and SD</w:t>
       </w:r>
     </w:p>
     <w:p>
@@ -883,7 +1008,7 @@
         <w:keepLines/>
       </w:pPr>
       <w:r>
-        <w:t>まず、潜在構造に分ける前に、Yの分布が戻っているかを見ます。このページでは、ミュー2とミュー3について、五つの手法のbiasとSDを比べます。</w:t>
+        <w:t>ここで示すのは、MNAR実験の結果です。まず、潜在構造に分ける前に、Yの分布が戻っているかを見ます。このページでは、ミュー2とミュー3について、五つの手法のbiasとSDを比べます。</w:t>
       </w:r>
     </w:p>
     <w:p>
@@ -904,7 +1029,7 @@
         <w:pStyle w:val="Heading1"/>
       </w:pPr>
       <w:r>
-        <w:t>Slide 20  Population outcome recovery: SE and coverage</w:t>
+        <w:t>Slide 21  Population outcome recovery: SE and coverage</w:t>
       </w:r>
     </w:p>
     <w:p>
@@ -912,7 +1037,7 @@
         <w:keepLines/>
       </w:pPr>
       <w:r>
-        <w:t>続いて、不確実性をうまく測れているかを見ます。提案法の平均SEは、ミュー2で0.0365、ミュー3で0.0339です。前のページのSD、0.0379と0.0345に近く、実際の推定値のばらつきをおおむね捉えています。coverageは94パーセントと93パーセントでした。</w:t>
+        <w:t>ここで示すのは、MNAR実験の結果です。続いて、不確実性をうまく測れているかを見ます。提案法の平均SEは、ミュー2で0.0365、ミュー3で0.0339です。前のページのSD、0.0379と0.0345に近く、実際の推定値のばらつきをおおむね捉えています。coverageは94パーセントと93パーセントでした。</w:t>
       </w:r>
     </w:p>
     <w:p>
@@ -933,7 +1058,7 @@
         <w:pStyle w:val="Heading1"/>
       </w:pPr>
       <w:r>
-        <w:t>Slide 21  Stage-2 full joint law</w:t>
+        <w:t>Slide 22  Stage-2 full joint law</w:t>
       </w:r>
     </w:p>
     <w:p>
@@ -941,7 +1066,7 @@
         <w:keepLines/>
       </w:pPr>
       <w:r>
-        <w:t>今度は、三つのYの同時分布を見ます。横軸は0と1の八通りの組合せ、縦軸はそれぞれが起こる確率です。黒い線が母集団の真の分布で、ほかの線は100反復の推定結果を平均しています。</w:t>
+        <w:t>ここで示すのは、MNAR実験の結果です。今度は、三つのYの同時分布を見ます。横軸は0と1の八通りの組合せ、縦軸はそれぞれが起こる確率です。黒い線が母集団の真の分布で、ほかの線は100反復の推定結果を平均しています。</w:t>
       </w:r>
     </w:p>
     <w:p>
@@ -962,7 +1087,7 @@
         <w:pStyle w:val="Heading1"/>
       </w:pPr>
       <w:r>
-        <w:t>Slide 22  Latent-parameter recovery</w:t>
+        <w:t>Slide 23  Latent-parameter recovery</w:t>
       </w:r>
     </w:p>
     <w:p>
@@ -970,7 +1095,7 @@
         <w:keepLines/>
       </w:pPr>
       <w:r>
-        <w:t>こちらは、潜在構造まで分けた後の結果です。測定核では、提案法のbiasの絶対値とRMSEが、MARと誤指定したselection likelihoodより小さくなっています。欠測モデルの形を直接決めず、Missing IVからペアの分布を回復していることが効いていると考えられます。</w:t>
+        <w:t>ここで示すのは、MNAR実験の結果です。こちらは、潜在構造まで分けた後の結果です。測定核では、提案法のbiasの絶対値とRMSEが、MARと誤指定したselection likelihoodより小さくなっています。欠測モデルの形を直接決めず、Missing IVからペアの分布を回復していることが効いていると考えられます。</w:t>
       </w:r>
     </w:p>
     <w:p>
@@ -991,7 +1116,7 @@
         <w:pStyle w:val="Heading1"/>
       </w:pPr>
       <w:r>
-        <w:t>Slide 23  Contribution &amp; Limitation &amp; Future Work</w:t>
+        <w:t>Slide 24  Contribution &amp; Limitation &amp; Future Work</w:t>
       </w:r>
     </w:p>
     <w:p>
@@ -1036,7 +1161,7 @@
         <w:pStyle w:val="Heading1"/>
       </w:pPr>
       <w:r>
-        <w:t>Slide 24  Selected references</w:t>
+        <w:t>Slide 25  Selected references</w:t>
       </w:r>
     </w:p>
     <w:p>
@@ -1057,7 +1182,7 @@
         <w:pStyle w:val="Heading1"/>
       </w:pPr>
       <w:r>
-        <w:t>Slide 25  Selected references (continued)</w:t>
+        <w:t>Slide 26  Selected references (continued)</w:t>
       </w:r>
     </w:p>
     <w:p>
@@ -1078,7 +1203,7 @@
         <w:pStyle w:val="Heading1"/>
       </w:pPr>
       <w:r>
-        <w:t>Appendix Slide 26  Motivation and objective</w:t>
+        <w:t>Appendix Slide 27  Motivation and objective</w:t>
       </w:r>
     </w:p>
     <w:p>
@@ -1123,7 +1248,7 @@
         <w:pStyle w:val="Heading1"/>
       </w:pPr>
       <w:r>
-        <w:t>Appendix Slide 27  Proposed two-stage identification</w:t>
+        <w:t>Appendix Slide 28  Proposed two-stage identification</w:t>
       </w:r>
     </w:p>
     <w:p>
@@ -1152,7 +1277,7 @@
         <w:pStyle w:val="Heading1"/>
       </w:pPr>
       <w:r>
-        <w:t>Appendix Slide 28  Model and assumptions</w:t>
+        <w:t>Appendix Slide 29  Model and assumptions</w:t>
       </w:r>
     </w:p>
     <w:p>
@@ -1173,7 +1298,7 @@
         <w:pStyle w:val="Heading1"/>
       </w:pPr>
       <w:r>
-        <w:t>Appendix Slide 29  Assumption 1</w:t>
+        <w:t>Appendix Slide 30  Assumption 1</w:t>
       </w:r>
     </w:p>
     <w:p>
@@ -1202,7 +1327,7 @@
         <w:pStyle w:val="Heading1"/>
       </w:pPr>
       <w:r>
-        <w:t>Appendix Slide 30  Assumptions 2 and 3</w:t>
+        <w:t>Appendix Slide 31  Assumptions 2 and 3</w:t>
       </w:r>
     </w:p>
     <w:p>
@@ -1231,7 +1356,7 @@
         <w:pStyle w:val="Heading1"/>
       </w:pPr>
       <w:r>
-        <w:t>Appendix Slide 31  Assumption 4</w:t>
+        <w:t>Appendix Slide 32  Assumption 4</w:t>
       </w:r>
     </w:p>
     <w:p>
@@ -1268,7 +1393,7 @@
         <w:pStyle w:val="Heading1"/>
       </w:pPr>
       <w:r>
-        <w:t>Appendix Slide 32  Lemma 2.1</w:t>
+        <w:t>Appendix Slide 33  Lemma 2.1</w:t>
       </w:r>
     </w:p>
     <w:p>
@@ -1305,7 +1430,7 @@
         <w:pStyle w:val="Heading1"/>
       </w:pPr>
       <w:r>
-        <w:t>Appendix Slide 33  Assumption 5</w:t>
+        <w:t>Appendix Slide 34  Assumption 5</w:t>
       </w:r>
     </w:p>
     <w:p>
@@ -1334,7 +1459,7 @@
         <w:pStyle w:val="Heading1"/>
       </w:pPr>
       <w:r>
-        <w:t>Appendix Slide 34  Two marginal views of the model</w:t>
+        <w:t>Appendix Slide 35  Two marginal views of the model</w:t>
       </w:r>
     </w:p>
     <w:p>
@@ -1371,7 +1496,7 @@
         <w:pStyle w:val="Heading1"/>
       </w:pPr>
       <w:r>
-        <w:t>Appendix Slide 35  Overlapping supported blocks</w:t>
+        <w:t>Appendix Slide 36  Overlapping supported blocks</w:t>
       </w:r>
     </w:p>
     <w:p>
@@ -1400,7 +1525,7 @@
         <w:pStyle w:val="Heading1"/>
       </w:pPr>
       <w:r>
-        <w:t>Appendix Slide 36  Assumptions 6 and 7</w:t>
+        <w:t>Appendix Slide 37  Assumptions 6 and 7</w:t>
       </w:r>
     </w:p>
     <w:p>
@@ -1437,7 +1562,7 @@
         <w:pStyle w:val="Heading1"/>
       </w:pPr>
       <w:r>
-        <w:t>Appendix Slide 37  New Proposition 1</w:t>
+        <w:t>Appendix Slide 38  New Proposition 1</w:t>
       </w:r>
     </w:p>
     <w:p>
@@ -1474,7 +1599,7 @@
         <w:pStyle w:val="Heading1"/>
       </w:pPr>
       <w:r>
-        <w:t>Appendix Slide 38  Finite latent-class identification</w:t>
+        <w:t>Appendix Slide 39  Finite latent-class identification</w:t>
       </w:r>
     </w:p>
     <w:p>
@@ -1495,7 +1620,7 @@
         <w:pStyle w:val="Heading1"/>
       </w:pPr>
       <w:r>
-        <w:t>Appendix Slide 39  The remaining decomposition problem</w:t>
+        <w:t>Appendix Slide 40  The remaining decomposition problem</w:t>
       </w:r>
     </w:p>
     <w:p>
@@ -1532,7 +1657,7 @@
         <w:pStyle w:val="Heading1"/>
       </w:pPr>
       <w:r>
-        <w:t>Appendix Slide 40  Identification strategy</w:t>
+        <w:t>Appendix Slide 41  Identification strategy</w:t>
       </w:r>
     </w:p>
     <w:p>
@@ -1561,7 +1686,7 @@
         <w:pStyle w:val="Heading1"/>
       </w:pPr>
       <w:r>
-        <w:t>Appendix Slide 41  Assumption 3.1: Support and model</w:t>
+        <w:t>Appendix Slide 42  Assumption 3.1: Support and model</w:t>
       </w:r>
     </w:p>
     <w:p>
@@ -1590,7 +1715,7 @@
         <w:pStyle w:val="Heading1"/>
       </w:pPr>
       <w:r>
-        <w:t>Appendix Slide 42  Assumption 3.1: Rank and labels</w:t>
+        <w:t>Appendix Slide 43  Assumption 3.1: Rank and labels</w:t>
       </w:r>
     </w:p>
     <w:p>
@@ -1627,7 +1752,7 @@
         <w:pStyle w:val="Heading1"/>
       </w:pPr>
       <w:r>
-        <w:t>Appendix Slide 43  Lemma 3.1</w:t>
+        <w:t>Appendix Slide 44  Lemma 3.1</w:t>
       </w:r>
     </w:p>
     <w:p>
@@ -1656,7 +1781,7 @@
         <w:pStyle w:val="Heading1"/>
       </w:pPr>
       <w:r>
-        <w:t>Appendix Slide 44  New Theorem 1</w:t>
+        <w:t>Appendix Slide 45  New Theorem 1</w:t>
       </w:r>
     </w:p>
     <w:p>
@@ -1685,7 +1810,7 @@
         <w:pStyle w:val="Heading1"/>
       </w:pPr>
       <w:r>
-        <w:t>Appendix Slide 45  Bridge-weighted composite estimation</w:t>
+        <w:t>Appendix Slide 46  Bridge-weighted composite estimation</w:t>
       </w:r>
     </w:p>
     <w:p>
@@ -1714,7 +1839,7 @@
         <w:pStyle w:val="Heading1"/>
       </w:pPr>
       <w:r>
-        <w:t>Appendix Slide 46  Conditions for estimation</w:t>
+        <w:t>Appendix Slide 47  Conditions for estimation</w:t>
       </w:r>
     </w:p>
     <w:p>
@@ -1743,7 +1868,7 @@
         <w:pStyle w:val="Heading1"/>
       </w:pPr>
       <w:r>
-        <w:t>Appendix Slide 47  Assumption 5.1: Regularity</w:t>
+        <w:t>Appendix Slide 48  Assumption 5.1: Regularity</w:t>
       </w:r>
     </w:p>
     <w:p>
@@ -1780,7 +1905,7 @@
         <w:pStyle w:val="Heading1"/>
       </w:pPr>
       <w:r>
-        <w:t>Appendix Slide 48  Assumption 5.1: Uniform convergence</w:t>
+        <w:t>Appendix Slide 49  Assumption 5.1: Uniform convergence</w:t>
       </w:r>
     </w:p>
     <w:p>
@@ -1809,7 +1934,7 @@
         <w:pStyle w:val="Heading1"/>
       </w:pPr>
       <w:r>
-        <w:t>Appendix Slide 49  Assumption 5.1: First stage and separation</w:t>
+        <w:t>Appendix Slide 50  Assumption 5.1: First stage and separation</w:t>
       </w:r>
     </w:p>
     <w:p>
@@ -1846,7 +1971,7 @@
         <w:pStyle w:val="Heading1"/>
       </w:pPr>
       <w:r>
-        <w:t>Appendix Slide 50  Proof sketch for Proposition 1</w:t>
+        <w:t>Appendix Slide 51  Proof sketch for Proposition 1</w:t>
       </w:r>
     </w:p>
     <w:p>
@@ -1883,7 +2008,7 @@
         <w:pStyle w:val="Heading1"/>
       </w:pPr>
       <w:r>
-        <w:t>Appendix Slide 51  Proof map for Theorem 1</w:t>
+        <w:t>Appendix Slide 52  Proof map for Theorem 1</w:t>
       </w:r>
     </w:p>
     <w:p>
@@ -1912,7 +2037,7 @@
         <w:pStyle w:val="Heading1"/>
       </w:pPr>
       <w:r>
-        <w:t>Appendix Slide 52  Proof of Theorem 1 (Steps 1--2)</w:t>
+        <w:t>Appendix Slide 53  Proof of Theorem 1 (Steps 1--2)</w:t>
       </w:r>
     </w:p>
     <w:p>
@@ -1941,7 +2066,7 @@
         <w:pStyle w:val="Heading1"/>
       </w:pPr>
       <w:r>
-        <w:t>Appendix Slide 53  Proof of Theorem 1 (Steps 3--4)</w:t>
+        <w:t>Appendix Slide 54  Proof of Theorem 1 (Steps 3--4)</w:t>
       </w:r>
     </w:p>
     <w:p>
@@ -1970,7 +2095,7 @@
         <w:pStyle w:val="Heading1"/>
       </w:pPr>
       <w:r>
-        <w:t>Appendix Slide 54  Proof of Theorem 1 (Steps 5--6)</w:t>
+        <w:t>Appendix Slide 55  Proof of Theorem 1 (Steps 5--6)</w:t>
       </w:r>
     </w:p>
     <w:p>
@@ -1999,7 +2124,7 @@
         <w:pStyle w:val="Heading1"/>
       </w:pPr>
       <w:r>
-        <w:t>Appendix Slide 55  Proof of Theorem 1 (Steps 7--8)</w:t>
+        <w:t>Appendix Slide 56  Proof of Theorem 1 (Steps 7--8)</w:t>
       </w:r>
     </w:p>
     <w:p>
@@ -2028,7 +2153,7 @@
         <w:pStyle w:val="Heading1"/>
       </w:pPr>
       <w:r>
-        <w:t>Appendix Slide 56  empirical diagnostics and falsification checks</w:t>
+        <w:t>Appendix Slide 57  empirical diagnostics and falsification checks</w:t>
       </w:r>
     </w:p>
     <w:p>
@@ -2057,7 +2182,7 @@
         <w:pStyle w:val="Heading1"/>
       </w:pPr>
       <w:r>
-        <w:t>Appendix Slide 57  simulation calibration</w:t>
+        <w:t>Appendix Slide 58  simulation calibration</w:t>
       </w:r>
     </w:p>
     <w:p>
@@ -2086,7 +2211,7 @@
         <w:pStyle w:val="Heading1"/>
       </w:pPr>
       <w:r>
-        <w:t>Appendix Slide 58  selection and shadow calibration</w:t>
+        <w:t>Appendix Slide 59  selection and shadow calibration</w:t>
       </w:r>
     </w:p>
     <w:p>

</xml_diff>

<commit_message>
Remove pending comparison slide and distinguish previous simulation model
</commit_message>
<xml_diff>
--- a/manuscript/vector_missing_iv_presentation_script_ja.docx
+++ b/manuscript/vector_missing_iv_presentation_script_ja.docx
@@ -25,7 +25,7 @@
     </w:p>
     <w:p>
       <w:r>
-        <w:t>英語Beamer全59枚に対応した、日本語の発表原稿です。欠測した人も含む分布をまず回復し、その後で潜在クラスの比率と測定核を分ける、という流れで説明します。本編26枚では二段階の要約、推定理論、三つの欠測機構の比較設計とMNARの数値結果を説明します。MCARとMARの比較は未実行で、掲載数値は既存のMNAR実験の五手法比較に限ります。27枚目からのAppendixには、元の詳細な動機、仮定、識別と推定の議論を残し、その後に証明と数値設定を収めています。</w:t>
+        <w:t>英語Beamer全58枚に対応した、日本語の発表原稿です。欠測した人も含む分布をまず回復し、その後で潜在クラスの比率と測定核を分ける、という流れで説明します。本編25枚では二段階の要約、推定理論、従来の計算手順とシミュレーション設定、MNARの数値結果を説明します。掲載数値は既存のMNAR実験の五手法比較に限り、新しいTカテゴリ候補の結果ではありません。26枚目からのAppendixには、元の詳細な動機、仮定、識別と推定の議論を残し、その後に証明と数値設定を収めています。</w:t>
       </w:r>
     </w:p>
     <w:p>
@@ -177,7 +177,7 @@
                 <w:color w:val="000000"/>
                 <w:sz w:val="21"/>
               </w:rPr>
-              <w:t>漸近理論、計算、simulationのモデルと評価対象</w:t>
+              <w:t>漸近理論、従来の計算手順とsimulation設定、評価対象</w:t>
             </w:r>
           </w:p>
         </w:tc>
@@ -194,39 +194,7 @@
                 <w:color w:val="000000"/>
                 <w:sz w:val="21"/>
               </w:rPr>
-              <w:t>Slide 17</w:t>
-            </w:r>
-          </w:p>
-        </w:tc>
-        <w:tc>
-          <w:tcPr>
-            <w:tcW w:type="dxa" w:w="7344"/>
-          </w:tcPr>
-          <w:p>
-            <w:r>
-              <w:rPr>
-                <w:rFonts w:ascii="Arial" w:hAnsi="Arial" w:eastAsia="BIZ UDPGothic"/>
-                <w:color w:val="000000"/>
-                <w:sz w:val="21"/>
-              </w:rPr>
-              <w:t>MCAR・MAR・MNARの比較設計 MCARとMARは未実行</w:t>
-            </w:r>
-          </w:p>
-        </w:tc>
-      </w:tr>
-      <w:tr>
-        <w:tc>
-          <w:tcPr>
-            <w:tcW w:type="dxa" w:w="2232"/>
-          </w:tcPr>
-          <w:p>
-            <w:r>
-              <w:rPr>
-                <w:rFonts w:ascii="Arial" w:hAnsi="Arial" w:eastAsia="BIZ UDPGothic"/>
-                <w:color w:val="000000"/>
-                <w:sz w:val="21"/>
-              </w:rPr>
-              <w:t>Slides 18–26</w:t>
+              <w:t>Slides 17–25</w:t>
             </w:r>
           </w:p>
         </w:tc>
@@ -258,7 +226,7 @@
                 <w:color w:val="000000"/>
                 <w:sz w:val="21"/>
               </w:rPr>
-              <w:t>Appendix 27–50</w:t>
+              <w:t>Appendix 26–49</w:t>
             </w:r>
           </w:p>
         </w:tc>
@@ -290,7 +258,7 @@
                 <w:color w:val="000000"/>
                 <w:sz w:val="21"/>
               </w:rPr>
-              <w:t>Appendix 51–59</w:t>
+              <w:t>Appendix 50–58</w:t>
             </w:r>
           </w:p>
         </w:tc>
@@ -786,7 +754,15 @@
         <w:pStyle w:val="Heading1"/>
       </w:pPr>
       <w:r>
-        <w:t>Slide 14  Computation</w:t>
+        <w:t>Slide 14  Previous block-bridge computation</w:t>
+      </w:r>
+    </w:p>
+    <w:p>
+      <w:pPr>
+        <w:keepLines/>
+      </w:pPr>
+      <w:r>
+        <w:t>従来のblock-bridge法について整理した計算手順を振り返ります。新しく検討しているTをカテゴリ変数とする候補モデルの計算手順ではありません。</w:t>
       </w:r>
     </w:p>
     <w:p>
@@ -815,7 +791,15 @@
         <w:pStyle w:val="Heading1"/>
       </w:pPr>
       <w:r>
-        <w:t>Slide 15  Simulation targets in the model</w:t>
+        <w:t>Slide 15  Previous simulation model</w:t>
+      </w:r>
+    </w:p>
+    <w:p>
+      <w:pPr>
+        <w:keepLines/>
+      </w:pPr>
+      <w:r>
+        <w:t>このページは、後で示す数値を得た従来のDGP、つまりデータの生成設定です。新しいTカテゴリ候補を検証したものではありません。図に残しているZを平均して消す関係も、この従来の設定についての説明です。</w:t>
       </w:r>
     </w:p>
     <w:p>
@@ -881,7 +865,7 @@
         <w:pStyle w:val="Heading1"/>
       </w:pPr>
       <w:r>
-        <w:t>Slide 17  Simulation comparison: MCAR, MAR and MNAR</w:t>
+        <w:t>Slide 17  MNAR benchmark: five estimators</w:t>
       </w:r>
     </w:p>
     <w:p>
@@ -889,60 +873,7 @@
         <w:keepLines/>
       </w:pPr>
       <w:r>
-        <w:t>比較の設計を、ここで整理します。Allmanらの有限潜在クラスのproduct mixtureに沿った、同じ潜在モデルの分布を使います。クラス比率と測定核は固定し、標本サイズも500、全項目の平均観測率も80パーセントにそろえて、欠測の起こり方だけを変えます。Y 1はいつも観測するので、Y 2とY 3の平均観測率はそれぞれ70パーセントです。</w:t>
-      </w:r>
-    </w:p>
-    <w:p>
-      <w:pPr>
-        <w:keepLines/>
-      </w:pPr>
-      <w:r>
-        <w:t>MCARでは、観測確率パイを定数にします。MARでは、いつも見えているY 1だけに観測確率を依存させます。MNARでは、現在の実験と同じく、Y 1、欠測する項目自身のY j、その交互作用に依存させます。</w:t>
-      </w:r>
-    </w:p>
-    <w:p>
-      <w:pPr>
-        <w:keepLines/>
-      </w:pPr>
-      <w:r>
-        <w:t>三つの設定それぞれで、通常の潜在クラスFIMLと、bridgeで補正する提案法を比べます。通常のFIMLは、欠測機構を無視できるとして観測データの尤度を使う方法です。欠測前の全データを使うoracleも、比較の基準として置きます。評価するのは、Yの確率、測定核M j、クラス比率p fです。</w:t>
-      </w:r>
-    </w:p>
-    <w:p>
-      <w:pPr>
-        <w:keepLines/>
-      </w:pPr>
-      <w:r>
-        <w:t>MCARとMARでは、潜在モデルが正しく、識別などの条件が満たされれば、通常のFIMLでも母集団の値を回復できるはずです。提案法も回復できるか、それに補正の分だけばらつきが増える可能性があるかを見ます。ただし、通常のFIMLはZを使わず、提案法はZを使います。同じ情報を使った効率比較ではないので、分散の差を補正のコストだけで説明することはできません。MNARでは、欠測を無視したときの偏りを、提案法がどこまで補正できるかを見ます。</w:t>
-      </w:r>
-    </w:p>
-    <w:p>
-      <w:pPr>
-        <w:keepLines/>
-      </w:pPr>
-      <w:r>
-        <w:t>ただし、これは比較の設計です。MCARとMARでの比較は、まだ実行していません。この後の数値と図は全て、既に実行したMNAR実験の五手法比較です。MCARやMARでも同じ結果が出た、という意味ではありません。</w:t>
-      </w:r>
-    </w:p>
-    <w:p>
-      <w:pPr>
-        <w:spacing w:after="20"/>
-      </w:pPr>
-    </w:p>
-    <w:p>
-      <w:pPr>
-        <w:pStyle w:val="Heading1"/>
-      </w:pPr>
-      <w:r>
-        <w:t>Slide 18  MNAR benchmark: five estimators</w:t>
-      </w:r>
-    </w:p>
-    <w:p>
-      <w:pPr>
-        <w:keepLines/>
-      </w:pPr>
-      <w:r>
-        <w:t>ここからは、既に実行したMNAR実験の結果です。先ほどの三つの欠測機構の比較とは別に、この実験では五つの推定法を比べています。図や表に残っているMARというラベルは、真の欠測機構の名前ではなく、欠測を無視できると仮定した通常の潜在クラスFIMLを指します。MCARとMARのデータでの比較は、まだ実行していません。</w:t>
+        <w:t>ここからは、先ほどの従来モデルで既に実行したMNAR実験の、五つの推定法を比べます。図や表に残っているMARというラベルは、真の欠測機構の名前ではなく、欠測を無視できると仮定した通常の潜在クラスFIMLを指します。掲載数値は、このMNAR実験の結果です。通常のFIMLはZを使わず、提案法はZを使うので、同じ情報を使った効率比較ではない点にも注意します。</w:t>
       </w:r>
     </w:p>
     <w:p>
@@ -971,7 +902,7 @@
         <w:pStyle w:val="Heading1"/>
       </w:pPr>
       <w:r>
-        <w:t>Slide 19  Simulation evaluation criteria</w:t>
+        <w:t>Slide 18  Simulation evaluation criteria</w:t>
       </w:r>
     </w:p>
     <w:p>
@@ -1000,7 +931,7 @@
         <w:pStyle w:val="Heading1"/>
       </w:pPr>
       <w:r>
-        <w:t>Slide 20  Population outcome recovery: bias and SD</w:t>
+        <w:t>Slide 19  Population outcome recovery: bias and SD</w:t>
       </w:r>
     </w:p>
     <w:p>
@@ -1029,7 +960,7 @@
         <w:pStyle w:val="Heading1"/>
       </w:pPr>
       <w:r>
-        <w:t>Slide 21  Population outcome recovery: SE and coverage</w:t>
+        <w:t>Slide 20  Population outcome recovery: SE and coverage</w:t>
       </w:r>
     </w:p>
     <w:p>
@@ -1058,7 +989,7 @@
         <w:pStyle w:val="Heading1"/>
       </w:pPr>
       <w:r>
-        <w:t>Slide 22  Stage-2 full joint law</w:t>
+        <w:t>Slide 21  Stage-2 full joint law</w:t>
       </w:r>
     </w:p>
     <w:p>
@@ -1087,7 +1018,7 @@
         <w:pStyle w:val="Heading1"/>
       </w:pPr>
       <w:r>
-        <w:t>Slide 23  Latent-parameter recovery</w:t>
+        <w:t>Slide 22  Latent-parameter recovery</w:t>
       </w:r>
     </w:p>
     <w:p>
@@ -1116,7 +1047,7 @@
         <w:pStyle w:val="Heading1"/>
       </w:pPr>
       <w:r>
-        <w:t>Slide 24  Contribution &amp; Limitation &amp; Future Work</w:t>
+        <w:t>Slide 23  Contribution &amp; Limitation &amp; Future Work</w:t>
       </w:r>
     </w:p>
     <w:p>
@@ -1161,7 +1092,7 @@
         <w:pStyle w:val="Heading1"/>
       </w:pPr>
       <w:r>
-        <w:t>Slide 25  Selected references</w:t>
+        <w:t>Slide 24  Selected references</w:t>
       </w:r>
     </w:p>
     <w:p>
@@ -1182,7 +1113,7 @@
         <w:pStyle w:val="Heading1"/>
       </w:pPr>
       <w:r>
-        <w:t>Slide 26  Selected references (continued)</w:t>
+        <w:t>Slide 25  Selected references (continued)</w:t>
       </w:r>
     </w:p>
     <w:p>
@@ -1203,7 +1134,7 @@
         <w:pStyle w:val="Heading1"/>
       </w:pPr>
       <w:r>
-        <w:t>Appendix Slide 27  Motivation and objective</w:t>
+        <w:t>Appendix Slide 26  Motivation and objective</w:t>
       </w:r>
     </w:p>
     <w:p>
@@ -1248,7 +1179,7 @@
         <w:pStyle w:val="Heading1"/>
       </w:pPr>
       <w:r>
-        <w:t>Appendix Slide 28  Proposed two-stage identification</w:t>
+        <w:t>Appendix Slide 27  Proposed two-stage identification</w:t>
       </w:r>
     </w:p>
     <w:p>
@@ -1277,7 +1208,7 @@
         <w:pStyle w:val="Heading1"/>
       </w:pPr>
       <w:r>
-        <w:t>Appendix Slide 29  Model and assumptions</w:t>
+        <w:t>Appendix Slide 28  Model and assumptions</w:t>
       </w:r>
     </w:p>
     <w:p>
@@ -1298,7 +1229,7 @@
         <w:pStyle w:val="Heading1"/>
       </w:pPr>
       <w:r>
-        <w:t>Appendix Slide 30  Assumption 1</w:t>
+        <w:t>Appendix Slide 29  Assumption 1</w:t>
       </w:r>
     </w:p>
     <w:p>
@@ -1327,7 +1258,7 @@
         <w:pStyle w:val="Heading1"/>
       </w:pPr>
       <w:r>
-        <w:t>Appendix Slide 31  Assumptions 2 and 3</w:t>
+        <w:t>Appendix Slide 30  Assumptions 2 and 3</w:t>
       </w:r>
     </w:p>
     <w:p>
@@ -1356,7 +1287,7 @@
         <w:pStyle w:val="Heading1"/>
       </w:pPr>
       <w:r>
-        <w:t>Appendix Slide 32  Assumption 4</w:t>
+        <w:t>Appendix Slide 31  Assumption 4</w:t>
       </w:r>
     </w:p>
     <w:p>
@@ -1393,7 +1324,7 @@
         <w:pStyle w:val="Heading1"/>
       </w:pPr>
       <w:r>
-        <w:t>Appendix Slide 33  Lemma 2.1</w:t>
+        <w:t>Appendix Slide 32  Lemma 2.1</w:t>
       </w:r>
     </w:p>
     <w:p>
@@ -1430,7 +1361,7 @@
         <w:pStyle w:val="Heading1"/>
       </w:pPr>
       <w:r>
-        <w:t>Appendix Slide 34  Assumption 5</w:t>
+        <w:t>Appendix Slide 33  Assumption 5</w:t>
       </w:r>
     </w:p>
     <w:p>
@@ -1459,7 +1390,7 @@
         <w:pStyle w:val="Heading1"/>
       </w:pPr>
       <w:r>
-        <w:t>Appendix Slide 35  Two marginal views of the model</w:t>
+        <w:t>Appendix Slide 34  Two marginal views of the model</w:t>
       </w:r>
     </w:p>
     <w:p>
@@ -1496,7 +1427,7 @@
         <w:pStyle w:val="Heading1"/>
       </w:pPr>
       <w:r>
-        <w:t>Appendix Slide 36  Overlapping supported blocks</w:t>
+        <w:t>Appendix Slide 35  Overlapping supported blocks</w:t>
       </w:r>
     </w:p>
     <w:p>
@@ -1525,7 +1456,7 @@
         <w:pStyle w:val="Heading1"/>
       </w:pPr>
       <w:r>
-        <w:t>Appendix Slide 37  Assumptions 6 and 7</w:t>
+        <w:t>Appendix Slide 36  Assumptions 6 and 7</w:t>
       </w:r>
     </w:p>
     <w:p>
@@ -1562,7 +1493,7 @@
         <w:pStyle w:val="Heading1"/>
       </w:pPr>
       <w:r>
-        <w:t>Appendix Slide 38  New Proposition 1</w:t>
+        <w:t>Appendix Slide 37  New Proposition 1</w:t>
       </w:r>
     </w:p>
     <w:p>
@@ -1599,7 +1530,7 @@
         <w:pStyle w:val="Heading1"/>
       </w:pPr>
       <w:r>
-        <w:t>Appendix Slide 39  Finite latent-class identification</w:t>
+        <w:t>Appendix Slide 38  Finite latent-class identification</w:t>
       </w:r>
     </w:p>
     <w:p>
@@ -1620,7 +1551,7 @@
         <w:pStyle w:val="Heading1"/>
       </w:pPr>
       <w:r>
-        <w:t>Appendix Slide 40  The remaining decomposition problem</w:t>
+        <w:t>Appendix Slide 39  The remaining decomposition problem</w:t>
       </w:r>
     </w:p>
     <w:p>
@@ -1657,7 +1588,7 @@
         <w:pStyle w:val="Heading1"/>
       </w:pPr>
       <w:r>
-        <w:t>Appendix Slide 41  Identification strategy</w:t>
+        <w:t>Appendix Slide 40  Identification strategy</w:t>
       </w:r>
     </w:p>
     <w:p>
@@ -1686,7 +1617,7 @@
         <w:pStyle w:val="Heading1"/>
       </w:pPr>
       <w:r>
-        <w:t>Appendix Slide 42  Assumption 3.1: Support and model</w:t>
+        <w:t>Appendix Slide 41  Assumption 3.1: Support and model</w:t>
       </w:r>
     </w:p>
     <w:p>
@@ -1715,7 +1646,7 @@
         <w:pStyle w:val="Heading1"/>
       </w:pPr>
       <w:r>
-        <w:t>Appendix Slide 43  Assumption 3.1: Rank and labels</w:t>
+        <w:t>Appendix Slide 42  Assumption 3.1: Rank and labels</w:t>
       </w:r>
     </w:p>
     <w:p>
@@ -1752,7 +1683,7 @@
         <w:pStyle w:val="Heading1"/>
       </w:pPr>
       <w:r>
-        <w:t>Appendix Slide 44  Lemma 3.1</w:t>
+        <w:t>Appendix Slide 43  Lemma 3.1</w:t>
       </w:r>
     </w:p>
     <w:p>
@@ -1781,7 +1712,7 @@
         <w:pStyle w:val="Heading1"/>
       </w:pPr>
       <w:r>
-        <w:t>Appendix Slide 45  New Theorem 1</w:t>
+        <w:t>Appendix Slide 44  New Theorem 1</w:t>
       </w:r>
     </w:p>
     <w:p>
@@ -1810,7 +1741,7 @@
         <w:pStyle w:val="Heading1"/>
       </w:pPr>
       <w:r>
-        <w:t>Appendix Slide 46  Bridge-weighted composite estimation</w:t>
+        <w:t>Appendix Slide 45  Bridge-weighted composite estimation</w:t>
       </w:r>
     </w:p>
     <w:p>
@@ -1839,7 +1770,7 @@
         <w:pStyle w:val="Heading1"/>
       </w:pPr>
       <w:r>
-        <w:t>Appendix Slide 47  Conditions for estimation</w:t>
+        <w:t>Appendix Slide 46  Conditions for estimation</w:t>
       </w:r>
     </w:p>
     <w:p>
@@ -1868,7 +1799,7 @@
         <w:pStyle w:val="Heading1"/>
       </w:pPr>
       <w:r>
-        <w:t>Appendix Slide 48  Assumption 5.1: Regularity</w:t>
+        <w:t>Appendix Slide 47  Assumption 5.1: Regularity</w:t>
       </w:r>
     </w:p>
     <w:p>
@@ -1905,7 +1836,7 @@
         <w:pStyle w:val="Heading1"/>
       </w:pPr>
       <w:r>
-        <w:t>Appendix Slide 49  Assumption 5.1: Uniform convergence</w:t>
+        <w:t>Appendix Slide 48  Assumption 5.1: Uniform convergence</w:t>
       </w:r>
     </w:p>
     <w:p>
@@ -1934,7 +1865,7 @@
         <w:pStyle w:val="Heading1"/>
       </w:pPr>
       <w:r>
-        <w:t>Appendix Slide 50  Assumption 5.1: First stage and separation</w:t>
+        <w:t>Appendix Slide 49  Assumption 5.1: First stage and separation</w:t>
       </w:r>
     </w:p>
     <w:p>
@@ -1971,7 +1902,7 @@
         <w:pStyle w:val="Heading1"/>
       </w:pPr>
       <w:r>
-        <w:t>Appendix Slide 51  Proof sketch for Proposition 1</w:t>
+        <w:t>Appendix Slide 50  Proof sketch for Proposition 1</w:t>
       </w:r>
     </w:p>
     <w:p>
@@ -2008,7 +1939,7 @@
         <w:pStyle w:val="Heading1"/>
       </w:pPr>
       <w:r>
-        <w:t>Appendix Slide 52  Proof map for Theorem 1</w:t>
+        <w:t>Appendix Slide 51  Proof map for Theorem 1</w:t>
       </w:r>
     </w:p>
     <w:p>
@@ -2037,7 +1968,7 @@
         <w:pStyle w:val="Heading1"/>
       </w:pPr>
       <w:r>
-        <w:t>Appendix Slide 53  Proof of Theorem 1 (Steps 1--2)</w:t>
+        <w:t>Appendix Slide 52  Proof of Theorem 1 (Steps 1--2)</w:t>
       </w:r>
     </w:p>
     <w:p>
@@ -2066,7 +1997,7 @@
         <w:pStyle w:val="Heading1"/>
       </w:pPr>
       <w:r>
-        <w:t>Appendix Slide 54  Proof of Theorem 1 (Steps 3--4)</w:t>
+        <w:t>Appendix Slide 53  Proof of Theorem 1 (Steps 3--4)</w:t>
       </w:r>
     </w:p>
     <w:p>
@@ -2095,7 +2026,7 @@
         <w:pStyle w:val="Heading1"/>
       </w:pPr>
       <w:r>
-        <w:t>Appendix Slide 55  Proof of Theorem 1 (Steps 5--6)</w:t>
+        <w:t>Appendix Slide 54  Proof of Theorem 1 (Steps 5--6)</w:t>
       </w:r>
     </w:p>
     <w:p>
@@ -2124,7 +2055,7 @@
         <w:pStyle w:val="Heading1"/>
       </w:pPr>
       <w:r>
-        <w:t>Appendix Slide 56  Proof of Theorem 1 (Steps 7--8)</w:t>
+        <w:t>Appendix Slide 55  Proof of Theorem 1 (Steps 7--8)</w:t>
       </w:r>
     </w:p>
     <w:p>
@@ -2153,7 +2084,7 @@
         <w:pStyle w:val="Heading1"/>
       </w:pPr>
       <w:r>
-        <w:t>Appendix Slide 57  empirical diagnostics and falsification checks</w:t>
+        <w:t>Appendix Slide 56  empirical diagnostics and falsification checks</w:t>
       </w:r>
     </w:p>
     <w:p>
@@ -2182,7 +2113,7 @@
         <w:pStyle w:val="Heading1"/>
       </w:pPr>
       <w:r>
-        <w:t>Appendix Slide 58  simulation calibration</w:t>
+        <w:t>Appendix Slide 57  simulation calibration</w:t>
       </w:r>
     </w:p>
     <w:p>
@@ -2211,7 +2142,7 @@
         <w:pStyle w:val="Heading1"/>
       </w:pPr>
       <w:r>
-        <w:t>Appendix Slide 59  selection and shadow calibration</w:t>
+        <w:t>Appendix Slide 58  selection and shadow calibration</w:t>
       </w:r>
     </w:p>
     <w:p>

</xml_diff>

<commit_message>
Remove previous-model labels from presentation slides
</commit_message>
<xml_diff>
--- a/manuscript/vector_missing_iv_presentation_script_ja.docx
+++ b/manuscript/vector_missing_iv_presentation_script_ja.docx
@@ -754,15 +754,7 @@
         <w:pStyle w:val="Heading1"/>
       </w:pPr>
       <w:r>
-        <w:t>Slide 14  Previous block-bridge computation</w:t>
-      </w:r>
-    </w:p>
-    <w:p>
-      <w:pPr>
-        <w:keepLines/>
-      </w:pPr>
-      <w:r>
-        <w:t>従来のblock-bridge法について整理した計算手順を振り返ります。新しく検討しているTをカテゴリ変数とする候補モデルの計算手順ではありません。</w:t>
+        <w:t>Slide 14  Computation</w:t>
       </w:r>
     </w:p>
     <w:p>
@@ -791,15 +783,7 @@
         <w:pStyle w:val="Heading1"/>
       </w:pPr>
       <w:r>
-        <w:t>Slide 15  Previous simulation model</w:t>
-      </w:r>
-    </w:p>
-    <w:p>
-      <w:pPr>
-        <w:keepLines/>
-      </w:pPr>
-      <w:r>
-        <w:t>このページは、後で示す数値を得た従来のDGP、つまりデータの生成設定です。新しいTカテゴリ候補を検証したものではありません。図に残しているZを平均して消す関係も、この従来の設定についての説明です。</w:t>
+        <w:t>Slide 15  Simulation targets in the model</w:t>
       </w:r>
     </w:p>
     <w:p>

</xml_diff>

<commit_message>
Condense selection motivation and introduce two contributions
</commit_message>
<xml_diff>
--- a/manuscript/vector_missing_iv_presentation_script_ja.docx
+++ b/manuscript/vector_missing_iv_presentation_script_ja.docx
@@ -392,6 +392,14 @@
     </w:p>
     <w:p>
       <w:pPr>
+        <w:keepLines/>
+      </w:pPr>
+      <w:r>
+        <w:t>ここで、欠測確率の関数形を決めないことにも意味があります。ZhaoとShaoが議論するように、selection modelを間違えるとバイアスにつながります。そこで、Missing IVとcompletenessを使い、selectionのリンクを指定せずに回復する方法を考えます。</w:t>
+      </w:r>
+    </w:p>
+    <w:p>
+      <w:pPr>
         <w:spacing w:after="20"/>
       </w:pPr>
     </w:p>
@@ -524,7 +532,7 @@
         <w:pStyle w:val="Heading1"/>
       </w:pPr>
       <w:r>
-        <w:t>Slide 8  Why leave the selection model unspecified?</w:t>
+        <w:t>Slide 8  Our contribution</w:t>
       </w:r>
     </w:p>
     <w:p>
@@ -532,7 +540,7 @@
         <w:keepLines/>
       </w:pPr>
       <w:r>
-        <w:t>もう一つ、欠測モデルをどこまで決めるか、という問題があります。ZhaoとShaoが議論しているように、outcomeと欠測機構を含むモデル全体を正しく指定できれば、パラメトリックな尤度法は効率の面で有力です。ただし、selectionの関数形を間違えるとバイアスが出ます。そこで彼らは、outcomeのモデルを残しつつ、欠測機構は特定しない半パラメトリックな方法を考えています。</w:t>
+        <w:t>ここまでの研究に対して、本稿の貢献を二つにまとめます。一つ目は、Missing IVによる識別と、有限潜在クラスの分解を、一つの枠組みでつなぐことです。潜在変数とMNARを一緒に扱うこと自体ではなく、この接続が本稿の焦点です。</w:t>
       </w:r>
     </w:p>
     <w:p>
@@ -540,15 +548,7 @@
         <w:keepLines/>
       </w:pPr>
       <w:r>
-        <w:t>本稿でも、selectionの関数形を決めずにノンパラメトリックに分布を回復することを重視します。ただし、何も仮定しなくてよいという意味ではありません。Missing IVやcompletenessは必要です。後半で正指定と誤指定のselection likelihoodを比べるのも、この違いを見るためです。</w:t>
-      </w:r>
-    </w:p>
-    <w:p>
-      <w:pPr>
-        <w:keepLines/>
-      </w:pPr>
-      <w:r>
-        <w:t>ここで本稿が考えるのは、その先です。欠測を補正してYの分布が分かっても、それだけでQ Fと各Q jが別々に分かるわけではありません。MNARの下での分布の回復を、潜在クラス比率と測定核の一意な分解へ、どうつなぐか。ここが今回の問題です。</w:t>
+        <w:t>二つ目は、Yの分布を戻すだけで終わらず、潜在分布Q Fと各項目の測定核Q Yの両方を識別対象にすることです。重なりのあるblockとanchor項目、潜在分布を動かす変数を使い、クラスのラベルをそろえます。もちろん、除外制約やsupport、rankの条件が必要です。次に、その識別戦略を順に説明します。</w:t>
       </w:r>
     </w:p>
     <w:p>

</xml_diff>